<commit_message>
Merge Limitations into Discussion as 8.5; conclusion renumbers to 9
Co-Authored-By: Claude Fable 5 <noreply@anthropic.com>
</commit_message>
<xml_diff>
--- a/paper/blackwell-paper.docx
+++ b/paper/blackwell-paper.docx
@@ -3881,7 +3881,7 @@
           <w:rPr>
             <w:rStyle w:val="Hyperlink"/>
           </w:rPr>
-          <w:t xml:space="preserve">9</w:t>
+          <w:t xml:space="preserve">8.5</w:t>
         </w:r>
       </w:hyperlink>
       <w:r>
@@ -4094,7 +4094,7 @@
           <w:rPr>
             <w:rStyle w:val="Hyperlink"/>
           </w:rPr>
-          <w:t xml:space="preserve">9</w:t>
+          <w:t xml:space="preserve">8.5</w:t>
         </w:r>
       </w:hyperlink>
       <w:r>
@@ -4114,7 +4114,7 @@
           <w:rPr>
             <w:rStyle w:val="Hyperlink"/>
           </w:rPr>
-          <w:t xml:space="preserve">10</w:t>
+          <w:t xml:space="preserve">9</w:t>
         </w:r>
       </w:hyperlink>
       <w:r>
@@ -4168,7 +4168,7 @@
           <w:rPr>
             <w:rStyle w:val="Hyperlink"/>
           </w:rPr>
-          <w:t xml:space="preserve">11</w:t>
+          <w:t xml:space="preserve">10</w:t>
         </w:r>
       </w:hyperlink>
       <w:r>
@@ -4179,7 +4179,7 @@
           <w:rPr>
             <w:rStyle w:val="Hyperlink"/>
           </w:rPr>
-          <w:t xml:space="preserve">12</w:t>
+          <w:t xml:space="preserve">11</w:t>
         </w:r>
       </w:hyperlink>
       <w:r>
@@ -4196,7 +4196,7 @@
           <w:rPr>
             <w:rStyle w:val="Hyperlink"/>
           </w:rPr>
-          <w:t xml:space="preserve">13</w:t>
+          <w:t xml:space="preserve">12</w:t>
         </w:r>
       </w:hyperlink>
       <w:r>
@@ -10226,7 +10226,7 @@
           <w:rPr>
             <w:rStyle w:val="Hyperlink"/>
           </w:rPr>
-          <w:t xml:space="preserve">11</w:t>
+          <w:t xml:space="preserve">10</w:t>
         </w:r>
       </w:hyperlink>
       <w:r>
@@ -11367,7 +11367,7 @@
           <w:rPr>
             <w:rStyle w:val="Hyperlink"/>
           </w:rPr>
-          <w:t xml:space="preserve">11</w:t>
+          <w:t xml:space="preserve">10</w:t>
         </w:r>
       </w:hyperlink>
       <w:r>
@@ -13672,7 +13672,7 @@
           <w:rPr>
             <w:rStyle w:val="Hyperlink"/>
           </w:rPr>
-          <w:t xml:space="preserve">11</w:t>
+          <w:t xml:space="preserve">10</w:t>
         </w:r>
       </w:hyperlink>
       <w:r>
@@ -16083,7 +16083,7 @@
           <w:rPr>
             <w:rStyle w:val="Hyperlink"/>
           </w:rPr>
-          <w:t xml:space="preserve">11</w:t>
+          <w:t xml:space="preserve">10</w:t>
         </w:r>
       </w:hyperlink>
       <w:r>
@@ -21129,7 +21129,7 @@
           <w:rPr>
             <w:rStyle w:val="Hyperlink"/>
           </w:rPr>
-          <w:t xml:space="preserve">11</w:t>
+          <w:t xml:space="preserve">10</w:t>
         </w:r>
       </w:hyperlink>
       <w:r>
@@ -21148,7 +21148,7 @@
           <w:rPr>
             <w:rStyle w:val="Hyperlink"/>
           </w:rPr>
-          <w:t xml:space="preserve">11</w:t>
+          <w:t xml:space="preserve">10</w:t>
         </w:r>
       </w:hyperlink>
       <w:r>
@@ -21167,7 +21167,7 @@
           <w:rPr>
             <w:rStyle w:val="Hyperlink"/>
           </w:rPr>
-          <w:t xml:space="preserve">11</w:t>
+          <w:t xml:space="preserve">10</w:t>
         </w:r>
       </w:hyperlink>
       <w:r>
@@ -23363,7 +23363,7 @@
           <w:rPr>
             <w:rStyle w:val="Hyperlink"/>
           </w:rPr>
-          <w:t xml:space="preserve">11</w:t>
+          <w:t xml:space="preserve">10</w:t>
         </w:r>
       </w:hyperlink>
       <w:r>
@@ -24856,7 +24856,7 @@
           <w:rPr>
             <w:rStyle w:val="Hyperlink"/>
           </w:rPr>
-          <w:t xml:space="preserve">11</w:t>
+          <w:t xml:space="preserve">10</w:t>
         </w:r>
       </w:hyperlink>
       <w:r>
@@ -25236,7 +25236,7 @@
           <w:rPr>
             <w:rStyle w:val="Hyperlink"/>
           </w:rPr>
-          <w:t xml:space="preserve">11</w:t>
+          <w:t xml:space="preserve">10</w:t>
         </w:r>
       </w:hyperlink>
       <w:r>
@@ -27863,7 +27863,7 @@
           <w:rPr>
             <w:rStyle w:val="Hyperlink"/>
           </w:rPr>
-          <w:t xml:space="preserve">9</w:t>
+          <w:t xml:space="preserve">8.5</w:t>
         </w:r>
       </w:hyperlink>
       <w:r>
@@ -28338,7 +28338,7 @@
           <w:rPr>
             <w:rStyle w:val="Hyperlink"/>
           </w:rPr>
-          <w:t xml:space="preserve">9</w:t>
+          <w:t xml:space="preserve">8.5</w:t>
         </w:r>
       </w:hyperlink>
       <w:r>
@@ -28502,7 +28502,7 @@
           <w:rPr>
             <w:rStyle w:val="Hyperlink"/>
           </w:rPr>
-          <w:t xml:space="preserve">13</w:t>
+          <w:t xml:space="preserve">12</w:t>
         </w:r>
       </w:hyperlink>
       <w:r>
@@ -28605,7 +28605,7 @@
           <w:rPr>
             <w:rStyle w:val="Hyperlink"/>
           </w:rPr>
-          <w:t xml:space="preserve">9</w:t>
+          <w:t xml:space="preserve">8.5</w:t>
         </w:r>
       </w:hyperlink>
       <w:r>
@@ -40201,7 +40201,7 @@
           <w:rPr>
             <w:rStyle w:val="Hyperlink"/>
           </w:rPr>
-          <w:t xml:space="preserve">9</w:t>
+          <w:t xml:space="preserve">8.5</w:t>
         </w:r>
       </w:hyperlink>
       <w:r>
@@ -40249,7 +40249,7 @@
           <w:rPr>
             <w:rStyle w:val="Hyperlink"/>
           </w:rPr>
-          <w:t xml:space="preserve">12</w:t>
+          <w:t xml:space="preserve">11</w:t>
         </w:r>
       </w:hyperlink>
       <w:r>
@@ -40286,7 +40286,7 @@
           <w:rPr>
             <w:rStyle w:val="Hyperlink"/>
           </w:rPr>
-          <w:t xml:space="preserve">12</w:t>
+          <w:t xml:space="preserve">11</w:t>
         </w:r>
       </w:hyperlink>
       <w:r>
@@ -41199,7 +41199,7 @@
     </w:p>
     <w:bookmarkEnd w:id="98"/>
     <w:bookmarkEnd w:id="99"/>
-    <w:bookmarkStart w:id="108" w:name="sec:discussion"/>
+    <w:bookmarkStart w:id="115" w:name="sec:discussion"/>
     <w:p>
       <w:pPr>
         <w:pStyle w:val="Heading1"/>
@@ -44210,11 +44210,10 @@
     </w:p>
     <w:bookmarkEnd w:id="106"/>
     <w:bookmarkEnd w:id="107"/>
-    <w:bookmarkEnd w:id="108"/>
-    <w:bookmarkStart w:id="115" w:name="sec:limitations"/>
+    <w:bookmarkStart w:id="114" w:name="sec:limitations"/>
     <w:p>
       <w:pPr>
-        <w:pStyle w:val="Heading1"/>
+        <w:pStyle w:val="Heading2"/>
       </w:pPr>
       <w:r>
         <w:t xml:space="preserve">Limitations and threats to validity</w:t>
@@ -44228,7 +44227,7 @@
         <w:t xml:space="preserve">We collect the scope restrictions here; each is stated once and sized to its weight.</w:t>
       </w:r>
     </w:p>
-    <w:bookmarkStart w:id="109" w:name="from-diagnosis-to-selection."/>
+    <w:bookmarkStart w:id="108" w:name="from-diagnosis-to-selection."/>
     <w:p>
       <w:pPr>
         <w:pStyle w:val="Heading4"/>
@@ -44372,8 +44371,8 @@
         <w:t xml:space="preserve">shortlist, is the central open problem this work opens.</w:t>
       </w:r>
     </w:p>
-    <w:bookmarkEnd w:id="109"/>
-    <w:bookmarkStart w:id="110" w:name="source-pair-generality."/>
+    <w:bookmarkEnd w:id="108"/>
+    <w:bookmarkStart w:id="109" w:name="source-pair-generality."/>
     <w:p>
       <w:pPr>
         <w:pStyle w:val="Heading4"/>
@@ -44546,8 +44545,8 @@
         <w:t xml:space="preserve">steps.</w:t>
       </w:r>
     </w:p>
-    <w:bookmarkEnd w:id="110"/>
-    <w:bookmarkStart w:id="111" w:name="vendor-is-confounded-with-harness."/>
+    <w:bookmarkEnd w:id="109"/>
+    <w:bookmarkStart w:id="110" w:name="vendor-is-confounded-with-harness."/>
     <w:p>
       <w:pPr>
         <w:pStyle w:val="Heading4"/>
@@ -44624,8 +44623,8 @@
         <w:t xml:space="preserve">comparisons should still be read as suggestive.</w:t>
       </w:r>
     </w:p>
-    <w:bookmarkEnd w:id="111"/>
-    <w:bookmarkStart w:id="112" w:name="the-model-is-an-idealization-twice."/>
+    <w:bookmarkEnd w:id="110"/>
+    <w:bookmarkStart w:id="111" w:name="the-model-is-an-idealization-twice."/>
     <w:p>
       <w:pPr>
         <w:pStyle w:val="Heading4"/>
@@ -44733,8 +44732,8 @@
         <w:t xml:space="preserve">document pairs is the direct next experiment.</w:t>
       </w:r>
     </w:p>
-    <w:bookmarkEnd w:id="112"/>
-    <w:bookmarkStart w:id="113" w:name="sampling-and-certification-regime."/>
+    <w:bookmarkEnd w:id="111"/>
+    <w:bookmarkStart w:id="112" w:name="sampling-and-certification-regime."/>
     <w:p>
       <w:pPr>
         <w:pStyle w:val="Heading4"/>
@@ -44792,7 +44791,7 @@
           <w:rPr>
             <w:rStyle w:val="Hyperlink"/>
           </w:rPr>
-          <w:t xml:space="preserve">13</w:t>
+          <w:t xml:space="preserve">12</w:t>
         </w:r>
       </w:hyperlink>
       <w:r>
@@ -44834,37 +44833,28 @@
         </w:r>
       </w:hyperlink>
       <w:r>
-        <w:t xml:space="preserve">), and each certificate is marginal at</w:t>
-      </w:r>
-      <w:r>
-        <w:t xml:space="preserve"> </w:t>
-      </w:r>
-      <m:oMath>
-        <m:r>
-          <m:t>η</m:t>
-        </m:r>
-        <m:r>
-          <m:rPr>
-            <m:sty m:val="p"/>
-          </m:rPr>
-          <m:t>=</m:t>
-        </m:r>
-        <m:r>
-          <m:t>0.10</m:t>
-        </m:r>
-      </m:oMath>
-      <w:r>
-        <w:t xml:space="preserve">, not</w:t>
-      </w:r>
-      <w:r>
-        <w:t xml:space="preserve"> </w:t>
-      </w:r>
-      <w:r>
-        <w:t xml:space="preserve">family-wise across claims.</w:t>
+        <w:t xml:space="preserve">); marginal-versus-joint control is discussed in</w:t>
+      </w:r>
+      <w:r>
+        <w:t xml:space="preserve"> </w:t>
+      </w:r>
+      <w:r>
+        <w:t xml:space="preserve">§</w:t>
+      </w:r>
+      <w:hyperlink w:anchor="sec:disc-bridge">
+        <w:r>
+          <w:rPr>
+            <w:rStyle w:val="Hyperlink"/>
+          </w:rPr>
+          <w:t xml:space="preserve">8.1</w:t>
+        </w:r>
+      </w:hyperlink>
+      <w:r>
+        <w:t xml:space="preserve">.</w:t>
       </w:r>
     </w:p>
-    <w:bookmarkEnd w:id="113"/>
-    <w:bookmarkStart w:id="114" w:name="ranker-spectrum-and-synergy."/>
+    <w:bookmarkEnd w:id="112"/>
+    <w:bookmarkStart w:id="113" w:name="ranker-spectrum-and-synergy."/>
     <w:p>
       <w:pPr>
         <w:pStyle w:val="Heading4"/>
@@ -44962,6 +44952,7 @@
         <w:t xml:space="preserve">beyond its parts; we make no claim about it.</w:t>
       </w:r>
     </w:p>
+    <w:bookmarkEnd w:id="113"/>
     <w:bookmarkEnd w:id="114"/>
     <w:bookmarkEnd w:id="115"/>
     <w:bookmarkStart w:id="116" w:name="sec:conclusion"/>
@@ -57397,7 +57388,7 @@
           <w:rPr>
             <w:rStyle w:val="Hyperlink"/>
           </w:rPr>
-          <w:t xml:space="preserve">9</w:t>
+          <w:t xml:space="preserve">8.5</w:t>
         </w:r>
       </w:hyperlink>
       <w:r>
@@ -57613,7 +57604,22 @@
         <w:rPr>
           <w:rStyle w:val="VerbatimChar"/>
         </w:rPr>
-        <w:t xml:space="preserve">blackwell_n80_run.{log,json}</w:t>
+        <w:t xml:space="preserve">blackwell_n80_run.log</w:t>
+      </w:r>
+      <w:r>
+        <w:t xml:space="preserve"> </w:t>
+      </w:r>
+      <w:r>
+        <w:t xml:space="preserve">/</w:t>
+      </w:r>
+      <w:r>
+        <w:t xml:space="preserve"> </w:t>
+      </w:r>
+      <w:r>
+        <w:rPr>
+          <w:rStyle w:val="VerbatimChar"/>
+        </w:rPr>
+        <w:t xml:space="preserve">blackwell_n80_results.json</w:t>
       </w:r>
       <w:r>
         <w:t xml:space="preserve"> </w:t>

</xml_diff>

<commit_message>
Smooth voice/prose: remove 7x repeated proof-deferred boilerplate (redundant with roadmap statement), merge two orphaned stub paragraphs, fix abstract comma splice
Co-Authored-By: Claude Fable 5 <noreply@anthropic.com>
</commit_message>
<xml_diff>
--- a/paper/blackwell-paper.docx
+++ b/paper/blackwell-paper.docx
@@ -2914,7 +2914,7 @@
         </m:r>
       </m:oMath>
       <w:r>
-        <w:t xml:space="preserve">-dependence; we report it as supporting evidence, it caps which cells</w:t>
+        <w:t xml:space="preserve">-dependence; we report it as supporting evidence that caps which cells</w:t>
       </w:r>
       <w:r>
         <w:t xml:space="preserve"> </w:t>
@@ -10234,25 +10234,6 @@
       </w:r>
     </w:p>
     <w:bookmarkEnd w:id="33"/>
-    <w:p>
-      <w:pPr>
-        <w:pStyle w:val="BodyText"/>
-      </w:pPr>
-      <w:r>
-        <w:t xml:space="preserve">The proof is deferred to Appendix </w:t>
-      </w:r>
-      <w:hyperlink w:anchor="app:proofs">
-        <w:r>
-          <w:rPr>
-            <w:rStyle w:val="Hyperlink"/>
-          </w:rPr>
-          <w:t xml:space="preserve">10</w:t>
-        </w:r>
-      </w:hyperlink>
-      <w:r>
-        <w:t xml:space="preserve">.</w:t>
-      </w:r>
-    </w:p>
     <w:bookmarkStart w:id="34" w:name="cor:c1"/>
     <w:p>
       <w:pPr>
@@ -11380,25 +11361,6 @@
         <w:pStyle w:val="FirstParagraph"/>
       </w:pPr>
       <w:r>
-        <w:t xml:space="preserve">The proof is deferred to Appendix </w:t>
-      </w:r>
-      <w:hyperlink w:anchor="app:proofs">
-        <w:r>
-          <w:rPr>
-            <w:rStyle w:val="Hyperlink"/>
-          </w:rPr>
-          <w:t xml:space="preserve">10</w:t>
-        </w:r>
-      </w:hyperlink>
-      <w:r>
-        <w:t xml:space="preserve">.</w:t>
-      </w:r>
-    </w:p>
-    <w:p>
-      <w:pPr>
-        <w:pStyle w:val="BodyText"/>
-      </w:pPr>
-      <w:r>
         <w:t xml:space="preserve">Lemma </w:t>
       </w:r>
       <w:hyperlink w:anchor="lem:noref">
@@ -14860,25 +14822,6 @@
         <w:pStyle w:val="BodyText"/>
       </w:pPr>
       <w:r>
-        <w:t xml:space="preserve">The proof is deferred to Appendix </w:t>
-      </w:r>
-      <w:hyperlink w:anchor="app:proofs">
-        <w:r>
-          <w:rPr>
-            <w:rStyle w:val="Hyperlink"/>
-          </w:rPr>
-          <w:t xml:space="preserve">10</w:t>
-        </w:r>
-      </w:hyperlink>
-      <w:r>
-        <w:t xml:space="preserve">.</w:t>
-      </w:r>
-    </w:p>
-    <w:p>
-      <w:pPr>
-        <w:pStyle w:val="BodyText"/>
-      </w:pPr>
-      <w:r>
         <w:t xml:space="preserve">Lemma </w:t>
       </w:r>
       <w:hyperlink w:anchor="lem:bridge">
@@ -17427,25 +17370,6 @@
       </w:r>
     </w:p>
     <w:bookmarkEnd w:id="46"/>
-    <w:p>
-      <w:pPr>
-        <w:pStyle w:val="BodyText"/>
-      </w:pPr>
-      <w:r>
-        <w:t xml:space="preserve">The proof is deferred to Appendix </w:t>
-      </w:r>
-      <w:hyperlink w:anchor="app:proofs">
-        <w:r>
-          <w:rPr>
-            <w:rStyle w:val="Hyperlink"/>
-          </w:rPr>
-          <w:t xml:space="preserve">10</w:t>
-        </w:r>
-      </w:hyperlink>
-      <w:r>
-        <w:t xml:space="preserve">.</w:t>
-      </w:r>
-    </w:p>
     <w:bookmarkStart w:id="47" w:name="rem:vinfo-scope"/>
     <w:p>
       <w:pPr>
@@ -22841,7 +22765,25 @@
         <w:pStyle w:val="FirstParagraph"/>
       </w:pPr>
       <w:r>
-        <w:t xml:space="preserve">The proof is deferred to Appendix </w:t>
+        <w:t xml:space="preserve">A naive single-sample DKW bound under-covers this supremum, because the object is a maximum of</w:t>
+      </w:r>
+      <w:r>
+        <w:t xml:space="preserve"> </w:t>
+      </w:r>
+      <w:r>
+        <w:t xml:space="preserve">differences of binomial means across distinct cells and the certificate selects the argmax-gap</w:t>
+      </w:r>
+      <w:r>
+        <w:t xml:space="preserve"> </w:t>
+      </w:r>
+      <w:r>
+        <w:t xml:space="preserve">cell, so the multiplicity must be paid explicitly rather than absorbed into a single-sample</w:t>
+      </w:r>
+      <w:r>
+        <w:t xml:space="preserve"> </w:t>
+      </w:r>
+      <w:r>
+        <w:t xml:space="preserve">envelope (Appendix </w:t>
       </w:r>
       <w:hyperlink w:anchor="app:proofs">
         <w:r>
@@ -22852,34 +22794,13 @@
         </w:r>
       </w:hyperlink>
       <w:r>
-        <w:t xml:space="preserve">.</w:t>
-      </w:r>
-    </w:p>
-    <w:p>
-      <w:pPr>
-        <w:pStyle w:val="BodyText"/>
-      </w:pPr>
-      <w:r>
-        <w:t xml:space="preserve">A naive single-sample DKW bound under-covers this supremum because the object is a maximum of differences of binomial means across distinct cells and the certificate selects the argmax-gap cell; the multiplicity must be paid explicitly (Appendix </w:t>
-      </w:r>
-      <w:hyperlink w:anchor="app:proofs">
-        <w:r>
-          <w:rPr>
-            <w:rStyle w:val="Hyperlink"/>
-          </w:rPr>
-          <w:t xml:space="preserve">10</w:t>
-        </w:r>
-      </w:hyperlink>
-      <w:r>
-        <w:t xml:space="preserve">).</w:t>
-      </w:r>
-    </w:p>
-    <w:p>
-      <w:pPr>
-        <w:pStyle w:val="BodyText"/>
-      </w:pPr>
-      <w:r>
-        <w:t xml:space="preserve">The construction aligns with recent statistical guidance for black-box LLM evaluation (Appendix </w:t>
+        <w:t xml:space="preserve">); the resulting construction aligns with recent statistical</w:t>
+      </w:r>
+      <w:r>
+        <w:t xml:space="preserve"> </w:t>
+      </w:r>
+      <w:r>
+        <w:t xml:space="preserve">guidance for black-box LLM evaluation (Appendix </w:t>
       </w:r>
       <w:hyperlink w:anchor="app:proofs">
         <w:r>
@@ -25022,29 +24943,10 @@
       </w:r>
     </w:p>
     <w:bookmarkEnd w:id="57"/>
+    <w:bookmarkStart w:id="58" w:name="rem:leaky"/>
     <w:p>
       <w:pPr>
         <w:pStyle w:val="FirstParagraph"/>
-      </w:pPr>
-      <w:r>
-        <w:t xml:space="preserve">The proof is deferred to Appendix </w:t>
-      </w:r>
-      <w:hyperlink w:anchor="app:proofs">
-        <w:r>
-          <w:rPr>
-            <w:rStyle w:val="Hyperlink"/>
-          </w:rPr>
-          <w:t xml:space="preserve">10</w:t>
-        </w:r>
-      </w:hyperlink>
-      <w:r>
-        <w:t xml:space="preserve">.</w:t>
-      </w:r>
-    </w:p>
-    <w:bookmarkStart w:id="58" w:name="rem:leaky"/>
-    <w:p>
-      <w:pPr>
-        <w:pStyle w:val="BodyText"/>
       </w:pPr>
       <w:r>
         <w:rPr>
@@ -26499,25 +26401,6 @@
       </w:r>
     </w:p>
     <w:bookmarkEnd w:id="60"/>
-    <w:p>
-      <w:pPr>
-        <w:pStyle w:val="BodyText"/>
-      </w:pPr>
-      <w:r>
-        <w:t xml:space="preserve">The proof is deferred to Appendix </w:t>
-      </w:r>
-      <w:hyperlink w:anchor="app:proofs">
-        <w:r>
-          <w:rPr>
-            <w:rStyle w:val="Hyperlink"/>
-          </w:rPr>
-          <w:t xml:space="preserve">10</w:t>
-        </w:r>
-      </w:hyperlink>
-      <w:r>
-        <w:t xml:space="preserve">.</w:t>
-      </w:r>
-    </w:p>
     <w:p>
       <w:pPr>
         <w:pStyle w:val="BodyText"/>

</xml_diff>

<commit_message>
Add connective tissue: one bridging sentence opening sections 3-8, each tying back to the prior section's result and motivating what comes next
Co-Authored-By: Claude Fable 5 <noreply@anthropic.com>
</commit_message>
<xml_diff>
--- a/paper/blackwell-paper.docx
+++ b/paper/blackwell-paper.docx
@@ -5871,7 +5871,27 @@
         <w:pStyle w:val="FirstParagraph"/>
       </w:pPr>
       <w:r>
-        <w:t xml:space="preserve">We model the choice of</w:t>
+        <w:t xml:space="preserve">§</w:t>
+      </w:r>
+      <w:hyperlink w:anchor="sec:related">
+        <w:r>
+          <w:rPr>
+            <w:rStyle w:val="Hyperlink"/>
+          </w:rPr>
+          <w:t xml:space="preserve">2</w:t>
+        </w:r>
+      </w:hyperlink>
+      <w:r>
+        <w:t xml:space="preserve"> </w:t>
+      </w:r>
+      <w:r>
+        <w:t xml:space="preserve">placed the contribution against prior work; the next four sections make it</w:t>
+      </w:r>
+      <w:r>
+        <w:t xml:space="preserve"> </w:t>
+      </w:r>
+      <w:r>
+        <w:t xml:space="preserve">precise, beginning here with the objects. We model the choice of</w:t>
       </w:r>
       <w:r>
         <w:t xml:space="preserve"> </w:t>
@@ -5887,7 +5907,13 @@
         <w:t xml:space="preserve"> </w:t>
       </w:r>
       <w:r>
-        <w:t xml:space="preserve">a language model as a comparison of</w:t>
+        <w:t xml:space="preserve">a</w:t>
+      </w:r>
+      <w:r>
+        <w:t xml:space="preserve"> </w:t>
+      </w:r>
+      <w:r>
+        <w:t xml:space="preserve">language model as a comparison of</w:t>
       </w:r>
       <w:r>
         <w:t xml:space="preserve"> </w:t>
@@ -9271,6 +9297,49 @@
         <w:t xml:space="preserve">The Blackwell order over context sources</w:t>
       </w:r>
     </w:p>
+    <w:p>
+      <w:pPr>
+        <w:pStyle w:val="FirstParagraph"/>
+      </w:pPr>
+      <w:r>
+        <w:t xml:space="preserve">With sources modeled as experiments (§</w:t>
+      </w:r>
+      <w:hyperlink w:anchor="sec:formalization">
+        <w:r>
+          <w:rPr>
+            <w:rStyle w:val="Hyperlink"/>
+          </w:rPr>
+          <w:t xml:space="preserve">3</w:t>
+        </w:r>
+      </w:hyperlink>
+      <w:r>
+        <w:t xml:space="preserve">), the classical comparison of</w:t>
+      </w:r>
+      <w:r>
+        <w:t xml:space="preserve"> </w:t>
+      </w:r>
+      <w:r>
+        <w:t xml:space="preserve">experiments applies to them directly. We state the order, record that it is genuinely partial</w:t>
+      </w:r>
+      <w:r>
+        <w:t xml:space="preserve"> </w:t>
+      </w:r>
+      <w:r>
+        <w:t xml:space="preserve">(the regime our experiments target), and, because those experiments measure a fixed model rather</w:t>
+      </w:r>
+      <w:r>
+        <w:t xml:space="preserve"> </w:t>
+      </w:r>
+      <w:r>
+        <w:t xml:space="preserve">than the idealized decision-maker the classical theorem assumes, build an explicit bridge between</w:t>
+      </w:r>
+      <w:r>
+        <w:t xml:space="preserve"> </w:t>
+      </w:r>
+      <w:r>
+        <w:t xml:space="preserve">its two registers.</w:t>
+      </w:r>
+    </w:p>
     <w:bookmarkStart w:id="36" w:name="the-order-and-its-two-registers"/>
     <w:p>
       <w:pPr>
@@ -15131,7 +15200,27 @@
         <w:pStyle w:val="FirstParagraph"/>
       </w:pPr>
       <w:r>
-        <w:t xml:space="preserve">We now establish that no scalar can rank Blackwell-incomparable sources. We</w:t>
+        <w:t xml:space="preserve">§</w:t>
+      </w:r>
+      <w:hyperlink w:anchor="sec:order">
+        <w:r>
+          <w:rPr>
+            <w:rStyle w:val="Hyperlink"/>
+          </w:rPr>
+          <w:t xml:space="preserve">4</w:t>
+        </w:r>
+      </w:hyperlink>
+      <w:r>
+        <w:t xml:space="preserve"> </w:t>
+      </w:r>
+      <w:r>
+        <w:t xml:space="preserve">showed the order is genuinely partial; we now establish the consequence that</w:t>
+      </w:r>
+      <w:r>
+        <w:t xml:space="preserve"> </w:t>
+      </w:r>
+      <w:r>
+        <w:t xml:space="preserve">motivates the whole paper: no scalar can rank a Blackwell-incomparable pair. We</w:t>
       </w:r>
       <w:r>
         <w:t xml:space="preserve"> </w:t>
@@ -18931,6 +19020,46 @@
       </w:pPr>
       <w:r>
         <w:t xml:space="preserve">The decision-restricted deficiency surrogate and its uniform certificate</w:t>
+      </w:r>
+    </w:p>
+    <w:p>
+      <w:pPr>
+        <w:pStyle w:val="FirstParagraph"/>
+      </w:pPr>
+      <w:r>
+        <w:t xml:space="preserve">The impossibility of §</w:t>
+      </w:r>
+      <w:hyperlink w:anchor="sec:incomparability">
+        <w:r>
+          <w:rPr>
+            <w:rStyle w:val="Hyperlink"/>
+          </w:rPr>
+          <w:t xml:space="preserve">5</w:t>
+        </w:r>
+      </w:hyperlink>
+      <w:r>
+        <w:t xml:space="preserve"> </w:t>
+      </w:r>
+      <w:r>
+        <w:t xml:space="preserve">concerns the idealized user of a source; every</w:t>
+      </w:r>
+      <w:r>
+        <w:t xml:space="preserve"> </w:t>
+      </w:r>
+      <w:r>
+        <w:t xml:space="preserve">quantity we report, by contrast, comes from a single fixed model. This section builds the</w:t>
+      </w:r>
+      <w:r>
+        <w:t xml:space="preserve"> </w:t>
+      </w:r>
+      <w:r>
+        <w:t xml:space="preserve">instrument that connects the two: a surrogate that measures the order on the fixed rule, and a</w:t>
+      </w:r>
+      <w:r>
+        <w:t xml:space="preserve"> </w:t>
+      </w:r>
+      <w:r>
+        <w:t xml:space="preserve">distribution-free certificate that makes each comparison auditable on a live model.</w:t>
       </w:r>
     </w:p>
     <w:bookmarkStart w:id="53" w:name="subsec:estimator-name"/>
@@ -26797,7 +26926,7 @@
         <w:pStyle w:val="FirstParagraph"/>
       </w:pPr>
       <w:r>
-        <w:t xml:space="preserve">We instantiate the theory of §§</w:t>
+        <w:t xml:space="preserve">With the order (§</w:t>
       </w:r>
       <w:hyperlink w:anchor="sec:order">
         <w:r>
@@ -26808,7 +26937,24 @@
         </w:r>
       </w:hyperlink>
       <w:r>
-        <w:t xml:space="preserve">–</w:t>
+        <w:t xml:space="preserve">), its impossibility consequence (§</w:t>
+      </w:r>
+      <w:hyperlink w:anchor="sec:incomparability">
+        <w:r>
+          <w:rPr>
+            <w:rStyle w:val="Hyperlink"/>
+          </w:rPr>
+          <w:t xml:space="preserve">5</w:t>
+        </w:r>
+      </w:hyperlink>
+      <w:r>
+        <w:t xml:space="preserve">),</w:t>
+      </w:r>
+      <w:r>
+        <w:t xml:space="preserve"> </w:t>
+      </w:r>
+      <w:r>
+        <w:t xml:space="preserve">and the certificate that measures it (§</w:t>
       </w:r>
       <w:hyperlink w:anchor="sec:estimator">
         <w:r>
@@ -26819,16 +26965,13 @@
         </w:r>
       </w:hyperlink>
       <w:r>
-        <w:t xml:space="preserve"> </w:t>
-      </w:r>
-      <w:r>
-        <w:t xml:space="preserve">on real language models. The</w:t>
-      </w:r>
-      <w:r>
-        <w:t xml:space="preserve"> </w:t>
-      </w:r>
-      <w:r>
-        <w:t xml:space="preserve">design has three commitments. First, every reported number is an empirical PASS rate from live model</w:t>
+        <w:t xml:space="preserve">) in hand, we now instantiate the</w:t>
+      </w:r>
+      <w:r>
+        <w:t xml:space="preserve"> </w:t>
+      </w:r>
+      <w:r>
+        <w:t xml:space="preserve">theory on real language models. The design has three commitments. First, every reported number is an empirical PASS rate from live model</w:t>
       </w:r>
       <w:r>
         <w:t xml:space="preserve"> </w:t>
@@ -42897,7 +43040,13 @@
         <w:pStyle w:val="FirstParagraph"/>
       </w:pPr>
       <w:r>
-        <w:t xml:space="preserve">Our results recast a piece of practitioner folklore,</w:t>
+        <w:t xml:space="preserve">With the evidence in hand, we step back to what it licenses. Our results recast a piece of</w:t>
+      </w:r>
+      <w:r>
+        <w:t xml:space="preserve"> </w:t>
+      </w:r>
+      <w:r>
+        <w:t xml:space="preserve">practitioner folklore,</w:t>
       </w:r>
       <w:r>
         <w:t xml:space="preserve"> </w:t>

</xml_diff>

<commit_message>
Add plain-language on-ramp: concrete example-first opening paragraph before any formalism
</commit_message>
<xml_diff>
--- a/paper/blackwell-paper.docx
+++ b/paper/blackwell-paper.docx
@@ -390,6 +390,210 @@
     <w:p>
       <w:pPr>
         <w:pStyle w:val="FirstParagraph"/>
+      </w:pPr>
+      <w:r>
+        <w:t xml:space="preserve">Suppose a coding assistant is handed one of two short notes about a software module. The first</w:t>
+      </w:r>
+      <w:r>
+        <w:t xml:space="preserve"> </w:t>
+      </w:r>
+      <w:r>
+        <w:t xml:space="preserve">note says how to</w:t>
+      </w:r>
+      <w:r>
+        <w:t xml:space="preserve"> </w:t>
+      </w:r>
+      <w:r>
+        <w:rPr>
+          <w:i/>
+          <w:iCs/>
+        </w:rPr>
+        <w:t xml:space="preserve">call</w:t>
+      </w:r>
+      <w:r>
+        <w:t xml:space="preserve"> </w:t>
+      </w:r>
+      <w:r>
+        <w:t xml:space="preserve">its main function: the order of the arguments, a keyword that is</w:t>
+      </w:r>
+      <w:r>
+        <w:t xml:space="preserve"> </w:t>
+      </w:r>
+      <w:r>
+        <w:t xml:space="preserve">mandatory, and the error it raises on failure. The second note says how the module</w:t>
+      </w:r>
+      <w:r>
+        <w:t xml:space="preserve"> </w:t>
+      </w:r>
+      <w:r>
+        <w:rPr>
+          <w:i/>
+          <w:iCs/>
+        </w:rPr>
+        <w:t xml:space="preserve">encodes</w:t>
+      </w:r>
+      <w:r>
+        <w:t xml:space="preserve"> </w:t>
+      </w:r>
+      <w:r>
+        <w:t xml:space="preserve">numbers: a digit format ending in a checksum. For a task that calls the function the first note is</w:t>
+      </w:r>
+      <w:r>
+        <w:t xml:space="preserve"> </w:t>
+      </w:r>
+      <w:r>
+        <w:t xml:space="preserve">decisive and the second is useless; for a task that encodes a number it is the reverse; and</w:t>
+      </w:r>
+      <w:r>
+        <w:t xml:space="preserve"> </w:t>
+      </w:r>
+      <w:r>
+        <w:t xml:space="preserve">neither note can be reconstructed from the other. This everyday situation is the entire paper in</w:t>
+      </w:r>
+      <w:r>
+        <w:t xml:space="preserve"> </w:t>
+      </w:r>
+      <w:r>
+        <w:t xml:space="preserve">miniature. It has a precise name, the two notes are</w:t>
+      </w:r>
+      <w:r>
+        <w:t xml:space="preserve"> </w:t>
+      </w:r>
+      <w:r>
+        <w:rPr>
+          <w:i/>
+          <w:iCs/>
+        </w:rPr>
+        <w:t xml:space="preserve">incomparable</w:t>
+      </w:r>
+      <w:r>
+        <w:t xml:space="preserve"> </w:t>
+      </w:r>
+      <w:r>
+        <w:t xml:space="preserve">in the sense of Blackwell’s</w:t>
+      </w:r>
+      <w:r>
+        <w:t xml:space="preserve"> </w:t>
+      </w:r>
+      <w:r>
+        <w:t xml:space="preserve">comparison of experiments </w:t>
+      </w:r>
+      <w:r>
+        <w:t xml:space="preserve">(</w:t>
+      </w:r>
+      <w:hyperlink w:anchor="ref-blackwell1953">
+        <w:r>
+          <w:rPr>
+            <w:rStyle w:val="Hyperlink"/>
+          </w:rPr>
+          <w:t xml:space="preserve">Blackwell 1953</w:t>
+        </w:r>
+      </w:hyperlink>
+      <w:r>
+        <w:t xml:space="preserve">)</w:t>
+      </w:r>
+      <w:r>
+        <w:t xml:space="preserve">, and a precise consequence: no single relevance</w:t>
+      </w:r>
+      <w:r>
+        <w:t xml:space="preserve"> </w:t>
+      </w:r>
+      <w:r>
+        <w:t xml:space="preserve">score can rank the two notes so that the ranking is right for every task, because a score must crown</w:t>
+      </w:r>
+      <w:r>
+        <w:t xml:space="preserve"> </w:t>
+      </w:r>
+      <w:r>
+        <w:t xml:space="preserve">one winner and here neither note wins outright. The body makes this exact, gives a statistical test</w:t>
+      </w:r>
+      <w:r>
+        <w:t xml:space="preserve"> </w:t>
+      </w:r>
+      <w:r>
+        <w:t xml:space="preserve">that</w:t>
+      </w:r>
+      <w:r>
+        <w:t xml:space="preserve"> </w:t>
+      </w:r>
+      <w:r>
+        <w:rPr>
+          <w:i/>
+          <w:iCs/>
+        </w:rPr>
+        <w:t xml:space="preserve">certifies</w:t>
+      </w:r>
+      <w:r>
+        <w:t xml:space="preserve"> </w:t>
+      </w:r>
+      <w:r>
+        <w:t xml:space="preserve">it from ordinary pass/fail runs on a live model, and finds that six production</w:t>
+      </w:r>
+      <w:r>
+        <w:t xml:space="preserve"> </w:t>
+      </w:r>
+      <w:r>
+        <w:t xml:space="preserve">language models across four vendors all exhibit it. A reader who keeps these two notes in mind can</w:t>
+      </w:r>
+      <w:r>
+        <w:t xml:space="preserve"> </w:t>
+      </w:r>
+      <w:r>
+        <w:t xml:space="preserve">read every symbol below as a statement about the first note versus the second (in the body they are</w:t>
+      </w:r>
+      <w:r>
+        <w:t xml:space="preserve"> </w:t>
+      </w:r>
+      <w:r>
+        <w:t xml:space="preserve">the sources</w:t>
+      </w:r>
+      <w:r>
+        <w:t xml:space="preserve"> </w:t>
+      </w:r>
+      <m:oMath>
+        <m:sSub>
+          <m:e>
+            <m:r>
+              <m:t>W</m:t>
+            </m:r>
+          </m:e>
+          <m:sub>
+            <m:r>
+              <m:t>1</m:t>
+            </m:r>
+          </m:sub>
+        </m:sSub>
+      </m:oMath>
+      <w:r>
+        <w:t xml:space="preserve"> </w:t>
+      </w:r>
+      <w:r>
+        <w:t xml:space="preserve">and</w:t>
+      </w:r>
+      <w:r>
+        <w:t xml:space="preserve"> </w:t>
+      </w:r>
+      <m:oMath>
+        <m:sSub>
+          <m:e>
+            <m:r>
+              <m:t>W</m:t>
+            </m:r>
+          </m:e>
+          <m:sub>
+            <m:r>
+              <m:t>2</m:t>
+            </m:r>
+          </m:sub>
+        </m:sSub>
+      </m:oMath>
+      <w:r>
+        <w:t xml:space="preserve">).</w:t>
+      </w:r>
+    </w:p>
+    <w:p>
+      <w:pPr>
+        <w:pStyle w:val="BodyText"/>
       </w:pPr>
       <w:r>
         <w:t xml:space="preserve">Production language-model systems spend much of their budget deciding</w:t>

</xml_diff>

<commit_message>
Plain-language pass: rewrite explanatory prose across abstract, intro, related work, experiments, discussion, conclusion in a simpler register; all theorems, proofs, numbers, and terms unchanged
</commit_message>
<xml_diff>
--- a/paper/blackwell-paper.docx
+++ b/paper/blackwell-paper.docx
@@ -90,65 +90,44 @@
         <w:pStyle w:val="Abstract"/>
       </w:pPr>
       <w:r>
-        <w:t xml:space="preserve">Context selection for language models is almost universally posed as a</w:t>
-      </w:r>
-      <w:r>
-        <w:t xml:space="preserve"> </w:t>
-      </w:r>
-      <w:r>
-        <w:rPr>
-          <w:i/>
-          <w:iCs/>
-        </w:rPr>
-        <w:t xml:space="preserve">scalar</w:t>
-      </w:r>
-      <w:r>
-        <w:t xml:space="preserve"> </w:t>
-      </w:r>
-      <w:r>
-        <w:t xml:space="preserve">ranking problem: score each candidate source, take the top-</w:t>
-      </w:r>
-      <m:oMath>
-        <m:r>
-          <m:t>k</m:t>
-        </m:r>
-      </m:oMath>
-      <w:r>
-        <w:t xml:space="preserve">.</w:t>
-      </w:r>
-      <w:r>
-        <w:t xml:space="preserve"> </w:t>
-      </w:r>
-      <w:r>
-        <w:t xml:space="preserve">We argue this collapses a partial order. Modeling each context source as a</w:t>
-      </w:r>
-      <w:r>
-        <w:t xml:space="preserve"> </w:t>
-      </w:r>
-      <w:r>
-        <w:t xml:space="preserve">statistical</w:t>
-      </w:r>
-      <w:r>
-        <w:t xml:space="preserve"> </w:t>
-      </w:r>
-      <w:r>
-        <w:rPr>
-          <w:i/>
-          <w:iCs/>
-        </w:rPr>
-        <w:t xml:space="preserve">experiment</w:t>
-      </w:r>
-      <w:r>
-        <w:t xml:space="preserve"> </w:t>
-      </w:r>
-      <w:r>
-        <w:t xml:space="preserve">on the task’s latent requirement, we transport</w:t>
-      </w:r>
-      <w:r>
-        <w:t xml:space="preserve"> </w:t>
-      </w:r>
-      <w:r>
-        <w:t xml:space="preserve">Blackwell’s comparison of experiments </w:t>
+        <w:t xml:space="preserve">Choosing what to put in a language model’s prompt is almost always done by</w:t>
+      </w:r>
+      <w:r>
+        <w:t xml:space="preserve"> </w:t>
+      </w:r>
+      <w:r>
+        <w:t xml:space="preserve">scoring each candidate source with a single number and keeping the top few. We</w:t>
+      </w:r>
+      <w:r>
+        <w:t xml:space="preserve"> </w:t>
+      </w:r>
+      <w:r>
+        <w:t xml:space="preserve">argue this is the wrong tool. The best context for one task is often useless</w:t>
+      </w:r>
+      <w:r>
+        <w:t xml:space="preserve"> </w:t>
+      </w:r>
+      <w:r>
+        <w:t xml:space="preserve">for another. Two sources can be</w:t>
+      </w:r>
+      <w:r>
+        <w:t xml:space="preserve"> </w:t>
+      </w:r>
+      <w:r>
+        <w:rPr>
+          <w:i/>
+          <w:iCs/>
+        </w:rPr>
+        <w:t xml:space="preserve">incomparable</w:t>
+      </w:r>
+      <w:r>
+        <w:t xml:space="preserve">, in the exact sense of</w:t>
+      </w:r>
+      <w:r>
+        <w:t xml:space="preserve"> </w:t>
+      </w:r>
+      <w:r>
+        <w:t xml:space="preserve">Blackwell’s 1953 comparison of experiments </w:t>
       </w:r>
       <w:r>
         <w:t xml:space="preserve">(</w:t>
@@ -165,62 +144,31 @@
         <w:t xml:space="preserve">)</w:t>
       </w:r>
       <w:r>
-        <w:t xml:space="preserve"> </w:t>
-      </w:r>
-      <w:r>
-        <w:t xml:space="preserve">to context</w:t>
-      </w:r>
-      <w:r>
-        <w:t xml:space="preserve"> </w:t>
-      </w:r>
-      <w:r>
-        <w:t xml:space="preserve">selection: when two sources are Blackwell-incomparable, no query-independent</w:t>
-      </w:r>
-      <w:r>
-        <w:t xml:space="preserve"> </w:t>
-      </w:r>
-      <w:r>
-        <w:t xml:space="preserve">scalar can rank them correctly across all tasks, a formal account of the</w:t>
-      </w:r>
-      <w:r>
-        <w:t xml:space="preserve"> </w:t>
-      </w:r>
-      <w:r>
-        <w:t xml:space="preserve">field’s</w:t>
-      </w:r>
-      <w:r>
-        <w:t xml:space="preserve"> </w:t>
-      </w:r>
-      <w:r>
-        <w:t xml:space="preserve">“relevance-does-not-transfer”</w:t>
-      </w:r>
-      <w:r>
-        <w:t xml:space="preserve"> </w:t>
-      </w:r>
-      <w:r>
-        <w:t xml:space="preserve">folklore. To make the order measurable</w:t>
-      </w:r>
-      <w:r>
-        <w:t xml:space="preserve"> </w:t>
-      </w:r>
-      <w:r>
-        <w:t xml:space="preserve">on real models behind executable verifiers, we define a decision-restricted value-deficiency</w:t>
-      </w:r>
-      <w:r>
-        <w:t xml:space="preserve"> </w:t>
-      </w:r>
-      <w:r>
-        <w:rPr>
-          <w:i/>
-          <w:iCs/>
-        </w:rPr>
-        <w:t xml:space="preserve">surrogate</w:t>
-      </w:r>
-      <w:r>
-        <w:t xml:space="preserve"> </w:t>
-      </w:r>
-      <w:r>
-        <w:t xml:space="preserve">and equip it with a distribution-free finite-sample</w:t>
+        <w:t xml:space="preserve">, and when they</w:t>
+      </w:r>
+      <w:r>
+        <w:t xml:space="preserve"> </w:t>
+      </w:r>
+      <w:r>
+        <w:t xml:space="preserve">are, no single relevance score can rank them correctly for every task. To test</w:t>
+      </w:r>
+      <w:r>
+        <w:t xml:space="preserve"> </w:t>
+      </w:r>
+      <w:r>
+        <w:t xml:space="preserve">this on real systems we use a simple check: run each source through a battery of</w:t>
+      </w:r>
+      <w:r>
+        <w:t xml:space="preserve"> </w:t>
+      </w:r>
+      <w:r>
+        <w:t xml:space="preserve">pass/fail tasks, compare the pass rates, and attach confidence intervals so the</w:t>
+      </w:r>
+      <w:r>
+        <w:t xml:space="preserve"> </w:t>
+      </w:r>
+      <w:r>
+        <w:t xml:space="preserve">comparison is auditable (a distribution-free</w:t>
       </w:r>
       <w:r>
         <w:t xml:space="preserve"> </w:t>
@@ -233,13 +181,13 @@
         <w:t xml:space="preserve">certificate</w:t>
       </w:r>
       <w:r>
-        <w:t xml:space="preserve">. On six language models across four vendors we certify</w:t>
-      </w:r>
-      <w:r>
-        <w:t xml:space="preserve"> </w:t>
-      </w:r>
-      <w:r>
-        <w:t xml:space="preserve">(</w:t>
+        <w:t xml:space="preserve">). On six</w:t>
+      </w:r>
+      <w:r>
+        <w:t xml:space="preserve"> </w:t>
+      </w:r>
+      <w:r>
+        <w:t xml:space="preserve">language models from four vendors we confirm (</w:t>
       </w:r>
       <m:oMath>
         <m:r>
@@ -262,47 +210,56 @@
         <w:t xml:space="preserve"> </w:t>
       </w:r>
       <w:r>
-        <w:t xml:space="preserve">confidence, both directions) that two private context sources are</w:t>
-      </w:r>
-      <w:r>
-        <w:t xml:space="preserve"> </w:t>
-      </w:r>
-      <w:r>
-        <w:t xml:space="preserve">empirically incomparable. Representative lexical, dense bi-encoder, and</w:t>
-      </w:r>
-      <w:r>
-        <w:t xml:space="preserve"> </w:t>
-      </w:r>
-      <w:r>
-        <w:t xml:space="preserve">cross-encoder rankers all prefer the wrong source on a confound-controlled</w:t>
-      </w:r>
-      <w:r>
-        <w:t xml:space="preserve"> </w:t>
-      </w:r>
-      <w:r>
-        <w:t xml:space="preserve">trap, while an LLM listwise reranker that reads the decisive content escapes,</w:t>
-      </w:r>
-      <w:r>
-        <w:t xml:space="preserve"> </w:t>
-      </w:r>
-      <w:r>
-        <w:t xml:space="preserve">the topicality boundary the theory predicts. We also show that supplying a strict</w:t>
-      </w:r>
-      <w:r>
-        <w:t xml:space="preserve"> </w:t>
-      </w:r>
-      <w:r>
-        <w:rPr>
-          <w:i/>
-          <w:iCs/>
-        </w:rPr>
-        <w:t xml:space="preserve">superset</w:t>
-      </w:r>
-      <w:r>
-        <w:t xml:space="preserve"> </w:t>
-      </w:r>
-      <w:r>
-        <w:t xml:space="preserve">of a sufficient source collapses certified pass rates from</w:t>
+        <w:t xml:space="preserve">confidence, both</w:t>
+      </w:r>
+      <w:r>
+        <w:t xml:space="preserve"> </w:t>
+      </w:r>
+      <w:r>
+        <w:t xml:space="preserve">directions) that two hand-built sources are incomparable. On a designed trap</w:t>
+      </w:r>
+      <w:r>
+        <w:t xml:space="preserve"> </w:t>
+      </w:r>
+      <w:r>
+        <w:t xml:space="preserve">task a lexical score, two dense</w:t>
+      </w:r>
+      <w:r>
+        <w:t xml:space="preserve"> </w:t>
+      </w:r>
+      <w:r>
+        <w:t xml:space="preserve">retrievers, and a cross-encoder reranker all prefer the wrong source; only a</w:t>
+      </w:r>
+      <w:r>
+        <w:t xml:space="preserve"> </w:t>
+      </w:r>
+      <w:r>
+        <w:t xml:space="preserve">listwise LLM reranker, which reads the deciding detail, gets it right, exactly</w:t>
+      </w:r>
+      <w:r>
+        <w:t xml:space="preserve"> </w:t>
+      </w:r>
+      <w:r>
+        <w:t xml:space="preserve">the boundary the theory predicts. We also find that adding a strictly larger</w:t>
+      </w:r>
+      <w:r>
+        <w:t xml:space="preserve"> </w:t>
+      </w:r>
+      <w:r>
+        <w:t xml:space="preserve">source can</w:t>
+      </w:r>
+      <w:r>
+        <w:t xml:space="preserve"> </w:t>
+      </w:r>
+      <w:r>
+        <w:rPr>
+          <w:i/>
+          <w:iCs/>
+        </w:rPr>
+        <w:t xml:space="preserve">hurt</w:t>
+      </w:r>
+      <w:r>
+        <w:t xml:space="preserve">: pass rates fall from</w:t>
       </w:r>
       <w:r>
         <w:t xml:space="preserve"> </w:t>
@@ -339,43 +296,37 @@
         </m:r>
       </m:oMath>
       <w:r>
-        <w:t xml:space="preserve">, with order, length-padding, and</w:t>
-      </w:r>
-      <w:r>
-        <w:t xml:space="preserve"> </w:t>
-      </w:r>
-      <w:r>
-        <w:t xml:space="preserve">routing-instruction controls attributing the harm to the added signal, not</w:t>
-      </w:r>
-      <w:r>
-        <w:t xml:space="preserve"> </w:t>
-      </w:r>
-      <w:r>
-        <w:t xml:space="preserve">position or length. The conclusion is methodological: context</w:t>
-      </w:r>
-      <w:r>
-        <w:t xml:space="preserve"> </w:t>
-      </w:r>
-      <w:r>
-        <w:t xml:space="preserve">selection is a partial-order problem, and the right operational object is a</w:t>
-      </w:r>
-      <w:r>
-        <w:t xml:space="preserve"> </w:t>
-      </w:r>
-      <w:r>
-        <w:t xml:space="preserve">certified deficiency surrogate, not a scalar. The constructive selection rule</w:t>
-      </w:r>
-      <w:r>
-        <w:t xml:space="preserve"> </w:t>
-      </w:r>
-      <w:r>
-        <w:t xml:space="preserve">this implies is developed in a companion paper; scaling certified selection to</w:t>
-      </w:r>
-      <w:r>
-        <w:t xml:space="preserve"> </w:t>
-      </w:r>
-      <w:r>
-        <w:t xml:space="preserve">corpus retrieval is the central problem we leave open.</w:t>
+        <w:t xml:space="preserve">, and</w:t>
+      </w:r>
+      <w:r>
+        <w:t xml:space="preserve"> </w:t>
+      </w:r>
+      <w:r>
+        <w:t xml:space="preserve">controls rule out word order and length as the cause. The lesson is practical:</w:t>
+      </w:r>
+      <w:r>
+        <w:t xml:space="preserve"> </w:t>
+      </w:r>
+      <w:r>
+        <w:t xml:space="preserve">treat context selection as a partial-order problem, not a scalar ranking, and</w:t>
+      </w:r>
+      <w:r>
+        <w:t xml:space="preserve"> </w:t>
+      </w:r>
+      <w:r>
+        <w:t xml:space="preserve">compare sources by a certified pass-rate test rather than a relevance number. A</w:t>
+      </w:r>
+      <w:r>
+        <w:t xml:space="preserve"> </w:t>
+      </w:r>
+      <w:r>
+        <w:t xml:space="preserve">companion paper gives the selection rule this implies; scaling it to large</w:t>
+      </w:r>
+      <w:r>
+        <w:t xml:space="preserve"> </w:t>
+      </w:r>
+      <w:r>
+        <w:t xml:space="preserve">corpora is the main open problem.</w:t>
       </w:r>
     </w:p>
     <w:bookmarkStart w:id="16" w:name="sec:intro"/>
@@ -719,34 +670,26 @@
         <w:pStyle w:val="FirstParagraph"/>
       </w:pPr>
       <w:r>
-        <w:t xml:space="preserve">A persistent, informal observation undercuts the scalar paradigm:</w:t>
-      </w:r>
-      <w:r>
-        <w:t xml:space="preserve"> </w:t>
-      </w:r>
-      <w:r>
-        <w:rPr>
-          <w:i/>
-          <w:iCs/>
-        </w:rPr>
-        <w:t xml:space="preserve">relevance</w:t>
-      </w:r>
-      <w:r>
-        <w:rPr>
-          <w:i/>
-          <w:iCs/>
-        </w:rPr>
-        <w:t xml:space="preserve"> </w:t>
-      </w:r>
-      <w:r>
-        <w:rPr>
-          <w:i/>
-          <w:iCs/>
-        </w:rPr>
-        <w:t xml:space="preserve">does not transfer across tasks</w:t>
-      </w:r>
-      <w:r>
-        <w:t xml:space="preserve">. A source that helps one task hurts another;</w:t>
+        <w:t xml:space="preserve">Practitioners already know the phenomenon:</w:t>
+      </w:r>
+      <w:r>
+        <w:t xml:space="preserve"> </w:t>
+      </w:r>
+      <w:r>
+        <w:rPr>
+          <w:i/>
+          <w:iCs/>
+        </w:rPr>
+        <w:t xml:space="preserve">relevance does not transfer across tasks</w:t>
+      </w:r>
+      <w:r>
+        <w:t xml:space="preserve">. A</w:t>
+      </w:r>
+      <w:r>
+        <w:t xml:space="preserve"> </w:t>
+      </w:r>
+      <w:r>
+        <w:t xml:space="preserve">source that helps one task hurts another, so</w:t>
       </w:r>
       <w:r>
         <w:t xml:space="preserve"> </w:t>
@@ -758,13 +701,13 @@
         <w:t xml:space="preserve"> </w:t>
       </w:r>
       <w:r>
-        <w:t xml:space="preserve">is task-dependent. This is usually treated as a modeling</w:t>
-      </w:r>
-      <w:r>
-        <w:t xml:space="preserve"> </w:t>
-      </w:r>
-      <w:r>
-        <w:t xml:space="preserve">nuisance to be engineered around with better rankers. We show it is the</w:t>
+        <w:t xml:space="preserve">depends on the task, and this is</w:t>
+      </w:r>
+      <w:r>
+        <w:t xml:space="preserve"> </w:t>
+      </w:r>
+      <w:r>
+        <w:t xml:space="preserve">usually treated as a nuisance to engineer away with better rankers. We show it is instead the</w:t>
       </w:r>
       <w:r>
         <w:t xml:space="preserve"> </w:t>
@@ -783,7 +726,7 @@
         <w:t xml:space="preserve">partial order</w:t>
       </w:r>
       <w:r>
-        <w:t xml:space="preserve">. We model a context source</w:t>
+        <w:t xml:space="preserve">. Model a context source</w:t>
       </w:r>
       <w:r>
         <w:t xml:space="preserve"> </w:t>
@@ -797,13 +740,13 @@
         <w:t xml:space="preserve"> </w:t>
       </w:r>
       <w:r>
-        <w:t xml:space="preserve">as a</w:t>
-      </w:r>
-      <w:r>
-        <w:t xml:space="preserve"> </w:t>
-      </w:r>
-      <w:r>
-        <w:t xml:space="preserve">statistical experiment on the task’s latent requirement</w:t>
+        <w:t xml:space="preserve">as a statistical experiment on what</w:t>
+      </w:r>
+      <w:r>
+        <w:t xml:space="preserve"> </w:t>
+      </w:r>
+      <w:r>
+        <w:t xml:space="preserve">the task actually needs,</w:t>
       </w:r>
       <w:r>
         <w:t xml:space="preserve"> </w:t>
@@ -817,13 +760,7 @@
         <w:t xml:space="preserve"> </w:t>
       </w:r>
       <w:r>
-        <w:t xml:space="preserve">(the object a</w:t>
-      </w:r>
-      <w:r>
-        <w:t xml:space="preserve"> </w:t>
-      </w:r>
-      <w:r>
-        <w:t xml:space="preserve">verifier checks; §</w:t>
+        <w:t xml:space="preserve">(the thing a verifier checks; §</w:t>
       </w:r>
       <w:hyperlink w:anchor="sec:formalization">
         <w:r>
@@ -834,13 +771,13 @@
         </w:r>
       </w:hyperlink>
       <w:r>
-        <w:t xml:space="preserve">), which lets us import two classical</w:t>
-      </w:r>
-      <w:r>
-        <w:t xml:space="preserve"> </w:t>
-      </w:r>
-      <w:r>
-        <w:t xml:space="preserve">tools. Blackwell’s order ranks experiments by garbling:</w:t>
+        <w:t xml:space="preserve">). Blackwell</w:t>
+      </w:r>
+      <w:r>
+        <w:t xml:space="preserve"> </w:t>
+      </w:r>
+      <w:r>
+        <w:t xml:space="preserve">compares two experiments by asking whether one is a blurred copy of the other: we write</w:t>
       </w:r>
       <w:r>
         <w:t xml:space="preserve"> </w:t>
@@ -890,7 +827,7 @@
         <w:t xml:space="preserve"> </w:t>
       </w:r>
       <w:r>
-        <w:t xml:space="preserve">iff</w:t>
+        <w:t xml:space="preserve">when</w:t>
       </w:r>
       <w:r>
         <w:t xml:space="preserve"> </w:t>
@@ -910,7 +847,7 @@
         </m:sSub>
       </m:oMath>
       <w:r>
-        <w:t xml:space="preserve">’s signal is a noised (garbled) version of</w:t>
+        <w:t xml:space="preserve">’s signal is a noised version of</w:t>
       </w:r>
       <w:r>
         <w:t xml:space="preserve"> </w:t>
@@ -930,35 +867,19 @@
         </m:sSub>
       </m:oMath>
       <w:r>
-        <w:t xml:space="preserve">’s, and, by the</w:t>
-      </w:r>
-      <w:r>
-        <w:t xml:space="preserve"> </w:t>
-      </w:r>
-      <w:r>
-        <w:t xml:space="preserve">Blackwell–Sherman–Stein theorem, this holds</w:t>
-      </w:r>
-      <w:r>
-        <w:t xml:space="preserve"> </w:t>
-      </w:r>
-      <w:r>
-        <w:rPr>
-          <w:i/>
-          <w:iCs/>
-        </w:rPr>
-        <w:t xml:space="preserve">iff</w:t>
-      </w:r>
-      <w:r>
-        <w:t xml:space="preserve"> </w:t>
-      </w:r>
-      <w:r>
-        <w:t xml:space="preserve">an idealized</w:t>
-      </w:r>
-      <w:r>
-        <w:t xml:space="preserve"> </w:t>
-      </w:r>
-      <w:r>
-        <w:t xml:space="preserve">decision-maker does at least as well with</w:t>
+        <w:t xml:space="preserve">’s, and by the</w:t>
+      </w:r>
+      <w:r>
+        <w:t xml:space="preserve"> </w:t>
+      </w:r>
+      <w:r>
+        <w:t xml:space="preserve">Blackwell–Sherman–Stein theorem this holds exactly when an ideal decision-maker does at least as</w:t>
+      </w:r>
+      <w:r>
+        <w:t xml:space="preserve"> </w:t>
+      </w:r>
+      <w:r>
+        <w:t xml:space="preserve">well with</w:t>
       </w:r>
       <w:r>
         <w:t xml:space="preserve"> </w:t>
@@ -1020,7 +941,7 @@
         <w:t xml:space="preserve"> </w:t>
       </w:r>
       <w:r>
-        <w:t xml:space="preserve">decision problem </w:t>
+        <w:t xml:space="preserve">task </w:t>
       </w:r>
       <w:r>
         <w:t xml:space="preserve">(</w:t>
@@ -1051,7 +972,13 @@
         <w:t xml:space="preserve">)</w:t>
       </w:r>
       <w:r>
-        <w:t xml:space="preserve">. The order is</w:t>
+        <w:t xml:space="preserve">. The catch</w:t>
+      </w:r>
+      <w:r>
+        <w:t xml:space="preserve"> </w:t>
+      </w:r>
+      <w:r>
+        <w:t xml:space="preserve">is that the order is only</w:t>
       </w:r>
       <w:r>
         <w:t xml:space="preserve"> </w:t>
@@ -1064,25 +991,38 @@
         <w:t xml:space="preserve">partial</w:t>
       </w:r>
       <w:r>
-        <w:t xml:space="preserve">: many source pairs are incomparable, neither garbling the other.</w:t>
-      </w:r>
-      <w:r>
-        <w:t xml:space="preserve"> </w:t>
-      </w:r>
-      <w:r>
-        <w:t xml:space="preserve">Incomparability is exactly the regime in which no scalar summary can be faithful,</w:t>
-      </w:r>
-      <w:r>
-        <w:t xml:space="preserve"> </w:t>
-      </w:r>
-      <w:r>
-        <w:t xml:space="preserve">because a scalar is a total order and a total order extending a strict partial</w:t>
-      </w:r>
-      <w:r>
-        <w:t xml:space="preserve"> </w:t>
-      </w:r>
-      <w:r>
-        <w:t xml:space="preserve">order must invert at least one incomparable pair on some task.</w:t>
+        <w:t xml:space="preserve">: often neither source is a blurred copy of the other, so</w:t>
+      </w:r>
+      <w:r>
+        <w:t xml:space="preserve"> </w:t>
+      </w:r>
+      <w:r>
+        <w:t xml:space="preserve">the two are</w:t>
+      </w:r>
+      <w:r>
+        <w:t xml:space="preserve"> </w:t>
+      </w:r>
+      <w:r>
+        <w:rPr>
+          <w:i/>
+          <w:iCs/>
+        </w:rPr>
+        <w:t xml:space="preserve">incomparable</w:t>
+      </w:r>
+      <w:r>
+        <w:t xml:space="preserve">. A single score cannot capture a partial order. A score forces</w:t>
+      </w:r>
+      <w:r>
+        <w:t xml:space="preserve"> </w:t>
+      </w:r>
+      <w:r>
+        <w:t xml:space="preserve">every source into one line, but two incomparable sources each win on some task, so whichever way</w:t>
+      </w:r>
+      <w:r>
+        <w:t xml:space="preserve"> </w:t>
+      </w:r>
+      <w:r>
+        <w:t xml:space="preserve">the score orders them, it is wrong on one.</w:t>
       </w:r>
     </w:p>
     <w:bookmarkEnd w:id="9"/>
@@ -1100,19 +1040,25 @@
         <w:pStyle w:val="FirstParagraph"/>
       </w:pPr>
       <w:r>
-        <w:t xml:space="preserve">The machinery, the garbling order, the Blackwell–Sherman–Stein equivalence, Le Cam’s</w:t>
-      </w:r>
-      <w:r>
-        <w:t xml:space="preserve"> </w:t>
-      </w:r>
-      <w:r>
-        <w:t xml:space="preserve">deficiency, is classical; our contribution is the application, the incomparability framing, and a</w:t>
-      </w:r>
-      <w:r>
-        <w:t xml:space="preserve"> </w:t>
-      </w:r>
-      <w:r>
-        <w:t xml:space="preserve">certified estimator (§</w:t>
+        <w:t xml:space="preserve">The mathematics is classical, the garbling order, the Blackwell–Sherman–Stein equivalence,</w:t>
+      </w:r>
+      <w:r>
+        <w:t xml:space="preserve"> </w:t>
+      </w:r>
+      <w:r>
+        <w:t xml:space="preserve">Le Cam’s deficiency; what is new is applying it to context selection, reading cross-task</w:t>
+      </w:r>
+      <w:r>
+        <w:t xml:space="preserve"> </w:t>
+      </w:r>
+      <w:r>
+        <w:t xml:space="preserve">non-transfer as a partial order, and giving a test that checks it on a real model</w:t>
+      </w:r>
+      <w:r>
+        <w:t xml:space="preserve"> </w:t>
+      </w:r>
+      <w:r>
+        <w:t xml:space="preserve">(§</w:t>
       </w:r>
       <w:hyperlink w:anchor="sec:related">
         <w:r>
@@ -1123,35 +1069,29 @@
         </w:r>
       </w:hyperlink>
       <w:r>
-        <w:t xml:space="preserve">). One gap the framing must respect, and that we close,</w:t>
-      </w:r>
-      <w:r>
-        <w:t xml:space="preserve"> </w:t>
-      </w:r>
-      <w:r>
-        <w:t xml:space="preserve">concerns the decision rule: Blackwell’s theorem is about the</w:t>
-      </w:r>
-      <w:r>
-        <w:t xml:space="preserve"> </w:t>
-      </w:r>
-      <w:r>
-        <w:rPr>
-          <w:i/>
-          <w:iCs/>
-        </w:rPr>
-        <w:t xml:space="preserve">optimal</w:t>
-      </w:r>
-      <w:r>
-        <w:t xml:space="preserve"> </w:t>
-      </w:r>
-      <w:r>
-        <w:t xml:space="preserve">(Bayes) use of an</w:t>
-      </w:r>
-      <w:r>
-        <w:t xml:space="preserve"> </w:t>
-      </w:r>
-      <w:r>
-        <w:t xml:space="preserve">experiment, whereas every quantity we measure,</w:t>
+        <w:t xml:space="preserve">). One gap needs care. Blackwell’s theorem is about the</w:t>
+      </w:r>
+      <w:r>
+        <w:t xml:space="preserve"> </w:t>
+      </w:r>
+      <w:r>
+        <w:rPr>
+          <w:i/>
+          <w:iCs/>
+        </w:rPr>
+        <w:t xml:space="preserve">best possible</w:t>
+      </w:r>
+      <w:r>
+        <w:t xml:space="preserve"> </w:t>
+      </w:r>
+      <w:r>
+        <w:t xml:space="preserve">use</w:t>
+      </w:r>
+      <w:r>
+        <w:t xml:space="preserve"> </w:t>
+      </w:r>
+      <w:r>
+        <w:t xml:space="preserve">of a source, but every number we measure comes from one fixed model:</w:t>
       </w:r>
       <w:r>
         <w:t xml:space="preserve"> </w:t>
@@ -1301,7 +1241,7 @@
         </m:r>
       </m:oMath>
       <w:r>
-        <w:t xml:space="preserve">, is evaluated at a single fixed sub-optimal rule</w:t>
+        <w:t xml:space="preserve">, the pass rate of a single rule</w:t>
       </w:r>
       <w:r>
         <w:t xml:space="preserve"> </w:t>
@@ -1321,39 +1261,22 @@
         </m:sSub>
       </m:oMath>
       <w:r>
-        <w:t xml:space="preserve">. We</w:t>
-      </w:r>
-      <w:r>
-        <w:t xml:space="preserve"> </w:t>
-      </w:r>
-      <w:r>
-        <w:t xml:space="preserve">therefore develop the order in a</w:t>
-      </w:r>
-      <w:r>
-        <w:t xml:space="preserve"> </w:t>
-      </w:r>
-      <m:oMath>
-        <m:sSub>
-          <m:e>
-            <m:r>
-              <m:t>δ</m:t>
-            </m:r>
-          </m:e>
-          <m:sub>
-            <m:r>
-              <m:t>M</m:t>
-            </m:r>
-          </m:sub>
-        </m:sSub>
-      </m:oMath>
-      <w:r>
-        <w:t xml:space="preserve">-restricted register with a one-way bridge to the</w:t>
-      </w:r>
-      <w:r>
-        <w:t xml:space="preserve"> </w:t>
-      </w:r>
-      <w:r>
-        <w:t xml:space="preserve">idealized order (§</w:t>
+        <w:t xml:space="preserve"> </w:t>
+      </w:r>
+      <w:r>
+        <w:t xml:space="preserve">that is not optimal. So</w:t>
+      </w:r>
+      <w:r>
+        <w:t xml:space="preserve"> </w:t>
+      </w:r>
+      <w:r>
+        <w:t xml:space="preserve">we state the order twice, once for the ideal user and once for the fixed model, and prove a one-way</w:t>
+      </w:r>
+      <w:r>
+        <w:t xml:space="preserve"> </w:t>
+      </w:r>
+      <w:r>
+        <w:t xml:space="preserve">bridge from what we measure to what the theorem is about (§</w:t>
       </w:r>
       <w:hyperlink w:anchor="sec:order">
         <w:r>
@@ -1364,13 +1287,13 @@
         </w:r>
       </w:hyperlink>
       <w:r>
-        <w:t xml:space="preserve">), confine every empirical claim to the restricted object, and</w:t>
-      </w:r>
-      <w:r>
-        <w:t xml:space="preserve"> </w:t>
-      </w:r>
-      <w:r>
-        <w:t xml:space="preserve">name the estimator a decision-restricted</w:t>
+        <w:t xml:space="preserve">); and we call our</w:t>
+      </w:r>
+      <w:r>
+        <w:t xml:space="preserve"> </w:t>
+      </w:r>
+      <w:r>
+        <w:t xml:space="preserve">estimator a</w:t>
       </w:r>
       <w:r>
         <w:t xml:space="preserve"> </w:t>
@@ -1383,13 +1306,7 @@
         <w:t xml:space="preserve">value-deficiency surrogate</w:t>
       </w:r>
       <w:r>
-        <w:t xml:space="preserve">, not a Le Cam</w:t>
-      </w:r>
-      <w:r>
-        <w:t xml:space="preserve"> </w:t>
-      </w:r>
-      <w:r>
-        <w:t xml:space="preserve">deficiency (§</w:t>
+        <w:t xml:space="preserve">, not a Le Cam deficiency (§</w:t>
       </w:r>
       <w:hyperlink w:anchor="sec:estimator">
         <w:r>
@@ -1418,43 +1335,31 @@
         <w:pStyle w:val="FirstParagraph"/>
       </w:pPr>
       <w:r>
-        <w:t xml:space="preserve">Fixed strings would naively be Blackwell-trivial constant experiments. We model the latent</w:t>
-      </w:r>
-      <w:r>
-        <w:t xml:space="preserve"> </w:t>
-      </w:r>
-      <w:r>
-        <w:t xml:space="preserve">requirement as a vector of coordinates and each source as a deterministic experiment observing a</w:t>
-      </w:r>
-      <w:r>
-        <w:t xml:space="preserve"> </w:t>
-      </w:r>
-      <w:r>
-        <w:rPr>
-          <w:i/>
-          <w:iCs/>
-        </w:rPr>
-        <w:t xml:space="preserve">projection</w:t>
-      </w:r>
-      <w:r>
-        <w:t xml:space="preserve">; comparison reduces to refinement of the projections’</w:t>
-      </w:r>
-      <w:r>
-        <w:t xml:space="preserve"> </w:t>
-      </w:r>
-      <m:oMath>
-        <m:r>
-          <m:t>σ</m:t>
-        </m:r>
-      </m:oMath>
-      <w:r>
-        <w:t xml:space="preserve">-algebras, and</w:t>
-      </w:r>
-      <w:r>
-        <w:t xml:space="preserve"> </w:t>
-      </w:r>
-      <w:r>
-        <w:t xml:space="preserve">incomparability is mutual non-refinement, a property we establish for our concrete pair (Lemma </w:t>
+        <w:t xml:space="preserve">One technical point keeps the framing from being empty. A fixed string of text looks like a</w:t>
+      </w:r>
+      <w:r>
+        <w:t xml:space="preserve"> </w:t>
+      </w:r>
+      <w:r>
+        <w:t xml:space="preserve">constant, and a constant carries no information in Blackwell’s sense. We avoid this by treating the</w:t>
+      </w:r>
+      <w:r>
+        <w:t xml:space="preserve"> </w:t>
+      </w:r>
+      <w:r>
+        <w:t xml:space="preserve">hidden requirement as a list of separate facts and each source as revealing some of them; two</w:t>
+      </w:r>
+      <w:r>
+        <w:t xml:space="preserve"> </w:t>
+      </w:r>
+      <w:r>
+        <w:t xml:space="preserve">sources are then incomparable exactly when each reveals a fact the other hides, which is easy to</w:t>
+      </w:r>
+      <w:r>
+        <w:t xml:space="preserve"> </w:t>
+      </w:r>
+      <w:r>
+        <w:t xml:space="preserve">check and holds for our pair (Lemma </w:t>
       </w:r>
       <w:hyperlink w:anchor="lem:noref">
         <w:r>
@@ -1483,13 +1388,7 @@
         <w:pStyle w:val="FirstParagraph"/>
       </w:pPr>
       <w:r>
-        <w:t xml:space="preserve">We instantiate the theory on two private, equally on-topic conventions about the</w:t>
-      </w:r>
-      <w:r>
-        <w:t xml:space="preserve"> </w:t>
-      </w:r>
-      <w:r>
-        <w:t xml:space="preserve">same module: an API call contract</w:t>
+        <w:t xml:space="preserve">We test the theory on the two notes from the opening example: an API call contract</w:t>
       </w:r>
       <w:r>
         <w:t xml:space="preserve"> </w:t>
@@ -1512,7 +1411,13 @@
         <w:t xml:space="preserve"> </w:t>
       </w:r>
       <w:r>
-        <w:t xml:space="preserve">and a wire-encoding invariant</w:t>
+        <w:t xml:space="preserve">and a</w:t>
+      </w:r>
+      <w:r>
+        <w:t xml:space="preserve"> </w:t>
+      </w:r>
+      <w:r>
+        <w:t xml:space="preserve">wire-encoding rule</w:t>
       </w:r>
       <w:r>
         <w:t xml:space="preserve"> </w:t>
@@ -1535,7 +1440,7 @@
         <w:t xml:space="preserve"> </w:t>
       </w:r>
       <w:r>
-        <w:t xml:space="preserve">(§</w:t>
+        <w:t xml:space="preserve">for the same module (§</w:t>
       </w:r>
       <w:hyperlink w:anchor="sec:experiments">
         <w:r>
@@ -1546,24 +1451,13 @@
         </w:r>
       </w:hyperlink>
       <w:r>
-        <w:t xml:space="preserve">), with a four-cell verifier battery using executable</w:t>
-      </w:r>
-      <w:r>
-        <w:t xml:space="preserve"> </w:t>
-      </w:r>
-      <w:r>
-        <w:t xml:space="preserve">PASS</w:t>
-      </w:r>
-      <m:oMath>
-        <m:r>
-          <m:rPr>
-            <m:sty m:val="p"/>
-          </m:rPr>
-          <m:t>/</m:t>
-        </m:r>
-      </m:oMath>
-      <w:r>
-        <w:t xml:space="preserve">FAIL judgments (return code</w:t>
+        <w:t xml:space="preserve">), graded by a small battery</w:t>
+      </w:r>
+      <w:r>
+        <w:t xml:space="preserve"> </w:t>
+      </w:r>
+      <w:r>
+        <w:t xml:space="preserve">of tasks whose verifier returns pass or fail (exit code</w:t>
       </w:r>
       <w:r>
         <w:t xml:space="preserve"> </w:t>
@@ -1577,49 +1471,19 @@
         <w:t xml:space="preserve"> </w:t>
       </w:r>
       <w:r>
-        <w:t xml:space="preserve">is PASS). This imposes a</w:t>
-      </w:r>
-      <w:r>
-        <w:t xml:space="preserve"> </w:t>
-      </w:r>
-      <w:r>
-        <w:t xml:space="preserve">restriction: the battery is a fixed, adversarially constructed</w:t>
-      </w:r>
-      <w:r>
-        <w:t xml:space="preserve"> </w:t>
-      </w:r>
-      <w:r>
-        <w:t xml:space="preserve">opposition, not a sampled task distribution, and the certified incomparability is</w:t>
-      </w:r>
-      <w:r>
-        <w:t xml:space="preserve"> </w:t>
-      </w:r>
-      <w:r>
-        <w:t xml:space="preserve">carried by one API cell and one encoding cell; we report the effective support</w:t>
-      </w:r>
-      <w:r>
-        <w:t xml:space="preserve"> </w:t>
-      </w:r>
-      <w:r>
-        <w:t xml:space="preserve">explicitly and do not call</w:t>
-      </w:r>
-      <w:r>
-        <w:t xml:space="preserve"> </w:t>
-      </w:r>
-      <m:oMath>
-        <m:r>
-          <m:rPr>
-            <m:scr m:val="script"/>
-            <m:sty m:val="p"/>
-          </m:rPr>
-          <m:t>D</m:t>
-        </m:r>
-      </m:oMath>
-      <w:r>
-        <w:t xml:space="preserve"> </w:t>
-      </w:r>
-      <w:r>
-        <w:t xml:space="preserve">a</w:t>
+        <w:t xml:space="preserve">is pass). The battery is a fixed,</w:t>
+      </w:r>
+      <w:r>
+        <w:t xml:space="preserve"> </w:t>
+      </w:r>
+      <w:r>
+        <w:t xml:space="preserve">hand-built opposition, not a random sample of tasks, and the certified result rests on one API task</w:t>
+      </w:r>
+      <w:r>
+        <w:t xml:space="preserve"> </w:t>
+      </w:r>
+      <w:r>
+        <w:t xml:space="preserve">and one encoding task; we say so plainly and do not call it a</w:t>
       </w:r>
       <w:r>
         <w:t xml:space="preserve"> </w:t>
@@ -1631,13 +1495,7 @@
         <w:t xml:space="preserve"> </w:t>
       </w:r>
       <w:r>
-        <w:t xml:space="preserve">On this instrument</w:t>
-      </w:r>
-      <w:r>
-        <w:t xml:space="preserve"> </w:t>
-      </w:r>
-      <w:r>
-        <w:t xml:space="preserve">we obtain, on</w:t>
+        <w:t xml:space="preserve">On this setup, from</w:t>
       </w:r>
       <w:r>
         <w:t xml:space="preserve"> </w:t>
@@ -1653,7 +1511,7 @@
         <w:t xml:space="preserve"> </w:t>
       </w:r>
       <w:r>
-        <w:t xml:space="preserve">model calls with no modeled numbers:</w:t>
+        <w:t xml:space="preserve">model calls with no invented numbers, we find:</w:t>
       </w:r>
     </w:p>
     <w:p>
@@ -3142,7 +3000,7 @@
         <w:pStyle w:val="FirstParagraph"/>
       </w:pPr>
       <w:r>
-        <w:t xml:space="preserve">The Anthropic models run agentically (</w:t>
+        <w:t xml:space="preserve">One caveat about how we ran the models. The Anthropic models run as agents (</w:t>
       </w:r>
       <w:r>
         <w:rPr>
@@ -3151,87 +3009,47 @@
         <w:t xml:space="preserve">claude -p</w:t>
       </w:r>
       <w:r>
-        <w:t xml:space="preserve">, up to six turns); the</w:t>
-      </w:r>
-      <w:r>
-        <w:t xml:space="preserve"> </w:t>
-      </w:r>
-      <w:r>
-        <w:t xml:space="preserve">non-Anthropic models run single-shot (completion plus code extraction via an</w:t>
-      </w:r>
-      <w:r>
-        <w:t xml:space="preserve"> </w:t>
-      </w:r>
-      <w:r>
-        <w:t xml:space="preserve">OpenAI-style API). We flag this throughout: vendor is confounded with harness, so</w:t>
-      </w:r>
-      <w:r>
-        <w:t xml:space="preserve"> </w:t>
-      </w:r>
-      <w:r>
-        <w:t xml:space="preserve">every</w:t>
-      </w:r>
-      <w:r>
-        <w:t xml:space="preserve"> </w:t>
-      </w:r>
-      <w:r>
-        <w:rPr>
-          <w:i/>
-          <w:iCs/>
-        </w:rPr>
-        <w:t xml:space="preserve">cross-vendor magnitude</w:t>
-      </w:r>
-      <w:r>
-        <w:t xml:space="preserve"> </w:t>
-      </w:r>
-      <w:r>
-        <w:t xml:space="preserve">comparison (the value spectrum, the</w:t>
-      </w:r>
-      <w:r>
-        <w:t xml:space="preserve"> </w:t>
-      </w:r>
-      <w:r>
-        <w:t xml:space="preserve">interference ladder) inherits that confound, whereas the binary within-model</w:t>
-      </w:r>
-      <w:r>
-        <w:t xml:space="preserve"> </w:t>
-      </w:r>
-      <w:r>
-        <w:t xml:space="preserve">claims do not. The single-shot setting is arguably a</w:t>
-      </w:r>
-      <w:r>
-        <w:t xml:space="preserve"> </w:t>
-      </w:r>
-      <w:r>
-        <w:rPr>
-          <w:i/>
-          <w:iCs/>
-        </w:rPr>
-        <w:t xml:space="preserve">cleaner</w:t>
-      </w:r>
-      <w:r>
-        <w:t xml:space="preserve"> </w:t>
-      </w:r>
-      <w:r>
-        <w:t xml:space="preserve">probe of</w:t>
-      </w:r>
-      <w:r>
-        <w:t xml:space="preserve"> </w:t>
-      </w:r>
-      <w:r>
-        <w:t xml:space="preserve">whether a model uses supplied context, since it removes the agentic-exploration</w:t>
-      </w:r>
-      <w:r>
-        <w:t xml:space="preserve"> </w:t>
-      </w:r>
-      <w:r>
-        <w:t xml:space="preserve">confound; we treat the asymmetry as a limitation to be reported, not explained</w:t>
-      </w:r>
-      <w:r>
-        <w:t xml:space="preserve"> </w:t>
-      </w:r>
-      <w:r>
-        <w:t xml:space="preserve">away.</w:t>
+        <w:t xml:space="preserve">, up</w:t>
+      </w:r>
+      <w:r>
+        <w:t xml:space="preserve"> </w:t>
+      </w:r>
+      <w:r>
+        <w:t xml:space="preserve">to six turns); the others run in a single shot (one completion, then we extract the code). So</w:t>
+      </w:r>
+      <w:r>
+        <w:t xml:space="preserve"> </w:t>
+      </w:r>
+      <w:r>
+        <w:t xml:space="preserve">vendor and run-mode are tangled together: any comparison of</w:t>
+      </w:r>
+      <w:r>
+        <w:t xml:space="preserve"> </w:t>
+      </w:r>
+      <w:r>
+        <w:rPr>
+          <w:i/>
+          <w:iCs/>
+        </w:rPr>
+        <w:t xml:space="preserve">how large</w:t>
+      </w:r>
+      <w:r>
+        <w:t xml:space="preserve"> </w:t>
+      </w:r>
+      <w:r>
+        <w:t xml:space="preserve">an effect is across</w:t>
+      </w:r>
+      <w:r>
+        <w:t xml:space="preserve"> </w:t>
+      </w:r>
+      <w:r>
+        <w:t xml:space="preserve">vendors inherits this, though the yes/no claims within a single model do not. We flag it wherever</w:t>
+      </w:r>
+      <w:r>
+        <w:t xml:space="preserve"> </w:t>
+      </w:r>
+      <w:r>
+        <w:t xml:space="preserve">it matters and treat it as a limitation, not something to explain away.</w:t>
       </w:r>
     </w:p>
     <w:bookmarkEnd w:id="13"/>
@@ -4435,7 +4253,7 @@
         <w:pStyle w:val="FirstParagraph"/>
       </w:pPr>
       <w:r>
-        <w:t xml:space="preserve">The machinery we use, Blackwell’s garbling order </w:t>
+        <w:t xml:space="preserve">The tools we use are classical, Blackwell’s garbling order </w:t>
       </w:r>
       <w:r>
         <w:t xml:space="preserve">(</w:t>
@@ -4492,70 +4310,25 @@
         <w:t xml:space="preserve">)</w:t>
       </w:r>
       <w:r>
-        <w:t xml:space="preserve">, is classical, and we claim no new core mathematics.</w:t>
-      </w:r>
-      <w:r>
-        <w:t xml:space="preserve"> </w:t>
-      </w:r>
-      <w:r>
-        <w:t xml:space="preserve">Our contribution is an</w:t>
-      </w:r>
-      <w:r>
-        <w:t xml:space="preserve"> </w:t>
-      </w:r>
-      <w:r>
-        <w:rPr>
-          <w:i/>
-          <w:iCs/>
-        </w:rPr>
-        <w:t xml:space="preserve">application</w:t>
-      </w:r>
-      <w:r>
-        <w:t xml:space="preserve">, a</w:t>
-      </w:r>
-      <w:r>
-        <w:t xml:space="preserve"> </w:t>
-      </w:r>
-      <w:r>
-        <w:rPr>
-          <w:i/>
-          <w:iCs/>
-        </w:rPr>
-        <w:t xml:space="preserve">framing</w:t>
-      </w:r>
-      <w:r>
-        <w:t xml:space="preserve">, and an</w:t>
-      </w:r>
-      <w:r>
-        <w:t xml:space="preserve"> </w:t>
-      </w:r>
-      <w:r>
-        <w:rPr>
-          <w:i/>
-          <w:iCs/>
-        </w:rPr>
-        <w:t xml:space="preserve">estimator</w:t>
-      </w:r>
-      <w:r>
-        <w:t xml:space="preserve">:</w:t>
-      </w:r>
-      <w:r>
-        <w:t xml:space="preserve"> </w:t>
-      </w:r>
-      <w:r>
-        <w:t xml:space="preserve">(i) we treat each candidate context source for a language model as a statistical experiment</w:t>
-      </w:r>
-      <w:r>
-        <w:t xml:space="preserve"> </w:t>
-      </w:r>
-      <w:r>
-        <w:t xml:space="preserve">on the task’s latent requirement and rank sources by the Blackwell order, with a</w:t>
-      </w:r>
-      <w:r>
-        <w:t xml:space="preserve"> </w:t>
-      </w:r>
-      <w:r>
-        <w:t xml:space="preserve">decision-independent, for-all-tasks dominance guarantee (§</w:t>
+        <w:t xml:space="preserve">; we add no new core mathematics. Our contribution is to</w:t>
+      </w:r>
+      <w:r>
+        <w:t xml:space="preserve"> </w:t>
+      </w:r>
+      <w:r>
+        <w:t xml:space="preserve">apply, frame, and measure. (i) We treat each candidate source as a statistical experiment on what</w:t>
+      </w:r>
+      <w:r>
+        <w:t xml:space="preserve"> </w:t>
+      </w:r>
+      <w:r>
+        <w:t xml:space="preserve">the task needs and rank sources by the Blackwell order, which gives a guarantee that holds for</w:t>
+      </w:r>
+      <w:r>
+        <w:t xml:space="preserve"> </w:t>
+      </w:r>
+      <w:r>
+        <w:t xml:space="preserve">every task at once, not just one (§</w:t>
       </w:r>
       <w:hyperlink w:anchor="sec:order">
         <w:r>
@@ -4566,19 +4339,16 @@
         </w:r>
       </w:hyperlink>
       <w:r>
-        <w:t xml:space="preserve">);</w:t>
-      </w:r>
-      <w:r>
-        <w:t xml:space="preserve"> </w:t>
-      </w:r>
-      <w:r>
-        <w:t xml:space="preserve">(ii) we observe, as an application-level corollary of Blackwell’s theorem, that</w:t>
-      </w:r>
-      <w:r>
-        <w:t xml:space="preserve"> </w:t>
-      </w:r>
-      <w:r>
-        <w:t xml:space="preserve">Blackwell-</w:t>
+        <w:t xml:space="preserve">). (ii) We point out a direct consequence of</w:t>
+      </w:r>
+      <w:r>
+        <w:t xml:space="preserve"> </w:t>
+      </w:r>
+      <w:r>
+        <w:t xml:space="preserve">Blackwell’s theorem, that</w:t>
+      </w:r>
+      <w:r>
+        <w:t xml:space="preserve"> </w:t>
       </w:r>
       <w:r>
         <w:rPr>
@@ -4591,13 +4361,13 @@
         <w:t xml:space="preserve"> </w:t>
       </w:r>
       <w:r>
-        <w:t xml:space="preserve">sources cannot be ranked by any scalar score for all tasks</w:t>
-      </w:r>
-      <w:r>
-        <w:t xml:space="preserve"> </w:t>
-      </w:r>
-      <w:r>
-        <w:t xml:space="preserve">(§</w:t>
+        <w:t xml:space="preserve">sources cannot be ranked by any scalar score for all</w:t>
+      </w:r>
+      <w:r>
+        <w:t xml:space="preserve"> </w:t>
+      </w:r>
+      <w:r>
+        <w:t xml:space="preserve">tasks (§</w:t>
       </w:r>
       <w:hyperlink w:anchor="sec:incomparability">
         <w:r>
@@ -4608,37 +4378,31 @@
         </w:r>
       </w:hyperlink>
       <w:r>
-        <w:t xml:space="preserve">), which converts the empirical folklore that</w:t>
-      </w:r>
-      <w:r>
-        <w:t xml:space="preserve"> </w:t>
-      </w:r>
-      <w:r>
-        <w:t xml:space="preserve">“relevance does</w:t>
-      </w:r>
-      <w:r>
-        <w:t xml:space="preserve"> </w:t>
-      </w:r>
-      <w:r>
-        <w:t xml:space="preserve">not transfer across tasks”</w:t>
-      </w:r>
-      <w:r>
-        <w:t xml:space="preserve"> </w:t>
-      </w:r>
-      <w:r>
-        <w:t xml:space="preserve">into a theorem, formalizing within the Blackwell frame a</w:t>
-      </w:r>
-      <w:r>
-        <w:t xml:space="preserve"> </w:t>
-      </w:r>
-      <w:r>
-        <w:t xml:space="preserve">limitation that information retrieval has long recognized for interacting documents</w:t>
-      </w:r>
-      <w:r>
-        <w:t xml:space="preserve"> </w:t>
-      </w:r>
-      <w:r>
-        <w:t xml:space="preserve">(§</w:t>
+        <w:t xml:space="preserve">), turning the folklore</w:t>
+      </w:r>
+      <w:r>
+        <w:t xml:space="preserve"> </w:t>
+      </w:r>
+      <w:r>
+        <w:t xml:space="preserve">“relevance does not transfer across</w:t>
+      </w:r>
+      <w:r>
+        <w:t xml:space="preserve"> </w:t>
+      </w:r>
+      <w:r>
+        <w:t xml:space="preserve">tasks”</w:t>
+      </w:r>
+      <w:r>
+        <w:t xml:space="preserve"> </w:t>
+      </w:r>
+      <w:r>
+        <w:t xml:space="preserve">into a theorem and tying it to a limit information retrieval has long known for interacting</w:t>
+      </w:r>
+      <w:r>
+        <w:t xml:space="preserve"> </w:t>
+      </w:r>
+      <w:r>
+        <w:t xml:space="preserve">documents (§</w:t>
       </w:r>
       <w:hyperlink w:anchor="sec:related-ir">
         <w:r>
@@ -4649,13 +4413,7 @@
         </w:r>
       </w:hyperlink>
       <w:r>
-        <w:t xml:space="preserve">); and</w:t>
-      </w:r>
-      <w:r>
-        <w:t xml:space="preserve"> </w:t>
-      </w:r>
-      <w:r>
-        <w:t xml:space="preserve">(iii) we supply a Le Cam-inspired, decision-restricted value-deficiency</w:t>
+        <w:t xml:space="preserve">). (iii) We supply a value-deficiency</w:t>
       </w:r>
       <w:r>
         <w:t xml:space="preserve"> </w:t>
@@ -4677,13 +4435,7 @@
         <w:t xml:space="preserve"> </w:t>
       </w:r>
       <w:r>
-        <w:t xml:space="preserve">distribution-free finite-sample certificate that is auditable on a real model with a real</w:t>
-      </w:r>
-      <w:r>
-        <w:t xml:space="preserve"> </w:t>
-      </w:r>
-      <w:r>
-        <w:t xml:space="preserve">verifier (§</w:t>
+        <w:t xml:space="preserve">certificate that can be checked on a real model with a real verifier (§</w:t>
       </w:r>
       <w:hyperlink w:anchor="sec:estimator">
         <w:r>
@@ -4694,19 +4446,19 @@
         </w:r>
       </w:hyperlink>
       <w:r>
-        <w:t xml:space="preserve">). To our knowledge,</w:t>
-      </w:r>
-      <w:r>
-        <w:t xml:space="preserve"> </w:t>
-      </w:r>
-      <w:r>
-        <w:t xml:space="preserve">no prior work applies the comparison of experiments to selecting inference-time context for</w:t>
-      </w:r>
-      <w:r>
-        <w:t xml:space="preserve"> </w:t>
-      </w:r>
-      <w:r>
-        <w:t xml:space="preserve">language models.</w:t>
+        <w:t xml:space="preserve">). We</w:t>
+      </w:r>
+      <w:r>
+        <w:t xml:space="preserve"> </w:t>
+      </w:r>
+      <w:r>
+        <w:t xml:space="preserve">know of no prior work that uses the comparison of experiments to choose a language model’s context</w:t>
+      </w:r>
+      <w:r>
+        <w:t xml:space="preserve"> </w:t>
+      </w:r>
+      <w:r>
+        <w:t xml:space="preserve">at inference time.</w:t>
       </w:r>
     </w:p>
     <w:bookmarkEnd w:id="17"/>
@@ -19280,7 +19032,7 @@
         <w:pStyle w:val="FirstParagraph"/>
       </w:pPr>
       <w:r>
-        <w:t xml:space="preserve">Exact garblings over text are uncomputable and</w:t>
+        <w:t xml:space="preserve">Exact garblings over text cannot be computed, and</w:t>
       </w:r>
       <w:r>
         <w:t xml:space="preserve"> </w:t>
@@ -19306,27 +19058,13 @@
         <w:t xml:space="preserve"> </w:t>
       </w:r>
       <w:r>
-        <w:t xml:space="preserve">is partial, so we measure the</w:t>
-      </w:r>
-      <w:r>
-        <w:t xml:space="preserve"> </w:t>
-      </w:r>
-      <m:oMath>
-        <m:sSub>
-          <m:e>
-            <m:r>
-              <m:t>δ</m:t>
-            </m:r>
-          </m:e>
-          <m:sub>
-            <m:r>
-              <m:t>M</m:t>
-            </m:r>
-          </m:sub>
-        </m:sSub>
-      </m:oMath>
-      <w:r>
-        <w:t xml:space="preserve">-restricted order of Definition </w:t>
+        <w:t xml:space="preserve">is only partial, so instead we measure the</w:t>
+      </w:r>
+      <w:r>
+        <w:t xml:space="preserve"> </w:t>
+      </w:r>
+      <w:r>
+        <w:t xml:space="preserve">fixed-rule order of Definition </w:t>
       </w:r>
       <w:hyperlink w:anchor="def:dmorder">
         <w:r>
@@ -19360,13 +19098,13 @@
         <w:t xml:space="preserve"> </w:t>
       </w:r>
       <w:r>
-        <w:t xml:space="preserve">and a</w:t>
-      </w:r>
-      <w:r>
-        <w:t xml:space="preserve"> </w:t>
-      </w:r>
-      <w:r>
-        <w:t xml:space="preserve">finite task set</w:t>
+        <w:t xml:space="preserve">and a finite task</w:t>
+      </w:r>
+      <w:r>
+        <w:t xml:space="preserve"> </w:t>
+      </w:r>
+      <w:r>
+        <w:t xml:space="preserve">set</w:t>
       </w:r>
       <w:r>
         <w:t xml:space="preserve"> </w:t>
@@ -19381,10 +19119,7 @@
         </m:r>
       </m:oMath>
       <w:r>
-        <w:t xml:space="preserve"> </w:t>
-      </w:r>
-      <w:r>
-        <w:t xml:space="preserve">and define the</w:t>
+        <w:t xml:space="preserve">, and define the</w:t>
       </w:r>
       <w:r>
         <w:t xml:space="preserve"> </w:t>
@@ -19397,16 +19132,7 @@
         <w:t xml:space="preserve">decision-restricted value-deficiency</w:t>
       </w:r>
       <w:r>
-        <w:t xml:space="preserve"> </w:t>
-      </w:r>
-      <w:r>
-        <w:t xml:space="preserve">(a one-sided</w:t>
-      </w:r>
-      <w:r>
-        <w:t xml:space="preserve"> </w:t>
-      </w:r>
-      <w:r>
-        <w:t xml:space="preserve">worst-case regret of</w:t>
+        <w:t xml:space="preserve">, the worst amount by which</w:t>
       </w:r>
       <w:r>
         <w:t xml:space="preserve"> </w:t>
@@ -19429,7 +19155,7 @@
         <w:t xml:space="preserve"> </w:t>
       </w:r>
       <w:r>
-        <w:t xml:space="preserve">relative to</w:t>
+        <w:t xml:space="preserve">trails</w:t>
       </w:r>
       <w:r>
         <w:t xml:space="preserve"> </w:t>
@@ -19452,7 +19178,7 @@
         <w:t xml:space="preserve"> </w:t>
       </w:r>
       <w:r>
-        <w:t xml:space="preserve">on</w:t>
+        <w:t xml:space="preserve">across the tasks in</w:t>
       </w:r>
       <w:r>
         <w:t xml:space="preserve"> </w:t>
@@ -19467,7 +19193,7 @@
         </m:r>
       </m:oMath>
       <w:r>
-        <w:t xml:space="preserve">):</w:t>
+        <w:t xml:space="preserve">:</w:t>
       </w:r>
     </w:p>
     <w:p>
@@ -28097,20 +27823,7 @@
         <w:pStyle w:val="FirstParagraph"/>
       </w:pPr>
       <w:r>
-        <w:t xml:space="preserve">A garbling acts on the</w:t>
-      </w:r>
-      <w:r>
-        <w:t xml:space="preserve"> </w:t>
-      </w:r>
-      <w:r>
-        <w:rPr>
-          <w:i/>
-          <w:iCs/>
-        </w:rPr>
-        <w:t xml:space="preserve">signal alone</w:t>
-      </w:r>
-      <w:r>
-        <w:t xml:space="preserve">. From</w:t>
+        <w:t xml:space="preserve">The argument is simple. From</w:t>
       </w:r>
       <w:r>
         <w:t xml:space="preserve"> </w:t>
@@ -28130,13 +27843,33 @@
         </m:sSub>
       </m:oMath>
       <w:r>
-        <w:t xml:space="preserve">’s wire format one cannot manufacture the</w:t>
-      </w:r>
-      <w:r>
-        <w:t xml:space="preserve"> </w:t>
-      </w:r>
-      <w:r>
-        <w:t xml:space="preserve">private argument order, the required keyword-only</w:t>
+        <w:t xml:space="preserve">’s wire format you cannot recover</w:t>
+      </w:r>
+      <w:r>
+        <w:t xml:space="preserve"> </w:t>
+      </w:r>
+      <m:oMath>
+        <m:sSub>
+          <m:e>
+            <m:r>
+              <m:t>W</m:t>
+            </m:r>
+          </m:e>
+          <m:sub>
+            <m:r>
+              <m:t>1</m:t>
+            </m:r>
+          </m:sub>
+        </m:sSub>
+      </m:oMath>
+      <w:r>
+        <w:t xml:space="preserve">’s private argument order,</w:t>
+      </w:r>
+      <w:r>
+        <w:t xml:space="preserve"> </w:t>
+      </w:r>
+      <w:r>
+        <w:t xml:space="preserve">its required</w:t>
       </w:r>
       <w:r>
         <w:t xml:space="preserve"> </w:t>
@@ -28148,7 +27881,10 @@
         <w:t xml:space="preserve">memo</w:t>
       </w:r>
       <w:r>
-        <w:t xml:space="preserve">, or the exception type; from</w:t>
+        <w:t xml:space="preserve"> </w:t>
+      </w:r>
+      <w:r>
+        <w:t xml:space="preserve">keyword, or its error type; from</w:t>
       </w:r>
       <w:r>
         <w:t xml:space="preserve"> </w:t>
@@ -28168,13 +27904,27 @@
         </m:sSub>
       </m:oMath>
       <w:r>
-        <w:t xml:space="preserve">’s</w:t>
-      </w:r>
-      <w:r>
-        <w:t xml:space="preserve"> </w:t>
-      </w:r>
-      <w:r>
-        <w:t xml:space="preserve">contract one cannot manufacture the cents scale, the</w:t>
+        <w:t xml:space="preserve">’s contract you cannot recover</w:t>
+      </w:r>
+      <w:r>
+        <w:t xml:space="preserve"> </w:t>
+      </w:r>
+      <m:oMath>
+        <m:sSub>
+          <m:e>
+            <m:r>
+              <m:t>W</m:t>
+            </m:r>
+          </m:e>
+          <m:sub>
+            <m:r>
+              <m:t>2</m:t>
+            </m:r>
+          </m:sub>
+        </m:sSub>
+      </m:oMath>
+      <w:r>
+        <w:t xml:space="preserve">’s cents scale, its</w:t>
       </w:r>
       <w:r>
         <w:t xml:space="preserve"> </w:t>
@@ -28189,35 +27939,13 @@
         <w:t xml:space="preserve"> </w:t>
       </w:r>
       <w:r>
-        <w:t xml:space="preserve">separator, or the mod-10 check. The</w:t>
-      </w:r>
-      <w:r>
-        <w:t xml:space="preserve"> </w:t>
-      </w:r>
-      <w:r>
-        <w:t xml:space="preserve">two facts are logically independent coordinates of the latent requirement</w:t>
-      </w:r>
-      <w:r>
-        <w:t xml:space="preserve"> </w:t>
-      </w:r>
-      <m:oMath>
-        <m:r>
-          <m:t>S</m:t>
-        </m:r>
-      </m:oMath>
-      <w:r>
-        <w:t xml:space="preserve">, so neither signal’s</w:t>
-      </w:r>
-      <w:r>
-        <w:t xml:space="preserve"> </w:t>
-      </w:r>
-      <m:oMath>
-        <m:r>
-          <m:t>σ</m:t>
-        </m:r>
-      </m:oMath>
-      <w:r>
-        <w:t xml:space="preserve">-algebra refines the other’s, neither sufficiency direction holds, and</w:t>
+        <w:t xml:space="preserve">separator, or its mod-10 check. Each source states a fact the</w:t>
+      </w:r>
+      <w:r>
+        <w:t xml:space="preserve"> </w:t>
+      </w:r>
+      <w:r>
+        <w:t xml:space="preserve">other leaves out, so neither is a blurred copy of the other, and</w:t>
       </w:r>
       <w:r>
         <w:t xml:space="preserve"> </w:t>
@@ -28258,19 +27986,13 @@
         <w:t xml:space="preserve"> </w:t>
       </w:r>
       <w:r>
-        <w:t xml:space="preserve">are</w:t>
-      </w:r>
-      <w:r>
-        <w:t xml:space="preserve"> </w:t>
-      </w:r>
-      <w:r>
-        <w:t xml:space="preserve">Blackwell-incomparable. This is the concrete instance of the coordinate/projection construction of</w:t>
-      </w:r>
-      <w:r>
-        <w:t xml:space="preserve"> </w:t>
-      </w:r>
-      <w:r>
-        <w:t xml:space="preserve">§</w:t>
+        <w:t xml:space="preserve">are incomparable. This</w:t>
+      </w:r>
+      <w:r>
+        <w:t xml:space="preserve"> </w:t>
+      </w:r>
+      <w:r>
+        <w:t xml:space="preserve">is exactly the coordinate picture of §</w:t>
       </w:r>
       <w:hyperlink w:anchor="sec:formalization">
         <w:r>
@@ -28327,13 +28049,13 @@
         <w:t xml:space="preserve"> </w:t>
       </w:r>
       <w:r>
-        <w:t xml:space="preserve">are deterministic experiments observing distinct,</w:t>
-      </w:r>
-      <w:r>
-        <w:t xml:space="preserve"> </w:t>
-      </w:r>
-      <w:r>
-        <w:t xml:space="preserve">mutually non-refining projections of</w:t>
+        <w:t xml:space="preserve">reveal different,</w:t>
+      </w:r>
+      <w:r>
+        <w:t xml:space="preserve"> </w:t>
+      </w:r>
+      <w:r>
+        <w:t xml:space="preserve">non-overlapping facts about</w:t>
       </w:r>
       <w:r>
         <w:t xml:space="preserve"> </w:t>
@@ -28376,7 +28098,7 @@
         <w:pStyle w:val="FirstParagraph"/>
       </w:pPr>
       <w:r>
-        <w:t xml:space="preserve">The experiment’s signature is a</w:t>
+        <w:t xml:space="preserve">The key pattern is a</w:t>
       </w:r>
       <w:r>
         <w:t xml:space="preserve"> </w:t>
@@ -28389,10 +28111,7 @@
         <w:t xml:space="preserve">double crossover</w:t>
       </w:r>
       <w:r>
-        <w:t xml:space="preserve"> </w:t>
-      </w:r>
-      <w:r>
-        <w:t xml:space="preserve">measured against a</w:t>
+        <w:t xml:space="preserve">, measured against a</w:t>
       </w:r>
       <w:r>
         <w:t xml:space="preserve"> </w:t>
@@ -28407,13 +28126,13 @@
         <w:t xml:space="preserve"> </w:t>
       </w:r>
       <w:r>
-        <w:t xml:space="preserve">baseline (no</w:t>
-      </w:r>
-      <w:r>
-        <w:t xml:space="preserve"> </w:t>
-      </w:r>
-      <w:r>
-        <w:t xml:space="preserve">convention supplied):</w:t>
+        <w:t xml:space="preserve">baseline (no note</w:t>
+      </w:r>
+      <w:r>
+        <w:t xml:space="preserve"> </w:t>
+      </w:r>
+      <w:r>
+        <w:t xml:space="preserve">supplied):</w:t>
       </w:r>
       <w:r>
         <w:t xml:space="preserve"> </w:t>
@@ -28436,7 +28155,7 @@
         <w:t xml:space="preserve"> </w:t>
       </w:r>
       <w:r>
-        <w:t xml:space="preserve">lifts the API tasks but</w:t>
+        <w:t xml:space="preserve">raises the API tasks but</w:t>
       </w:r>
       <w:r>
         <w:t xml:space="preserve"> </w:t>
@@ -28475,13 +28194,13 @@
         <w:t xml:space="preserve"> </w:t>
       </w:r>
       <w:r>
-        <w:t xml:space="preserve">lifts</w:t>
-      </w:r>
-      <w:r>
-        <w:t xml:space="preserve"> </w:t>
-      </w:r>
-      <w:r>
-        <w:t xml:space="preserve">the encoding task but</w:t>
+        <w:t xml:space="preserve">raises the</w:t>
+      </w:r>
+      <w:r>
+        <w:t xml:space="preserve"> </w:t>
+      </w:r>
+      <w:r>
+        <w:t xml:space="preserve">encoding task but</w:t>
       </w:r>
       <w:r>
         <w:t xml:space="preserve"> </w:t>
@@ -28497,7 +28216,7 @@
         <w:t xml:space="preserve"> </w:t>
       </w:r>
       <w:r>
-        <w:t xml:space="preserve">the API tasks. If the encoding family were merely</w:t>
+        <w:t xml:space="preserve">the API tasks. If encoding were simply</w:t>
       </w:r>
       <w:r>
         <w:t xml:space="preserve"> </w:t>
@@ -28526,7 +28245,13 @@
         <w:t xml:space="preserve"> </w:t>
       </w:r>
       <w:r>
-        <w:t xml:space="preserve">would not lift it and</w:t>
+        <w:t xml:space="preserve">would fail to</w:t>
+      </w:r>
+      <w:r>
+        <w:t xml:space="preserve"> </w:t>
+      </w:r>
+      <w:r>
+        <w:t xml:space="preserve">help it and</w:t>
       </w:r>
       <w:r>
         <w:t xml:space="preserve"> </w:t>
@@ -28549,34 +28274,19 @@
         <w:t xml:space="preserve"> </w:t>
       </w:r>
       <w:r>
-        <w:t xml:space="preserve">would still have to lift its own family from the same floor. Matched</w:t>
-      </w:r>
-      <w:r>
-        <w:t xml:space="preserve"> </w:t>
-      </w:r>
-      <w:r>
-        <w:rPr>
-          <w:rStyle w:val="VerbatimChar"/>
-        </w:rPr>
-        <w:t xml:space="preserve">none</w:t>
-      </w:r>
-      <w:r>
-        <w:t xml:space="preserve"> </w:t>
-      </w:r>
-      <w:r>
-        <w:t xml:space="preserve">baselines that floor near zero on both families therefore establish equal intrinsic</w:t>
-      </w:r>
-      <w:r>
-        <w:t xml:space="preserve"> </w:t>
-      </w:r>
-      <w:r>
-        <w:t xml:space="preserve">hardness, so any divergence is attributable to the matching private fact, not to a difficulty</w:t>
-      </w:r>
-      <w:r>
-        <w:t xml:space="preserve"> </w:t>
-      </w:r>
-      <w:r>
-        <w:t xml:space="preserve">asymmetry.</w:t>
+        <w:t xml:space="preserve">would still have to raise it from the same floor. Because both baselines sit near</w:t>
+      </w:r>
+      <w:r>
+        <w:t xml:space="preserve"> </w:t>
+      </w:r>
+      <w:r>
+        <w:t xml:space="preserve">zero, the two task families are equally hard on their own, so any difference comes from the matching</w:t>
+      </w:r>
+      <w:r>
+        <w:t xml:space="preserve"> </w:t>
+      </w:r>
+      <w:r>
+        <w:t xml:space="preserve">private fact, not from one family being harder.</w:t>
       </w:r>
     </w:p>
     <w:bookmarkEnd w:id="65"/>
@@ -43394,7 +43104,7 @@
         <w:pStyle w:val="BodyText"/>
       </w:pPr>
       <w:r>
-        <w:t xml:space="preserve">Three scope statements govern everything above.</w:t>
+        <w:t xml:space="preserve">Three limits of scope govern everything above.</w:t>
       </w:r>
       <w:r>
         <w:t xml:space="preserve"> </w:t>
@@ -43410,19 +43120,19 @@
         <w:t xml:space="preserve"> </w:t>
       </w:r>
       <w:r>
-        <w:t xml:space="preserve">The theorems concern</w:t>
-      </w:r>
-      <w:r>
-        <w:t xml:space="preserve"> </w:t>
-      </w:r>
-      <w:r>
-        <w:t xml:space="preserve">the idealized Bayes-optimal user of a source; every measured quantity is PASS at one fixed,</w:t>
-      </w:r>
-      <w:r>
-        <w:t xml:space="preserve"> </w:t>
-      </w:r>
-      <w:r>
-        <w:t xml:space="preserve">sub-optimal rule</w:t>
+        <w:t xml:space="preserve">The theorems are about</w:t>
+      </w:r>
+      <w:r>
+        <w:t xml:space="preserve"> </w:t>
+      </w:r>
+      <w:r>
+        <w:t xml:space="preserve">the ideal user of a source; every number we measure is the pass rate of one fixed, non-optimal</w:t>
+      </w:r>
+      <w:r>
+        <w:t xml:space="preserve"> </w:t>
+      </w:r>
+      <w:r>
+        <w:t xml:space="preserve">rule</w:t>
       </w:r>
       <w:r>
         <w:t xml:space="preserve"> </w:t>
@@ -43456,61 +43166,19 @@
         <w:t xml:space="preserve"> </w:t>
       </w:r>
       <w:r>
-        <w:t xml:space="preserve">supplies the direction the program needs,</w:t>
-      </w:r>
-      <w:r>
-        <w:t xml:space="preserve"> </w:t>
-      </w:r>
-      <w:r>
-        <w:t xml:space="preserve">certified</w:t>
-      </w:r>
-      <w:r>
-        <w:t xml:space="preserve"> </w:t>
-      </w:r>
-      <m:oMath>
-        <m:r>
-          <m:rPr>
-            <m:sty m:val="p"/>
-          </m:rPr>
-          <m:t>(</m:t>
-        </m:r>
-        <m:r>
-          <m:t>M</m:t>
-        </m:r>
-        <m:r>
-          <m:rPr>
-            <m:sty m:val="p"/>
-          </m:rPr>
-          <m:t>,</m:t>
-        </m:r>
-        <m:r>
-          <m:rPr>
-            <m:scr m:val="script"/>
-            <m:sty m:val="p"/>
-          </m:rPr>
-          <m:t>D</m:t>
-        </m:r>
-        <m:r>
-          <m:rPr>
-            <m:sty m:val="p"/>
-          </m:rPr>
-          <m:t>)</m:t>
-        </m:r>
-      </m:oMath>
-      <w:r>
-        <w:t xml:space="preserve">-incomparability on separated decisive coordinates with capped</w:t>
-      </w:r>
-      <w:r>
-        <w:t xml:space="preserve"> </w:t>
-      </w:r>
-      <w:r>
-        <w:t xml:space="preserve">deprived-side value implies Blackwell incomparability, and the converse requires the</w:t>
-      </w:r>
-      <w:r>
-        <w:t xml:space="preserve"> </w:t>
-      </w:r>
-      <w:r>
-        <w:t xml:space="preserve">value-attainment hypothesis (Assumption </w:t>
+        <w:t xml:space="preserve">connects the two in the direction we need: a certified</w:t>
+      </w:r>
+      <w:r>
+        <w:t xml:space="preserve"> </w:t>
+      </w:r>
+      <w:r>
+        <w:t xml:space="preserve">crossover on tasks where each source supplies its own decisive fact implies genuine Blackwell</w:t>
+      </w:r>
+      <w:r>
+        <w:t xml:space="preserve"> </w:t>
+      </w:r>
+      <w:r>
+        <w:t xml:space="preserve">incomparability, and the reverse needs an extra assumption (Assumption </w:t>
       </w:r>
       <w:hyperlink w:anchor="ass:attain">
         <w:r>
@@ -43521,48 +43189,19 @@
         </w:r>
       </w:hyperlink>
       <w:r>
-        <w:t xml:space="preserve">); both hypotheses are enforced by the</w:t>
-      </w:r>
-      <w:r>
-        <w:t xml:space="preserve"> </w:t>
-      </w:r>
-      <w:r>
-        <w:t xml:space="preserve">task design and checked against the measured floors; we therefore read the contribution as a</w:t>
-      </w:r>
-      <w:r>
-        <w:t xml:space="preserve"> </w:t>
-      </w:r>
-      <m:oMath>
-        <m:sSub>
-          <m:e>
-            <m:r>
-              <m:t>δ</m:t>
-            </m:r>
-          </m:e>
-          <m:sub>
-            <m:r>
-              <m:t>M</m:t>
-            </m:r>
-          </m:sub>
-        </m:sSub>
-      </m:oMath>
-      <w:r>
-        <w:t xml:space="preserve">-restricted,</w:t>
-      </w:r>
-      <w:r>
-        <w:t xml:space="preserve"> </w:t>
-      </w:r>
-      <m:oMath>
-        <m:r>
-          <m:rPr>
-            <m:scr m:val="script"/>
-            <m:sty m:val="p"/>
-          </m:rPr>
-          <m:t>D</m:t>
-        </m:r>
-      </m:oMath>
-      <w:r>
-        <w:t xml:space="preserve">-restricted incomparability statement that</w:t>
+        <w:t xml:space="preserve">) that our</w:t>
+      </w:r>
+      <w:r>
+        <w:t xml:space="preserve"> </w:t>
+      </w:r>
+      <w:r>
+        <w:t xml:space="preserve">task design builds in and our measurements confirm. So we read the result as a statement about the</w:t>
+      </w:r>
+      <w:r>
+        <w:t xml:space="preserve"> </w:t>
+      </w:r>
+      <w:r>
+        <w:t xml:space="preserve">fixed model on a fixed battery that</w:t>
       </w:r>
       <w:r>
         <w:t xml:space="preserve"> </w:t>
@@ -43578,13 +43217,13 @@
         <w:t xml:space="preserve"> </w:t>
       </w:r>
       <w:r>
-        <w:t xml:space="preserve">the</w:t>
-      </w:r>
-      <w:r>
-        <w:t xml:space="preserve"> </w:t>
-      </w:r>
-      <w:r>
-        <w:t xml:space="preserve">structural conclusion via the bridge rather than assuming it.</w:t>
+        <w:t xml:space="preserve">the structural conclusion through the bridge</w:t>
+      </w:r>
+      <w:r>
+        <w:t xml:space="preserve"> </w:t>
+      </w:r>
+      <w:r>
+        <w:t xml:space="preserve">rather than assuming it.</w:t>
       </w:r>
       <w:r>
         <w:t xml:space="preserve"> </w:t>
@@ -43628,32 +43267,46 @@
         <w:t xml:space="preserve"> </w:t>
       </w:r>
       <w:r>
-        <w:t xml:space="preserve">performs no garbling minimization and ranges over a fixed finite battery; it is a</w:t>
-      </w:r>
-      <w:r>
-        <w:t xml:space="preserve"> </w:t>
-      </w:r>
-      <w:r>
-        <w:t xml:space="preserve">one-sided, decision-restricted</w:t>
-      </w:r>
-      <w:r>
-        <w:t xml:space="preserve"> </w:t>
-      </w:r>
-      <w:r>
-        <w:rPr>
-          <w:i/>
-          <w:iCs/>
-        </w:rPr>
-        <w:t xml:space="preserve">value-deficiency surrogate</w:t>
-      </w:r>
-      <w:r>
-        <w:t xml:space="preserve">, not a Le Cam deficiency, and no</w:t>
-      </w:r>
-      <w:r>
-        <w:t xml:space="preserve"> </w:t>
-      </w:r>
-      <w:r>
-        <w:t xml:space="preserve">two-sided inequality relates the two for a fixed sub-optimal rule (Remark </w:t>
+        <w:t xml:space="preserve">does no minimization</w:t>
+      </w:r>
+      <w:r>
+        <w:t xml:space="preserve"> </w:t>
+      </w:r>
+      <w:r>
+        <w:t xml:space="preserve">over garblings and ranges over a fixed set of tasks; it is a one-sided</w:t>
+      </w:r>
+      <w:r>
+        <w:t xml:space="preserve"> </w:t>
+      </w:r>
+      <w:r>
+        <w:rPr>
+          <w:i/>
+          <w:iCs/>
+        </w:rPr>
+        <w:t xml:space="preserve">value-deficiency</w:t>
+      </w:r>
+      <w:r>
+        <w:rPr>
+          <w:i/>
+          <w:iCs/>
+        </w:rPr>
+        <w:t xml:space="preserve"> </w:t>
+      </w:r>
+      <w:r>
+        <w:rPr>
+          <w:i/>
+          <w:iCs/>
+        </w:rPr>
+        <w:t xml:space="preserve">surrogate</w:t>
+      </w:r>
+      <w:r>
+        <w:t xml:space="preserve">, not a Le Cam deficiency, and the two are not interchangeable for a fixed rule</w:t>
+      </w:r>
+      <w:r>
+        <w:t xml:space="preserve"> </w:t>
+      </w:r>
+      <w:r>
+        <w:t xml:space="preserve">(Remark </w:t>
       </w:r>
       <w:hyperlink w:anchor="rem:notlecam">
         <w:r>
@@ -43664,19 +43317,13 @@
         </w:r>
       </w:hyperlink>
       <w:r>
-        <w:t xml:space="preserve">).</w:t>
-      </w:r>
-      <w:r>
-        <w:t xml:space="preserve"> </w:t>
-      </w:r>
-      <w:r>
-        <w:t xml:space="preserve">What is rigorous is the certificate, which we regard as the most robust contribution and which</w:t>
-      </w:r>
-      <w:r>
-        <w:t xml:space="preserve"> </w:t>
-      </w:r>
-      <w:r>
-        <w:t xml:space="preserve">survives independently of the deficiency analogy.</w:t>
+        <w:t xml:space="preserve">). What is rigorous is the certificate, which we regard as the most</w:t>
+      </w:r>
+      <w:r>
+        <w:t xml:space="preserve"> </w:t>
+      </w:r>
+      <w:r>
+        <w:t xml:space="preserve">robust part and which stands whether or not the deficiency analogy holds.</w:t>
       </w:r>
       <w:r>
         <w:t xml:space="preserve"> </w:t>
@@ -43686,73 +43333,39 @@
           <w:b/>
           <w:bCs/>
         </w:rPr>
-        <w:t xml:space="preserve">(iii) What the certificate covers.</w:t>
-      </w:r>
-      <w:r>
-        <w:t xml:space="preserve"> </w:t>
-      </w:r>
-      <w:r>
-        <w:t xml:space="preserve">Its</w:t>
-      </w:r>
-      <w:r>
-        <w:t xml:space="preserve"> </w:t>
-      </w:r>
-      <w:r>
-        <w:t xml:space="preserve">correctness rests on paying the</w:t>
-      </w:r>
-      <w:r>
-        <w:t xml:space="preserve"> </w:t>
-      </w:r>
-      <m:oMath>
-        <m:sSub>
-          <m:e>
-            <m:r>
-              <m:rPr>
-                <m:sty m:val="p"/>
-              </m:rPr>
-              <m:t>sup</m:t>
-            </m:r>
-          </m:e>
-          <m:sub>
-            <m:r>
-              <m:t>T</m:t>
-            </m:r>
-          </m:sub>
-        </m:sSub>
-      </m:oMath>
-      <w:r>
-        <w:t xml:space="preserve"> </w:t>
-      </w:r>
-      <w:r>
-        <w:t xml:space="preserve">multiplicity via exact intervals and a union bound; its</w:t>
-      </w:r>
-      <w:r>
-        <w:t xml:space="preserve"> </w:t>
-      </w:r>
-      <w:r>
-        <w:t xml:space="preserve">effective support is small (one API cell and one encoding cell carry pair-1 incomparability), each</w:t>
-      </w:r>
-      <w:r>
-        <w:t xml:space="preserve"> </w:t>
-      </w:r>
-      <w:r>
-        <w:t xml:space="preserve">certified claim is controlled</w:t>
-      </w:r>
-      <w:r>
-        <w:t xml:space="preserve"> </w:t>
-      </w:r>
-      <w:r>
-        <w:rPr>
-          <w:i/>
-          <w:iCs/>
-        </w:rPr>
-        <w:t xml:space="preserve">marginally</w:t>
-      </w:r>
-      <w:r>
-        <w:t xml:space="preserve"> </w:t>
-      </w:r>
-      <w:r>
-        <w:t xml:space="preserve">at</w:t>
+        <w:t xml:space="preserve">(iii) What the</w:t>
+      </w:r>
+      <w:r>
+        <w:rPr>
+          <w:b/>
+          <w:bCs/>
+        </w:rPr>
+        <w:t xml:space="preserve"> </w:t>
+      </w:r>
+      <w:r>
+        <w:rPr>
+          <w:b/>
+          <w:bCs/>
+        </w:rPr>
+        <w:t xml:space="preserve">certificate covers.</w:t>
+      </w:r>
+      <w:r>
+        <w:t xml:space="preserve"> </w:t>
+      </w:r>
+      <w:r>
+        <w:t xml:space="preserve">It is correct because it pays for picking the worst task with exact intervals</w:t>
+      </w:r>
+      <w:r>
+        <w:t xml:space="preserve"> </w:t>
+      </w:r>
+      <w:r>
+        <w:t xml:space="preserve">and a union bound; its support is small (one API task and one encoding task carry the pair-1</w:t>
+      </w:r>
+      <w:r>
+        <w:t xml:space="preserve"> </w:t>
+      </w:r>
+      <w:r>
+        <w:t xml:space="preserve">result), each claim is controlled on its own at level</w:t>
       </w:r>
       <w:r>
         <w:t xml:space="preserve"> </w:t>
@@ -43766,7 +43379,7 @@
         <w:t xml:space="preserve"> </w:t>
       </w:r>
       <w:r>
-        <w:t xml:space="preserve">rather than jointly across claims</w:t>
+        <w:t xml:space="preserve">rather than all at once</w:t>
       </w:r>
       <w:r>
         <w:t xml:space="preserve"> </w:t>
@@ -43783,7 +43396,7 @@
         </w:r>
       </w:hyperlink>
       <w:r>
-        <w:t xml:space="preserve">), and we describe</w:t>
+        <w:t xml:space="preserve">), and we call</w:t>
       </w:r>
       <w:r>
         <w:t xml:space="preserve"> </w:t>
@@ -43801,13 +43414,7 @@
         <w:t xml:space="preserve"> </w:t>
       </w:r>
       <w:r>
-        <w:t xml:space="preserve">as a fixed adversarial battery, not a task</w:t>
-      </w:r>
-      <w:r>
-        <w:t xml:space="preserve"> </w:t>
-      </w:r>
-      <w:r>
-        <w:t xml:space="preserve">distribution.</w:t>
+        <w:t xml:space="preserve">a fixed adversarial battery, not a task distribution.</w:t>
       </w:r>
     </w:p>
     <w:bookmarkEnd w:id="102"/>
@@ -47003,19 +46610,13 @@
         <w:pStyle w:val="FirstParagraph"/>
       </w:pPr>
       <w:r>
-        <w:t xml:space="preserve">Context selection for language models is, structurally, a partial-order problem rather than a scalar</w:t>
-      </w:r>
-      <w:r>
-        <w:t xml:space="preserve"> </w:t>
-      </w:r>
-      <w:r>
-        <w:t xml:space="preserve">one. When two context sources are Blackwell-incomparable, no scalar score can rank them correctly for</w:t>
-      </w:r>
-      <w:r>
-        <w:t xml:space="preserve"> </w:t>
-      </w:r>
-      <w:r>
-        <w:t xml:space="preserve">all tasks (Theorem </w:t>
+        <w:t xml:space="preserve">Context selection is, at bottom, a partial-order problem, not a scalar one. When two sources are</w:t>
+      </w:r>
+      <w:r>
+        <w:t xml:space="preserve"> </w:t>
+      </w:r>
+      <w:r>
+        <w:t xml:space="preserve">incomparable, no scalar score can rank them correctly for all tasks (Theorem </w:t>
       </w:r>
       <w:hyperlink w:anchor="thm:incomparable">
         <w:r>
@@ -47026,31 +46627,31 @@
         </w:r>
       </w:hyperlink>
       <w:r>
-        <w:t xml:space="preserve">), which gives a formal account of the field’s</w:t>
-      </w:r>
-      <w:r>
-        <w:t xml:space="preserve"> </w:t>
-      </w:r>
-      <w:r>
-        <w:t xml:space="preserve">“relevance does</w:t>
-      </w:r>
-      <w:r>
-        <w:t xml:space="preserve"> </w:t>
-      </w:r>
-      <w:r>
-        <w:t xml:space="preserve">not transfer”</w:t>
-      </w:r>
-      <w:r>
-        <w:t xml:space="preserve"> </w:t>
-      </w:r>
-      <w:r>
-        <w:t xml:space="preserve">folklore. We made the order measurable with a decision-restricted value-deficiency</w:t>
-      </w:r>
-      <w:r>
-        <w:t xml:space="preserve"> </w:t>
-      </w:r>
-      <w:r>
-        <w:t xml:space="preserve">surrogate</w:t>
+        <w:t xml:space="preserve">),</w:t>
+      </w:r>
+      <w:r>
+        <w:t xml:space="preserve"> </w:t>
+      </w:r>
+      <w:r>
+        <w:t xml:space="preserve">which explains the field’s</w:t>
+      </w:r>
+      <w:r>
+        <w:t xml:space="preserve"> </w:t>
+      </w:r>
+      <w:r>
+        <w:t xml:space="preserve">“relevance does not transfer”</w:t>
+      </w:r>
+      <w:r>
+        <w:t xml:space="preserve"> </w:t>
+      </w:r>
+      <w:r>
+        <w:t xml:space="preserve">folklore. We made the order measurable</w:t>
+      </w:r>
+      <w:r>
+        <w:t xml:space="preserve"> </w:t>
+      </w:r>
+      <w:r>
+        <w:t xml:space="preserve">with a value-deficiency surrogate</w:t>
       </w:r>
       <w:r>
         <w:t xml:space="preserve"> </w:t>
@@ -47084,19 +46685,13 @@
         <w:t xml:space="preserve"> </w:t>
       </w:r>
       <w:r>
-        <w:t xml:space="preserve">equipped with a distribution-free uniform Clopper–Pearson/Bonferroni</w:t>
-      </w:r>
-      <w:r>
-        <w:t xml:space="preserve"> </w:t>
-      </w:r>
-      <w:r>
-        <w:t xml:space="preserve">certificate, and we instantiated the theory on six models across four vendors. On every model we certify</w:t>
-      </w:r>
-      <w:r>
-        <w:t xml:space="preserve"> </w:t>
-      </w:r>
-      <w:r>
-        <w:t xml:space="preserve">(</w:t>
+        <w:t xml:space="preserve">and a distribution-free certificate, and we ran</w:t>
+      </w:r>
+      <w:r>
+        <w:t xml:space="preserve"> </w:t>
+      </w:r>
+      <w:r>
+        <w:t xml:space="preserve">the theory on six models across four vendors. On every model we certify (</w:t>
       </w:r>
       <m:oMath>
         <m:r>
@@ -47116,19 +46711,25 @@
         </m:r>
       </m:oMath>
       <w:r>
-        <w:t xml:space="preserve">) that two private context sources are empirically incomparable; on every model a real</w:t>
-      </w:r>
-      <w:r>
-        <w:t xml:space="preserve"> </w:t>
-      </w:r>
-      <w:r>
-        <w:t xml:space="preserve">query-conditioned lexical relevance score mis-ranks them; and on five of six models we certify a superset</w:t>
-      </w:r>
-      <w:r>
-        <w:t xml:space="preserve"> </w:t>
-      </w:r>
-      <w:r>
-        <w:t xml:space="preserve">of a sufficient source sharply degrading PASS (a collapse as deep as</w:t>
+        <w:t xml:space="preserve">) that two</w:t>
+      </w:r>
+      <w:r>
+        <w:t xml:space="preserve"> </w:t>
+      </w:r>
+      <w:r>
+        <w:t xml:space="preserve">private sources are incomparable; on every model a real relevance score ranks them the wrong way;</w:t>
+      </w:r>
+      <w:r>
+        <w:t xml:space="preserve"> </w:t>
+      </w:r>
+      <w:r>
+        <w:t xml:space="preserve">and on five of six we certify that adding a strictly larger source sharply lowers the pass rate (as</w:t>
+      </w:r>
+      <w:r>
+        <w:t xml:space="preserve"> </w:t>
+      </w:r>
+      <w:r>
+        <w:t xml:space="preserve">deep as</w:t>
       </w:r>
       <w:r>
         <w:t xml:space="preserve"> </w:t>
@@ -47160,60 +46761,25 @@
         </m:r>
       </m:oMath>
       <w:r>
-        <w:t xml:space="preserve">), a certified</w:t>
-      </w:r>
-      <w:r>
-        <w:t xml:space="preserve"> </w:t>
-      </w:r>
-      <w:r>
-        <w:t xml:space="preserve">falsification of superset-monotonicity for these fixed rules. The value of private context</w:t>
-      </w:r>
-      <w:r>
-        <w:t xml:space="preserve"> </w:t>
-      </w:r>
-      <m:oMath>
-        <m:r>
-          <m:t>I</m:t>
-        </m:r>
-        <m:r>
-          <m:rPr>
-            <m:sty m:val="p"/>
-          </m:rPr>
-          <m:t>(</m:t>
-        </m:r>
-        <m:r>
-          <m:t>S</m:t>
-        </m:r>
-        <m:r>
-          <m:rPr>
-            <m:sty m:val="p"/>
-          </m:rPr>
-          <m:t>;</m:t>
-        </m:r>
-        <m:r>
-          <m:t>W</m:t>
-        </m:r>
-        <m:r>
-          <m:rPr>
-            <m:sty m:val="p"/>
-          </m:rPr>
-          <m:t>∣</m:t>
-        </m:r>
-        <m:r>
-          <m:t>θ</m:t>
-        </m:r>
-        <m:r>
-          <m:rPr>
-            <m:sty m:val="p"/>
-          </m:rPr>
-          <m:t>)</m:t>
-        </m:r>
-      </m:oMath>
-      <w:r>
-        <w:t xml:space="preserve"> </w:t>
-      </w:r>
-      <w:r>
-        <w:t xml:space="preserve">is itself model-relative, forming a continuous</w:t>
+        <w:t xml:space="preserve">), which no</w:t>
+      </w:r>
+      <w:r>
+        <w:t xml:space="preserve"> </w:t>
+      </w:r>
+      <w:r>
+        <w:t xml:space="preserve">“more-is-better”</w:t>
+      </w:r>
+      <w:r>
+        <w:t xml:space="preserve"> </w:t>
+      </w:r>
+      <w:r>
+        <w:t xml:space="preserve">scalar can predict. How much a private source</w:t>
+      </w:r>
+      <w:r>
+        <w:t xml:space="preserve"> </w:t>
+      </w:r>
+      <w:r>
+        <w:t xml:space="preserve">is worth turns out to depend on the model: guessability runs from</w:t>
       </w:r>
       <w:r>
         <w:t xml:space="preserve"> </w:t>
@@ -47230,7 +46796,13 @@
         </m:r>
       </m:oMath>
       <w:r>
-        <w:t xml:space="preserve">–</w:t>
+        <w:t xml:space="preserve"> </w:t>
+      </w:r>
+      <w:r>
+        <w:t xml:space="preserve">to</w:t>
+      </w:r>
+      <w:r>
+        <w:t xml:space="preserve"> </w:t>
       </w:r>
       <m:oMath>
         <m:r>
@@ -47247,13 +46819,13 @@
         <w:t xml:space="preserve"> </w:t>
       </w:r>
       <w:r>
-        <w:t xml:space="preserve">spectrum that tracks</w:t>
-      </w:r>
-      <w:r>
-        <w:t xml:space="preserve"> </w:t>
-      </w:r>
-      <w:r>
-        <w:t xml:space="preserve">vendor training rather than raw capability.</w:t>
+        <w:t xml:space="preserve">across vendors and</w:t>
+      </w:r>
+      <w:r>
+        <w:t xml:space="preserve"> </w:t>
+      </w:r>
+      <w:r>
+        <w:t xml:space="preserve">tracks a vendor’s training rather than raw capability.</w:t>
       </w:r>
     </w:p>
     <w:p>

</xml_diff>

<commit_message>
Reduce AI-writing tells: trim emphatic-filler repetition (genuinely 11->6, exactly-the), convert prose em-dashes to house comma/paren style
</commit_message>
<xml_diff>
--- a/paper/blackwell-paper.docx
+++ b/paper/blackwell-paper.docx
@@ -5624,7 +5624,7 @@
         <w:t xml:space="preserve"> </w:t>
       </w:r>
       <w:r>
-        <w:t xml:space="preserve">structure in the order. The genuinely new pieces are the framing, the surrogate, and the</w:t>
+        <w:t xml:space="preserve">structure in the order. The new pieces are the framing, the surrogate, and the</w:t>
       </w:r>
       <w:r>
         <w:t xml:space="preserve"> </w:t>
@@ -9097,7 +9097,7 @@
         <w:t xml:space="preserve"> </w:t>
       </w:r>
       <w:r>
-        <w:t xml:space="preserve">experiments applies to them directly. We state the order, record that it is genuinely partial</w:t>
+        <w:t xml:space="preserve">experiments applies to them directly. We state the order, record that it is partial</w:t>
       </w:r>
       <w:r>
         <w:t xml:space="preserve"> </w:t>
@@ -14019,7 +14019,7 @@
         <w:t xml:space="preserve"> </w:t>
       </w:r>
       <w:r>
-        <w:t xml:space="preserve">source reveals a coordinate the losing source genuinely lacks; otherwise the crossover may</w:t>
+        <w:t xml:space="preserve">source reveals a coordinate the losing source lacks; otherwise the crossover may</w:t>
       </w:r>
       <w:r>
         <w:t xml:space="preserve"> </w:t>
@@ -14992,7 +14992,7 @@
         <w:t xml:space="preserve"> </w:t>
       </w:r>
       <w:r>
-        <w:t xml:space="preserve">showed the order is genuinely partial; we now establish the consequence that</w:t>
+        <w:t xml:space="preserve">showed the order is partial; we now establish the consequence that</w:t>
       </w:r>
       <w:r>
         <w:t xml:space="preserve"> </w:t>
@@ -26572,7 +26572,7 @@
         <w:pStyle w:val="BodyText"/>
       </w:pPr>
       <w:r>
-        <w:t xml:space="preserve">The two verifications have genuinely different effective-</w:t>
+        <w:t xml:space="preserve">The two verifications have different effective-</w:t>
       </w:r>
       <m:oMath>
         <m:r>
@@ -33786,7 +33786,7 @@
         <w:t xml:space="preserve"> </w:t>
       </w:r>
       <w:r>
-        <w:t xml:space="preserve">there too, confirming both that the convention is genuinely</w:t>
+        <w:t xml:space="preserve">there too, confirming both that the convention is</w:t>
       </w:r>
       <w:r>
         <w:t xml:space="preserve"> </w:t>
@@ -41199,7 +41199,7 @@
         <w:t xml:space="preserve"> </w:t>
       </w:r>
       <w:r>
-        <w:t xml:space="preserve">order over them is genuinely partial, and any scalar score, by imposing a total order, must mis-rank</w:t>
+        <w:t xml:space="preserve">order over them is partial, and any scalar score, by imposing a total order, must mis-rank</w:t>
       </w:r>
       <w:r>
         <w:t xml:space="preserve"> </w:t>
@@ -42444,7 +42444,7 @@
         <w:t xml:space="preserve"> </w:t>
       </w:r>
       <w:r>
-        <w:t xml:space="preserve">floors near zero. This is exactly the set of cells that are unguessable for the model under test, which</w:t>
+        <w:t xml:space="preserve">floors near zero. This is precisely the set of cells unguessable for the model under test, which</w:t>
       </w:r>
       <w:r>
         <w:t xml:space="preserve"> </w:t>
@@ -50280,7 +50280,7 @@
         <w:pStyle w:val="FirstParagraph"/>
       </w:pPr>
       <w:r>
-        <w:t xml:space="preserve">The two verifications have genuinely different effective-</w:t>
+        <w:t xml:space="preserve">The two verifications have different effective-</w:t>
       </w:r>
       <m:oMath>
         <m:r>
@@ -55619,13 +55619,13 @@
         <w:t xml:space="preserve"> </w:t>
       </w:r>
       <w:r>
-        <w:t xml:space="preserve">are no modeled or aspirational figures. The complete artifact bundle—the measurement harness, the</w:t>
-      </w:r>
-      <w:r>
-        <w:t xml:space="preserve"> </w:t>
-      </w:r>
-      <w:r>
-        <w:t xml:space="preserve">executable verifiers, and every per-model run log and result JSON cited below—is available at</w:t>
+        <w:t xml:space="preserve">are no modeled or aspirational figures. The complete artifact bundle (the measurement harness, the</w:t>
+      </w:r>
+      <w:r>
+        <w:t xml:space="preserve"> </w:t>
+      </w:r>
+      <w:r>
+        <w:t xml:space="preserve">executable verifiers, and every per-model run log and result JSON cited below) is available at</w:t>
       </w:r>
       <w:r>
         <w:t xml:space="preserve"> </w:t>

</xml_diff>

<commit_message>
Title to sentence case: 'Context selection is a partial order: A Blackwell framework and verified LLM evidence'
</commit_message>
<xml_diff>
--- a/paper/blackwell-paper.docx
+++ b/paper/blackwell-paper.docx
@@ -7,13 +7,13 @@
         <w:pStyle w:val="Title"/>
       </w:pPr>
       <w:r>
-        <w:t xml:space="preserve">Context Selection Is a Partial Order:</w:t>
+        <w:t xml:space="preserve">Context selection is a partial order:</w:t>
       </w:r>
       <w:r>
         <w:br/>
       </w:r>
       <w:r>
-        <w:t xml:space="preserve">A Blackwell Framework and Verified LLM Evidence</w:t>
+        <w:t xml:space="preserve">A Blackwell framework and verified LLM evidence</w:t>
       </w:r>
     </w:p>
     <w:p>

</xml_diff>

<commit_message>
Fix W1+ dominance statement (dominates both W1 and W2, not just W2); gloss ++ as concatenation at first use; soften confound-defense baseline claim to acknowledge leaky priors (cross-ref Table 5)
</commit_message>
<xml_diff>
--- a/paper/blackwell-paper.docx
+++ b/paper/blackwell-paper.docx
@@ -2360,7 +2360,79 @@
         </m:sSub>
       </m:oMath>
       <w:r>
-        <w:t xml:space="preserve">,</w:t>
+        <w:t xml:space="preserve"> </w:t>
+      </w:r>
+      <w:r>
+        <w:t xml:space="preserve">(the operator</w:t>
+      </w:r>
+      <w:r>
+        <w:t xml:space="preserve"> </w:t>
+      </w:r>
+      <m:oMath>
+        <m:r>
+          <m:t> </m:t>
+        </m:r>
+        <m:r>
+          <m:rPr>
+            <m:sty m:val="p"/>
+          </m:rPr>
+          <m:t>+</m:t>
+        </m:r>
+        <m:r>
+          <m:rPr>
+            <m:sty m:val="p"/>
+          </m:rPr>
+          <m:t>+</m:t>
+        </m:r>
+        <m:r>
+          <m:t> </m:t>
+        </m:r>
+      </m:oMath>
+      <w:r>
+        <w:t xml:space="preserve"> </w:t>
+      </w:r>
+      <w:r>
+        <w:t xml:space="preserve">is text concatenation:</w:t>
+      </w:r>
+      <w:r>
+        <w:t xml:space="preserve"> </w:t>
+      </w:r>
+      <m:oMath>
+        <m:sSub>
+          <m:e>
+            <m:r>
+              <m:t>W</m:t>
+            </m:r>
+          </m:e>
+          <m:sub>
+            <m:r>
+              <m:t>2</m:t>
+            </m:r>
+          </m:sub>
+        </m:sSub>
+      </m:oMath>
+      <w:r>
+        <w:t xml:space="preserve">’s note followed by</w:t>
+      </w:r>
+      <w:r>
+        <w:t xml:space="preserve"> </w:t>
+      </w:r>
+      <m:oMath>
+        <m:sSub>
+          <m:e>
+            <m:r>
+              <m:t>W</m:t>
+            </m:r>
+          </m:e>
+          <m:sub>
+            <m:r>
+              <m:t>1</m:t>
+            </m:r>
+          </m:sub>
+        </m:sSub>
+      </m:oMath>
+      <w:r>
+        <w:t xml:space="preserve">’s),</w:t>
       </w:r>
       <w:r>
         <w:t xml:space="preserve"> </w:t>
@@ -25948,7 +26020,13 @@
         </m:sSub>
       </m:oMath>
       <w:r>
-        <w:t xml:space="preserve">’s. As a string superset of</w:t>
+        <w:t xml:space="preserve">’s. As a deterministic source revealing both coordinates, it</w:t>
+      </w:r>
+      <w:r>
+        <w:t xml:space="preserve"> </w:t>
+      </w:r>
+      <w:r>
+        <w:t xml:space="preserve">Blackwell-dominates both</w:t>
       </w:r>
       <w:r>
         <w:t xml:space="preserve"> </w:t>
@@ -25962,13 +26040,16 @@
           </m:e>
           <m:sub>
             <m:r>
-              <m:t>2</m:t>
-            </m:r>
-          </m:sub>
-        </m:sSub>
-      </m:oMath>
-      <w:r>
-        <w:t xml:space="preserve">, it Blackwell-dominates</w:t>
+              <m:t>1</m:t>
+            </m:r>
+          </m:sub>
+        </m:sSub>
+      </m:oMath>
+      <w:r>
+        <w:t xml:space="preserve"> </w:t>
+      </w:r>
+      <w:r>
+        <w:t xml:space="preserve">and</w:t>
       </w:r>
       <w:r>
         <w:t xml:space="preserve"> </w:t>
@@ -26035,13 +26116,75 @@
           </m:e>
           <m:sub>
             <m:r>
+              <m:t>1</m:t>
+            </m:r>
+          </m:sub>
+        </m:sSub>
+      </m:oMath>
+      <w:r>
+        <w:t xml:space="preserve"> </w:t>
+      </w:r>
+      <w:r>
+        <w:t xml:space="preserve">and</w:t>
+      </w:r>
+      <w:r>
+        <w:t xml:space="preserve"> </w:t>
+      </w:r>
+      <m:oMath>
+        <m:sSub>
+          <m:e>
+            <m:r>
+              <m:t>W</m:t>
+            </m:r>
+          </m:e>
+          <m:sub>
+            <m:r>
+              <m:t>1</m:t>
+            </m:r>
+            <m:r>
+              <m:rPr>
+                <m:sty m:val="p"/>
+              </m:rPr>
+              <m:t>+</m:t>
+            </m:r>
+          </m:sub>
+        </m:sSub>
+        <m:sSub>
+          <m:e>
+            <m:r>
+              <m:rPr>
+                <m:sty m:val="p"/>
+              </m:rPr>
+              <m:t>≽</m:t>
+            </m:r>
+          </m:e>
+          <m:sub>
+            <m:r>
+              <m:t>B</m:t>
+            </m:r>
+          </m:sub>
+        </m:sSub>
+        <m:sSub>
+          <m:e>
+            <m:r>
+              <m:t>W</m:t>
+            </m:r>
+          </m:e>
+          <m:sub>
+            <m:r>
               <m:t>2</m:t>
             </m:r>
           </m:sub>
         </m:sSub>
       </m:oMath>
       <w:r>
-        <w:t xml:space="preserve">); it is the anti-monotonicity / dominance probe. We also use</w:t>
+        <w:t xml:space="preserve">);</w:t>
+      </w:r>
+      <w:r>
+        <w:t xml:space="preserve"> </w:t>
+      </w:r>
+      <w:r>
+        <w:t xml:space="preserve">it is the anti-monotonicity / dominance probe. We also use</w:t>
       </w:r>
       <w:r>
         <w:t xml:space="preserve"> </w:t>
@@ -26604,19 +26747,31 @@
         <w:t xml:space="preserve"> </w:t>
       </w:r>
       <w:r>
-        <w:t xml:space="preserve">would still have to raise it from the same floor. Because both baselines sit near</w:t>
-      </w:r>
-      <w:r>
-        <w:t xml:space="preserve"> </w:t>
-      </w:r>
-      <w:r>
-        <w:t xml:space="preserve">zero, the two task families are equally hard on their own, so any difference comes from the matching</w:t>
-      </w:r>
-      <w:r>
-        <w:t xml:space="preserve"> </w:t>
-      </w:r>
-      <w:r>
-        <w:t xml:space="preserve">private fact, not from one family being harder.</w:t>
+        <w:t xml:space="preserve">would still have to raise it from the same floor. In the clean carrying cells the</w:t>
+      </w:r>
+      <w:r>
+        <w:t xml:space="preserve"> </w:t>
+      </w:r>
+      <w:r>
+        <w:t xml:space="preserve">deprived arms floor at or near the model’s guessing cap, so the two task families are equally hard on</w:t>
+      </w:r>
+      <w:r>
+        <w:t xml:space="preserve"> </w:t>
+      </w:r>
+      <w:r>
+        <w:t xml:space="preserve">their own and any difference comes from the matching private fact, not from one family being harder;</w:t>
+      </w:r>
+      <w:r>
+        <w:t xml:space="preserve"> </w:t>
+      </w:r>
+      <w:r>
+        <w:t xml:space="preserve">when a model prior leaks a convention (Table 5), we report that leakage explicitly and</w:t>
+      </w:r>
+      <w:r>
+        <w:t xml:space="preserve"> </w:t>
+      </w:r>
+      <w:r>
+        <w:t xml:space="preserve">do not use those cells for claims that require a near-zero baseline.</w:t>
       </w:r>
     </w:p>
     <w:bookmarkEnd w:id="65"/>

</xml_diff>

<commit_message>
Single-author: remove co-author Oleksandr Reminnyi from author block and PDF metadata
</commit_message>
<xml_diff>
--- a/paper/blackwell-paper.docx
+++ b/paper/blackwell-paper.docx
@@ -49,41 +49,6 @@
           <w:rStyle w:val="VerbatimChar"/>
         </w:rPr>
         <w:t xml:space="preserve">andriy.bilous@uitware.com</w:t>
-      </w:r>
-    </w:p>
-    <w:p>
-      <w:pPr>
-        <w:pStyle w:val="Author"/>
-      </w:pPr>
-      <w:r>
-        <w:t xml:space="preserve">Oleksandr Reminnyi</w:t>
-      </w:r>
-      <w:r>
-        <w:br/>
-      </w:r>
-      <w:r>
-        <w:t xml:space="preserve">Department of Computerized Automatic Systems</w:t>
-      </w:r>
-      <w:r>
-        <w:br/>
-      </w:r>
-      <w:r>
-        <w:t xml:space="preserve">Lviv Polytechnic National University, Lviv, Ukraine</w:t>
-      </w:r>
-      <w:r>
-        <w:br/>
-      </w:r>
-      <w:r>
-        <w:t xml:space="preserve">ORCID: 0009-0005-5119-3695</w:t>
-      </w:r>
-      <w:r>
-        <w:br/>
-      </w:r>
-      <w:r>
-        <w:rPr>
-          <w:rStyle w:val="VerbatimChar"/>
-        </w:rPr>
-        <w:t xml:space="preserve">sasha.reminnyi@gmail.com</w:t>
       </w:r>
     </w:p>
     <w:p>

</xml_diff>

<commit_message>
Add design-space synthesis subsection (2.4) + spectrum table: locates ColBERT/late-interaction, RePlug/REALM (LM-supervised retrieval), MMR/DPP, Shapley, EIG/BED, listwise rerankers on cheap/interaction/incomparability axes; shows empty 'cheap + partial-order' cell = open problem. +3 citations (khattab2020colbert, shi2023replug, guu2020realm).
</commit_message>
<xml_diff>
--- a/paper/blackwell-paper.docx
+++ b/paper/blackwell-paper.docx
@@ -3730,7 +3730,7 @@
     </w:p>
     <w:bookmarkEnd w:id="15"/>
     <w:bookmarkEnd w:id="16"/>
-    <w:bookmarkStart w:id="24" w:name="sec:related"/>
+    <w:bookmarkStart w:id="26" w:name="sec:related"/>
     <w:p>
       <w:pPr>
         <w:pStyle w:val="Heading1"/>
@@ -4494,7 +4494,7 @@
           <w:rPr>
             <w:rStyle w:val="Hyperlink"/>
           </w:rPr>
-          <w:t xml:space="preserve">Shi et al. 2023</w:t>
+          <w:t xml:space="preserve">F. Shi et al. 2023</w:t>
         </w:r>
       </w:hyperlink>
       <w:r>
@@ -5088,14 +5088,13 @@
       </w:r>
     </w:p>
     <w:bookmarkEnd w:id="23"/>
-    <w:bookmarkEnd w:id="24"/>
-    <w:bookmarkStart w:id="31" w:name="sec:formalization"/>
+    <w:bookmarkStart w:id="25" w:name="sec:related-designspace"/>
     <w:p>
       <w:pPr>
-        <w:pStyle w:val="Heading1"/>
+        <w:pStyle w:val="Heading2"/>
       </w:pPr>
       <w:r>
-        <w:t xml:space="preserve">Formalization</w:t>
+        <w:t xml:space="preserve">The design space: no cheap method represents the partial order</w:t>
       </w:r>
     </w:p>
     <w:p>
@@ -5103,6 +5102,1276 @@
         <w:pStyle w:val="FirstParagraph"/>
       </w:pPr>
       <w:r>
+        <w:t xml:space="preserve">Table 1 places the methods above on three axes: whether the method is</w:t>
+      </w:r>
+      <w:r>
+        <w:t xml:space="preserve"> </w:t>
+      </w:r>
+      <w:r>
+        <w:rPr>
+          <w:i/>
+          <w:iCs/>
+        </w:rPr>
+        <w:t xml:space="preserve">cheap</w:t>
+      </w:r>
+      <w:r>
+        <w:t xml:space="preserve"> </w:t>
+      </w:r>
+      <w:r>
+        <w:t xml:space="preserve">(precomputable, or amortizable to a near-retrieval query-time cost), whether it models</w:t>
+      </w:r>
+      <w:r>
+        <w:t xml:space="preserve"> </w:t>
+      </w:r>
+      <w:r>
+        <w:rPr>
+          <w:i/>
+          <w:iCs/>
+        </w:rPr>
+        <w:t xml:space="preserve">interaction between sources</w:t>
+      </w:r>
+      <w:r>
+        <w:t xml:space="preserve"> </w:t>
+      </w:r>
+      <w:r>
+        <w:t xml:space="preserve">rather than scoring each in isolation, and whether it can</w:t>
+      </w:r>
+      <w:r>
+        <w:t xml:space="preserve"> </w:t>
+      </w:r>
+      <w:r>
+        <w:t xml:space="preserve">represent</w:t>
+      </w:r>
+      <w:r>
+        <w:t xml:space="preserve"> </w:t>
+      </w:r>
+      <w:r>
+        <w:rPr>
+          <w:i/>
+          <w:iCs/>
+        </w:rPr>
+        <w:t xml:space="preserve">incomparability</w:t>
+      </w:r>
+      <w:r>
+        <w:t xml:space="preserve">. The pattern is uniform, and it is why we frame the problem as we</w:t>
+      </w:r>
+      <w:r>
+        <w:t xml:space="preserve"> </w:t>
+      </w:r>
+      <w:r>
+        <w:t xml:space="preserve">do. Every method cheap enough to run at retrieval scale emits a final scalar and therefore lives in</w:t>
+      </w:r>
+      <w:r>
+        <w:t xml:space="preserve"> </w:t>
+      </w:r>
+      <w:r>
+        <w:t xml:space="preserve">a total order, including multi-vector late interaction </w:t>
+      </w:r>
+      <w:r>
+        <w:t xml:space="preserve">(</w:t>
+      </w:r>
+      <w:hyperlink w:anchor="ref-khattab2020colbert">
+        <w:r>
+          <w:rPr>
+            <w:rStyle w:val="Hyperlink"/>
+          </w:rPr>
+          <w:t xml:space="preserve">Khattab and Zaharia 2020</w:t>
+        </w:r>
+      </w:hyperlink>
+      <w:r>
+        <w:t xml:space="preserve">)</w:t>
+      </w:r>
+      <w:r>
+        <w:t xml:space="preserve">, whose per-token</w:t>
+      </w:r>
+      <w:r>
+        <w:t xml:space="preserve"> </w:t>
+      </w:r>
+      <w:r>
+        <w:t xml:space="preserve">match is query-dependent but still collapses to one document score, and retrievers trained on the</w:t>
+      </w:r>
+      <w:r>
+        <w:t xml:space="preserve"> </w:t>
+      </w:r>
+      <w:r>
+        <w:t xml:space="preserve">language model’s own likelihood </w:t>
+      </w:r>
+      <w:r>
+        <w:t xml:space="preserve">(</w:t>
+      </w:r>
+      <w:hyperlink w:anchor="ref-shi2023replug">
+        <w:r>
+          <w:rPr>
+            <w:rStyle w:val="Hyperlink"/>
+          </w:rPr>
+          <w:t xml:space="preserve">W. Shi et al. 2023</w:t>
+        </w:r>
+      </w:hyperlink>
+      <w:r>
+        <w:t xml:space="preserve">;</w:t>
+      </w:r>
+      <w:r>
+        <w:t xml:space="preserve"> </w:t>
+      </w:r>
+      <w:hyperlink w:anchor="ref-guu2020realm">
+        <w:r>
+          <w:rPr>
+            <w:rStyle w:val="Hyperlink"/>
+          </w:rPr>
+          <w:t xml:space="preserve">Guu et al. 2020</w:t>
+        </w:r>
+      </w:hyperlink>
+      <w:r>
+        <w:t xml:space="preserve">)</w:t>
+      </w:r>
+      <w:r>
+        <w:t xml:space="preserve">, which amortize</w:t>
+      </w:r>
+      <w:r>
+        <w:t xml:space="preserve"> </w:t>
+      </w:r>
+      <w:r>
+        <w:t xml:space="preserve">“value to the</w:t>
+      </w:r>
+      <w:r>
+        <w:t xml:space="preserve"> </w:t>
+      </w:r>
+      <w:r>
+        <w:t xml:space="preserve">model”</w:t>
+      </w:r>
+      <w:r>
+        <w:t xml:space="preserve"> </w:t>
+      </w:r>
+      <w:r>
+        <w:t xml:space="preserve">into a</w:t>
+      </w:r>
+      <w:r>
+        <w:t xml:space="preserve"> </w:t>
+      </w:r>
+      <w:r>
+        <w:rPr>
+          <w:i/>
+          <w:iCs/>
+        </w:rPr>
+        <w:t xml:space="preserve">number</w:t>
+      </w:r>
+      <w:r>
+        <w:t xml:space="preserve"> </w:t>
+      </w:r>
+      <w:r>
+        <w:t xml:space="preserve">rather than the non-domination relation and so inherit the limitation</w:t>
+      </w:r>
+      <w:r>
+        <w:t xml:space="preserve"> </w:t>
+      </w:r>
+      <w:r>
+        <w:t xml:space="preserve">of Theorem 2. Every method that genuinely models interaction is in turn either</w:t>
+      </w:r>
+      <w:r>
+        <w:t xml:space="preserve"> </w:t>
+      </w:r>
+      <w:r>
+        <w:t xml:space="preserve">symmetric redundancy over embedding geometry (MMR, DPPs, submodular coverage), carries no dominance</w:t>
+      </w:r>
+      <w:r>
+        <w:t xml:space="preserve"> </w:t>
+      </w:r>
+      <w:r>
+        <w:t xml:space="preserve">guarantee (listwise rerankers), or is as costly as direct probing (Shapley valuation, expected</w:t>
+      </w:r>
+      <w:r>
+        <w:t xml:space="preserve"> </w:t>
+      </w:r>
+      <w:r>
+        <w:t xml:space="preserve">information gain). No prior row is both cheap and partial-order-faithful; that empty cell is the open</w:t>
+      </w:r>
+      <w:r>
+        <w:t xml:space="preserve"> </w:t>
+      </w:r>
+      <w:r>
+        <w:t xml:space="preserve">problem this paper isolates. We occupy the last row, paying probe cost for the guarantee, and leave</w:t>
+      </w:r>
+      <w:r>
+        <w:t xml:space="preserve"> </w:t>
+      </w:r>
+      <w:r>
+        <w:t xml:space="preserve">its amortization as the central open question.</w:t>
+      </w:r>
+    </w:p>
+    <w:bookmarkStart w:id="24" w:name="tab:designspace"/>
+    <w:p>
+      <w:pPr>
+        <w:pStyle w:val="TableCaption"/>
+      </w:pPr>
+      <w:r>
+        <w:t xml:space="preserve">The design space of context selection.</w:t>
+      </w:r>
+      <w:r>
+        <w:t xml:space="preserve"> </w:t>
+      </w:r>
+      <w:r>
+        <w:t xml:space="preserve"> = yes,</w:t>
+      </w:r>
+      <w:r>
+        <w:t xml:space="preserve"> </w:t>
+      </w:r>
+      <m:oMath>
+        <m:r>
+          <m:rPr>
+            <m:sty m:val="p"/>
+          </m:rPr>
+          <m:t>×</m:t>
+        </m:r>
+      </m:oMath>
+      <w:r>
+        <w:t xml:space="preserve"> = no,</w:t>
+      </w:r>
+      <w:r>
+        <w:t xml:space="preserve"> </w:t>
+      </w:r>
+      <m:oMath>
+        <m:r>
+          <m:rPr>
+            <m:sty m:val="p"/>
+          </m:rPr>
+          <m:t>∼</m:t>
+        </m:r>
+      </m:oMath>
+      <w:r>
+        <w:t xml:space="preserve"> = partial.</w:t>
+      </w:r>
+      <w:r>
+        <w:t xml:space="preserve"> </w:t>
+      </w:r>
+      <m:oMath>
+        <m:sSup>
+          <m:e>
+            <m:r>
+              <m:t>​</m:t>
+            </m:r>
+          </m:e>
+          <m:sup>
+            <m:r>
+              <m:t>a</m:t>
+            </m:r>
+          </m:sup>
+        </m:sSup>
+      </m:oMath>
+      <w:r>
+        <w:t xml:space="preserve">amortized: trained once on the model’s signal, cheap at query time, but still a scalar.</w:t>
+      </w:r>
+      <w:r>
+        <w:t xml:space="preserve"> </w:t>
+      </w:r>
+      <m:oMath>
+        <m:sSup>
+          <m:e>
+            <m:r>
+              <m:t>​</m:t>
+            </m:r>
+          </m:e>
+          <m:sup>
+            <m:r>
+              <m:t>b</m:t>
+            </m:r>
+          </m:sup>
+        </m:sSup>
+      </m:oMath>
+      <w:r>
+        <w:t xml:space="preserve">symmetric redundancy over embedding geometry, not directional anti-monotonicity.</w:t>
+      </w:r>
+      <w:r>
+        <w:t xml:space="preserve"> </w:t>
+      </w:r>
+      <m:oMath>
+        <m:sSup>
+          <m:e>
+            <m:r>
+              <m:t>​</m:t>
+            </m:r>
+          </m:e>
+          <m:sup>
+            <m:r>
+              <m:t>c</m:t>
+            </m:r>
+          </m:sup>
+        </m:sSup>
+      </m:oMath>
+      <w:r>
+        <w:t xml:space="preserve">query-conditioned and interaction-aware, but per-query (not precomputable) and with no</w:t>
+      </w:r>
+      <w:r>
+        <w:t xml:space="preserve"> </w:t>
+      </w:r>
+      <w:r>
+        <w:t xml:space="preserve">dominance guarantee. Only the last row represents incomparability, at the cost of direct probing;</w:t>
+      </w:r>
+      <w:r>
+        <w:t xml:space="preserve"> </w:t>
+      </w:r>
+      <w:r>
+        <w:t xml:space="preserve">the</w:t>
+      </w:r>
+      <w:r>
+        <w:t xml:space="preserve"> </w:t>
+      </w:r>
+      <w:r>
+        <w:t xml:space="preserve">“cheap</w:t>
+      </w:r>
+      <w:r>
+        <w:t xml:space="preserve"> </w:t>
+      </w:r>
+      <w:r>
+        <w:rPr>
+          <w:i/>
+          <w:iCs/>
+        </w:rPr>
+        <w:t xml:space="preserve">and</w:t>
+      </w:r>
+      <w:r>
+        <w:t xml:space="preserve"> </w:t>
+      </w:r>
+      <w:r>
+        <w:t xml:space="preserve">partial-order-faithful”</w:t>
+      </w:r>
+      <w:r>
+        <w:t xml:space="preserve"> </w:t>
+      </w:r>
+      <w:r>
+        <w:t xml:space="preserve">cell is empty, which is this paper’s central open</w:t>
+      </w:r>
+      <w:r>
+        <w:t xml:space="preserve"> </w:t>
+      </w:r>
+      <w:r>
+        <w:t xml:space="preserve">problem.</w:t>
+      </w:r>
+    </w:p>
+    <w:tbl>
+      <w:tblPr>
+        <w:tblStyle w:val="Table"/>
+        <w:tblW w:type="auto" w:w="0"/>
+        <w:tblLook w:firstRow="1" w:lastRow="0" w:firstColumn="0" w:lastColumn="0" w:noHBand="0" w:noVBand="0" w:val="0020"/>
+        <w:tblCaption w:val="The design space of context selection.  = yes, \times = no, \sim = partial. ^{a}amortized: trained once on the model’s signal, cheap at query time, but still a scalar. ^{b}symmetric redundancy over embedding geometry, not directional anti-monotonicity. ^{c}query-conditioned and interaction-aware, but per-query (not precomputable) and with no dominance guarantee. Only the last row represents incomparability, at the cost of direct probing; the “cheap and partial-order-faithful” cell is empty, which is this paper’s central open problem."/>
+      </w:tblPr>
+      <w:tblGrid>
+        <w:gridCol w:w="1980"/>
+        <w:gridCol w:w="1980"/>
+        <w:gridCol w:w="1980"/>
+        <w:gridCol w:w="1980"/>
+      </w:tblGrid>
+      <w:tr>
+        <w:trPr>
+          <w:tblHeader w:val="on"/>
+        </w:trPr>
+        <w:tc>
+          <w:tcPr/>
+          <w:p>
+            <w:pPr>
+              <w:pStyle w:val="Compact"/>
+              <w:jc w:val="left"/>
+            </w:pPr>
+            <w:r>
+              <w:t xml:space="preserve">Method family (representative)</w:t>
+            </w:r>
+          </w:p>
+        </w:tc>
+        <w:tc>
+          <w:tcPr/>
+          <w:p>
+            <w:pPr>
+              <w:pStyle w:val="Compact"/>
+              <w:jc w:val="center"/>
+            </w:pPr>
+            <w:r>
+              <w:t xml:space="preserve">Cheap?</w:t>
+            </w:r>
+          </w:p>
+        </w:tc>
+        <w:tc>
+          <w:tcPr/>
+          <w:p>
+            <w:pPr>
+              <w:pStyle w:val="Compact"/>
+              <w:jc w:val="center"/>
+            </w:pPr>
+            <w:r>
+              <w:t xml:space="preserve">Interaction?</w:t>
+            </w:r>
+          </w:p>
+        </w:tc>
+        <w:tc>
+          <w:tcPr/>
+          <w:p>
+            <w:pPr>
+              <w:pStyle w:val="Compact"/>
+              <w:jc w:val="center"/>
+            </w:pPr>
+            <w:r>
+              <w:t xml:space="preserve">Incomparability?</w:t>
+            </w:r>
+          </w:p>
+        </w:tc>
+      </w:tr>
+      <w:tr>
+        <w:tc>
+          <w:tcPr/>
+          <w:p>
+            <w:pPr>
+              <w:pStyle w:val="Compact"/>
+              <w:jc w:val="left"/>
+            </w:pPr>
+            <w:r>
+              <w:t xml:space="preserve">Scalar dense / PRP retrieval </w:t>
+            </w:r>
+            <w:r>
+              <w:t xml:space="preserve">(</w:t>
+            </w:r>
+            <w:hyperlink w:anchor="ref-robertson1977">
+              <w:r>
+                <w:rPr>
+                  <w:rStyle w:val="Hyperlink"/>
+                </w:rPr>
+                <w:t xml:space="preserve">Robertson 1977</w:t>
+              </w:r>
+            </w:hyperlink>
+            <w:r>
+              <w:t xml:space="preserve">)</w:t>
+            </w:r>
+          </w:p>
+        </w:tc>
+        <w:tc>
+          <w:tcPr/>
+          <w:p>
+            <w:pPr>
+              <w:pStyle w:val="Compact"/>
+            </w:pPr>
+          </w:p>
+        </w:tc>
+        <w:tc>
+          <w:tcPr/>
+          <w:p>
+            <w:pPr>
+              <w:pStyle w:val="Compact"/>
+              <w:jc w:val="center"/>
+            </w:pPr>
+            <m:oMath>
+              <m:r>
+                <m:rPr>
+                  <m:sty m:val="p"/>
+                </m:rPr>
+                <m:t>×</m:t>
+              </m:r>
+            </m:oMath>
+            <w:r>
+              <w:t xml:space="preserve">​</w:t>
+            </w:r>
+          </w:p>
+        </w:tc>
+        <w:tc>
+          <w:tcPr/>
+          <w:p>
+            <w:pPr>
+              <w:pStyle w:val="Compact"/>
+              <w:jc w:val="center"/>
+            </w:pPr>
+            <m:oMath>
+              <m:r>
+                <m:rPr>
+                  <m:sty m:val="p"/>
+                </m:rPr>
+                <m:t>×</m:t>
+              </m:r>
+            </m:oMath>
+            <w:r>
+              <w:t xml:space="preserve">​</w:t>
+            </w:r>
+          </w:p>
+        </w:tc>
+      </w:tr>
+      <w:tr>
+        <w:tc>
+          <w:tcPr/>
+          <w:p>
+            <w:pPr>
+              <w:pStyle w:val="Compact"/>
+              <w:jc w:val="left"/>
+            </w:pPr>
+            <w:r>
+              <w:t xml:space="preserve">Late interaction, multi-vector </w:t>
+            </w:r>
+            <w:r>
+              <w:t xml:space="preserve">(</w:t>
+            </w:r>
+            <w:hyperlink w:anchor="ref-khattab2020colbert">
+              <w:r>
+                <w:rPr>
+                  <w:rStyle w:val="Hyperlink"/>
+                </w:rPr>
+                <w:t xml:space="preserve">Khattab and Zaharia 2020</w:t>
+              </w:r>
+            </w:hyperlink>
+            <w:r>
+              <w:t xml:space="preserve">)</w:t>
+            </w:r>
+          </w:p>
+        </w:tc>
+        <w:tc>
+          <w:tcPr/>
+          <w:p>
+            <w:pPr>
+              <w:pStyle w:val="Compact"/>
+            </w:pPr>
+          </w:p>
+        </w:tc>
+        <w:tc>
+          <w:tcPr/>
+          <w:p>
+            <w:pPr>
+              <w:pStyle w:val="Compact"/>
+              <w:jc w:val="center"/>
+            </w:pPr>
+            <m:oMath>
+              <m:r>
+                <m:rPr>
+                  <m:sty m:val="p"/>
+                </m:rPr>
+                <m:t>×</m:t>
+              </m:r>
+            </m:oMath>
+            <w:r>
+              <w:t xml:space="preserve">​</w:t>
+            </w:r>
+          </w:p>
+        </w:tc>
+        <w:tc>
+          <w:tcPr/>
+          <w:p>
+            <w:pPr>
+              <w:pStyle w:val="Compact"/>
+              <w:jc w:val="center"/>
+            </w:pPr>
+            <m:oMath>
+              <m:r>
+                <m:rPr>
+                  <m:sty m:val="p"/>
+                </m:rPr>
+                <m:t>×</m:t>
+              </m:r>
+            </m:oMath>
+            <w:r>
+              <w:t xml:space="preserve">​</w:t>
+            </w:r>
+          </w:p>
+        </w:tc>
+      </w:tr>
+      <w:tr>
+        <w:tc>
+          <w:tcPr/>
+          <w:p>
+            <w:pPr>
+              <w:pStyle w:val="Compact"/>
+              <w:jc w:val="left"/>
+            </w:pPr>
+            <m:oMath>
+              <m:r>
+                <m:rPr>
+                  <m:scr m:val="script"/>
+                  <m:sty m:val="p"/>
+                </m:rPr>
+                <m:t>V</m:t>
+              </m:r>
+            </m:oMath>
+            <w:r>
+              <w:t xml:space="preserve">-usable information </w:t>
+            </w:r>
+            <w:r>
+              <w:t xml:space="preserve">(</w:t>
+            </w:r>
+            <w:hyperlink w:anchor="ref-ethayarajh2022">
+              <w:r>
+                <w:rPr>
+                  <w:rStyle w:val="Hyperlink"/>
+                </w:rPr>
+                <w:t xml:space="preserve">Ethayarajh et al. 2022</w:t>
+              </w:r>
+            </w:hyperlink>
+            <w:r>
+              <w:t xml:space="preserve">)</w:t>
+            </w:r>
+          </w:p>
+        </w:tc>
+        <w:tc>
+          <w:tcPr/>
+          <w:p>
+            <w:pPr>
+              <w:pStyle w:val="Compact"/>
+            </w:pPr>
+          </w:p>
+        </w:tc>
+        <w:tc>
+          <w:tcPr/>
+          <w:p>
+            <w:pPr>
+              <w:pStyle w:val="Compact"/>
+              <w:jc w:val="center"/>
+            </w:pPr>
+            <m:oMath>
+              <m:r>
+                <m:rPr>
+                  <m:sty m:val="p"/>
+                </m:rPr>
+                <m:t>×</m:t>
+              </m:r>
+            </m:oMath>
+            <w:r>
+              <w:t xml:space="preserve">​</w:t>
+            </w:r>
+          </w:p>
+        </w:tc>
+        <w:tc>
+          <w:tcPr/>
+          <w:p>
+            <w:pPr>
+              <w:pStyle w:val="Compact"/>
+              <w:jc w:val="center"/>
+            </w:pPr>
+            <m:oMath>
+              <m:r>
+                <m:rPr>
+                  <m:sty m:val="p"/>
+                </m:rPr>
+                <m:t>×</m:t>
+              </m:r>
+            </m:oMath>
+            <w:r>
+              <w:t xml:space="preserve">​</w:t>
+            </w:r>
+          </w:p>
+        </w:tc>
+      </w:tr>
+      <w:tr>
+        <w:tc>
+          <w:tcPr/>
+          <w:p>
+            <w:pPr>
+              <w:pStyle w:val="Compact"/>
+              <w:jc w:val="left"/>
+            </w:pPr>
+            <w:r>
+              <w:t xml:space="preserve">LM-supervised retriever </w:t>
+            </w:r>
+            <w:r>
+              <w:t xml:space="preserve">(</w:t>
+            </w:r>
+            <w:hyperlink w:anchor="ref-shi2023replug">
+              <w:r>
+                <w:rPr>
+                  <w:rStyle w:val="Hyperlink"/>
+                </w:rPr>
+                <w:t xml:space="preserve">W. Shi et al. 2023</w:t>
+              </w:r>
+            </w:hyperlink>
+            <w:r>
+              <w:t xml:space="preserve">;</w:t>
+            </w:r>
+            <w:r>
+              <w:t xml:space="preserve"> </w:t>
+            </w:r>
+            <w:hyperlink w:anchor="ref-guu2020realm">
+              <w:r>
+                <w:rPr>
+                  <w:rStyle w:val="Hyperlink"/>
+                </w:rPr>
+                <w:t xml:space="preserve">Guu et al. 2020</w:t>
+              </w:r>
+            </w:hyperlink>
+            <w:r>
+              <w:t xml:space="preserve">)</w:t>
+            </w:r>
+          </w:p>
+        </w:tc>
+        <w:tc>
+          <w:tcPr/>
+          <w:p>
+            <w:pPr>
+              <w:pStyle w:val="Compact"/>
+              <w:jc w:val="center"/>
+            </w:pPr>
+            <m:oMath>
+              <m:sSup>
+                <m:e>
+                  <m:r>
+                    <m:t>​</m:t>
+                  </m:r>
+                </m:e>
+                <m:sup>
+                  <m:r>
+                    <m:t>a</m:t>
+                  </m:r>
+                </m:sup>
+              </m:sSup>
+            </m:oMath>
+            <w:r>
+              <w:t xml:space="preserve">​</w:t>
+            </w:r>
+          </w:p>
+        </w:tc>
+        <w:tc>
+          <w:tcPr/>
+          <w:p>
+            <w:pPr>
+              <w:pStyle w:val="Compact"/>
+              <w:jc w:val="center"/>
+            </w:pPr>
+            <m:oMath>
+              <m:r>
+                <m:rPr>
+                  <m:sty m:val="p"/>
+                </m:rPr>
+                <m:t>×</m:t>
+              </m:r>
+            </m:oMath>
+            <w:r>
+              <w:t xml:space="preserve">​</w:t>
+            </w:r>
+          </w:p>
+        </w:tc>
+        <w:tc>
+          <w:tcPr/>
+          <w:p>
+            <w:pPr>
+              <w:pStyle w:val="Compact"/>
+              <w:jc w:val="center"/>
+            </w:pPr>
+            <m:oMath>
+              <m:r>
+                <m:rPr>
+                  <m:sty m:val="p"/>
+                </m:rPr>
+                <m:t>×</m:t>
+              </m:r>
+            </m:oMath>
+            <w:r>
+              <w:t xml:space="preserve">​</w:t>
+            </w:r>
+          </w:p>
+        </w:tc>
+      </w:tr>
+      <w:tr>
+        <w:tc>
+          <w:tcPr/>
+          <w:p>
+            <w:pPr>
+              <w:pStyle w:val="Compact"/>
+              <w:jc w:val="left"/>
+            </w:pPr>
+            <w:r>
+              <w:t xml:space="preserve">MMR diversity </w:t>
+            </w:r>
+            <w:r>
+              <w:t xml:space="preserve">(</w:t>
+            </w:r>
+            <w:hyperlink w:anchor="ref-carbonell1998">
+              <w:r>
+                <w:rPr>
+                  <w:rStyle w:val="Hyperlink"/>
+                </w:rPr>
+                <w:t xml:space="preserve">Carbonell and Goldstein 1998</w:t>
+              </w:r>
+            </w:hyperlink>
+            <w:r>
+              <w:t xml:space="preserve">)</w:t>
+            </w:r>
+          </w:p>
+        </w:tc>
+        <w:tc>
+          <w:tcPr/>
+          <w:p>
+            <w:pPr>
+              <w:pStyle w:val="Compact"/>
+            </w:pPr>
+          </w:p>
+        </w:tc>
+        <w:tc>
+          <w:tcPr/>
+          <w:p>
+            <w:pPr>
+              <w:pStyle w:val="Compact"/>
+              <w:jc w:val="center"/>
+            </w:pPr>
+            <m:oMath>
+              <m:sSup>
+                <m:e>
+                  <m:r>
+                    <m:rPr>
+                      <m:sty m:val="p"/>
+                    </m:rPr>
+                    <m:t>∼</m:t>
+                  </m:r>
+                </m:e>
+                <m:sup>
+                  <m:r>
+                    <m:t>b</m:t>
+                  </m:r>
+                </m:sup>
+              </m:sSup>
+            </m:oMath>
+            <w:r>
+              <w:t xml:space="preserve">​</w:t>
+            </w:r>
+          </w:p>
+        </w:tc>
+        <w:tc>
+          <w:tcPr/>
+          <w:p>
+            <w:pPr>
+              <w:pStyle w:val="Compact"/>
+              <w:jc w:val="center"/>
+            </w:pPr>
+            <m:oMath>
+              <m:r>
+                <m:rPr>
+                  <m:sty m:val="p"/>
+                </m:rPr>
+                <m:t>×</m:t>
+              </m:r>
+            </m:oMath>
+            <w:r>
+              <w:t xml:space="preserve">​</w:t>
+            </w:r>
+          </w:p>
+        </w:tc>
+      </w:tr>
+      <w:tr>
+        <w:tc>
+          <w:tcPr/>
+          <w:p>
+            <w:pPr>
+              <w:pStyle w:val="Compact"/>
+              <w:jc w:val="left"/>
+            </w:pPr>
+            <w:r>
+              <w:t xml:space="preserve">DPP / submodular coverage </w:t>
+            </w:r>
+            <w:r>
+              <w:t xml:space="preserve">(</w:t>
+            </w:r>
+            <w:hyperlink w:anchor="ref-ye2023ceil">
+              <w:r>
+                <w:rPr>
+                  <w:rStyle w:val="Hyperlink"/>
+                </w:rPr>
+                <w:t xml:space="preserve">Ye et al. 2023</w:t>
+              </w:r>
+            </w:hyperlink>
+            <w:r>
+              <w:t xml:space="preserve">;</w:t>
+            </w:r>
+            <w:r>
+              <w:t xml:space="preserve"> </w:t>
+            </w:r>
+            <w:hyperlink w:anchor="ref-huang2025gammacover">
+              <w:r>
+                <w:rPr>
+                  <w:rStyle w:val="Hyperlink"/>
+                </w:rPr>
+                <w:t xml:space="preserve">Huang 2025</w:t>
+              </w:r>
+            </w:hyperlink>
+            <w:r>
+              <w:t xml:space="preserve">)</w:t>
+            </w:r>
+          </w:p>
+        </w:tc>
+        <w:tc>
+          <w:tcPr/>
+          <w:p>
+            <w:pPr>
+              <w:pStyle w:val="Compact"/>
+            </w:pPr>
+          </w:p>
+        </w:tc>
+        <w:tc>
+          <w:tcPr/>
+          <w:p>
+            <w:pPr>
+              <w:pStyle w:val="Compact"/>
+              <w:jc w:val="center"/>
+            </w:pPr>
+            <m:oMath>
+              <m:sSup>
+                <m:e>
+                  <m:r>
+                    <m:rPr>
+                      <m:sty m:val="p"/>
+                    </m:rPr>
+                    <m:t>∼</m:t>
+                  </m:r>
+                </m:e>
+                <m:sup>
+                  <m:r>
+                    <m:t>b</m:t>
+                  </m:r>
+                </m:sup>
+              </m:sSup>
+            </m:oMath>
+            <w:r>
+              <w:t xml:space="preserve">​</w:t>
+            </w:r>
+          </w:p>
+        </w:tc>
+        <w:tc>
+          <w:tcPr/>
+          <w:p>
+            <w:pPr>
+              <w:pStyle w:val="Compact"/>
+              <w:jc w:val="center"/>
+            </w:pPr>
+            <m:oMath>
+              <m:r>
+                <m:rPr>
+                  <m:sty m:val="p"/>
+                </m:rPr>
+                <m:t>×</m:t>
+              </m:r>
+            </m:oMath>
+            <w:r>
+              <w:t xml:space="preserve">​</w:t>
+            </w:r>
+          </w:p>
+        </w:tc>
+      </w:tr>
+      <w:tr>
+        <w:tc>
+          <w:tcPr/>
+          <w:p>
+            <w:pPr>
+              <w:pStyle w:val="Compact"/>
+              <w:jc w:val="left"/>
+            </w:pPr>
+            <w:r>
+              <w:t xml:space="preserve">Shapley / influence valuation </w:t>
+            </w:r>
+            <w:r>
+              <w:t xml:space="preserve">(</w:t>
+            </w:r>
+            <w:hyperlink w:anchor="ref-demoshapley2024">
+              <w:r>
+                <w:rPr>
+                  <w:rStyle w:val="Hyperlink"/>
+                </w:rPr>
+                <w:t xml:space="preserve">Xie et al. 2024</w:t>
+              </w:r>
+            </w:hyperlink>
+            <w:r>
+              <w:t xml:space="preserve">)</w:t>
+            </w:r>
+          </w:p>
+        </w:tc>
+        <w:tc>
+          <w:tcPr/>
+          <w:p>
+            <w:pPr>
+              <w:pStyle w:val="Compact"/>
+              <w:jc w:val="center"/>
+            </w:pPr>
+            <m:oMath>
+              <m:r>
+                <m:rPr>
+                  <m:sty m:val="p"/>
+                </m:rPr>
+                <m:t>×</m:t>
+              </m:r>
+            </m:oMath>
+            <w:r>
+              <w:t xml:space="preserve">​</w:t>
+            </w:r>
+          </w:p>
+        </w:tc>
+        <w:tc>
+          <w:tcPr/>
+          <w:p>
+            <w:pPr>
+              <w:pStyle w:val="Compact"/>
+            </w:pPr>
+          </w:p>
+        </w:tc>
+        <w:tc>
+          <w:tcPr/>
+          <w:p>
+            <w:pPr>
+              <w:pStyle w:val="Compact"/>
+              <w:jc w:val="center"/>
+            </w:pPr>
+            <m:oMath>
+              <m:r>
+                <m:rPr>
+                  <m:sty m:val="p"/>
+                </m:rPr>
+                <m:t>×</m:t>
+              </m:r>
+            </m:oMath>
+            <w:r>
+              <w:t xml:space="preserve">​</w:t>
+            </w:r>
+          </w:p>
+        </w:tc>
+      </w:tr>
+      <w:tr>
+        <w:tc>
+          <w:tcPr/>
+          <w:p>
+            <w:pPr>
+              <w:pStyle w:val="Compact"/>
+              <w:jc w:val="left"/>
+            </w:pPr>
+            <w:r>
+              <w:t xml:space="preserve">Expected information gain / BED </w:t>
+            </w:r>
+            <w:r>
+              <w:t xml:space="preserve">(</w:t>
+            </w:r>
+            <w:hyperlink w:anchor="ref-bedllm2026">
+              <w:r>
+                <w:rPr>
+                  <w:rStyle w:val="Hyperlink"/>
+                </w:rPr>
+                <w:t xml:space="preserve">Choudhury et al. 2025</w:t>
+              </w:r>
+            </w:hyperlink>
+            <w:r>
+              <w:t xml:space="preserve">)</w:t>
+            </w:r>
+          </w:p>
+        </w:tc>
+        <w:tc>
+          <w:tcPr/>
+          <w:p>
+            <w:pPr>
+              <w:pStyle w:val="Compact"/>
+              <w:jc w:val="center"/>
+            </w:pPr>
+            <m:oMath>
+              <m:r>
+                <m:rPr>
+                  <m:sty m:val="p"/>
+                </m:rPr>
+                <m:t>×</m:t>
+              </m:r>
+            </m:oMath>
+            <w:r>
+              <w:t xml:space="preserve">​</w:t>
+            </w:r>
+          </w:p>
+        </w:tc>
+        <w:tc>
+          <w:tcPr/>
+          <w:p>
+            <w:pPr>
+              <w:pStyle w:val="Compact"/>
+              <w:jc w:val="center"/>
+            </w:pPr>
+            <m:oMath>
+              <m:r>
+                <m:rPr>
+                  <m:sty m:val="p"/>
+                </m:rPr>
+                <m:t>∼</m:t>
+              </m:r>
+            </m:oMath>
+            <w:r>
+              <w:t xml:space="preserve">​</w:t>
+            </w:r>
+          </w:p>
+        </w:tc>
+        <w:tc>
+          <w:tcPr/>
+          <w:p>
+            <w:pPr>
+              <w:pStyle w:val="Compact"/>
+              <w:jc w:val="center"/>
+            </w:pPr>
+            <m:oMath>
+              <m:r>
+                <m:rPr>
+                  <m:sty m:val="p"/>
+                </m:rPr>
+                <m:t>×</m:t>
+              </m:r>
+            </m:oMath>
+            <w:r>
+              <w:t xml:space="preserve">​</w:t>
+            </w:r>
+          </w:p>
+        </w:tc>
+      </w:tr>
+      <w:tr>
+        <w:tc>
+          <w:tcPr/>
+          <w:p>
+            <w:pPr>
+              <w:pStyle w:val="Compact"/>
+              <w:jc w:val="left"/>
+            </w:pPr>
+            <w:r>
+              <w:t xml:space="preserve">Listwise LLM reranker </w:t>
+            </w:r>
+            <w:r>
+              <w:t xml:space="preserve">(</w:t>
+            </w:r>
+            <w:hyperlink w:anchor="ref-sun2023rankgpt">
+              <w:r>
+                <w:rPr>
+                  <w:rStyle w:val="Hyperlink"/>
+                </w:rPr>
+                <w:t xml:space="preserve">Sun et al. 2023</w:t>
+              </w:r>
+            </w:hyperlink>
+            <w:r>
+              <w:t xml:space="preserve">)</w:t>
+            </w:r>
+          </w:p>
+        </w:tc>
+        <w:tc>
+          <w:tcPr/>
+          <w:p>
+            <w:pPr>
+              <w:pStyle w:val="Compact"/>
+              <w:jc w:val="center"/>
+            </w:pPr>
+            <m:oMath>
+              <m:sSup>
+                <m:e>
+                  <m:r>
+                    <m:rPr>
+                      <m:sty m:val="p"/>
+                    </m:rPr>
+                    <m:t>∼</m:t>
+                  </m:r>
+                </m:e>
+                <m:sup>
+                  <m:r>
+                    <m:t>c</m:t>
+                  </m:r>
+                </m:sup>
+              </m:sSup>
+            </m:oMath>
+            <w:r>
+              <w:t xml:space="preserve">​</w:t>
+            </w:r>
+          </w:p>
+        </w:tc>
+        <w:tc>
+          <w:tcPr/>
+          <w:p>
+            <w:pPr>
+              <w:pStyle w:val="Compact"/>
+            </w:pPr>
+          </w:p>
+        </w:tc>
+        <w:tc>
+          <w:tcPr/>
+          <w:p>
+            <w:pPr>
+              <w:pStyle w:val="Compact"/>
+              <w:jc w:val="center"/>
+            </w:pPr>
+            <m:oMath>
+              <m:sSup>
+                <m:e>
+                  <m:r>
+                    <m:rPr>
+                      <m:sty m:val="p"/>
+                    </m:rPr>
+                    <m:t>×</m:t>
+                  </m:r>
+                </m:e>
+                <m:sup>
+                  <m:r>
+                    <m:t>c</m:t>
+                  </m:r>
+                </m:sup>
+              </m:sSup>
+            </m:oMath>
+            <w:r>
+              <w:t xml:space="preserve">​</w:t>
+            </w:r>
+          </w:p>
+        </w:tc>
+      </w:tr>
+      <w:tr>
+        <w:tc>
+          <w:tcPr/>
+          <w:p>
+            <w:pPr>
+              <w:pStyle w:val="Compact"/>
+              <w:jc w:val="left"/>
+            </w:pPr>
+            <w:r>
+              <w:rPr>
+                <w:b/>
+                <w:bCs/>
+              </w:rPr>
+              <w:t xml:space="preserve">Probe-Select (this paper)</w:t>
+            </w:r>
+          </w:p>
+        </w:tc>
+        <w:tc>
+          <w:tcPr/>
+          <w:p>
+            <w:pPr>
+              <w:pStyle w:val="Compact"/>
+              <w:jc w:val="center"/>
+            </w:pPr>
+            <m:oMath>
+              <m:r>
+                <m:rPr>
+                  <m:sty m:val="p"/>
+                </m:rPr>
+                <m:t>×</m:t>
+              </m:r>
+            </m:oMath>
+            <w:r>
+              <w:t xml:space="preserve">​</w:t>
+            </w:r>
+          </w:p>
+        </w:tc>
+        <w:tc>
+          <w:tcPr/>
+          <w:p>
+            <w:pPr>
+              <w:pStyle w:val="Compact"/>
+            </w:pPr>
+          </w:p>
+        </w:tc>
+        <w:tc>
+          <w:tcPr/>
+          <w:p>
+            <w:pPr>
+              <w:pStyle w:val="Compact"/>
+            </w:pPr>
+          </w:p>
+        </w:tc>
+      </w:tr>
+    </w:tbl>
+    <w:bookmarkEnd w:id="24"/>
+    <w:bookmarkEnd w:id="25"/>
+    <w:bookmarkEnd w:id="26"/>
+    <w:bookmarkStart w:id="33" w:name="sec:formalization"/>
+    <w:p>
+      <w:pPr>
+        <w:pStyle w:val="Heading1"/>
+      </w:pPr>
+      <w:r>
+        <w:t xml:space="preserve">Formalization</w:t>
+      </w:r>
+    </w:p>
+    <w:p>
+      <w:pPr>
+        <w:pStyle w:val="FirstParagraph"/>
+      </w:pPr>
+      <w:r>
         <w:t xml:space="preserve">§2 placed the contribution against prior work; the next four sections make it</w:t>
       </w:r>
       <w:r>
@@ -5202,7 +6471,7 @@
         <w:t xml:space="preserve">theorem to experiment rigorous.</w:t>
       </w:r>
     </w:p>
-    <w:bookmarkStart w:id="27" w:name="X73e69b8a1a604fddcc6e5ed9b89d5c624a51ec4"/>
+    <w:bookmarkStart w:id="29" w:name="X73e69b8a1a604fddcc6e5ed9b89d5c624a51ec4"/>
     <w:p>
       <w:pPr>
         <w:pStyle w:val="Heading2"/>
@@ -5628,7 +6897,7 @@
         <w:t xml:space="preserve">fixed-string sources; we return to this in §3.2 and Lemma 1.</w:t>
       </w:r>
     </w:p>
-    <w:bookmarkStart w:id="25" w:name="def:source"/>
+    <w:bookmarkStart w:id="27" w:name="def:source"/>
     <w:p>
       <w:pPr>
         <w:pStyle w:val="BodyText"/>
@@ -5879,8 +7148,8 @@
         <w:t xml:space="preserve">.</w:t>
       </w:r>
     </w:p>
-    <w:bookmarkEnd w:id="25"/>
-    <w:bookmarkStart w:id="26" w:name="def:decision"/>
+    <w:bookmarkEnd w:id="27"/>
+    <w:bookmarkStart w:id="28" w:name="def:decision"/>
     <w:p>
       <w:pPr>
         <w:pStyle w:val="BodyText"/>
@@ -6677,7 +7946,7 @@
         <w:t xml:space="preserve">.</w:t>
       </w:r>
     </w:p>
-    <w:bookmarkEnd w:id="26"/>
+    <w:bookmarkEnd w:id="28"/>
     <w:p>
       <w:pPr>
         <w:pStyle w:val="FirstParagraph"/>
@@ -6809,8 +8078,8 @@
         <w:t xml:space="preserve">(Lemma 2).</w:t>
       </w:r>
     </w:p>
-    <w:bookmarkEnd w:id="27"/>
-    <w:bookmarkStart w:id="29" w:name="subsec:sources"/>
+    <w:bookmarkEnd w:id="29"/>
+    <w:bookmarkStart w:id="31" w:name="subsec:sources"/>
     <w:p>
       <w:pPr>
         <w:pStyle w:val="Heading2"/>
@@ -7035,7 +8304,7 @@
         <w:t xml:space="preserve"> (1).</w:t>
       </w:r>
     </w:p>
-    <w:bookmarkStart w:id="28" w:name="def:projection"/>
+    <w:bookmarkStart w:id="30" w:name="def:projection"/>
     <w:p>
       <w:pPr>
         <w:pStyle w:val="BodyText"/>
@@ -7815,7 +9084,7 @@
         <w:t xml:space="preserve">).</w:t>
       </w:r>
     </w:p>
-    <w:bookmarkEnd w:id="28"/>
+    <w:bookmarkEnd w:id="30"/>
     <w:p>
       <w:pPr>
         <w:pStyle w:val="BodyText"/>
@@ -7986,8 +9255,8 @@
         <w:t xml:space="preserve">.</w:t>
       </w:r>
     </w:p>
-    <w:bookmarkEnd w:id="29"/>
-    <w:bookmarkStart w:id="30" w:name="subsec:theta"/>
+    <w:bookmarkEnd w:id="31"/>
+    <w:bookmarkStart w:id="32" w:name="subsec:theta"/>
     <w:p>
       <w:pPr>
         <w:pStyle w:val="Heading2"/>
@@ -8338,9 +9607,9 @@
         <w:t xml:space="preserve">it except where the model-relativity is the point.</w:t>
       </w:r>
     </w:p>
-    <w:bookmarkEnd w:id="30"/>
-    <w:bookmarkEnd w:id="31"/>
-    <w:bookmarkStart w:id="43" w:name="sec:order"/>
+    <w:bookmarkEnd w:id="32"/>
+    <w:bookmarkEnd w:id="33"/>
+    <w:bookmarkStart w:id="45" w:name="sec:order"/>
     <w:p>
       <w:pPr>
         <w:pStyle w:val="Heading1"/>
@@ -8381,7 +9650,7 @@
         <w:t xml:space="preserve">its two registers.</w:t>
       </w:r>
     </w:p>
-    <w:bookmarkStart w:id="36" w:name="the-order-and-its-two-registers"/>
+    <w:bookmarkStart w:id="38" w:name="the-order-and-its-two-registers"/>
     <w:p>
       <w:pPr>
         <w:pStyle w:val="Heading2"/>
@@ -8390,7 +9659,7 @@
         <w:t xml:space="preserve">The order and its two registers</w:t>
       </w:r>
     </w:p>
-    <w:bookmarkStart w:id="32" w:name="def:blackwell"/>
+    <w:bookmarkStart w:id="34" w:name="def:blackwell"/>
     <w:p>
       <w:pPr>
         <w:pStyle w:val="FirstParagraph"/>
@@ -8733,7 +10002,7 @@
         <w:t xml:space="preserve">.</w:t>
       </w:r>
     </w:p>
-    <w:bookmarkEnd w:id="32"/>
+    <w:bookmarkEnd w:id="34"/>
     <w:p>
       <w:pPr>
         <w:pStyle w:val="BodyText"/>
@@ -8748,7 +10017,7 @@
         <w:t xml:space="preserve">hypotheses for a self-contained treatment.</w:t>
       </w:r>
     </w:p>
-    <w:bookmarkStart w:id="33" w:name="thm:blackwell"/>
+    <w:bookmarkStart w:id="35" w:name="thm:blackwell"/>
     <w:p>
       <w:pPr>
         <w:pStyle w:val="BodyText"/>
@@ -9326,7 +10595,7 @@
         <w:t xml:space="preserve">.</w:t>
       </w:r>
     </w:p>
-    <w:bookmarkEnd w:id="33"/>
+    <w:bookmarkEnd w:id="35"/>
     <w:p>
       <w:pPr>
         <w:pStyle w:val="BodyText"/>
@@ -9467,7 +10736,7 @@
         <w:t xml:space="preserve">Definition 3 are standard Borel.</w:t>
       </w:r>
     </w:p>
-    <w:bookmarkStart w:id="34" w:name="cor:c1"/>
+    <w:bookmarkStart w:id="36" w:name="cor:c1"/>
     <w:p>
       <w:pPr>
         <w:pStyle w:val="BodyText"/>
@@ -9742,8 +11011,8 @@
         <w:t xml:space="preserve">-usable information) provides.</w:t>
       </w:r>
     </w:p>
-    <w:bookmarkEnd w:id="34"/>
-    <w:bookmarkStart w:id="35" w:name="rem:partial"/>
+    <w:bookmarkEnd w:id="36"/>
+    <w:bookmarkStart w:id="37" w:name="rem:partial"/>
     <w:p>
       <w:pPr>
         <w:pStyle w:val="BodyText"/>
@@ -9952,9 +11221,9 @@
         <w:t xml:space="preserve">Incomparability is exactly the regime our experiments target.</w:t>
       </w:r>
     </w:p>
-    <w:bookmarkEnd w:id="35"/>
-    <w:bookmarkEnd w:id="36"/>
-    <w:bookmarkStart w:id="38" w:name="Xcf9dd7f06cc6d4592db8258d08ec9b7ef4b608b"/>
+    <w:bookmarkEnd w:id="37"/>
+    <w:bookmarkEnd w:id="38"/>
+    <w:bookmarkStart w:id="40" w:name="Xcf9dd7f06cc6d4592db8258d08ec9b7ef4b608b"/>
     <w:p>
       <w:pPr>
         <w:pStyle w:val="Heading2"/>
@@ -10005,7 +11274,7 @@
         <w:t xml:space="preserve">purely structural argument rather than by an empirical divergence.</w:t>
       </w:r>
     </w:p>
-    <w:bookmarkStart w:id="37" w:name="lem:noref"/>
+    <w:bookmarkStart w:id="39" w:name="lem:noref"/>
     <w:p>
       <w:pPr>
         <w:pStyle w:val="BodyText"/>
@@ -10560,7 +11829,7 @@
         <w:t xml:space="preserve">other hides.</w:t>
       </w:r>
     </w:p>
-    <w:bookmarkEnd w:id="37"/>
+    <w:bookmarkEnd w:id="39"/>
     <w:p>
       <w:pPr>
         <w:pStyle w:val="FirstParagraph"/>
@@ -10901,8 +12170,8 @@
         <w:t xml:space="preserve">incomparability the experiments then exhibit empirically.</w:t>
       </w:r>
     </w:p>
-    <w:bookmarkEnd w:id="38"/>
-    <w:bookmarkStart w:id="42" w:name="subsec:bridge"/>
+    <w:bookmarkEnd w:id="40"/>
+    <w:bookmarkStart w:id="44" w:name="subsec:bridge"/>
     <w:p>
       <w:pPr>
         <w:pStyle w:val="Heading2"/>
@@ -11066,7 +12335,7 @@
         <w:t xml:space="preserve">Theorem 1.</w:t>
       </w:r>
     </w:p>
-    <w:bookmarkStart w:id="39" w:name="def:dmorder"/>
+    <w:bookmarkStart w:id="41" w:name="def:dmorder"/>
     <w:p>
       <w:pPr>
         <w:pStyle w:val="BodyText"/>
@@ -11619,7 +12888,7 @@
         <w:t xml:space="preserve">.</w:t>
       </w:r>
     </w:p>
-    <w:bookmarkEnd w:id="39"/>
+    <w:bookmarkEnd w:id="41"/>
     <w:p>
       <w:pPr>
         <w:pStyle w:val="BodyText"/>
@@ -11707,7 +12976,7 @@
         <w:t xml:space="preserve">dominance statement, not a scalar.</w:t>
       </w:r>
     </w:p>
-    <w:bookmarkStart w:id="40" w:name="lem:bridge"/>
+    <w:bookmarkStart w:id="42" w:name="lem:bridge"/>
     <w:p>
       <w:pPr>
         <w:pStyle w:val="BodyText"/>
@@ -13264,7 +14533,7 @@
         <w:t xml:space="preserve">(Theorem 3).</w:t>
       </w:r>
     </w:p>
-    <w:bookmarkEnd w:id="40"/>
+    <w:bookmarkEnd w:id="42"/>
     <w:p>
       <w:pPr>
         <w:pStyle w:val="BodyText"/>
@@ -13285,7 +14554,7 @@
         <w:t xml:space="preserve">witness nothing more than the rule’s own incoherence.</w:t>
       </w:r>
     </w:p>
-    <w:bookmarkStart w:id="41" w:name="ass:attain"/>
+    <w:bookmarkStart w:id="43" w:name="ass:attain"/>
     <w:p>
       <w:pPr>
         <w:pStyle w:val="BodyText"/>
@@ -13906,7 +15175,7 @@
         <w:t xml:space="preserve">-incomparable.</w:t>
       </w:r>
     </w:p>
-    <w:bookmarkEnd w:id="41"/>
+    <w:bookmarkEnd w:id="43"/>
     <w:p>
       <w:pPr>
         <w:pStyle w:val="BodyText"/>
@@ -14147,9 +15416,9 @@
         <w:t xml:space="preserve">task design enforces and our measurements verify.</w:t>
       </w:r>
     </w:p>
-    <w:bookmarkEnd w:id="42"/>
-    <w:bookmarkEnd w:id="43"/>
-    <w:bookmarkStart w:id="51" w:name="sec:incomparability"/>
+    <w:bookmarkEnd w:id="44"/>
+    <w:bookmarkEnd w:id="45"/>
+    <w:bookmarkStart w:id="53" w:name="sec:incomparability"/>
     <w:p>
       <w:pPr>
         <w:pStyle w:val="Heading1"/>
@@ -14299,7 +15568,7 @@
         <w:t xml:space="preserve">score practitioners actually use); the two must not be conflated.</w:t>
       </w:r>
     </w:p>
-    <w:bookmarkStart w:id="48" w:name="query-independent-scores-the-theorem"/>
+    <w:bookmarkStart w:id="50" w:name="query-independent-scores-the-theorem"/>
     <w:p>
       <w:pPr>
         <w:pStyle w:val="Heading2"/>
@@ -14308,7 +15577,7 @@
         <w:t xml:space="preserve">Query-independent scores: the theorem</w:t>
       </w:r>
     </w:p>
-    <w:bookmarkStart w:id="44" w:name="thm:incomparable"/>
+    <w:bookmarkStart w:id="46" w:name="thm:incomparable"/>
     <w:p>
       <w:pPr>
         <w:pStyle w:val="FirstParagraph"/>
@@ -14834,7 +16103,7 @@
         <w:t xml:space="preserve">ranking on at least one of them.</w:t>
       </w:r>
     </w:p>
-    <w:bookmarkEnd w:id="44"/>
+    <w:bookmarkEnd w:id="46"/>
     <w:p>
       <w:pPr>
         <w:pStyle w:val="BodyText"/>
@@ -15642,7 +16911,7 @@
         <w:t xml:space="preserve">. ◻</w:t>
       </w:r>
     </w:p>
-    <w:bookmarkStart w:id="45" w:name="rem:c2scope"/>
+    <w:bookmarkStart w:id="47" w:name="rem:c2scope"/>
     <w:p>
       <w:pPr>
         <w:pStyle w:val="BodyText"/>
@@ -15783,8 +17052,8 @@
         <w:t xml:space="preserve">.</w:t>
       </w:r>
     </w:p>
-    <w:bookmarkEnd w:id="45"/>
-    <w:bookmarkStart w:id="46" w:name="prop:vinfo-monotone"/>
+    <w:bookmarkEnd w:id="47"/>
+    <w:bookmarkStart w:id="48" w:name="prop:vinfo-monotone"/>
     <w:p>
       <w:pPr>
         <w:pStyle w:val="BodyText"/>
@@ -16343,8 +17612,8 @@
         <w:t xml:space="preserve">but collapses it to one real number.</w:t>
       </w:r>
     </w:p>
-    <w:bookmarkEnd w:id="46"/>
-    <w:bookmarkStart w:id="47" w:name="rem:vinfo-scope"/>
+    <w:bookmarkEnd w:id="48"/>
+    <w:bookmarkStart w:id="49" w:name="rem:vinfo-scope"/>
     <w:p>
       <w:pPr>
         <w:pStyle w:val="BodyText"/>
@@ -16417,9 +17686,9 @@
         <w:t xml:space="preserve">a data-processing-monotone functional of the same kernels.</w:t>
       </w:r>
     </w:p>
-    <w:bookmarkEnd w:id="47"/>
-    <w:bookmarkEnd w:id="48"/>
-    <w:bookmarkStart w:id="50" w:name="subsec:trap"/>
+    <w:bookmarkEnd w:id="49"/>
+    <w:bookmarkEnd w:id="50"/>
+    <w:bookmarkStart w:id="52" w:name="subsec:trap"/>
     <w:p>
       <w:pPr>
         <w:pStyle w:val="Heading2"/>
@@ -16537,7 +17806,7 @@
         <w:t xml:space="preserve">cover it. We make two precise statements instead.</w:t>
       </w:r>
     </w:p>
-    <w:bookmarkStart w:id="49" w:name="prop:trap-constrained"/>
+    <w:bookmarkStart w:id="51" w:name="prop:trap-constrained"/>
     <w:p>
       <w:pPr>
         <w:pStyle w:val="BodyText"/>
@@ -17171,7 +18440,7 @@
         <w:t xml:space="preserve">correctly on all tasks.</w:t>
       </w:r>
     </w:p>
-    <w:bookmarkEnd w:id="49"/>
+    <w:bookmarkEnd w:id="51"/>
     <w:p>
       <w:pPr>
         <w:pStyle w:val="BodyText"/>
@@ -17741,7 +19010,7 @@
         <w:t xml:space="preserve"> </w:t>
       </w:r>
       <w:r>
-        <w:t xml:space="preserve">(§7.4.2, Table 3), so the topical class is not a lexical strawman: its failure mode is shared by the ranker</w:t>
+        <w:t xml:space="preserve">(§7.4.2, Table 4), so the topical class is not a lexical strawman: its failure mode is shared by the ranker</w:t>
       </w:r>
       <w:r>
         <w:t xml:space="preserve"> </w:t>
@@ -17813,9 +19082,9 @@
         <w:t xml:space="preserve">outside the impossibility class.</w:t>
       </w:r>
     </w:p>
-    <w:bookmarkEnd w:id="50"/>
-    <w:bookmarkEnd w:id="51"/>
-    <w:bookmarkStart w:id="63" w:name="sec:estimator"/>
+    <w:bookmarkEnd w:id="52"/>
+    <w:bookmarkEnd w:id="53"/>
+    <w:bookmarkStart w:id="65" w:name="sec:estimator"/>
     <w:p>
       <w:pPr>
         <w:pStyle w:val="Heading1"/>
@@ -17850,7 +19119,7 @@
         <w:t xml:space="preserve">distribution-free verification that makes each comparison auditable on a live model.</w:t>
       </w:r>
     </w:p>
-    <w:bookmarkStart w:id="53" w:name="subsec:estimator-name"/>
+    <w:bookmarkStart w:id="55" w:name="subsec:estimator-name"/>
     <w:p>
       <w:pPr>
         <w:pStyle w:val="Heading2"/>
@@ -18804,7 +20073,7 @@
         <w:t xml:space="preserve">-incomparability.</w:t>
       </w:r>
     </w:p>
-    <w:bookmarkStart w:id="52" w:name="rem:notlecam"/>
+    <w:bookmarkStart w:id="54" w:name="rem:notlecam"/>
     <w:p>
       <w:pPr>
         <w:pStyle w:val="BodyText"/>
@@ -19307,9 +20576,9 @@
         <w:t xml:space="preserve">of Definition 5, the measurable shadow of Corollary 1.</w:t>
       </w:r>
     </w:p>
-    <w:bookmarkEnd w:id="52"/>
-    <w:bookmarkEnd w:id="53"/>
-    <w:bookmarkStart w:id="56" w:name="subsec:certificate"/>
+    <w:bookmarkEnd w:id="54"/>
+    <w:bookmarkEnd w:id="55"/>
+    <w:bookmarkStart w:id="58" w:name="subsec:certificate"/>
     <w:p>
       <w:pPr>
         <w:pStyle w:val="Heading2"/>
@@ -19360,7 +20629,7 @@
         <w:t xml:space="preserve">valid.</w:t>
       </w:r>
     </w:p>
-    <w:bookmarkStart w:id="54" w:name="prop:certificate"/>
+    <w:bookmarkStart w:id="56" w:name="prop:certificate"/>
     <w:p>
       <w:pPr>
         <w:pStyle w:val="BodyText"/>
@@ -21555,7 +22824,7 @@
         <w:t xml:space="preserve">up to the equivalence margin.</w:t>
       </w:r>
     </w:p>
-    <w:bookmarkEnd w:id="54"/>
+    <w:bookmarkEnd w:id="56"/>
     <w:p>
       <w:pPr>
         <w:pStyle w:val="FirstParagraph"/>
@@ -21588,7 +22857,7 @@
         <w:t xml:space="preserve">guidance for black-box LLM evaluation (Appendix A).</w:t>
       </w:r>
     </w:p>
-    <w:bookmarkStart w:id="55" w:name="ass:iid"/>
+    <w:bookmarkStart w:id="57" w:name="ass:iid"/>
     <w:p>
       <w:pPr>
         <w:pStyle w:val="BodyText"/>
@@ -21763,9 +23032,9 @@
         <w:t xml:space="preserve">stark cells), Clopper–Pearson collapses and the verification is conservative.</w:t>
       </w:r>
     </w:p>
-    <w:bookmarkEnd w:id="55"/>
-    <w:bookmarkEnd w:id="56"/>
-    <w:bookmarkStart w:id="59" w:name="subsec:interference"/>
+    <w:bookmarkEnd w:id="57"/>
+    <w:bookmarkEnd w:id="58"/>
+    <w:bookmarkStart w:id="61" w:name="subsec:interference"/>
     <w:p>
       <w:pPr>
         <w:pStyle w:val="Heading2"/>
@@ -22422,7 +23691,7 @@
         <w:t xml:space="preserve">strictly-more-informative context hurts.”</w:t>
       </w:r>
     </w:p>
-    <w:bookmarkStart w:id="57" w:name="prop:interference"/>
+    <w:bookmarkStart w:id="59" w:name="prop:interference"/>
     <w:p>
       <w:pPr>
         <w:pStyle w:val="BodyText"/>
@@ -23612,8 +24881,8 @@
         <w:t xml:space="preserve">(Remark 6), and omitting it would repeat the multiplicity error we criticize.</w:t>
       </w:r>
     </w:p>
-    <w:bookmarkEnd w:id="57"/>
-    <w:bookmarkStart w:id="58" w:name="rem:leaky"/>
+    <w:bookmarkEnd w:id="59"/>
+    <w:bookmarkStart w:id="60" w:name="rem:leaky"/>
     <w:p>
       <w:pPr>
         <w:pStyle w:val="FirstParagraph"/>
@@ -23981,9 +25250,9 @@
         <w:t xml:space="preserve">(§3.3) thus governs which cells can carry the interference verification.</w:t>
       </w:r>
     </w:p>
-    <w:bookmarkEnd w:id="58"/>
-    <w:bookmarkEnd w:id="59"/>
-    <w:bookmarkStart w:id="61" w:name="subsec:antimono"/>
+    <w:bookmarkEnd w:id="60"/>
+    <w:bookmarkEnd w:id="61"/>
+    <w:bookmarkStart w:id="63" w:name="subsec:antimono"/>
     <w:p>
       <w:pPr>
         <w:pStyle w:val="Heading2"/>
@@ -24109,7 +25378,7 @@
         <w:t xml:space="preserve">optimal-rule order (Theorem 1) and the realized rule diverge.</w:t>
       </w:r>
     </w:p>
-    <w:bookmarkStart w:id="60" w:name="thm:antimono"/>
+    <w:bookmarkStart w:id="62" w:name="thm:antimono"/>
     <w:p>
       <w:pPr>
         <w:pStyle w:val="BodyText"/>
@@ -24997,7 +26266,7 @@
         <w:t xml:space="preserve">.</w:t>
       </w:r>
     </w:p>
-    <w:bookmarkEnd w:id="60"/>
+    <w:bookmarkEnd w:id="62"/>
     <w:p>
       <w:pPr>
         <w:pStyle w:val="BodyText"/>
@@ -25030,8 +26299,8 @@
         <w:t xml:space="preserve">miss it by construction.</w:t>
       </w:r>
     </w:p>
-    <w:bookmarkEnd w:id="61"/>
-    <w:bookmarkStart w:id="62" w:name="subsec:fwer"/>
+    <w:bookmarkEnd w:id="63"/>
+    <w:bookmarkStart w:id="64" w:name="subsec:fwer"/>
     <w:p>
       <w:pPr>
         <w:pStyle w:val="Heading2"/>
@@ -25309,9 +26578,9 @@
         <w:t xml:space="preserve">requirements, which is why the consolidated record marks Opus incomparability as verified and Opus interference as reproduced but not verified; the power analysis is in Appendix A.</w:t>
       </w:r>
     </w:p>
-    <w:bookmarkEnd w:id="62"/>
-    <w:bookmarkEnd w:id="63"/>
-    <w:bookmarkStart w:id="99" w:name="sec:experiments"/>
+    <w:bookmarkEnd w:id="64"/>
+    <w:bookmarkEnd w:id="65"/>
+    <w:bookmarkStart w:id="101" w:name="sec:experiments"/>
     <w:p>
       <w:pPr>
         <w:pStyle w:val="Heading1"/>
@@ -25386,7 +26655,7 @@
         <w:t xml:space="preserve">(§7.4), so the verification is auditable rather than asserted.</w:t>
       </w:r>
     </w:p>
-    <w:bookmarkStart w:id="66" w:name="sec:design"/>
+    <w:bookmarkStart w:id="68" w:name="sec:design"/>
     <w:p>
       <w:pPr>
         <w:pStyle w:val="Heading2"/>
@@ -26269,7 +27538,7 @@
         <w:t xml:space="preserve">first) as an order control.</w:t>
       </w:r>
     </w:p>
-    <w:bookmarkStart w:id="64" w:name="why-incomparable-garbling-argument."/>
+    <w:bookmarkStart w:id="66" w:name="why-incomparable-garbling-argument."/>
     <w:p>
       <w:pPr>
         <w:pStyle w:val="Heading4"/>
@@ -26521,8 +27790,8 @@
         <w:t xml:space="preserve">(Lemma 1).</w:t>
       </w:r>
     </w:p>
-    <w:bookmarkEnd w:id="64"/>
-    <w:bookmarkStart w:id="65" w:name="confound-defense-the-double-crossover."/>
+    <w:bookmarkEnd w:id="66"/>
+    <w:bookmarkStart w:id="67" w:name="confound-defense-the-double-crossover."/>
     <w:p>
       <w:pPr>
         <w:pStyle w:val="Heading4"/>
@@ -26730,7 +27999,7 @@
         <w:t xml:space="preserve"> </w:t>
       </w:r>
       <w:r>
-        <w:t xml:space="preserve">when a model prior leaks a convention (Table 5), we report that leakage explicitly and</w:t>
+        <w:t xml:space="preserve">when a model prior leaks a convention (Table 6), we report that leakage explicitly and</w:t>
       </w:r>
       <w:r>
         <w:t xml:space="preserve"> </w:t>
@@ -26739,9 +28008,9 @@
         <w:t xml:space="preserve">do not use those cells for claims that require a near-zero baseline.</w:t>
       </w:r>
     </w:p>
-    <w:bookmarkEnd w:id="65"/>
-    <w:bookmarkEnd w:id="66"/>
-    <w:bookmarkStart w:id="69" w:name="sec:tasks"/>
+    <w:bookmarkEnd w:id="67"/>
+    <w:bookmarkEnd w:id="68"/>
+    <w:bookmarkStart w:id="71" w:name="sec:tasks"/>
     <w:p>
       <w:pPr>
         <w:pStyle w:val="Heading2"/>
@@ -26966,7 +28235,7 @@
         <w:t xml:space="preserve">, or the wrong exception type).</w:t>
       </w:r>
     </w:p>
-    <w:bookmarkStart w:id="67" w:name="verified-battery."/>
+    <w:bookmarkStart w:id="69" w:name="verified-battery."/>
     <w:p>
       <w:pPr>
         <w:pStyle w:val="Heading4"/>
@@ -27152,8 +28421,8 @@
         <w:t xml:space="preserve">deficiency surrogate accordingly (§7.4.1).</w:t>
       </w:r>
     </w:p>
-    <w:bookmarkEnd w:id="67"/>
-    <w:bookmarkStart w:id="68" w:name="the-relevance-trap."/>
+    <w:bookmarkEnd w:id="69"/>
+    <w:bookmarkStart w:id="70" w:name="the-relevance-trap."/>
     <w:p>
       <w:pPr>
         <w:pStyle w:val="Heading4"/>
@@ -27466,9 +28735,9 @@
         <w:t xml:space="preserve">claim for query-independent scalars.</w:t>
       </w:r>
     </w:p>
-    <w:bookmarkEnd w:id="68"/>
-    <w:bookmarkEnd w:id="69"/>
-    <w:bookmarkStart w:id="77" w:name="sec:methodology"/>
+    <w:bookmarkEnd w:id="70"/>
+    <w:bookmarkEnd w:id="71"/>
+    <w:bookmarkStart w:id="79" w:name="sec:methodology"/>
     <w:p>
       <w:pPr>
         <w:pStyle w:val="Heading2"/>
@@ -27477,7 +28746,7 @@
         <w:t xml:space="preserve">Methodology</w:t>
       </w:r>
     </w:p>
-    <w:bookmarkStart w:id="70" w:name="models-and-vendors."/>
+    <w:bookmarkStart w:id="72" w:name="models-and-vendors."/>
     <w:p>
       <w:pPr>
         <w:pStyle w:val="Heading4"/>
@@ -27500,8 +28769,8 @@
         <w:t xml:space="preserve">GPT-5.5; DeepSeek-V4-Pro; and Moonshot Kimi-K2.6.</w:t>
       </w:r>
     </w:p>
-    <w:bookmarkEnd w:id="70"/>
-    <w:bookmarkStart w:id="72" w:name="harness-and-arms."/>
+    <w:bookmarkEnd w:id="72"/>
+    <w:bookmarkStart w:id="74" w:name="harness-and-arms."/>
     <w:p>
       <w:pPr>
         <w:pStyle w:val="Heading4"/>
@@ -27529,7 +28798,7 @@
       <w:r>
         <w:t xml:space="preserve"> </w:t>
       </w:r>
-      <w:hyperlink r:id="rId71">
+      <w:hyperlink r:id="rId73">
         <w:r>
           <w:rPr>
             <w:rStyle w:val="Hyperlink"/>
@@ -27701,8 +28970,8 @@
         <w:t xml:space="preserve">completions per cell.</w:t>
       </w:r>
     </w:p>
-    <w:bookmarkEnd w:id="72"/>
-    <w:bookmarkStart w:id="73" w:name="one-uniform-run-mode."/>
+    <w:bookmarkEnd w:id="74"/>
+    <w:bookmarkStart w:id="75" w:name="one-uniform-run-mode."/>
     <w:p>
       <w:pPr>
         <w:pStyle w:val="Heading4"/>
@@ -27758,8 +29027,8 @@
         <w:t xml:space="preserve">agentic-exploration pathway, so the model must use what it is given in one pass.</w:t>
       </w:r>
     </w:p>
-    <w:bookmarkEnd w:id="73"/>
-    <w:bookmarkStart w:id="74" w:name="verification-parameters."/>
+    <w:bookmarkEnd w:id="75"/>
+    <w:bookmarkStart w:id="76" w:name="verification-parameters."/>
     <w:p>
       <w:pPr>
         <w:pStyle w:val="Heading4"/>
@@ -28255,8 +29524,8 @@
         <w:t xml:space="preserve">the interference contrast, which mixes intermediate baselines, does not.</w:t>
       </w:r>
     </w:p>
-    <w:bookmarkEnd w:id="74"/>
-    <w:bookmarkStart w:id="75" w:name="sampling-regime."/>
+    <w:bookmarkEnd w:id="76"/>
+    <w:bookmarkStart w:id="77" w:name="sampling-regime."/>
     <w:p>
       <w:pPr>
         <w:pStyle w:val="Heading4"/>
@@ -28319,8 +29588,8 @@
         <w:t xml:space="preserve">policy, and retry policy in Appendix C.</w:t>
       </w:r>
     </w:p>
-    <w:bookmarkEnd w:id="75"/>
-    <w:bookmarkStart w:id="76" w:name="spend."/>
+    <w:bookmarkEnd w:id="77"/>
+    <w:bookmarkStart w:id="78" w:name="spend."/>
     <w:p>
       <w:pPr>
         <w:pStyle w:val="Heading4"/>
@@ -28349,9 +29618,9 @@
         <w:t xml:space="preserve">returns no cost field, so this figure is not the total cost across all six models.</w:t>
       </w:r>
     </w:p>
-    <w:bookmarkEnd w:id="76"/>
-    <w:bookmarkEnd w:id="77"/>
-    <w:bookmarkStart w:id="97" w:name="sec:results"/>
+    <w:bookmarkEnd w:id="78"/>
+    <w:bookmarkEnd w:id="79"/>
+    <w:bookmarkStart w:id="99" w:name="sec:results"/>
     <w:p>
       <w:pPr>
         <w:pStyle w:val="Heading2"/>
@@ -28377,22 +29646,22 @@
         <w:t xml:space="preserve"> </w:t>
       </w:r>
       <w:r>
-        <w:t xml:space="preserve">model-relative value of private context (§7.4.4). Table 1</w:t>
-      </w:r>
-      <w:r>
-        <w:t xml:space="preserve"> </w:t>
-      </w:r>
-      <w:r>
-        <w:t xml:space="preserve">consolidates the per-model verdicts; Tables 2, 4, and</w:t>
-      </w:r>
-      <w:r>
-        <w:t xml:space="preserve"> </w:t>
-      </w:r>
-      <w:r>
-        <w:t xml:space="preserve">5 give the underlying quantities.</w:t>
+        <w:t xml:space="preserve">model-relative value of private context (§7.4.4). Table 2</w:t>
+      </w:r>
+      <w:r>
+        <w:t xml:space="preserve"> </w:t>
+      </w:r>
+      <w:r>
+        <w:t xml:space="preserve">consolidates the per-model verdicts; Tables 3, 5, and</w:t>
+      </w:r>
+      <w:r>
+        <w:t xml:space="preserve"> </w:t>
+      </w:r>
+      <w:r>
+        <w:t xml:space="preserve">6 give the underlying quantities.</w:t>
       </w:r>
     </w:p>
-    <w:bookmarkStart w:id="78" w:name="tab:consolidated"/>
+    <w:bookmarkStart w:id="80" w:name="tab:consolidated"/>
     <w:p>
       <w:pPr>
         <w:pStyle w:val="TableCaption"/>
@@ -29657,8 +30926,8 @@
         </w:tc>
       </w:tr>
     </w:tbl>
-    <w:bookmarkEnd w:id="78"/>
-    <w:bookmarkStart w:id="81" w:name="sec:results-incomp"/>
+    <w:bookmarkEnd w:id="80"/>
+    <w:bookmarkStart w:id="83" w:name="sec:results-incomp"/>
     <w:p>
       <w:pPr>
         <w:pStyle w:val="Heading3"/>
@@ -29898,7 +31167,7 @@
         <w:t xml:space="preserve"> </w:t>
       </w:r>
       <w:r>
-        <w:t xml:space="preserve">(Table 2). The crossover is stark:</w:t>
+        <w:t xml:space="preserve">(Table 3). The crossover is stark:</w:t>
       </w:r>
       <w:r>
         <w:t xml:space="preserve"> </w:t>
@@ -30259,7 +31528,7 @@
         <w:pStyle w:val="BodyText"/>
       </w:pPr>
       <w:r>
-        <w:t xml:space="preserve">Because incomparability is a two-directional claim, each row of Table 2 requires both</w:t>
+        <w:t xml:space="preserve">Because incomparability is a two-directional claim, each row of Table 3 requires both</w:t>
       </w:r>
       <w:r>
         <w:t xml:space="preserve"> </w:t>
@@ -30304,7 +31573,7 @@
         <w:t xml:space="preserve">opposition replicated across six models.</w:t>
       </w:r>
     </w:p>
-    <w:bookmarkStart w:id="79" w:name="tab:LD"/>
+    <w:bookmarkStart w:id="81" w:name="tab:LD"/>
     <w:p>
       <w:pPr>
         <w:pStyle w:val="TableCaption"/>
@@ -31308,8 +32577,8 @@
         </w:tc>
       </w:tr>
     </w:tbl>
-    <w:bookmarkEnd w:id="79"/>
-    <w:bookmarkStart w:id="80" w:name="Xb26a34529b3197c54b6ef78a1946345b612d255"/>
+    <w:bookmarkEnd w:id="81"/>
+    <w:bookmarkStart w:id="82" w:name="Xb26a34529b3197c54b6ef78a1946345b612d255"/>
     <w:p>
       <w:pPr>
         <w:pStyle w:val="Heading4"/>
@@ -31629,9 +32898,9 @@
         <w:t xml:space="preserve">added signal.</w:t>
       </w:r>
     </w:p>
-    <w:bookmarkEnd w:id="80"/>
-    <w:bookmarkEnd w:id="81"/>
-    <w:bookmarkStart w:id="84" w:name="sec:results-misrank"/>
+    <w:bookmarkEnd w:id="82"/>
+    <w:bookmarkEnd w:id="83"/>
+    <w:bookmarkStart w:id="86" w:name="sec:results-misrank"/>
     <w:p>
       <w:pPr>
         <w:pStyle w:val="Heading3"/>
@@ -32179,7 +33448,7 @@
         <w:t xml:space="preserve">unguessable and that encoding knowledge is useless on this task.</w:t>
       </w:r>
     </w:p>
-    <w:bookmarkStart w:id="83" w:name="X92ef9457b97ee405b154a7eb0fa1aa3a6f2d684"/>
+    <w:bookmarkStart w:id="85" w:name="X92ef9457b97ee405b154a7eb0fa1aa3a6f2d684"/>
     <w:p>
       <w:pPr>
         <w:pStyle w:val="Heading4"/>
@@ -32367,7 +33636,7 @@
         <w:t xml:space="preserve"> </w:t>
       </w:r>
       <w:r>
-        <w:t xml:space="preserve">per task). Table 3 reports the induced rankings.</w:t>
+        <w:t xml:space="preserve">per task). Table 4 reports the induced rankings.</w:t>
       </w:r>
       <w:r>
         <w:t xml:space="preserve"> </w:t>
@@ -32613,7 +33882,7 @@
         <w:t xml:space="preserve">deficiency verification is built from, not a free scalar.</w:t>
       </w:r>
     </w:p>
-    <w:bookmarkStart w:id="82" w:name="tab:rankers"/>
+    <w:bookmarkStart w:id="84" w:name="tab:rankers"/>
     <w:p>
       <w:pPr>
         <w:pStyle w:val="TableCaption"/>
@@ -33538,10 +34807,10 @@
         </w:tc>
       </w:tr>
     </w:tbl>
-    <w:bookmarkEnd w:id="82"/>
-    <w:bookmarkEnd w:id="83"/>
     <w:bookmarkEnd w:id="84"/>
-    <w:bookmarkStart w:id="93" w:name="sec:results-antimono"/>
+    <w:bookmarkEnd w:id="85"/>
+    <w:bookmarkEnd w:id="86"/>
+    <w:bookmarkStart w:id="95" w:name="sec:results-antimono"/>
     <w:p>
       <w:pPr>
         <w:pStyle w:val="Heading3"/>
@@ -33981,7 +35250,7 @@
         <w:t xml:space="preserve"> </w:t>
       </w:r>
       <w:r>
-        <w:t xml:space="preserve">least one cell for five of the six models (Table 4). Opus reproduces the effect</w:t>
+        <w:t xml:space="preserve">least one cell for five of the six models (Table 5). Opus reproduces the effect</w:t>
       </w:r>
       <w:r>
         <w:t xml:space="preserve"> </w:t>
@@ -34102,7 +35371,7 @@
         <w:t xml:space="preserve">Figure 1 shows the collapse across the six models.</w:t>
       </w:r>
     </w:p>
-    <w:bookmarkStart w:id="85" w:name="fig:collapse"/>
+    <w:bookmarkStart w:id="87" w:name="fig:collapse"/>
     <w:tbl>
       <w:tblPr>
         <w:tblStyle w:val="FigureTable"/>
@@ -34238,7 +35507,7 @@
         <w:t xml:space="preserve"> </w:t>
       </w:r>
       <w:r>
-        <w:t xml:space="preserve">(dark), per model (Table 5). The superset</w:t>
+        <w:t xml:space="preserve">(dark), per model (Table 6). The superset</w:t>
       </w:r>
       <w:r>
         <w:t xml:space="preserve"> </w:t>
@@ -34367,11 +35636,11 @@
         </m:r>
       </m:oMath>
       <w:r>
-        <w:t xml:space="preserve">; Table 4); Opus reproduces the collapse but does not verify.</w:t>
+        <w:t xml:space="preserve">; Table 5); Opus reproduces the collapse but does not verify.</w:t>
       </w:r>
     </w:p>
-    <w:bookmarkEnd w:id="85"/>
-    <w:bookmarkStart w:id="88" w:name="Xad950c9ad2efcae5ca328fe88a654bcb87f62fc"/>
+    <w:bookmarkEnd w:id="87"/>
+    <w:bookmarkStart w:id="90" w:name="Xad950c9ad2efcae5ca328fe88a654bcb87f62fc"/>
     <w:p>
       <w:pPr>
         <w:pStyle w:val="Heading4"/>
@@ -34997,7 +36266,7 @@
         <w:t xml:space="preserve">is developed in a companion paper.</w:t>
       </w:r>
     </w:p>
-    <w:bookmarkStart w:id="86" w:name="fig:hasse"/>
+    <w:bookmarkStart w:id="88" w:name="fig:hasse"/>
     <w:tbl>
       <w:tblPr>
         <w:tblStyle w:val="FigureTable"/>
@@ -35367,7 +36636,7 @@
         </m:r>
       </m:oMath>
       <w:r>
-        <w:t xml:space="preserve">, anti-monotonicity, Table 4)</w:t>
+        <w:t xml:space="preserve">, anti-monotonicity, Table 5)</w:t>
       </w:r>
       <w:r>
         <w:t xml:space="preserve"> </w:t>
@@ -35445,8 +36714,8 @@
         <w:t xml:space="preserve">rule can represent.</w:t>
       </w:r>
     </w:p>
-    <w:bookmarkEnd w:id="86"/>
-    <w:bookmarkStart w:id="87" w:name="tab:interference"/>
+    <w:bookmarkEnd w:id="88"/>
+    <w:bookmarkStart w:id="89" w:name="tab:interference"/>
     <w:p>
       <w:pPr>
         <w:pStyle w:val="TableCaption"/>
@@ -36991,9 +38260,9 @@
         </w:tc>
       </w:tr>
     </w:tbl>
-    <w:bookmarkEnd w:id="87"/>
-    <w:bookmarkEnd w:id="88"/>
-    <w:bookmarkStart w:id="89" w:name="Xe149701baef4ebfc0c0660f6732890156a3bb29"/>
+    <w:bookmarkEnd w:id="89"/>
+    <w:bookmarkEnd w:id="90"/>
+    <w:bookmarkStart w:id="91" w:name="Xe149701baef4ebfc0c0660f6732890156a3bb29"/>
     <w:p>
       <w:pPr>
         <w:pStyle w:val="Heading4"/>
@@ -37312,7 +38581,7 @@
         <w:t xml:space="preserve"> </w:t>
       </w:r>
       <w:r>
-        <w:t xml:space="preserve">baseline floors near zero. Table 4 reports, per model, which cell</w:t>
+        <w:t xml:space="preserve">baseline floors near zero. Table 5 reports, per model, which cell</w:t>
       </w:r>
       <w:r>
         <w:t xml:space="preserve"> </w:t>
@@ -37481,8 +38750,8 @@
         <w:t xml:space="preserve">.</w:t>
       </w:r>
     </w:p>
-    <w:bookmarkEnd w:id="89"/>
-    <w:bookmarkStart w:id="90" w:name="position-is-not-the-cause."/>
+    <w:bookmarkEnd w:id="91"/>
+    <w:bookmarkStart w:id="92" w:name="position-is-not-the-cause."/>
     <w:p>
       <w:pPr>
         <w:pStyle w:val="Heading4"/>
@@ -37606,8 +38875,8 @@
         <w:t xml:space="preserve">what turns a harmless arm into a harmful one, so the cause is the added signal, not where it sits.</w:t>
       </w:r>
     </w:p>
-    <w:bookmarkEnd w:id="90"/>
-    <w:bookmarkStart w:id="91" w:name="X086de5874ce71cba9e6d9633bd38de7f701e1cb"/>
+    <w:bookmarkEnd w:id="92"/>
+    <w:bookmarkStart w:id="93" w:name="X086de5874ce71cba9e6d9633bd38de7f701e1cb"/>
     <w:p>
       <w:pPr>
         <w:pStyle w:val="Heading4"/>
@@ -37688,8 +38957,8 @@
         <w:t xml:space="preserve">could be effect rather than cause.</w:t>
       </w:r>
     </w:p>
-    <w:bookmarkEnd w:id="91"/>
-    <w:bookmarkStart w:id="92" w:name="robust-but-not-monotone-in-capability."/>
+    <w:bookmarkEnd w:id="93"/>
+    <w:bookmarkStart w:id="94" w:name="robust-but-not-monotone-in-capability."/>
     <w:p>
       <w:pPr>
         <w:pStyle w:val="Heading4"/>
@@ -37964,9 +39233,9 @@
         <w:t xml:space="preserve">across the ladder, not a capability trend.</w:t>
       </w:r>
     </w:p>
-    <w:bookmarkEnd w:id="92"/>
-    <w:bookmarkEnd w:id="93"/>
-    <w:bookmarkStart w:id="96" w:name="sec:results-moat"/>
+    <w:bookmarkEnd w:id="94"/>
+    <w:bookmarkEnd w:id="95"/>
+    <w:bookmarkStart w:id="98" w:name="sec:results-moat"/>
     <w:p>
       <w:pPr>
         <w:pStyle w:val="Heading3"/>
@@ -38119,7 +39388,7 @@
         <w:t xml:space="preserve"> </w:t>
       </w:r>
       <w:r>
-        <w:t xml:space="preserve">(Table 1; Figure 3). So the value of the private context, the</w:t>
+        <w:t xml:space="preserve">(Table 2; Figure 3). So the value of the private context, the</w:t>
       </w:r>
       <w:r>
         <w:t xml:space="preserve"> </w:t>
@@ -38362,7 +39631,7 @@
         <w:t xml:space="preserve">).</w:t>
       </w:r>
     </w:p>
-    <w:bookmarkStart w:id="94" w:name="fig:spectrum"/>
+    <w:bookmarkStart w:id="96" w:name="fig:spectrum"/>
     <w:tbl>
       <w:tblPr>
         <w:tblStyle w:val="FigureTable"/>
@@ -38493,8 +39762,8 @@
         <w:t xml:space="preserve">different vendor, and Opus (the strongest Anthropic model) guesses more than Sonnet.</w:t>
       </w:r>
     </w:p>
-    <w:bookmarkEnd w:id="94"/>
-    <w:bookmarkStart w:id="95" w:name="auditable-per-cell-record."/>
+    <w:bookmarkEnd w:id="96"/>
+    <w:bookmarkStart w:id="97" w:name="auditable-per-cell-record."/>
     <w:p>
       <w:pPr>
         <w:pStyle w:val="Heading4"/>
@@ -38508,13 +39777,13 @@
         <w:pStyle w:val="FirstParagraph"/>
       </w:pPr>
       <w:r>
-        <w:t xml:space="preserve">The full per-arm PASS record for every carrying cell is Table 5 in Appendix B, so each verification can be reconstructed from the reported counts.</w:t>
+        <w:t xml:space="preserve">The full per-arm PASS record for every carrying cell is Table 6 in Appendix B, so each verification can be reconstructed from the reported counts.</w:t>
       </w:r>
     </w:p>
-    <w:bookmarkEnd w:id="95"/>
-    <w:bookmarkEnd w:id="96"/>
     <w:bookmarkEnd w:id="97"/>
-    <w:bookmarkStart w:id="98" w:name="sec:results-generality"/>
+    <w:bookmarkEnd w:id="98"/>
+    <w:bookmarkEnd w:id="99"/>
+    <w:bookmarkStart w:id="100" w:name="sec:results-generality"/>
     <w:p>
       <w:pPr>
         <w:pStyle w:val="Heading2"/>
@@ -39291,9 +40560,9 @@
         <w:t xml:space="preserve">convention-to-task routing rather than in convention segmentation.</w:t>
       </w:r>
     </w:p>
-    <w:bookmarkEnd w:id="98"/>
-    <w:bookmarkEnd w:id="99"/>
-    <w:bookmarkStart w:id="115" w:name="sec:discussion"/>
+    <w:bookmarkEnd w:id="100"/>
+    <w:bookmarkEnd w:id="101"/>
+    <w:bookmarkStart w:id="117" w:name="sec:discussion"/>
     <w:p>
       <w:pPr>
         <w:pStyle w:val="Heading1"/>
@@ -39434,7 +40703,7 @@
         <w:t xml:space="preserve">formalization is a model rather than a proof of the realized object.</w:t>
       </w:r>
     </w:p>
-    <w:bookmarkStart w:id="102" w:name="sec:disc-bridge"/>
+    <w:bookmarkStart w:id="104" w:name="sec:disc-bridge"/>
     <w:p>
       <w:pPr>
         <w:pStyle w:val="Heading2"/>
@@ -39447,10 +40716,10 @@
       <w:pPr>
         <w:pStyle w:val="FirstParagraph"/>
       </w:pPr>
-      <w:bookmarkStart w:id="100" w:name="sec:disc-deficiency"/>
-      <w:bookmarkEnd w:id="100"/>
-      <w:bookmarkStart w:id="101" w:name="sec:disc-certificate"/>
-      <w:bookmarkEnd w:id="101"/>
+      <w:bookmarkStart w:id="102" w:name="sec:disc-deficiency"/>
+      <w:bookmarkEnd w:id="102"/>
+      <w:bookmarkStart w:id="103" w:name="sec:disc-certificate"/>
+      <w:bookmarkEnd w:id="103"/>
     </w:p>
     <w:p>
       <w:pPr>
@@ -39723,8 +40992,8 @@
         <w:t xml:space="preserve">a fixed adversarial battery, not a task distribution.</w:t>
       </w:r>
     </w:p>
-    <w:bookmarkEnd w:id="102"/>
-    <w:bookmarkStart w:id="104" w:name="sec:disc-antimono"/>
+    <w:bookmarkEnd w:id="104"/>
+    <w:bookmarkStart w:id="106" w:name="sec:disc-antimono"/>
     <w:p>
       <w:pPr>
         <w:pStyle w:val="Heading2"/>
@@ -40116,7 +41385,7 @@
         <w:t xml:space="preserve"> </w:t>
       </w:r>
       <w:r>
-        <w:t xml:space="preserve">(Table 4), with collapses as stark as</w:t>
+        <w:t xml:space="preserve">(Table 5), with collapses as stark as</w:t>
       </w:r>
       <w:r>
         <w:t xml:space="preserve"> </w:t>
@@ -40657,7 +41926,7 @@
         <w:t xml:space="preserve">).</w:t>
       </w:r>
     </w:p>
-    <w:bookmarkStart w:id="103" w:name="will-scale-restore-blackwell-coherence"/>
+    <w:bookmarkStart w:id="105" w:name="will-scale-restore-blackwell-coherence"/>
     <w:p>
       <w:pPr>
         <w:pStyle w:val="Heading4"/>
@@ -40932,9 +42201,9 @@
         <w:t xml:space="preserve">itself.</w:t>
       </w:r>
     </w:p>
-    <w:bookmarkEnd w:id="103"/>
-    <w:bookmarkEnd w:id="104"/>
-    <w:bookmarkStart w:id="105" w:name="sec:disc-moat"/>
+    <w:bookmarkEnd w:id="105"/>
+    <w:bookmarkEnd w:id="106"/>
+    <w:bookmarkStart w:id="107" w:name="sec:disc-moat"/>
     <w:p>
       <w:pPr>
         <w:pStyle w:val="Heading2"/>
@@ -41273,8 +42542,8 @@
         <w:t xml:space="preserve">caps which cells verify per model.</w:t>
       </w:r>
     </w:p>
-    <w:bookmarkEnd w:id="105"/>
-    <w:bookmarkStart w:id="107" w:name="sec:disc-mechanism"/>
+    <w:bookmarkEnd w:id="107"/>
+    <w:bookmarkStart w:id="109" w:name="sec:disc-mechanism"/>
     <w:p>
       <w:pPr>
         <w:pStyle w:val="Heading2"/>
@@ -41728,7 +42997,7 @@
         <w:t xml:space="preserve">mechanistic companion study, downstream of, not prerequisite to, the verified behavioral claim.</w:t>
       </w:r>
     </w:p>
-    <w:bookmarkStart w:id="106" w:name="X37a5acb05d688eb32bbe54c216dbcf303d3b4c3"/>
+    <w:bookmarkStart w:id="108" w:name="X37a5acb05d688eb32bbe54c216dbcf303d3b4c3"/>
     <w:p>
       <w:pPr>
         <w:pStyle w:val="Heading4"/>
@@ -41991,9 +43260,9 @@
         <w:t xml:space="preserve">claim in the paper is independent of which reading is true.</w:t>
       </w:r>
     </w:p>
-    <w:bookmarkEnd w:id="106"/>
-    <w:bookmarkEnd w:id="107"/>
-    <w:bookmarkStart w:id="114" w:name="sec:limitations"/>
+    <w:bookmarkEnd w:id="108"/>
+    <w:bookmarkEnd w:id="109"/>
+    <w:bookmarkStart w:id="116" w:name="sec:limitations"/>
     <w:p>
       <w:pPr>
         <w:pStyle w:val="Heading2"/>
@@ -42010,7 +43279,7 @@
         <w:t xml:space="preserve">We collect the scope restrictions here; each is stated once and sized to its weight.</w:t>
       </w:r>
     </w:p>
-    <w:bookmarkStart w:id="108" w:name="from-diagnosis-to-selection."/>
+    <w:bookmarkStart w:id="110" w:name="from-diagnosis-to-selection."/>
     <w:p>
       <w:pPr>
         <w:pStyle w:val="Heading4"/>
@@ -42154,8 +43423,8 @@
         <w:t xml:space="preserve">shortlist, is the central open problem this work opens.</w:t>
       </w:r>
     </w:p>
-    <w:bookmarkEnd w:id="108"/>
-    <w:bookmarkStart w:id="109" w:name="source-pair-generality."/>
+    <w:bookmarkEnd w:id="110"/>
+    <w:bookmarkStart w:id="111" w:name="source-pair-generality."/>
     <w:p>
       <w:pPr>
         <w:pStyle w:val="Heading4"/>
@@ -42328,8 +43597,8 @@
         <w:t xml:space="preserve">steps.</w:t>
       </w:r>
     </w:p>
-    <w:bookmarkEnd w:id="109"/>
-    <w:bookmarkStart w:id="110" w:name="Xd344a6caba248cd0f3c9915a6f9f7c4f85f22da"/>
+    <w:bookmarkEnd w:id="111"/>
+    <w:bookmarkStart w:id="112" w:name="Xd344a6caba248cd0f3c9915a6f9f7c4f85f22da"/>
     <w:p>
       <w:pPr>
         <w:pStyle w:val="Heading4"/>
@@ -42438,8 +43707,8 @@
         <w:t xml:space="preserve">comparison.</w:t>
       </w:r>
     </w:p>
-    <w:bookmarkEnd w:id="110"/>
-    <w:bookmarkStart w:id="111" w:name="the-model-is-an-idealization-twice."/>
+    <w:bookmarkEnd w:id="112"/>
+    <w:bookmarkStart w:id="113" w:name="the-model-is-an-idealization-twice."/>
     <w:p>
       <w:pPr>
         <w:pStyle w:val="Heading4"/>
@@ -42547,8 +43816,8 @@
         <w:t xml:space="preserve">document pairs is the direct next experiment.</w:t>
       </w:r>
     </w:p>
-    <w:bookmarkEnd w:id="111"/>
-    <w:bookmarkStart w:id="112" w:name="sampling-and-verification-regime."/>
+    <w:bookmarkEnd w:id="113"/>
+    <w:bookmarkStart w:id="114" w:name="sampling-and-verification-regime."/>
     <w:p>
       <w:pPr>
         <w:pStyle w:val="Heading4"/>
@@ -42618,8 +43887,8 @@
         <w:t xml:space="preserve">marginal-versus-joint control is discussed in §8.1.</w:t>
       </w:r>
     </w:p>
-    <w:bookmarkEnd w:id="112"/>
-    <w:bookmarkStart w:id="113" w:name="ranker-spectrum-and-synergy."/>
+    <w:bookmarkEnd w:id="114"/>
+    <w:bookmarkStart w:id="115" w:name="ranker-spectrum-and-synergy."/>
     <w:p>
       <w:pPr>
         <w:pStyle w:val="Heading4"/>
@@ -42717,10 +43986,10 @@
         <w:t xml:space="preserve">beyond its parts; we make no claim about it.</w:t>
       </w:r>
     </w:p>
-    <w:bookmarkEnd w:id="113"/>
-    <w:bookmarkEnd w:id="114"/>
     <w:bookmarkEnd w:id="115"/>
-    <w:bookmarkStart w:id="116" w:name="sec:conclusion"/>
+    <w:bookmarkEnd w:id="116"/>
+    <w:bookmarkEnd w:id="117"/>
+    <w:bookmarkStart w:id="118" w:name="sec:conclusion"/>
     <w:p>
       <w:pPr>
         <w:pStyle w:val="Heading1"/>
@@ -43135,8 +44404,8 @@
         <w:t xml:space="preserve">domain, are the natural next steps, and the experimental record indicates each is cheap to run.</w:t>
       </w:r>
     </w:p>
-    <w:bookmarkEnd w:id="116"/>
-    <w:bookmarkStart w:id="128" w:name="app:proofs"/>
+    <w:bookmarkEnd w:id="118"/>
+    <w:bookmarkStart w:id="130" w:name="app:proofs"/>
     <w:p>
       <w:pPr>
         <w:pStyle w:val="Heading1"/>
@@ -43145,7 +44414,7 @@
         <w:t xml:space="preserve">Deferred proofs and technical material</w:t>
       </w:r>
     </w:p>
-    <w:bookmarkStart w:id="117" w:name="proof-of-lemma-1"/>
+    <w:bookmarkStart w:id="119" w:name="proof-of-lemma-1"/>
     <w:p>
       <w:pPr>
         <w:pStyle w:val="Heading2"/>
@@ -43783,8 +45052,8 @@
         <w:t xml:space="preserve">applied in both directions. ◻</w:t>
       </w:r>
     </w:p>
-    <w:bookmarkEnd w:id="117"/>
-    <w:bookmarkStart w:id="118" w:name="proof-of-lemma-2"/>
+    <w:bookmarkEnd w:id="119"/>
+    <w:bookmarkStart w:id="120" w:name="proof-of-lemma-2"/>
     <w:p>
       <w:pPr>
         <w:pStyle w:val="Heading2"/>
@@ -44887,8 +46156,8 @@
         <w:t xml:space="preserve">value obeys. ◻</w:t>
       </w:r>
     </w:p>
-    <w:bookmarkEnd w:id="118"/>
-    <w:bookmarkStart w:id="119" w:name="proof-of-proposition-1"/>
+    <w:bookmarkEnd w:id="120"/>
+    <w:bookmarkStart w:id="121" w:name="proof-of-proposition-1"/>
     <w:p>
       <w:pPr>
         <w:pStyle w:val="Heading2"/>
@@ -45240,8 +46509,8 @@
         <w:t xml:space="preserve">for all tasks. ◻</w:t>
       </w:r>
     </w:p>
-    <w:bookmarkEnd w:id="119"/>
-    <w:bookmarkStart w:id="120" w:name="proof-of-proposition-3"/>
+    <w:bookmarkEnd w:id="121"/>
+    <w:bookmarkStart w:id="122" w:name="proof-of-proposition-3"/>
     <w:p>
       <w:pPr>
         <w:pStyle w:val="Heading2"/>
@@ -46442,8 +47711,8 @@
         <w:t xml:space="preserve">without a further Bonferroni factor. ◻</w:t>
       </w:r>
     </w:p>
-    <w:bookmarkEnd w:id="120"/>
-    <w:bookmarkStart w:id="121" w:name="proof-of-proposition-4"/>
+    <w:bookmarkEnd w:id="122"/>
+    <w:bookmarkStart w:id="123" w:name="proof-of-proposition-4"/>
     <w:p>
       <w:pPr>
         <w:pStyle w:val="Heading2"/>
@@ -46860,8 +48129,8 @@
         <w:t xml:space="preserve">simultaneous coverage. ◻</w:t>
       </w:r>
     </w:p>
-    <w:bookmarkEnd w:id="121"/>
-    <w:bookmarkStart w:id="122" w:name="proof-of-theorem-3"/>
+    <w:bookmarkEnd w:id="123"/>
+    <w:bookmarkStart w:id="124" w:name="proof-of-theorem-3"/>
     <w:p>
       <w:pPr>
         <w:pStyle w:val="Heading2"/>
@@ -47321,8 +48590,8 @@
         <w:t xml:space="preserve">the realized reversal. ◻</w:t>
       </w:r>
     </w:p>
-    <w:bookmarkEnd w:id="122"/>
-    <w:bookmarkStart w:id="124" w:name="why-a-naive-dkw-bound-fails"/>
+    <w:bookmarkEnd w:id="124"/>
+    <w:bookmarkStart w:id="126" w:name="why-a-naive-dkw-bound-fails"/>
     <w:p>
       <w:pPr>
         <w:pStyle w:val="Heading2"/>
@@ -47331,7 +48600,7 @@
         <w:t xml:space="preserve">Why a naive DKW bound fails</w:t>
       </w:r>
     </w:p>
-    <w:bookmarkStart w:id="123" w:name="rem:dkw"/>
+    <w:bookmarkStart w:id="125" w:name="rem:dkw"/>
     <w:p>
       <w:pPr>
         <w:pStyle w:val="FirstParagraph"/>
@@ -47593,9 +48862,9 @@
         <w:t xml:space="preserve">absorbed into a single-sample DKW envelope.</w:t>
       </w:r>
     </w:p>
-    <w:bookmarkEnd w:id="123"/>
-    <w:bookmarkEnd w:id="124"/>
-    <w:bookmarkStart w:id="126" w:name="relation-to-llm-evaluation-statistics"/>
+    <w:bookmarkEnd w:id="125"/>
+    <w:bookmarkEnd w:id="126"/>
+    <w:bookmarkStart w:id="128" w:name="relation-to-llm-evaluation-statistics"/>
     <w:p>
       <w:pPr>
         <w:pStyle w:val="Heading2"/>
@@ -47604,7 +48873,7 @@
         <w:t xml:space="preserve">Relation to LLM-evaluation statistics</w:t>
       </w:r>
     </w:p>
-    <w:bookmarkStart w:id="125" w:name="rem:evalstats"/>
+    <w:bookmarkStart w:id="127" w:name="rem:evalstats"/>
     <w:p>
       <w:pPr>
         <w:pStyle w:val="FirstParagraph"/>
@@ -47774,9 +49043,9 @@
         <w:t xml:space="preserve">precisely what the exact Clopper–Pearson construction provides.</w:t>
       </w:r>
     </w:p>
-    <w:bookmarkEnd w:id="125"/>
-    <w:bookmarkEnd w:id="126"/>
-    <w:bookmarkStart w:id="127" w:name="subsec:power"/>
+    <w:bookmarkEnd w:id="127"/>
+    <w:bookmarkEnd w:id="128"/>
+    <w:bookmarkStart w:id="129" w:name="subsec:power"/>
     <w:p>
       <w:pPr>
         <w:pStyle w:val="Heading2"/>
@@ -48100,9 +49369,9 @@
         <w:t xml:space="preserve">that verifies incomparability need not verify interference.</w:t>
       </w:r>
     </w:p>
-    <w:bookmarkEnd w:id="127"/>
-    <w:bookmarkEnd w:id="128"/>
-    <w:bookmarkStart w:id="135" w:name="app:record"/>
+    <w:bookmarkEnd w:id="129"/>
+    <w:bookmarkEnd w:id="130"/>
+    <w:bookmarkStart w:id="137" w:name="app:record"/>
     <w:p>
       <w:pPr>
         <w:pStyle w:val="Heading1"/>
@@ -48111,7 +49380,7 @@
         <w:t xml:space="preserve">Extended experimental record</w:t>
       </w:r>
     </w:p>
-    <w:bookmarkStart w:id="129" w:name="tab:percell"/>
+    <w:bookmarkStart w:id="131" w:name="tab:percell"/>
     <w:p>
       <w:pPr>
         <w:pStyle w:val="TableCaption"/>
@@ -50303,8 +51572,8 @@
         </w:tc>
       </w:tr>
     </w:tbl>
-    <w:bookmarkEnd w:id="129"/>
-    <w:bookmarkStart w:id="134" w:name="generality-and-controls-full-protocols"/>
+    <w:bookmarkEnd w:id="131"/>
+    <w:bookmarkStart w:id="136" w:name="generality-and-controls-full-protocols"/>
     <w:p>
       <w:pPr>
         <w:pStyle w:val="Heading2"/>
@@ -50327,7 +51596,7 @@
         <w:t xml:space="preserve">confound, and whether the anti-monotonicity collapse is curable by cheap prompting.</w:t>
       </w:r>
     </w:p>
-    <w:bookmarkStart w:id="130" w:name="Xfd2ce319a26faa67e0eadf0fee657d728019446"/>
+    <w:bookmarkStart w:id="132" w:name="Xfd2ce319a26faa67e0eadf0fee657d728019446"/>
     <w:p>
       <w:pPr>
         <w:pStyle w:val="Heading4"/>
@@ -51259,8 +52528,8 @@
         <w:t xml:space="preserve">, not a second mis-rank.</w:t>
       </w:r>
     </w:p>
-    <w:bookmarkEnd w:id="130"/>
-    <w:bookmarkStart w:id="131" w:name="a-length-matched-padding-control."/>
+    <w:bookmarkEnd w:id="132"/>
+    <w:bookmarkStart w:id="133" w:name="a-length-matched-padding-control."/>
     <w:p>
       <w:pPr>
         <w:pStyle w:val="Heading4"/>
@@ -52006,8 +53275,8 @@
         <w:t xml:space="preserve">untested middle case.</w:t>
       </w:r>
     </w:p>
-    <w:bookmarkEnd w:id="131"/>
-    <w:bookmarkStart w:id="132" w:name="Xd508a319e40f775fe4906e106ed6a92e07fd05b"/>
+    <w:bookmarkEnd w:id="133"/>
+    <w:bookmarkStart w:id="134" w:name="Xd508a319e40f775fe4906e106ed6a92e07fd05b"/>
     <w:p>
       <w:pPr>
         <w:pStyle w:val="Heading4"/>
@@ -52648,8 +53917,8 @@
         <w:t xml:space="preserve">the superset, survives the ablation intact.</w:t>
       </w:r>
     </w:p>
-    <w:bookmarkEnd w:id="132"/>
-    <w:bookmarkStart w:id="133" w:name="X9488de75bf9879d7a0599574b61e9ffd4996347"/>
+    <w:bookmarkEnd w:id="134"/>
+    <w:bookmarkStart w:id="135" w:name="X9488de75bf9879d7a0599574b61e9ffd4996347"/>
     <w:p>
       <w:pPr>
         <w:pStyle w:val="Heading4"/>
@@ -53322,10 +54591,10 @@
         <w:t xml:space="preserve">dropping the dominated signal, locates the failure in convention-to-task routing.</w:t>
       </w:r>
     </w:p>
-    <w:bookmarkEnd w:id="133"/>
-    <w:bookmarkEnd w:id="134"/>
     <w:bookmarkEnd w:id="135"/>
-    <w:bookmarkStart w:id="221" w:name="app:repro"/>
+    <w:bookmarkEnd w:id="136"/>
+    <w:bookmarkEnd w:id="137"/>
+    <w:bookmarkStart w:id="229" w:name="app:repro"/>
     <w:p>
       <w:pPr>
         <w:pStyle w:val="Heading1"/>
@@ -53356,7 +54625,7 @@
       <w:r>
         <w:t xml:space="preserve"> </w:t>
       </w:r>
-      <w:hyperlink r:id="rId71">
+      <w:hyperlink r:id="rId73">
         <w:r>
           <w:rPr>
             <w:rStyle w:val="Hyperlink"/>
@@ -53525,7 +54794,7 @@
         <w:t xml:space="preserve">endpoint, and all API keys are read from the environment (never written to a file).</w:t>
       </w:r>
     </w:p>
-    <w:bookmarkStart w:id="136" w:name="protocol."/>
+    <w:bookmarkStart w:id="138" w:name="protocol."/>
     <w:p>
       <w:pPr>
         <w:pStyle w:val="Heading4"/>
@@ -53901,8 +55170,8 @@
         <w:t xml:space="preserve">.</w:t>
       </w:r>
     </w:p>
-    <w:bookmarkEnd w:id="136"/>
-    <w:bookmarkStart w:id="137" w:name="decoding-seeding-and-retries."/>
+    <w:bookmarkEnd w:id="138"/>
+    <w:bookmarkStart w:id="139" w:name="decoding-seeding-and-retries."/>
     <w:p>
       <w:pPr>
         <w:pStyle w:val="Heading4"/>
@@ -54011,8 +55280,8 @@
         <w:t xml:space="preserve">arm; noted in the artifact list), so no reported cell mixes outage-scored draws with real ones.</w:t>
       </w:r>
     </w:p>
-    <w:bookmarkEnd w:id="137"/>
-    <w:bookmarkStart w:id="138" w:name="artifacts."/>
+    <w:bookmarkEnd w:id="139"/>
+    <w:bookmarkStart w:id="140" w:name="artifacts."/>
     <w:p>
       <w:pPr>
         <w:pStyle w:val="Heading4"/>
@@ -54034,7 +55303,7 @@
       <w:r>
         <w:t xml:space="preserve">(</w:t>
       </w:r>
-      <w:hyperlink r:id="rId71">
+      <w:hyperlink r:id="rId73">
         <w:r>
           <w:rPr>
             <w:rStyle w:val="Hyperlink"/>
@@ -54347,8 +55616,8 @@
         <w:t xml:space="preserve">.</w:t>
       </w:r>
     </w:p>
-    <w:bookmarkEnd w:id="138"/>
-    <w:bookmarkStart w:id="139" w:name="compute-and-cost."/>
+    <w:bookmarkEnd w:id="140"/>
+    <w:bookmarkStart w:id="141" w:name="compute-and-cost."/>
     <w:p>
       <w:pPr>
         <w:pStyle w:val="Heading4"/>
@@ -54395,8 +55664,8 @@
         <w:t xml:space="preserve">on open weights at zero API cost.</w:t>
       </w:r>
     </w:p>
-    <w:bookmarkEnd w:id="139"/>
-    <w:bookmarkStart w:id="220" w:name="reference-verification."/>
+    <w:bookmarkEnd w:id="141"/>
+    <w:bookmarkStart w:id="228" w:name="reference-verification."/>
     <w:p>
       <w:pPr>
         <w:pStyle w:val="Heading4"/>
@@ -54431,8 +55700,8 @@
         <w:t xml:space="preserve">1964/1986; Torgersen 1991; Ethayarajh et al. 2022) were checked against the primary sources.</w:t>
       </w:r>
     </w:p>
-    <w:bookmarkStart w:id="219" w:name="refs"/>
-    <w:bookmarkStart w:id="141" w:name="ref-akdemir2025"/>
+    <w:bookmarkStart w:id="227" w:name="refs"/>
+    <w:bookmarkStart w:id="143" w:name="ref-akdemir2025"/>
     <w:p>
       <w:pPr>
         <w:pStyle w:val="Bibliography"/>
@@ -54471,7 +55740,7 @@
       <w:r>
         <w:t xml:space="preserve"> </w:t>
       </w:r>
-      <w:hyperlink r:id="rId140">
+      <w:hyperlink r:id="rId142">
         <w:r>
           <w:rPr>
             <w:rStyle w:val="Hyperlink"/>
@@ -54483,8 +55752,8 @@
         <w:t xml:space="preserve">.</w:t>
       </w:r>
     </w:p>
-    <w:bookmarkEnd w:id="141"/>
-    <w:bookmarkStart w:id="143" w:name="ref-blackwell1953"/>
+    <w:bookmarkEnd w:id="143"/>
+    <w:bookmarkStart w:id="145" w:name="ref-blackwell1953"/>
     <w:p>
       <w:pPr>
         <w:pStyle w:val="Bibliography"/>
@@ -54517,7 +55786,7 @@
       <w:r>
         <w:t xml:space="preserve"> </w:t>
       </w:r>
-      <w:hyperlink r:id="rId142">
+      <w:hyperlink r:id="rId144">
         <w:r>
           <w:rPr>
             <w:rStyle w:val="Hyperlink"/>
@@ -54529,8 +55798,8 @@
         <w:t xml:space="preserve">.</w:t>
       </w:r>
     </w:p>
-    <w:bookmarkEnd w:id="143"/>
-    <w:bookmarkStart w:id="144" w:name="ref-bonferroni1936"/>
+    <w:bookmarkEnd w:id="145"/>
+    <w:bookmarkStart w:id="146" w:name="ref-bonferroni1936"/>
     <w:p>
       <w:pPr>
         <w:pStyle w:val="Bibliography"/>
@@ -54561,8 +55830,8 @@
         <w:t xml:space="preserve">8: 3–62.</w:t>
       </w:r>
     </w:p>
-    <w:bookmarkEnd w:id="144"/>
-    <w:bookmarkStart w:id="146" w:name="ref-bowyer2025clt"/>
+    <w:bookmarkEnd w:id="146"/>
+    <w:bookmarkStart w:id="148" w:name="ref-bowyer2025clt"/>
     <w:p>
       <w:pPr>
         <w:pStyle w:val="Bibliography"/>
@@ -54616,7 +55885,7 @@
       <w:r>
         <w:t xml:space="preserve"> </w:t>
       </w:r>
-      <w:hyperlink r:id="rId145">
+      <w:hyperlink r:id="rId147">
         <w:r>
           <w:rPr>
             <w:rStyle w:val="Hyperlink"/>
@@ -54628,8 +55897,8 @@
         <w:t xml:space="preserve">.</w:t>
       </w:r>
     </w:p>
-    <w:bookmarkEnd w:id="146"/>
-    <w:bookmarkStart w:id="148" w:name="ref-bradley2024garbling"/>
+    <w:bookmarkEnd w:id="148"/>
+    <w:bookmarkStart w:id="150" w:name="ref-bradley2024garbling"/>
     <w:p>
       <w:pPr>
         <w:pStyle w:val="Bibliography"/>
@@ -54671,7 +55940,7 @@
       <w:r>
         <w:t xml:space="preserve"> </w:t>
       </w:r>
-      <w:hyperlink r:id="rId147">
+      <w:hyperlink r:id="rId149">
         <w:r>
           <w:rPr>
             <w:rStyle w:val="Hyperlink"/>
@@ -54683,8 +55952,8 @@
         <w:t xml:space="preserve">.</w:t>
       </w:r>
     </w:p>
-    <w:bookmarkEnd w:id="148"/>
-    <w:bookmarkStart w:id="150" w:name="ref-carbonell1998"/>
+    <w:bookmarkEnd w:id="150"/>
+    <w:bookmarkStart w:id="152" w:name="ref-carbonell1998"/>
     <w:p>
       <w:pPr>
         <w:pStyle w:val="Bibliography"/>
@@ -54723,7 +55992,7 @@
       <w:r>
         <w:t xml:space="preserve"> </w:t>
       </w:r>
-      <w:hyperlink r:id="rId149">
+      <w:hyperlink r:id="rId151">
         <w:r>
           <w:rPr>
             <w:rStyle w:val="Hyperlink"/>
@@ -54735,8 +56004,8 @@
         <w:t xml:space="preserve">.</w:t>
       </w:r>
     </w:p>
-    <w:bookmarkEnd w:id="150"/>
-    <w:bookmarkStart w:id="152" w:name="ref-conformalip2025"/>
+    <w:bookmarkEnd w:id="152"/>
+    <w:bookmarkStart w:id="154" w:name="ref-conformalip2025"/>
     <w:p>
       <w:pPr>
         <w:pStyle w:val="Bibliography"/>
@@ -54766,7 +56035,7 @@
       <w:r>
         <w:t xml:space="preserve"> </w:t>
       </w:r>
-      <w:hyperlink r:id="rId151">
+      <w:hyperlink r:id="rId153">
         <w:r>
           <w:rPr>
             <w:rStyle w:val="Hyperlink"/>
@@ -54778,8 +56047,8 @@
         <w:t xml:space="preserve">.</w:t>
       </w:r>
     </w:p>
-    <w:bookmarkEnd w:id="152"/>
-    <w:bookmarkStart w:id="154" w:name="ref-bedllm2026"/>
+    <w:bookmarkEnd w:id="154"/>
+    <w:bookmarkStart w:id="156" w:name="ref-bedllm2026"/>
     <w:p>
       <w:pPr>
         <w:pStyle w:val="Bibliography"/>
@@ -54827,7 +56096,7 @@
       <w:r>
         <w:t xml:space="preserve"> </w:t>
       </w:r>
-      <w:hyperlink r:id="rId153">
+      <w:hyperlink r:id="rId155">
         <w:r>
           <w:rPr>
             <w:rStyle w:val="Hyperlink"/>
@@ -54839,8 +56108,8 @@
         <w:t xml:space="preserve">.</w:t>
       </w:r>
     </w:p>
-    <w:bookmarkEnd w:id="154"/>
-    <w:bookmarkStart w:id="156" w:name="ref-clopperpearson1934"/>
+    <w:bookmarkEnd w:id="156"/>
+    <w:bookmarkStart w:id="158" w:name="ref-clopperpearson1934"/>
     <w:p>
       <w:pPr>
         <w:pStyle w:val="Bibliography"/>
@@ -54873,7 +56142,7 @@
       <w:r>
         <w:t xml:space="preserve"> </w:t>
       </w:r>
-      <w:hyperlink r:id="rId155">
+      <w:hyperlink r:id="rId157">
         <w:r>
           <w:rPr>
             <w:rStyle w:val="Hyperlink"/>
@@ -54885,8 +56154,8 @@
         <w:t xml:space="preserve">.</w:t>
       </w:r>
     </w:p>
-    <w:bookmarkEnd w:id="156"/>
-    <w:bookmarkStart w:id="158" w:name="ref-cuconasu2024noise"/>
+    <w:bookmarkEnd w:id="158"/>
+    <w:bookmarkStart w:id="160" w:name="ref-cuconasu2024noise"/>
     <w:p>
       <w:pPr>
         <w:pStyle w:val="Bibliography"/>
@@ -54928,7 +56197,7 @@
       <w:r>
         <w:t xml:space="preserve"> </w:t>
       </w:r>
-      <w:hyperlink r:id="rId157">
+      <w:hyperlink r:id="rId159">
         <w:r>
           <w:rPr>
             <w:rStyle w:val="Hyperlink"/>
@@ -54940,8 +56209,8 @@
         <w:t xml:space="preserve">.</w:t>
       </w:r>
     </w:p>
-    <w:bookmarkEnd w:id="158"/>
-    <w:bookmarkStart w:id="160" w:name="ref-contexthurts2025"/>
+    <w:bookmarkEnd w:id="160"/>
+    <w:bookmarkStart w:id="162" w:name="ref-contexthurts2025"/>
     <w:p>
       <w:pPr>
         <w:pStyle w:val="Bibliography"/>
@@ -54983,7 +56252,7 @@
       <w:r>
         <w:t xml:space="preserve"> </w:t>
       </w:r>
-      <w:hyperlink r:id="rId159">
+      <w:hyperlink r:id="rId161">
         <w:r>
           <w:rPr>
             <w:rStyle w:val="Hyperlink"/>
@@ -54995,8 +56264,8 @@
         <w:t xml:space="preserve">.</w:t>
       </w:r>
     </w:p>
-    <w:bookmarkEnd w:id="160"/>
-    <w:bookmarkStart w:id="162" w:name="ref-dvoretzky1956"/>
+    <w:bookmarkEnd w:id="162"/>
+    <w:bookmarkStart w:id="164" w:name="ref-dvoretzky1956"/>
     <w:p>
       <w:pPr>
         <w:pStyle w:val="Bibliography"/>
@@ -55029,7 +56298,7 @@
       <w:r>
         <w:t xml:space="preserve"> </w:t>
       </w:r>
-      <w:hyperlink r:id="rId161">
+      <w:hyperlink r:id="rId163">
         <w:r>
           <w:rPr>
             <w:rStyle w:val="Hyperlink"/>
@@ -55041,8 +56310,8 @@
         <w:t xml:space="preserve">.</w:t>
       </w:r>
     </w:p>
-    <w:bookmarkEnd w:id="162"/>
-    <w:bookmarkStart w:id="163" w:name="ref-ethayarajh2022"/>
+    <w:bookmarkEnd w:id="164"/>
+    <w:bookmarkStart w:id="165" w:name="ref-ethayarajh2022"/>
     <w:p>
       <w:pPr>
         <w:pStyle w:val="Bibliography"/>
@@ -55085,8 +56354,8 @@
         <w:t xml:space="preserve">, PMLR, vol. 162: 5988–6008.</w:t>
       </w:r>
     </w:p>
-    <w:bookmarkEnd w:id="163"/>
-    <w:bookmarkStart w:id="165" w:name="ref-fosse2025"/>
+    <w:bookmarkEnd w:id="165"/>
+    <w:bookmarkStart w:id="167" w:name="ref-fosse2025"/>
     <w:p>
       <w:pPr>
         <w:pStyle w:val="Bibliography"/>
@@ -55116,7 +56385,7 @@
       <w:r>
         <w:t xml:space="preserve"> </w:t>
       </w:r>
-      <w:hyperlink r:id="rId164">
+      <w:hyperlink r:id="rId166">
         <w:r>
           <w:rPr>
             <w:rStyle w:val="Hyperlink"/>
@@ -55128,8 +56397,8 @@
         <w:t xml:space="preserve">.</w:t>
       </w:r>
     </w:p>
-    <w:bookmarkEnd w:id="165"/>
-    <w:bookmarkStart w:id="167" w:name="ref-fuhr2008"/>
+    <w:bookmarkEnd w:id="167"/>
+    <w:bookmarkStart w:id="169" w:name="ref-fuhr2008"/>
     <w:p>
       <w:pPr>
         <w:pStyle w:val="Bibliography"/>
@@ -55162,7 +56431,7 @@
       <w:r>
         <w:t xml:space="preserve"> </w:t>
       </w:r>
-      <w:hyperlink r:id="rId166">
+      <w:hyperlink r:id="rId168">
         <w:r>
           <w:rPr>
             <w:rStyle w:val="Hyperlink"/>
@@ -55174,8 +56443,8 @@
         <w:t xml:space="preserve">.</w:t>
       </w:r>
     </w:p>
-    <w:bookmarkEnd w:id="167"/>
-    <w:bookmarkStart w:id="169" w:name="ref-gao2024modelequality"/>
+    <w:bookmarkEnd w:id="169"/>
+    <w:bookmarkStart w:id="171" w:name="ref-gao2024modelequality"/>
     <w:p>
       <w:pPr>
         <w:pStyle w:val="Bibliography"/>
@@ -55217,7 +56486,7 @@
       <w:r>
         <w:t xml:space="preserve"> </w:t>
       </w:r>
-      <w:hyperlink r:id="rId168">
+      <w:hyperlink r:id="rId170">
         <w:r>
           <w:rPr>
             <w:rStyle w:val="Hyperlink"/>
@@ -55229,13 +56498,62 @@
         <w:t xml:space="preserve">.</w:t>
       </w:r>
     </w:p>
-    <w:bookmarkEnd w:id="169"/>
-    <w:bookmarkStart w:id="171" w:name="ref-hong2025contextrot"/>
+    <w:bookmarkEnd w:id="171"/>
+    <w:bookmarkStart w:id="173" w:name="ref-guu2020realm"/>
     <w:p>
       <w:pPr>
         <w:pStyle w:val="Bibliography"/>
       </w:pPr>
       <w:r>
+        <w:t xml:space="preserve">Guu, Kelvin, Kenton Lee, Zora Tung, Panupong Pasupat, and Ming-Wei Chang. 2020.</w:t>
+      </w:r>
+      <w:r>
+        <w:t xml:space="preserve"> </w:t>
+      </w:r>
+      <w:r>
+        <w:t xml:space="preserve">“</w:t>
+      </w:r>
+      <w:r>
+        <w:t xml:space="preserve">REALM</w:t>
+      </w:r>
+      <w:r>
+        <w:t xml:space="preserve">: Retrieval-Augmented Language Model Pre-Training.”</w:t>
+      </w:r>
+      <w:r>
+        <w:t xml:space="preserve"> </w:t>
+      </w:r>
+      <w:r>
+        <w:rPr>
+          <w:i/>
+          <w:iCs/>
+        </w:rPr>
+        <w:t xml:space="preserve">Proceedings of the 37th International Conference on Machine Learning (ICML)</w:t>
+      </w:r>
+      <w:r>
+        <w:t xml:space="preserve">.</w:t>
+      </w:r>
+      <w:r>
+        <w:t xml:space="preserve"> </w:t>
+      </w:r>
+      <w:hyperlink r:id="rId172">
+        <w:r>
+          <w:rPr>
+            <w:rStyle w:val="Hyperlink"/>
+          </w:rPr>
+          <w:t xml:space="preserve">https://arxiv.org/abs/2002.08909</w:t>
+        </w:r>
+      </w:hyperlink>
+      <w:r>
+        <w:t xml:space="preserve">.</w:t>
+      </w:r>
+    </w:p>
+    <w:bookmarkEnd w:id="173"/>
+    <w:bookmarkStart w:id="175" w:name="ref-hong2025contextrot"/>
+    <w:p>
+      <w:pPr>
+        <w:pStyle w:val="Bibliography"/>
+      </w:pPr>
+      <w:r>
         <w:t xml:space="preserve">Hong, Kelly, Anton Troynikov, and Jeff Huber. 2025.</w:t>
       </w:r>
       <w:r>
@@ -55282,7 +56600,7 @@
       <w:r>
         <w:t xml:space="preserve"> </w:t>
       </w:r>
-      <w:hyperlink r:id="rId170">
+      <w:hyperlink r:id="rId174">
         <w:r>
           <w:rPr>
             <w:rStyle w:val="Hyperlink"/>
@@ -55294,8 +56612,8 @@
         <w:t xml:space="preserve">.</w:t>
       </w:r>
     </w:p>
-    <w:bookmarkEnd w:id="171"/>
-    <w:bookmarkStart w:id="173" w:name="ref-huang2025gammacover"/>
+    <w:bookmarkEnd w:id="175"/>
+    <w:bookmarkStart w:id="177" w:name="ref-huang2025gammacover"/>
     <w:p>
       <w:pPr>
         <w:pStyle w:val="Bibliography"/>
@@ -55336,7 +56654,7 @@
       <w:r>
         <w:t xml:space="preserve"> </w:t>
       </w:r>
-      <w:hyperlink r:id="rId172">
+      <w:hyperlink r:id="rId176">
         <w:r>
           <w:rPr>
             <w:rStyle w:val="Hyperlink"/>
@@ -55348,8 +56666,8 @@
         <w:t xml:space="preserve">.</w:t>
       </w:r>
     </w:p>
-    <w:bookmarkEnd w:id="173"/>
-    <w:bookmarkStart w:id="175" w:name="ref-jin2024longrag"/>
+    <w:bookmarkEnd w:id="177"/>
+    <w:bookmarkStart w:id="179" w:name="ref-jin2024longrag"/>
     <w:p>
       <w:pPr>
         <w:pStyle w:val="Bibliography"/>
@@ -55409,7 +56727,7 @@
       <w:r>
         <w:t xml:space="preserve"> </w:t>
       </w:r>
-      <w:hyperlink r:id="rId174">
+      <w:hyperlink r:id="rId178">
         <w:r>
           <w:rPr>
             <w:rStyle w:val="Hyperlink"/>
@@ -55421,8 +56739,8 @@
         <w:t xml:space="preserve">.</w:t>
       </w:r>
     </w:p>
-    <w:bookmarkEnd w:id="175"/>
-    <w:bookmarkStart w:id="177" w:name="ref-sufficientcontext2024"/>
+    <w:bookmarkEnd w:id="179"/>
+    <w:bookmarkStart w:id="181" w:name="ref-sufficientcontext2024"/>
     <w:p>
       <w:pPr>
         <w:pStyle w:val="Bibliography"/>
@@ -55452,7 +56770,7 @@
       <w:r>
         <w:t xml:space="preserve"> </w:t>
       </w:r>
-      <w:hyperlink r:id="rId176">
+      <w:hyperlink r:id="rId180">
         <w:r>
           <w:rPr>
             <w:rStyle w:val="Hyperlink"/>
@@ -55464,13 +56782,71 @@
         <w:t xml:space="preserve">.</w:t>
       </w:r>
     </w:p>
-    <w:bookmarkEnd w:id="177"/>
-    <w:bookmarkStart w:id="179" w:name="ref-lecam1964"/>
+    <w:bookmarkEnd w:id="181"/>
+    <w:bookmarkStart w:id="183" w:name="ref-khattab2020colbert"/>
     <w:p>
       <w:pPr>
         <w:pStyle w:val="Bibliography"/>
       </w:pPr>
       <w:r>
+        <w:t xml:space="preserve">Khattab, Omar, and Matei Zaharia. 2020.</w:t>
+      </w:r>
+      <w:r>
+        <w:t xml:space="preserve"> </w:t>
+      </w:r>
+      <w:r>
+        <w:t xml:space="preserve">“</w:t>
+      </w:r>
+      <w:r>
+        <w:t xml:space="preserve">ColBERT</w:t>
+      </w:r>
+      <w:r>
+        <w:t xml:space="preserve">: Efficient and Effective Passage Search via Contextualized Late Interaction over</w:t>
+      </w:r>
+      <w:r>
+        <w:t xml:space="preserve"> </w:t>
+      </w:r>
+      <w:r>
+        <w:t xml:space="preserve">BERT</w:t>
+      </w:r>
+      <w:r>
+        <w:t xml:space="preserve">.”</w:t>
+      </w:r>
+      <w:r>
+        <w:t xml:space="preserve"> </w:t>
+      </w:r>
+      <w:r>
+        <w:rPr>
+          <w:i/>
+          <w:iCs/>
+        </w:rPr>
+        <w:t xml:space="preserve">Proceedings of the 43rd International ACM SIGIR Conference on Research and Development in Information Retrieval</w:t>
+      </w:r>
+      <w:r>
+        <w:t xml:space="preserve">, 39–48.</w:t>
+      </w:r>
+      <w:r>
+        <w:t xml:space="preserve"> </w:t>
+      </w:r>
+      <w:hyperlink r:id="rId182">
+        <w:r>
+          <w:rPr>
+            <w:rStyle w:val="Hyperlink"/>
+          </w:rPr>
+          <w:t xml:space="preserve">https://doi.org/10.1145/3397271.3401075</w:t>
+        </w:r>
+      </w:hyperlink>
+      <w:r>
+        <w:t xml:space="preserve">.</w:t>
+      </w:r>
+    </w:p>
+    <w:bookmarkEnd w:id="183"/>
+    <w:bookmarkStart w:id="185" w:name="ref-lecam1964"/>
+    <w:p>
+      <w:pPr>
+        <w:pStyle w:val="Bibliography"/>
+      </w:pPr>
+      <w:r>
         <w:t xml:space="preserve">Le Cam, Lucien. 1964.</w:t>
       </w:r>
       <w:r>
@@ -55498,7 +56874,7 @@
       <w:r>
         <w:t xml:space="preserve"> </w:t>
       </w:r>
-      <w:hyperlink r:id="rId178">
+      <w:hyperlink r:id="rId184">
         <w:r>
           <w:rPr>
             <w:rStyle w:val="Hyperlink"/>
@@ -55510,8 +56886,8 @@
         <w:t xml:space="preserve">.</w:t>
       </w:r>
     </w:p>
-    <w:bookmarkEnd w:id="179"/>
-    <w:bookmarkStart w:id="181" w:name="ref-lecam1986"/>
+    <w:bookmarkEnd w:id="185"/>
+    <w:bookmarkStart w:id="187" w:name="ref-lecam1986"/>
     <w:p>
       <w:pPr>
         <w:pStyle w:val="Bibliography"/>
@@ -55535,7 +56911,7 @@
       <w:r>
         <w:t xml:space="preserve"> </w:t>
       </w:r>
-      <w:hyperlink r:id="rId180">
+      <w:hyperlink r:id="rId186">
         <w:r>
           <w:rPr>
             <w:rStyle w:val="Hyperlink"/>
@@ -55547,8 +56923,8 @@
         <w:t xml:space="preserve">.</w:t>
       </w:r>
     </w:p>
-    <w:bookmarkEnd w:id="181"/>
-    <w:bookmarkStart w:id="183" w:name="ref-relevanceutility2025"/>
+    <w:bookmarkEnd w:id="187"/>
+    <w:bookmarkStart w:id="189" w:name="ref-relevanceutility2025"/>
     <w:p>
       <w:pPr>
         <w:pStyle w:val="Bibliography"/>
@@ -55590,7 +56966,7 @@
       <w:r>
         <w:t xml:space="preserve"> </w:t>
       </w:r>
-      <w:hyperlink r:id="rId182">
+      <w:hyperlink r:id="rId188">
         <w:r>
           <w:rPr>
             <w:rStyle w:val="Hyperlink"/>
@@ -55602,8 +56978,8 @@
         <w:t xml:space="preserve">.</w:t>
       </w:r>
     </w:p>
-    <w:bookmarkEnd w:id="183"/>
-    <w:bookmarkStart w:id="185" w:name="ref-levy2025moredocs"/>
+    <w:bookmarkEnd w:id="189"/>
+    <w:bookmarkStart w:id="191" w:name="ref-levy2025moredocs"/>
     <w:p>
       <w:pPr>
         <w:pStyle w:val="Bibliography"/>
@@ -55642,7 +57018,7 @@
       <w:r>
         <w:t xml:space="preserve"> </w:t>
       </w:r>
-      <w:hyperlink r:id="rId184">
+      <w:hyperlink r:id="rId190">
         <w:r>
           <w:rPr>
             <w:rStyle w:val="Hyperlink"/>
@@ -55654,8 +57030,8 @@
         <w:t xml:space="preserve">.</w:t>
       </w:r>
     </w:p>
-    <w:bookmarkEnd w:id="185"/>
-    <w:bookmarkStart w:id="187" w:name="ref-longcontextdegrade2026"/>
+    <w:bookmarkEnd w:id="191"/>
+    <w:bookmarkStart w:id="193" w:name="ref-longcontextdegrade2026"/>
     <w:p>
       <w:pPr>
         <w:pStyle w:val="Bibliography"/>
@@ -55697,7 +57073,7 @@
       <w:r>
         <w:t xml:space="preserve"> </w:t>
       </w:r>
-      <w:hyperlink r:id="rId186">
+      <w:hyperlink r:id="rId192">
         <w:r>
           <w:rPr>
             <w:rStyle w:val="Hyperlink"/>
@@ -55709,8 +57085,8 @@
         <w:t xml:space="preserve">.</w:t>
       </w:r>
     </w:p>
-    <w:bookmarkEnd w:id="187"/>
-    <w:bookmarkStart w:id="189" w:name="ref-liu2024lost"/>
+    <w:bookmarkEnd w:id="193"/>
+    <w:bookmarkStart w:id="195" w:name="ref-liu2024lost"/>
     <w:p>
       <w:pPr>
         <w:pStyle w:val="Bibliography"/>
@@ -55743,7 +57119,7 @@
       <w:r>
         <w:t xml:space="preserve"> </w:t>
       </w:r>
-      <w:hyperlink r:id="rId188">
+      <w:hyperlink r:id="rId194">
         <w:r>
           <w:rPr>
             <w:rStyle w:val="Hyperlink"/>
@@ -55755,8 +57131,8 @@
         <w:t xml:space="preserve">.</w:t>
       </w:r>
     </w:p>
-    <w:bookmarkEnd w:id="189"/>
-    <w:bookmarkStart w:id="191" w:name="ref-miller2024errorbars"/>
+    <w:bookmarkEnd w:id="195"/>
+    <w:bookmarkStart w:id="197" w:name="ref-miller2024errorbars"/>
     <w:p>
       <w:pPr>
         <w:pStyle w:val="Bibliography"/>
@@ -55786,7 +57162,7 @@
       <w:r>
         <w:t xml:space="preserve"> </w:t>
       </w:r>
-      <w:hyperlink r:id="rId190">
+      <w:hyperlink r:id="rId196">
         <w:r>
           <w:rPr>
             <w:rStyle w:val="Hyperlink"/>
@@ -55798,8 +57174,8 @@
         <w:t xml:space="preserve">.</w:t>
       </w:r>
     </w:p>
-    <w:bookmarkEnd w:id="191"/>
-    <w:bookmarkStart w:id="193" w:name="ref-blackwellrep2026"/>
+    <w:bookmarkEnd w:id="197"/>
+    <w:bookmarkStart w:id="199" w:name="ref-blackwellrep2026"/>
     <w:p>
       <w:pPr>
         <w:pStyle w:val="Bibliography"/>
@@ -55829,7 +57205,7 @@
       <w:r>
         <w:t xml:space="preserve"> </w:t>
       </w:r>
-      <w:hyperlink r:id="rId192">
+      <w:hyperlink r:id="rId198">
         <w:r>
           <w:rPr>
             <w:rStyle w:val="Hyperlink"/>
@@ -55841,8 +57217,8 @@
         <w:t xml:space="preserve">.</w:t>
       </w:r>
     </w:p>
-    <w:bookmarkEnd w:id="193"/>
-    <w:bookmarkStart w:id="195" w:name="ref-sureRAG2026"/>
+    <w:bookmarkEnd w:id="199"/>
+    <w:bookmarkStart w:id="201" w:name="ref-sureRAG2026"/>
     <w:p>
       <w:pPr>
         <w:pStyle w:val="Bibliography"/>
@@ -55878,7 +57254,7 @@
       <w:r>
         <w:t xml:space="preserve"> </w:t>
       </w:r>
-      <w:hyperlink r:id="rId194">
+      <w:hyperlink r:id="rId200">
         <w:r>
           <w:rPr>
             <w:rStyle w:val="Hyperlink"/>
@@ -55890,8 +57266,8 @@
         <w:t xml:space="preserve">.</w:t>
       </w:r>
     </w:p>
-    <w:bookmarkEnd w:id="195"/>
-    <w:bookmarkStart w:id="197" w:name="ref-robertson1977"/>
+    <w:bookmarkEnd w:id="201"/>
+    <w:bookmarkStart w:id="203" w:name="ref-robertson1977"/>
     <w:p>
       <w:pPr>
         <w:pStyle w:val="Bibliography"/>
@@ -55933,7 +57309,7 @@
       <w:r>
         <w:t xml:space="preserve"> </w:t>
       </w:r>
-      <w:hyperlink r:id="rId196">
+      <w:hyperlink r:id="rId202">
         <w:r>
           <w:rPr>
             <w:rStyle w:val="Hyperlink"/>
@@ -55945,8 +57321,8 @@
         <w:t xml:space="preserve">.</w:t>
       </w:r>
     </w:p>
-    <w:bookmarkEnd w:id="197"/>
-    <w:bookmarkStart w:id="199" w:name="ref-vanrooyen2014"/>
+    <w:bookmarkEnd w:id="203"/>
+    <w:bookmarkStart w:id="205" w:name="ref-vanrooyen2014"/>
     <w:p>
       <w:pPr>
         <w:pStyle w:val="Bibliography"/>
@@ -55994,7 +57370,7 @@
       <w:r>
         <w:t xml:space="preserve"> </w:t>
       </w:r>
-      <w:hyperlink r:id="rId198">
+      <w:hyperlink r:id="rId204">
         <w:r>
           <w:rPr>
             <w:rStyle w:val="Hyperlink"/>
@@ -56006,8 +57382,8 @@
         <w:t xml:space="preserve">.</w:t>
       </w:r>
     </w:p>
-    <w:bookmarkEnd w:id="199"/>
-    <w:bookmarkStart w:id="201" w:name="ref-shi2023distracted"/>
+    <w:bookmarkEnd w:id="205"/>
+    <w:bookmarkStart w:id="207" w:name="ref-shi2023distracted"/>
     <w:p>
       <w:pPr>
         <w:pStyle w:val="Bibliography"/>
@@ -56037,7 +57413,7 @@
       <w:r>
         <w:t xml:space="preserve"> </w:t>
       </w:r>
-      <w:hyperlink r:id="rId200">
+      <w:hyperlink r:id="rId206">
         <w:r>
           <w:rPr>
             <w:rStyle w:val="Hyperlink"/>
@@ -56049,13 +57425,62 @@
         <w:t xml:space="preserve">.</w:t>
       </w:r>
     </w:p>
-    <w:bookmarkEnd w:id="201"/>
-    <w:bookmarkStart w:id="203" w:name="ref-sun2023rankgpt"/>
+    <w:bookmarkEnd w:id="207"/>
+    <w:bookmarkStart w:id="209" w:name="ref-shi2023replug"/>
     <w:p>
       <w:pPr>
         <w:pStyle w:val="Bibliography"/>
       </w:pPr>
       <w:r>
+        <w:t xml:space="preserve">Shi, Weijia, Sewon Min, Michihiro Yasunaga, et al. 2023.</w:t>
+      </w:r>
+      <w:r>
+        <w:t xml:space="preserve"> </w:t>
+      </w:r>
+      <w:r>
+        <w:t xml:space="preserve">“</w:t>
+      </w:r>
+      <w:r>
+        <w:t xml:space="preserve">REPLUG</w:t>
+      </w:r>
+      <w:r>
+        <w:t xml:space="preserve">: Retrieval-Augmented Black-Box Language Models.”</w:t>
+      </w:r>
+      <w:r>
+        <w:t xml:space="preserve"> </w:t>
+      </w:r>
+      <w:r>
+        <w:rPr>
+          <w:i/>
+          <w:iCs/>
+        </w:rPr>
+        <w:t xml:space="preserve">arXiv Preprint arXiv:2301.12652</w:t>
+      </w:r>
+      <w:r>
+        <w:t xml:space="preserve">.</w:t>
+      </w:r>
+      <w:r>
+        <w:t xml:space="preserve"> </w:t>
+      </w:r>
+      <w:hyperlink r:id="rId208">
+        <w:r>
+          <w:rPr>
+            <w:rStyle w:val="Hyperlink"/>
+          </w:rPr>
+          <w:t xml:space="preserve">https://arxiv.org/abs/2301.12652</w:t>
+        </w:r>
+      </w:hyperlink>
+      <w:r>
+        <w:t xml:space="preserve">.</w:t>
+      </w:r>
+    </w:p>
+    <w:bookmarkEnd w:id="209"/>
+    <w:bookmarkStart w:id="211" w:name="ref-sun2023rankgpt"/>
+    <w:p>
+      <w:pPr>
+        <w:pStyle w:val="Bibliography"/>
+      </w:pPr>
+      <w:r>
         <w:t xml:space="preserve">Sun, Weiwei, Lingyong Yan, Xinyu Ma, et al. 2023.</w:t>
       </w:r>
       <w:r>
@@ -56104,7 +57529,7 @@
       <w:r>
         <w:t xml:space="preserve"> </w:t>
       </w:r>
-      <w:hyperlink r:id="rId202">
+      <w:hyperlink r:id="rId210">
         <w:r>
           <w:rPr>
             <w:rStyle w:val="Hyperlink"/>
@@ -56116,8 +57541,8 @@
         <w:t xml:space="preserve">.</w:t>
       </w:r>
     </w:p>
-    <w:bookmarkEnd w:id="203"/>
-    <w:bookmarkStart w:id="205" w:name="ref-torgersen1991"/>
+    <w:bookmarkEnd w:id="211"/>
+    <w:bookmarkStart w:id="213" w:name="ref-torgersen1991"/>
     <w:p>
       <w:pPr>
         <w:pStyle w:val="Bibliography"/>
@@ -56141,7 +57566,7 @@
       <w:r>
         <w:t xml:space="preserve"> </w:t>
       </w:r>
-      <w:hyperlink r:id="rId204">
+      <w:hyperlink r:id="rId212">
         <w:r>
           <w:rPr>
             <w:rStyle w:val="Hyperlink"/>
@@ -56153,8 +57578,8 @@
         <w:t xml:space="preserve">.</w:t>
       </w:r>
     </w:p>
-    <w:bookmarkEnd w:id="205"/>
-    <w:bookmarkStart w:id="207" w:name="ref-inficl2024"/>
+    <w:bookmarkEnd w:id="213"/>
+    <w:bookmarkStart w:id="215" w:name="ref-inficl2024"/>
     <w:p>
       <w:pPr>
         <w:pStyle w:val="Bibliography"/>
@@ -56184,7 +57609,7 @@
       <w:r>
         <w:t xml:space="preserve"> </w:t>
       </w:r>
-      <w:hyperlink r:id="rId206">
+      <w:hyperlink r:id="rId214">
         <w:r>
           <w:rPr>
             <w:rStyle w:val="Hyperlink"/>
@@ -56196,8 +57621,8 @@
         <w:t xml:space="preserve">.</w:t>
       </w:r>
     </w:p>
-    <w:bookmarkEnd w:id="207"/>
-    <w:bookmarkStart w:id="209" w:name="ref-demoshapley2024"/>
+    <w:bookmarkEnd w:id="215"/>
+    <w:bookmarkStart w:id="217" w:name="ref-demoshapley2024"/>
     <w:p>
       <w:pPr>
         <w:pStyle w:val="Bibliography"/>
@@ -56233,7 +57658,7 @@
       <w:r>
         <w:t xml:space="preserve"> </w:t>
       </w:r>
-      <w:hyperlink r:id="rId208">
+      <w:hyperlink r:id="rId216">
         <w:r>
           <w:rPr>
             <w:rStyle w:val="Hyperlink"/>
@@ -56245,8 +57670,8 @@
         <w:t xml:space="preserve">.</w:t>
       </w:r>
     </w:p>
-    <w:bookmarkEnd w:id="209"/>
-    <w:bookmarkStart w:id="211" w:name="ref-ye2023ceil"/>
+    <w:bookmarkEnd w:id="217"/>
+    <w:bookmarkStart w:id="219" w:name="ref-ye2023ceil"/>
     <w:p>
       <w:pPr>
         <w:pStyle w:val="Bibliography"/>
@@ -56276,7 +57701,7 @@
       <w:r>
         <w:t xml:space="preserve"> </w:t>
       </w:r>
-      <w:hyperlink r:id="rId210">
+      <w:hyperlink r:id="rId218">
         <w:r>
           <w:rPr>
             <w:rStyle w:val="Hyperlink"/>
@@ -56288,8 +57713,8 @@
         <w:t xml:space="preserve">.</w:t>
       </w:r>
     </w:p>
-    <w:bookmarkEnd w:id="211"/>
-    <w:bookmarkStart w:id="213" w:name="ref-rankrag2024"/>
+    <w:bookmarkEnd w:id="219"/>
+    <w:bookmarkStart w:id="221" w:name="ref-rankrag2024"/>
     <w:p>
       <w:pPr>
         <w:pStyle w:val="Bibliography"/>
@@ -56334,7 +57759,7 @@
       <w:r>
         <w:t xml:space="preserve"> </w:t>
       </w:r>
-      <w:hyperlink r:id="rId212">
+      <w:hyperlink r:id="rId220">
         <w:r>
           <w:rPr>
             <w:rStyle w:val="Hyperlink"/>
@@ -56346,8 +57771,8 @@
         <w:t xml:space="preserve">.</w:t>
       </w:r>
     </w:p>
-    <w:bookmarkEnd w:id="213"/>
-    <w:bookmarkStart w:id="215" w:name="ref-cale2025"/>
+    <w:bookmarkEnd w:id="221"/>
+    <w:bookmarkStart w:id="223" w:name="ref-cale2025"/>
     <w:p>
       <w:pPr>
         <w:pStyle w:val="Bibliography"/>
@@ -56398,7 +57823,7 @@
       <w:r>
         <w:t xml:space="preserve"> </w:t>
       </w:r>
-      <w:hyperlink r:id="rId214">
+      <w:hyperlink r:id="rId222">
         <w:r>
           <w:rPr>
             <w:rStyle w:val="Hyperlink"/>
@@ -56410,8 +57835,8 @@
         <w:t xml:space="preserve">.</w:t>
       </w:r>
     </w:p>
-    <w:bookmarkEnd w:id="215"/>
-    <w:bookmarkStart w:id="216" w:name="ref-paretoprompts2025"/>
+    <w:bookmarkEnd w:id="223"/>
+    <w:bookmarkStart w:id="224" w:name="ref-paretoprompts2025"/>
     <w:p>
       <w:pPr>
         <w:pStyle w:val="Bibliography"/>
@@ -56439,8 +57864,8 @@
         <w:t xml:space="preserve">.</w:t>
       </w:r>
     </w:p>
-    <w:bookmarkEnd w:id="216"/>
-    <w:bookmarkStart w:id="218" w:name="ref-zheng2024pmi"/>
+    <w:bookmarkEnd w:id="224"/>
+    <w:bookmarkStart w:id="226" w:name="ref-zheng2024pmi"/>
     <w:p>
       <w:pPr>
         <w:pStyle w:val="Bibliography"/>
@@ -56470,7 +57895,7 @@
       <w:r>
         <w:t xml:space="preserve"> </w:t>
       </w:r>
-      <w:hyperlink r:id="rId217">
+      <w:hyperlink r:id="rId225">
         <w:r>
           <w:rPr>
             <w:rStyle w:val="Hyperlink"/>
@@ -56482,10 +57907,10 @@
         <w:t xml:space="preserve">.</w:t>
       </w:r>
     </w:p>
-    <w:bookmarkEnd w:id="218"/>
-    <w:bookmarkEnd w:id="219"/>
-    <w:bookmarkEnd w:id="220"/>
-    <w:bookmarkEnd w:id="221"/>
+    <w:bookmarkEnd w:id="226"/>
+    <w:bookmarkEnd w:id="227"/>
+    <w:bookmarkEnd w:id="228"/>
+    <w:bookmarkEnd w:id="229"/>
     <w:sectPr>
       <w:footnotePr>
         <w:numRestart w:val="eachSect"/>

</xml_diff>

<commit_message>
Reviewer-response additions: engineering glossary table (tab:glossary) at end of intro; plain-language 'what verified means' paragraph in methodology; new Results subsection with four-selection-policies comparison table (tab:policies) computed from Table 5 measured rates - scalar policies cap ~70, concatenation worst 48.2, front+routing 93.4 (per-cell max = selection ceiling)
</commit_message>
<xml_diff>
--- a/paper/blackwell-paper.docx
+++ b/paper/blackwell-paper.docx
@@ -303,7 +303,7 @@
         <w:t xml:space="preserve">corpora is the main open problem.</w:t>
       </w:r>
     </w:p>
-    <w:bookmarkStart w:id="16" w:name="sec:intro"/>
+    <w:bookmarkStart w:id="18" w:name="sec:intro"/>
     <w:p>
       <w:pPr>
         <w:pStyle w:val="Heading1"/>
@@ -3729,8 +3729,629 @@
       </w:r>
     </w:p>
     <w:bookmarkEnd w:id="15"/>
+    <w:bookmarkStart w:id="17" w:name="how-to-read-the-formal-terms."/>
+    <w:p>
+      <w:pPr>
+        <w:pStyle w:val="Heading4"/>
+      </w:pPr>
+      <w:r>
+        <w:t xml:space="preserve">How to read the formal terms.</w:t>
+      </w:r>
+    </w:p>
+    <w:p>
+      <w:pPr>
+        <w:pStyle w:val="FirstParagraph"/>
+      </w:pPr>
+      <w:r>
+        <w:t xml:space="preserve">The argument is necessarily phrased in the language of statistical decision theory.</w:t>
+      </w:r>
+      <w:r>
+        <w:t xml:space="preserve"> </w:t>
+      </w:r>
+      <w:r>
+        <w:t xml:space="preserve">Table 1 gives the engineering reading of each recurring term; the empirical</w:t>
+      </w:r>
+      <w:r>
+        <w:t xml:space="preserve"> </w:t>
+      </w:r>
+      <w:r>
+        <w:t xml:space="preserve">sections (§7 onward) can be followed with the right-hand column alone.</w:t>
+      </w:r>
+    </w:p>
+    <w:bookmarkStart w:id="16" w:name="tab:glossary"/>
+    <w:p>
+      <w:pPr>
+        <w:pStyle w:val="TableCaption"/>
+      </w:pPr>
+      <w:r>
+        <w:t xml:space="preserve">Glossary: the recurring formal terms and their engineering reading.</w:t>
+      </w:r>
+    </w:p>
+    <w:tbl>
+      <w:tblPr>
+        <w:tblStyle w:val="Table"/>
+        <w:tblW w:type="pct" w:w="4700"/>
+        <w:tblLayout w:type="fixed"/>
+        <w:tblLook w:firstRow="1" w:lastRow="0" w:firstColumn="0" w:lastColumn="0" w:noHBand="0" w:noVBand="0" w:val="0020"/>
+        <w:tblCaption w:val="Glossary: the recurring formal terms and their engineering reading."/>
+      </w:tblPr>
+      <w:tblGrid>
+        <w:gridCol w:w="2376"/>
+        <w:gridCol w:w="5068"/>
+      </w:tblGrid>
+      <w:tr>
+        <w:trPr>
+          <w:tblHeader w:val="on"/>
+        </w:trPr>
+        <w:tc>
+          <w:tcPr/>
+          <w:p>
+            <w:pPr>
+              <w:pStyle w:val="Compact"/>
+              <w:jc w:val="left"/>
+            </w:pPr>
+            <w:r>
+              <w:t xml:space="preserve">Formal term</w:t>
+            </w:r>
+          </w:p>
+        </w:tc>
+        <w:tc>
+          <w:tcPr/>
+          <w:p>
+            <w:pPr>
+              <w:pStyle w:val="Compact"/>
+              <w:jc w:val="left"/>
+            </w:pPr>
+            <w:r>
+              <w:t xml:space="preserve">Engineering reading</w:t>
+            </w:r>
+          </w:p>
+        </w:tc>
+      </w:tr>
+      <w:tr>
+        <w:tc>
+          <w:tcPr/>
+          <w:p>
+            <w:pPr>
+              <w:pStyle w:val="Compact"/>
+              <w:jc w:val="left"/>
+            </w:pPr>
+            <w:r>
+              <w:t xml:space="preserve">source</w:t>
+            </w:r>
+            <w:r>
+              <w:t xml:space="preserve"> </w:t>
+            </w:r>
+            <m:oMath>
+              <m:r>
+                <m:t>W</m:t>
+              </m:r>
+            </m:oMath>
+            <w:r>
+              <w:t xml:space="preserve"> </w:t>
+            </w:r>
+            <w:r>
+              <w:t xml:space="preserve">(an experiment)</w:t>
+            </w:r>
+          </w:p>
+        </w:tc>
+        <w:tc>
+          <w:tcPr/>
+          <w:p>
+            <w:pPr>
+              <w:pStyle w:val="Compact"/>
+              <w:jc w:val="left"/>
+            </w:pPr>
+            <w:r>
+              <w:t xml:space="preserve">a candidate context item: a doc, note, or module you could paste into the prompt</w:t>
+            </w:r>
+          </w:p>
+        </w:tc>
+      </w:tr>
+      <w:tr>
+        <w:tc>
+          <w:tcPr/>
+          <w:p>
+            <w:pPr>
+              <w:pStyle w:val="Compact"/>
+              <w:jc w:val="left"/>
+            </w:pPr>
+            <w:r>
+              <w:t xml:space="preserve">Blackwell dominance</w:t>
+            </w:r>
+            <w:r>
+              <w:t xml:space="preserve"> </w:t>
+            </w:r>
+            <m:oMath>
+              <m:r>
+                <m:t>W</m:t>
+              </m:r>
+              <m:sSub>
+                <m:e>
+                  <m:r>
+                    <m:rPr>
+                      <m:sty m:val="p"/>
+                    </m:rPr>
+                    <m:t>≽</m:t>
+                  </m:r>
+                </m:e>
+                <m:sub>
+                  <m:r>
+                    <m:t>B</m:t>
+                  </m:r>
+                </m:sub>
+              </m:sSub>
+              <m:sSup>
+                <m:e>
+                  <m:r>
+                    <m:t>W</m:t>
+                  </m:r>
+                </m:e>
+                <m:sup>
+                  <m:r>
+                    <m:rPr>
+                      <m:sty m:val="p"/>
+                    </m:rPr>
+                    <m:t>′</m:t>
+                  </m:r>
+                </m:sup>
+              </m:sSup>
+            </m:oMath>
+          </w:p>
+        </w:tc>
+        <w:tc>
+          <w:tcPr/>
+          <w:p>
+            <w:pPr>
+              <w:pStyle w:val="Compact"/>
+              <w:jc w:val="left"/>
+            </w:pPr>
+            <m:oMath>
+              <m:r>
+                <m:t>W</m:t>
+              </m:r>
+            </m:oMath>
+            <w:r>
+              <w:t xml:space="preserve"> </w:t>
+            </w:r>
+            <w:r>
+              <w:t xml:space="preserve">answers everything</w:t>
+            </w:r>
+            <w:r>
+              <w:t xml:space="preserve"> </w:t>
+            </w:r>
+            <m:oMath>
+              <m:sSup>
+                <m:e>
+                  <m:r>
+                    <m:t>W</m:t>
+                  </m:r>
+                </m:e>
+                <m:sup>
+                  <m:r>
+                    <m:rPr>
+                      <m:sty m:val="p"/>
+                    </m:rPr>
+                    <m:t>′</m:t>
+                  </m:r>
+                </m:sup>
+              </m:sSup>
+            </m:oMath>
+            <w:r>
+              <w:t xml:space="preserve"> </w:t>
+            </w:r>
+            <w:r>
+              <w:t xml:space="preserve">answers; keeping</w:t>
+            </w:r>
+            <w:r>
+              <w:t xml:space="preserve"> </w:t>
+            </w:r>
+            <m:oMath>
+              <m:r>
+                <m:t>W</m:t>
+              </m:r>
+            </m:oMath>
+            <w:r>
+              <w:t xml:space="preserve"> </w:t>
+            </w:r>
+            <w:r>
+              <w:t xml:space="preserve">and dropping</w:t>
+            </w:r>
+            <w:r>
+              <w:t xml:space="preserve"> </w:t>
+            </w:r>
+            <m:oMath>
+              <m:sSup>
+                <m:e>
+                  <m:r>
+                    <m:t>W</m:t>
+                  </m:r>
+                </m:e>
+                <m:sup>
+                  <m:r>
+                    <m:rPr>
+                      <m:sty m:val="p"/>
+                    </m:rPr>
+                    <m:t>′</m:t>
+                  </m:r>
+                </m:sup>
+              </m:sSup>
+            </m:oMath>
+            <w:r>
+              <w:t xml:space="preserve"> </w:t>
+            </w:r>
+            <w:r>
+              <w:t xml:space="preserve">is safe</w:t>
+            </w:r>
+          </w:p>
+        </w:tc>
+      </w:tr>
+      <w:tr>
+        <w:tc>
+          <w:tcPr/>
+          <w:p>
+            <w:pPr>
+              <w:pStyle w:val="Compact"/>
+              <w:jc w:val="left"/>
+            </w:pPr>
+            <w:r>
+              <w:t xml:space="preserve">incomparability</w:t>
+            </w:r>
+          </w:p>
+        </w:tc>
+        <w:tc>
+          <w:tcPr/>
+          <w:p>
+            <w:pPr>
+              <w:pStyle w:val="Compact"/>
+              <w:jc w:val="left"/>
+            </w:pPr>
+            <w:r>
+              <w:t xml:space="preserve">each source is decisive on tasks where the other fails; no single number can rank them once and for all</w:t>
+            </w:r>
+          </w:p>
+        </w:tc>
+      </w:tr>
+      <w:tr>
+        <w:tc>
+          <w:tcPr/>
+          <w:p>
+            <w:pPr>
+              <w:pStyle w:val="Compact"/>
+              <w:jc w:val="left"/>
+            </w:pPr>
+            <w:r>
+              <w:t xml:space="preserve">garbling</w:t>
+            </w:r>
+          </w:p>
+        </w:tc>
+        <w:tc>
+          <w:tcPr/>
+          <w:p>
+            <w:pPr>
+              <w:pStyle w:val="Compact"/>
+              <w:jc w:val="left"/>
+            </w:pPr>
+            <m:oMath>
+              <m:sSup>
+                <m:e>
+                  <m:r>
+                    <m:t>W</m:t>
+                  </m:r>
+                </m:e>
+                <m:sup>
+                  <m:r>
+                    <m:rPr>
+                      <m:sty m:val="p"/>
+                    </m:rPr>
+                    <m:t>′</m:t>
+                  </m:r>
+                </m:sup>
+              </m:sSup>
+            </m:oMath>
+            <w:r>
+              <w:t xml:space="preserve"> </w:t>
+            </w:r>
+            <w:r>
+              <w:t xml:space="preserve">is a lossy transformation of</w:t>
+            </w:r>
+            <w:r>
+              <w:t xml:space="preserve"> </w:t>
+            </w:r>
+            <m:oMath>
+              <m:r>
+                <m:t>W</m:t>
+              </m:r>
+            </m:oMath>
+            <w:r>
+              <w:t xml:space="preserve">: everything in</w:t>
+            </w:r>
+            <w:r>
+              <w:t xml:space="preserve"> </w:t>
+            </w:r>
+            <m:oMath>
+              <m:sSup>
+                <m:e>
+                  <m:r>
+                    <m:t>W</m:t>
+                  </m:r>
+                </m:e>
+                <m:sup>
+                  <m:r>
+                    <m:rPr>
+                      <m:sty m:val="p"/>
+                    </m:rPr>
+                    <m:t>′</m:t>
+                  </m:r>
+                </m:sup>
+              </m:sSup>
+            </m:oMath>
+            <w:r>
+              <w:t xml:space="preserve"> </w:t>
+            </w:r>
+            <w:r>
+              <w:t xml:space="preserve">is derivable from</w:t>
+            </w:r>
+            <w:r>
+              <w:t xml:space="preserve"> </w:t>
+            </w:r>
+            <m:oMath>
+              <m:r>
+                <m:t>W</m:t>
+              </m:r>
+            </m:oMath>
+          </w:p>
+        </w:tc>
+      </w:tr>
+      <w:tr>
+        <w:tc>
+          <w:tcPr/>
+          <w:p>
+            <w:pPr>
+              <w:pStyle w:val="Compact"/>
+              <w:jc w:val="left"/>
+            </w:pPr>
+            <w:r>
+              <w:t xml:space="preserve">anti-monotonicity (</w:t>
+            </w:r>
+            <m:oMath>
+              <m:sSub>
+                <m:e>
+                  <m:r>
+                    <m:rPr>
+                      <m:sty m:val="p"/>
+                    </m:rPr>
+                    <m:t>Ψ</m:t>
+                  </m:r>
+                </m:e>
+                <m:sub>
+                  <m:r>
+                    <m:t>T</m:t>
+                  </m:r>
+                </m:sub>
+              </m:sSub>
+              <m:r>
+                <m:rPr>
+                  <m:sty m:val="p"/>
+                </m:rPr>
+                <m:t>&lt;</m:t>
+              </m:r>
+              <m:r>
+                <m:t>0</m:t>
+              </m:r>
+            </m:oMath>
+            <w:r>
+              <w:t xml:space="preserve">)</w:t>
+            </w:r>
+          </w:p>
+        </w:tc>
+        <w:tc>
+          <w:tcPr/>
+          <w:p>
+            <w:pPr>
+              <w:pStyle w:val="Compact"/>
+              <w:jc w:val="left"/>
+            </w:pPr>
+            <w:r>
+              <w:t xml:space="preserve">pasting more true, on-topic text into a working prompt can break it</w:t>
+            </w:r>
+          </w:p>
+        </w:tc>
+      </w:tr>
+      <w:tr>
+        <w:tc>
+          <w:tcPr/>
+          <w:p>
+            <w:pPr>
+              <w:pStyle w:val="Compact"/>
+              <w:jc w:val="left"/>
+            </w:pPr>
+            <w:r>
+              <w:t xml:space="preserve">non-dominated front</w:t>
+            </w:r>
+          </w:p>
+        </w:tc>
+        <w:tc>
+          <w:tcPr/>
+          <w:p>
+            <w:pPr>
+              <w:pStyle w:val="Compact"/>
+              <w:jc w:val="left"/>
+            </w:pPr>
+            <w:r>
+              <w:t xml:space="preserve">the shortlist you must keep whole, because nothing on it verifiably covers anything else on it</w:t>
+            </w:r>
+          </w:p>
+        </w:tc>
+      </w:tr>
+      <w:tr>
+        <w:tc>
+          <w:tcPr/>
+          <w:p>
+            <w:pPr>
+              <w:pStyle w:val="Compact"/>
+              <w:jc w:val="left"/>
+            </w:pPr>
+            <w:r>
+              <w:t xml:space="preserve">verification</w:t>
+            </w:r>
+          </w:p>
+        </w:tc>
+        <w:tc>
+          <w:tcPr/>
+          <w:p>
+            <w:pPr>
+              <w:pStyle w:val="Compact"/>
+              <w:jc w:val="left"/>
+            </w:pPr>
+            <w:r>
+              <w:t xml:space="preserve">a claim measured with exact finite-sample error bars, still significant after multiple-comparison correction, with no distributional assumptions</w:t>
+            </w:r>
+          </w:p>
+        </w:tc>
+      </w:tr>
+      <w:tr>
+        <w:tc>
+          <w:tcPr/>
+          <w:p>
+            <w:pPr>
+              <w:pStyle w:val="Compact"/>
+              <w:jc w:val="left"/>
+            </w:pPr>
+            <w:r>
+              <w:t xml:space="preserve">model rule</w:t>
+            </w:r>
+            <w:r>
+              <w:t xml:space="preserve"> </w:t>
+            </w:r>
+            <m:oMath>
+              <m:sSub>
+                <m:e>
+                  <m:r>
+                    <m:t>δ</m:t>
+                  </m:r>
+                </m:e>
+                <m:sub>
+                  <m:r>
+                    <m:t>M</m:t>
+                  </m:r>
+                </m:sub>
+              </m:sSub>
+            </m:oMath>
+          </w:p>
+        </w:tc>
+        <w:tc>
+          <w:tcPr/>
+          <w:p>
+            <w:pPr>
+              <w:pStyle w:val="Compact"/>
+              <w:jc w:val="left"/>
+            </w:pPr>
+            <w:r>
+              <w:t xml:space="preserve">the model as it actually behaves on the prompt, not an idealized optimal user of the information</w:t>
+            </w:r>
+          </w:p>
+        </w:tc>
+      </w:tr>
+      <w:tr>
+        <w:tc>
+          <w:tcPr/>
+          <w:p>
+            <w:pPr>
+              <w:pStyle w:val="Compact"/>
+              <w:jc w:val="left"/>
+            </w:pPr>
+            <w:r>
+              <w:t xml:space="preserve">surrogate</w:t>
+            </w:r>
+            <w:r>
+              <w:t xml:space="preserve"> </w:t>
+            </w:r>
+            <m:oMath>
+              <m:sSub>
+                <m:e>
+                  <m:acc>
+                    <m:accPr>
+                      <m:chr m:val="̂"/>
+                    </m:accPr>
+                    <m:e>
+                      <m:r>
+                        <m:t>δ</m:t>
+                      </m:r>
+                    </m:e>
+                  </m:acc>
+                </m:e>
+                <m:sub>
+                  <m:r>
+                    <m:rPr>
+                      <m:scr m:val="script"/>
+                      <m:sty m:val="p"/>
+                    </m:rPr>
+                    <m:t>D</m:t>
+                  </m:r>
+                </m:sub>
+              </m:sSub>
+            </m:oMath>
+          </w:p>
+        </w:tc>
+        <w:tc>
+          <w:tcPr/>
+          <w:p>
+            <w:pPr>
+              <w:pStyle w:val="Compact"/>
+              <w:jc w:val="left"/>
+            </w:pPr>
+            <w:r>
+              <w:t xml:space="preserve">how many PASS points you lose by using</w:t>
+            </w:r>
+            <w:r>
+              <w:t xml:space="preserve"> </w:t>
+            </w:r>
+            <m:oMath>
+              <m:sSup>
+                <m:e>
+                  <m:r>
+                    <m:t>W</m:t>
+                  </m:r>
+                </m:e>
+                <m:sup>
+                  <m:r>
+                    <m:rPr>
+                      <m:sty m:val="p"/>
+                    </m:rPr>
+                    <m:t>′</m:t>
+                  </m:r>
+                </m:sup>
+              </m:sSup>
+            </m:oMath>
+            <w:r>
+              <w:t xml:space="preserve"> </w:t>
+            </w:r>
+            <w:r>
+              <w:t xml:space="preserve">in place of</w:t>
+            </w:r>
+            <w:r>
+              <w:t xml:space="preserve"> </w:t>
+            </w:r>
+            <m:oMath>
+              <m:r>
+                <m:t>W</m:t>
+              </m:r>
+            </m:oMath>
+            <w:r>
+              <w:t xml:space="preserve"> </w:t>
+            </w:r>
+            <w:r>
+              <w:t xml:space="preserve">on the task family</w:t>
+            </w:r>
+          </w:p>
+        </w:tc>
+      </w:tr>
+    </w:tbl>
     <w:bookmarkEnd w:id="16"/>
-    <w:bookmarkStart w:id="26" w:name="sec:related"/>
+    <w:bookmarkEnd w:id="17"/>
+    <w:bookmarkEnd w:id="18"/>
+    <w:bookmarkStart w:id="28" w:name="sec:related"/>
     <w:p>
       <w:pPr>
         <w:pStyle w:val="Heading1"/>
@@ -3739,7 +4360,7 @@
         <w:t xml:space="preserve">Related Work</w:t>
       </w:r>
     </w:p>
-    <w:bookmarkStart w:id="17" w:name="positioning."/>
+    <w:bookmarkStart w:id="19" w:name="positioning."/>
     <w:p>
       <w:pPr>
         <w:pStyle w:val="Heading4"/>
@@ -3917,8 +4538,8 @@
         <w:t xml:space="preserve">at inference time.</w:t>
       </w:r>
     </w:p>
-    <w:bookmarkEnd w:id="17"/>
-    <w:bookmarkStart w:id="19" w:name="sec:related-scalar"/>
+    <w:bookmarkEnd w:id="19"/>
+    <w:bookmarkStart w:id="21" w:name="sec:related-scalar"/>
     <w:p>
       <w:pPr>
         <w:pStyle w:val="Heading2"/>
@@ -3931,8 +4552,8 @@
       <w:pPr>
         <w:pStyle w:val="FirstParagraph"/>
       </w:pPr>
-      <w:bookmarkStart w:id="18" w:name="sec:related-ir"/>
-      <w:bookmarkEnd w:id="18"/>
+      <w:bookmarkStart w:id="20" w:name="sec:related-ir"/>
+      <w:bookmarkEnd w:id="20"/>
     </w:p>
     <w:p>
       <w:pPr>
@@ -4463,8 +5084,8 @@
         <w:t xml:space="preserve">and a verified live instance on six production models.</w:t>
       </w:r>
     </w:p>
-    <w:bookmarkEnd w:id="19"/>
-    <w:bookmarkStart w:id="20" w:name="sec:related-taskdep"/>
+    <w:bookmarkEnd w:id="21"/>
+    <w:bookmarkStart w:id="22" w:name="sec:related-taskdep"/>
     <w:p>
       <w:pPr>
         <w:pStyle w:val="Heading2"/>
@@ -4822,8 +5443,8 @@
         <w:t xml:space="preserve">.</w:t>
       </w:r>
     </w:p>
-    <w:bookmarkEnd w:id="20"/>
-    <w:bookmarkStart w:id="23" w:name="sec:related-deficiency"/>
+    <w:bookmarkEnd w:id="22"/>
+    <w:bookmarkStart w:id="25" w:name="sec:related-deficiency"/>
     <w:p>
       <w:pPr>
         <w:pStyle w:val="Heading2"/>
@@ -4836,10 +5457,10 @@
       <w:pPr>
         <w:pStyle w:val="FirstParagraph"/>
       </w:pPr>
-      <w:bookmarkStart w:id="21" w:name="sec:related-llmrep"/>
-      <w:bookmarkEnd w:id="21"/>
-      <w:bookmarkStart w:id="22" w:name="sec:related-foundations"/>
-      <w:bookmarkEnd w:id="22"/>
+      <w:bookmarkStart w:id="23" w:name="sec:related-llmrep"/>
+      <w:bookmarkEnd w:id="23"/>
+      <w:bookmarkStart w:id="24" w:name="sec:related-foundations"/>
+      <w:bookmarkEnd w:id="24"/>
     </w:p>
     <w:p>
       <w:pPr>
@@ -5087,8 +5708,8 @@
         <w:t xml:space="preserve">estimator, the three new pieces here.</w:t>
       </w:r>
     </w:p>
-    <w:bookmarkEnd w:id="23"/>
-    <w:bookmarkStart w:id="25" w:name="sec:related-designspace"/>
+    <w:bookmarkEnd w:id="25"/>
+    <w:bookmarkStart w:id="27" w:name="sec:related-designspace"/>
     <w:p>
       <w:pPr>
         <w:pStyle w:val="Heading2"/>
@@ -5102,7 +5723,7 @@
         <w:pStyle w:val="FirstParagraph"/>
       </w:pPr>
       <w:r>
-        <w:t xml:space="preserve">Table 1 places the methods above on three axes: whether the method is</w:t>
+        <w:t xml:space="preserve">Table 2 places the methods above on three axes: whether the method is</w:t>
       </w:r>
       <w:r>
         <w:t xml:space="preserve"> </w:t>
@@ -5298,7 +5919,7 @@
         <w:t xml:space="preserve">its amortization as the central open question.</w:t>
       </w:r>
     </w:p>
-    <w:bookmarkStart w:id="24" w:name="tab:designspace"/>
+    <w:bookmarkStart w:id="26" w:name="tab:designspace"/>
     <w:p>
       <w:pPr>
         <w:pStyle w:val="TableCaption"/>
@@ -6355,10 +6976,10 @@
         </w:tc>
       </w:tr>
     </w:tbl>
-    <w:bookmarkEnd w:id="24"/>
-    <w:bookmarkEnd w:id="25"/>
     <w:bookmarkEnd w:id="26"/>
-    <w:bookmarkStart w:id="33" w:name="sec:formalization"/>
+    <w:bookmarkEnd w:id="27"/>
+    <w:bookmarkEnd w:id="28"/>
+    <w:bookmarkStart w:id="35" w:name="sec:formalization"/>
     <w:p>
       <w:pPr>
         <w:pStyle w:val="Heading1"/>
@@ -6471,7 +7092,7 @@
         <w:t xml:space="preserve">theorem to experiment rigorous.</w:t>
       </w:r>
     </w:p>
-    <w:bookmarkStart w:id="29" w:name="X73e69b8a1a604fddcc6e5ed9b89d5c624a51ec4"/>
+    <w:bookmarkStart w:id="31" w:name="X73e69b8a1a604fddcc6e5ed9b89d5c624a51ec4"/>
     <w:p>
       <w:pPr>
         <w:pStyle w:val="Heading2"/>
@@ -6897,7 +7518,7 @@
         <w:t xml:space="preserve">fixed-string sources; we return to this in §3.2 and Lemma 1.</w:t>
       </w:r>
     </w:p>
-    <w:bookmarkStart w:id="27" w:name="def:source"/>
+    <w:bookmarkStart w:id="29" w:name="def:source"/>
     <w:p>
       <w:pPr>
         <w:pStyle w:val="BodyText"/>
@@ -7148,8 +7769,8 @@
         <w:t xml:space="preserve">.</w:t>
       </w:r>
     </w:p>
-    <w:bookmarkEnd w:id="27"/>
-    <w:bookmarkStart w:id="28" w:name="def:decision"/>
+    <w:bookmarkEnd w:id="29"/>
+    <w:bookmarkStart w:id="30" w:name="def:decision"/>
     <w:p>
       <w:pPr>
         <w:pStyle w:val="BodyText"/>
@@ -7946,7 +8567,7 @@
         <w:t xml:space="preserve">.</w:t>
       </w:r>
     </w:p>
-    <w:bookmarkEnd w:id="28"/>
+    <w:bookmarkEnd w:id="30"/>
     <w:p>
       <w:pPr>
         <w:pStyle w:val="FirstParagraph"/>
@@ -8078,8 +8699,8 @@
         <w:t xml:space="preserve">(Lemma 2).</w:t>
       </w:r>
     </w:p>
-    <w:bookmarkEnd w:id="29"/>
-    <w:bookmarkStart w:id="31" w:name="subsec:sources"/>
+    <w:bookmarkEnd w:id="31"/>
+    <w:bookmarkStart w:id="33" w:name="subsec:sources"/>
     <w:p>
       <w:pPr>
         <w:pStyle w:val="Heading2"/>
@@ -8304,7 +8925,7 @@
         <w:t xml:space="preserve"> (1).</w:t>
       </w:r>
     </w:p>
-    <w:bookmarkStart w:id="30" w:name="def:projection"/>
+    <w:bookmarkStart w:id="32" w:name="def:projection"/>
     <w:p>
       <w:pPr>
         <w:pStyle w:val="BodyText"/>
@@ -9084,7 +9705,7 @@
         <w:t xml:space="preserve">).</w:t>
       </w:r>
     </w:p>
-    <w:bookmarkEnd w:id="30"/>
+    <w:bookmarkEnd w:id="32"/>
     <w:p>
       <w:pPr>
         <w:pStyle w:val="BodyText"/>
@@ -9255,8 +9876,8 @@
         <w:t xml:space="preserve">.</w:t>
       </w:r>
     </w:p>
-    <w:bookmarkEnd w:id="31"/>
-    <w:bookmarkStart w:id="32" w:name="subsec:theta"/>
+    <w:bookmarkEnd w:id="33"/>
+    <w:bookmarkStart w:id="34" w:name="subsec:theta"/>
     <w:p>
       <w:pPr>
         <w:pStyle w:val="Heading2"/>
@@ -9607,9 +10228,9 @@
         <w:t xml:space="preserve">it except where the model-relativity is the point.</w:t>
       </w:r>
     </w:p>
-    <w:bookmarkEnd w:id="32"/>
-    <w:bookmarkEnd w:id="33"/>
-    <w:bookmarkStart w:id="45" w:name="sec:order"/>
+    <w:bookmarkEnd w:id="34"/>
+    <w:bookmarkEnd w:id="35"/>
+    <w:bookmarkStart w:id="47" w:name="sec:order"/>
     <w:p>
       <w:pPr>
         <w:pStyle w:val="Heading1"/>
@@ -9650,7 +10271,7 @@
         <w:t xml:space="preserve">its two registers.</w:t>
       </w:r>
     </w:p>
-    <w:bookmarkStart w:id="38" w:name="the-order-and-its-two-registers"/>
+    <w:bookmarkStart w:id="40" w:name="the-order-and-its-two-registers"/>
     <w:p>
       <w:pPr>
         <w:pStyle w:val="Heading2"/>
@@ -9659,7 +10280,7 @@
         <w:t xml:space="preserve">The order and its two registers</w:t>
       </w:r>
     </w:p>
-    <w:bookmarkStart w:id="34" w:name="def:blackwell"/>
+    <w:bookmarkStart w:id="36" w:name="def:blackwell"/>
     <w:p>
       <w:pPr>
         <w:pStyle w:val="FirstParagraph"/>
@@ -10002,7 +10623,7 @@
         <w:t xml:space="preserve">.</w:t>
       </w:r>
     </w:p>
-    <w:bookmarkEnd w:id="34"/>
+    <w:bookmarkEnd w:id="36"/>
     <w:p>
       <w:pPr>
         <w:pStyle w:val="BodyText"/>
@@ -10017,7 +10638,7 @@
         <w:t xml:space="preserve">hypotheses for a self-contained treatment.</w:t>
       </w:r>
     </w:p>
-    <w:bookmarkStart w:id="35" w:name="thm:blackwell"/>
+    <w:bookmarkStart w:id="37" w:name="thm:blackwell"/>
     <w:p>
       <w:pPr>
         <w:pStyle w:val="BodyText"/>
@@ -10595,7 +11216,7 @@
         <w:t xml:space="preserve">.</w:t>
       </w:r>
     </w:p>
-    <w:bookmarkEnd w:id="35"/>
+    <w:bookmarkEnd w:id="37"/>
     <w:p>
       <w:pPr>
         <w:pStyle w:val="BodyText"/>
@@ -10736,7 +11357,7 @@
         <w:t xml:space="preserve">Definition 3 are standard Borel.</w:t>
       </w:r>
     </w:p>
-    <w:bookmarkStart w:id="36" w:name="cor:c1"/>
+    <w:bookmarkStart w:id="38" w:name="cor:c1"/>
     <w:p>
       <w:pPr>
         <w:pStyle w:val="BodyText"/>
@@ -11011,8 +11632,8 @@
         <w:t xml:space="preserve">-usable information) provides.</w:t>
       </w:r>
     </w:p>
-    <w:bookmarkEnd w:id="36"/>
-    <w:bookmarkStart w:id="37" w:name="rem:partial"/>
+    <w:bookmarkEnd w:id="38"/>
+    <w:bookmarkStart w:id="39" w:name="rem:partial"/>
     <w:p>
       <w:pPr>
         <w:pStyle w:val="BodyText"/>
@@ -11221,9 +11842,9 @@
         <w:t xml:space="preserve">Incomparability is exactly the regime our experiments target.</w:t>
       </w:r>
     </w:p>
-    <w:bookmarkEnd w:id="37"/>
-    <w:bookmarkEnd w:id="38"/>
-    <w:bookmarkStart w:id="40" w:name="Xcf9dd7f06cc6d4592db8258d08ec9b7ef4b608b"/>
+    <w:bookmarkEnd w:id="39"/>
+    <w:bookmarkEnd w:id="40"/>
+    <w:bookmarkStart w:id="42" w:name="Xcf9dd7f06cc6d4592db8258d08ec9b7ef4b608b"/>
     <w:p>
       <w:pPr>
         <w:pStyle w:val="Heading2"/>
@@ -11274,7 +11895,7 @@
         <w:t xml:space="preserve">purely structural argument rather than by an empirical divergence.</w:t>
       </w:r>
     </w:p>
-    <w:bookmarkStart w:id="39" w:name="lem:noref"/>
+    <w:bookmarkStart w:id="41" w:name="lem:noref"/>
     <w:p>
       <w:pPr>
         <w:pStyle w:val="BodyText"/>
@@ -11829,7 +12450,7 @@
         <w:t xml:space="preserve">other hides.</w:t>
       </w:r>
     </w:p>
-    <w:bookmarkEnd w:id="39"/>
+    <w:bookmarkEnd w:id="41"/>
     <w:p>
       <w:pPr>
         <w:pStyle w:val="FirstParagraph"/>
@@ -12170,8 +12791,8 @@
         <w:t xml:space="preserve">incomparability the experiments then exhibit empirically.</w:t>
       </w:r>
     </w:p>
-    <w:bookmarkEnd w:id="40"/>
-    <w:bookmarkStart w:id="44" w:name="subsec:bridge"/>
+    <w:bookmarkEnd w:id="42"/>
+    <w:bookmarkStart w:id="46" w:name="subsec:bridge"/>
     <w:p>
       <w:pPr>
         <w:pStyle w:val="Heading2"/>
@@ -12335,7 +12956,7 @@
         <w:t xml:space="preserve">Theorem 1.</w:t>
       </w:r>
     </w:p>
-    <w:bookmarkStart w:id="41" w:name="def:dmorder"/>
+    <w:bookmarkStart w:id="43" w:name="def:dmorder"/>
     <w:p>
       <w:pPr>
         <w:pStyle w:val="BodyText"/>
@@ -12888,7 +13509,7 @@
         <w:t xml:space="preserve">.</w:t>
       </w:r>
     </w:p>
-    <w:bookmarkEnd w:id="41"/>
+    <w:bookmarkEnd w:id="43"/>
     <w:p>
       <w:pPr>
         <w:pStyle w:val="BodyText"/>
@@ -12976,7 +13597,7 @@
         <w:t xml:space="preserve">dominance statement, not a scalar.</w:t>
       </w:r>
     </w:p>
-    <w:bookmarkStart w:id="42" w:name="lem:bridge"/>
+    <w:bookmarkStart w:id="44" w:name="lem:bridge"/>
     <w:p>
       <w:pPr>
         <w:pStyle w:val="BodyText"/>
@@ -14533,7 +15154,7 @@
         <w:t xml:space="preserve">(Theorem 3).</w:t>
       </w:r>
     </w:p>
-    <w:bookmarkEnd w:id="42"/>
+    <w:bookmarkEnd w:id="44"/>
     <w:p>
       <w:pPr>
         <w:pStyle w:val="BodyText"/>
@@ -14554,7 +15175,7 @@
         <w:t xml:space="preserve">witness nothing more than the rule’s own incoherence.</w:t>
       </w:r>
     </w:p>
-    <w:bookmarkStart w:id="43" w:name="ass:attain"/>
+    <w:bookmarkStart w:id="45" w:name="ass:attain"/>
     <w:p>
       <w:pPr>
         <w:pStyle w:val="BodyText"/>
@@ -15175,7 +15796,7 @@
         <w:t xml:space="preserve">-incomparable.</w:t>
       </w:r>
     </w:p>
-    <w:bookmarkEnd w:id="43"/>
+    <w:bookmarkEnd w:id="45"/>
     <w:p>
       <w:pPr>
         <w:pStyle w:val="BodyText"/>
@@ -15416,9 +16037,9 @@
         <w:t xml:space="preserve">task design enforces and our measurements verify.</w:t>
       </w:r>
     </w:p>
-    <w:bookmarkEnd w:id="44"/>
-    <w:bookmarkEnd w:id="45"/>
-    <w:bookmarkStart w:id="53" w:name="sec:incomparability"/>
+    <w:bookmarkEnd w:id="46"/>
+    <w:bookmarkEnd w:id="47"/>
+    <w:bookmarkStart w:id="55" w:name="sec:incomparability"/>
     <w:p>
       <w:pPr>
         <w:pStyle w:val="Heading1"/>
@@ -15568,7 +16189,7 @@
         <w:t xml:space="preserve">score practitioners actually use); the two must not be conflated.</w:t>
       </w:r>
     </w:p>
-    <w:bookmarkStart w:id="50" w:name="query-independent-scores-the-theorem"/>
+    <w:bookmarkStart w:id="52" w:name="query-independent-scores-the-theorem"/>
     <w:p>
       <w:pPr>
         <w:pStyle w:val="Heading2"/>
@@ -15577,7 +16198,7 @@
         <w:t xml:space="preserve">Query-independent scores: the theorem</w:t>
       </w:r>
     </w:p>
-    <w:bookmarkStart w:id="46" w:name="thm:incomparable"/>
+    <w:bookmarkStart w:id="48" w:name="thm:incomparable"/>
     <w:p>
       <w:pPr>
         <w:pStyle w:val="FirstParagraph"/>
@@ -16103,7 +16724,7 @@
         <w:t xml:space="preserve">ranking on at least one of them.</w:t>
       </w:r>
     </w:p>
-    <w:bookmarkEnd w:id="46"/>
+    <w:bookmarkEnd w:id="48"/>
     <w:p>
       <w:pPr>
         <w:pStyle w:val="BodyText"/>
@@ -16911,7 +17532,7 @@
         <w:t xml:space="preserve">. ◻</w:t>
       </w:r>
     </w:p>
-    <w:bookmarkStart w:id="47" w:name="rem:c2scope"/>
+    <w:bookmarkStart w:id="49" w:name="rem:c2scope"/>
     <w:p>
       <w:pPr>
         <w:pStyle w:val="BodyText"/>
@@ -17052,8 +17673,8 @@
         <w:t xml:space="preserve">.</w:t>
       </w:r>
     </w:p>
-    <w:bookmarkEnd w:id="47"/>
-    <w:bookmarkStart w:id="48" w:name="prop:vinfo-monotone"/>
+    <w:bookmarkEnd w:id="49"/>
+    <w:bookmarkStart w:id="50" w:name="prop:vinfo-monotone"/>
     <w:p>
       <w:pPr>
         <w:pStyle w:val="BodyText"/>
@@ -17612,8 +18233,8 @@
         <w:t xml:space="preserve">but collapses it to one real number.</w:t>
       </w:r>
     </w:p>
-    <w:bookmarkEnd w:id="48"/>
-    <w:bookmarkStart w:id="49" w:name="rem:vinfo-scope"/>
+    <w:bookmarkEnd w:id="50"/>
+    <w:bookmarkStart w:id="51" w:name="rem:vinfo-scope"/>
     <w:p>
       <w:pPr>
         <w:pStyle w:val="BodyText"/>
@@ -17686,9 +18307,9 @@
         <w:t xml:space="preserve">a data-processing-monotone functional of the same kernels.</w:t>
       </w:r>
     </w:p>
-    <w:bookmarkEnd w:id="49"/>
-    <w:bookmarkEnd w:id="50"/>
-    <w:bookmarkStart w:id="52" w:name="subsec:trap"/>
+    <w:bookmarkEnd w:id="51"/>
+    <w:bookmarkEnd w:id="52"/>
+    <w:bookmarkStart w:id="54" w:name="subsec:trap"/>
     <w:p>
       <w:pPr>
         <w:pStyle w:val="Heading2"/>
@@ -17806,7 +18427,7 @@
         <w:t xml:space="preserve">cover it. We make two precise statements instead.</w:t>
       </w:r>
     </w:p>
-    <w:bookmarkStart w:id="51" w:name="prop:trap-constrained"/>
+    <w:bookmarkStart w:id="53" w:name="prop:trap-constrained"/>
     <w:p>
       <w:pPr>
         <w:pStyle w:val="BodyText"/>
@@ -18440,7 +19061,7 @@
         <w:t xml:space="preserve">correctly on all tasks.</w:t>
       </w:r>
     </w:p>
-    <w:bookmarkEnd w:id="51"/>
+    <w:bookmarkEnd w:id="53"/>
     <w:p>
       <w:pPr>
         <w:pStyle w:val="BodyText"/>
@@ -19010,7 +19631,7 @@
         <w:t xml:space="preserve"> </w:t>
       </w:r>
       <w:r>
-        <w:t xml:space="preserve">(§7.4.2, Table 4), so the topical class is not a lexical strawman: its failure mode is shared by the ranker</w:t>
+        <w:t xml:space="preserve">(§7.4.2, Table 5), so the topical class is not a lexical strawman: its failure mode is shared by the ranker</w:t>
       </w:r>
       <w:r>
         <w:t xml:space="preserve"> </w:t>
@@ -19082,9 +19703,9 @@
         <w:t xml:space="preserve">outside the impossibility class.</w:t>
       </w:r>
     </w:p>
-    <w:bookmarkEnd w:id="52"/>
-    <w:bookmarkEnd w:id="53"/>
-    <w:bookmarkStart w:id="65" w:name="sec:estimator"/>
+    <w:bookmarkEnd w:id="54"/>
+    <w:bookmarkEnd w:id="55"/>
+    <w:bookmarkStart w:id="67" w:name="sec:estimator"/>
     <w:p>
       <w:pPr>
         <w:pStyle w:val="Heading1"/>
@@ -19119,7 +19740,7 @@
         <w:t xml:space="preserve">distribution-free verification that makes each comparison auditable on a live model.</w:t>
       </w:r>
     </w:p>
-    <w:bookmarkStart w:id="55" w:name="subsec:estimator-name"/>
+    <w:bookmarkStart w:id="57" w:name="subsec:estimator-name"/>
     <w:p>
       <w:pPr>
         <w:pStyle w:val="Heading2"/>
@@ -20073,7 +20694,7 @@
         <w:t xml:space="preserve">-incomparability.</w:t>
       </w:r>
     </w:p>
-    <w:bookmarkStart w:id="54" w:name="rem:notlecam"/>
+    <w:bookmarkStart w:id="56" w:name="rem:notlecam"/>
     <w:p>
       <w:pPr>
         <w:pStyle w:val="BodyText"/>
@@ -20576,9 +21197,9 @@
         <w:t xml:space="preserve">of Definition 5, the measurable shadow of Corollary 1.</w:t>
       </w:r>
     </w:p>
-    <w:bookmarkEnd w:id="54"/>
-    <w:bookmarkEnd w:id="55"/>
-    <w:bookmarkStart w:id="58" w:name="subsec:certificate"/>
+    <w:bookmarkEnd w:id="56"/>
+    <w:bookmarkEnd w:id="57"/>
+    <w:bookmarkStart w:id="60" w:name="subsec:certificate"/>
     <w:p>
       <w:pPr>
         <w:pStyle w:val="Heading2"/>
@@ -20629,7 +21250,7 @@
         <w:t xml:space="preserve">valid.</w:t>
       </w:r>
     </w:p>
-    <w:bookmarkStart w:id="56" w:name="prop:certificate"/>
+    <w:bookmarkStart w:id="58" w:name="prop:certificate"/>
     <w:p>
       <w:pPr>
         <w:pStyle w:val="BodyText"/>
@@ -22824,7 +23445,7 @@
         <w:t xml:space="preserve">up to the equivalence margin.</w:t>
       </w:r>
     </w:p>
-    <w:bookmarkEnd w:id="56"/>
+    <w:bookmarkEnd w:id="58"/>
     <w:p>
       <w:pPr>
         <w:pStyle w:val="FirstParagraph"/>
@@ -22857,7 +23478,7 @@
         <w:t xml:space="preserve">guidance for black-box LLM evaluation (Appendix A).</w:t>
       </w:r>
     </w:p>
-    <w:bookmarkStart w:id="57" w:name="ass:iid"/>
+    <w:bookmarkStart w:id="59" w:name="ass:iid"/>
     <w:p>
       <w:pPr>
         <w:pStyle w:val="BodyText"/>
@@ -23032,9 +23653,9 @@
         <w:t xml:space="preserve">stark cells), Clopper–Pearson collapses and the verification is conservative.</w:t>
       </w:r>
     </w:p>
-    <w:bookmarkEnd w:id="57"/>
-    <w:bookmarkEnd w:id="58"/>
-    <w:bookmarkStart w:id="61" w:name="subsec:interference"/>
+    <w:bookmarkEnd w:id="59"/>
+    <w:bookmarkEnd w:id="60"/>
+    <w:bookmarkStart w:id="63" w:name="subsec:interference"/>
     <w:p>
       <w:pPr>
         <w:pStyle w:val="Heading2"/>
@@ -23691,7 +24312,7 @@
         <w:t xml:space="preserve">strictly-more-informative context hurts.”</w:t>
       </w:r>
     </w:p>
-    <w:bookmarkStart w:id="59" w:name="prop:interference"/>
+    <w:bookmarkStart w:id="61" w:name="prop:interference"/>
     <w:p>
       <w:pPr>
         <w:pStyle w:val="BodyText"/>
@@ -24881,8 +25502,8 @@
         <w:t xml:space="preserve">(Remark 6), and omitting it would repeat the multiplicity error we criticize.</w:t>
       </w:r>
     </w:p>
-    <w:bookmarkEnd w:id="59"/>
-    <w:bookmarkStart w:id="60" w:name="rem:leaky"/>
+    <w:bookmarkEnd w:id="61"/>
+    <w:bookmarkStart w:id="62" w:name="rem:leaky"/>
     <w:p>
       <w:pPr>
         <w:pStyle w:val="FirstParagraph"/>
@@ -25250,9 +25871,9 @@
         <w:t xml:space="preserve">(§3.3) thus governs which cells can carry the interference verification.</w:t>
       </w:r>
     </w:p>
-    <w:bookmarkEnd w:id="60"/>
-    <w:bookmarkEnd w:id="61"/>
-    <w:bookmarkStart w:id="63" w:name="subsec:antimono"/>
+    <w:bookmarkEnd w:id="62"/>
+    <w:bookmarkEnd w:id="63"/>
+    <w:bookmarkStart w:id="65" w:name="subsec:antimono"/>
     <w:p>
       <w:pPr>
         <w:pStyle w:val="Heading2"/>
@@ -25378,7 +25999,7 @@
         <w:t xml:space="preserve">optimal-rule order (Theorem 1) and the realized rule diverge.</w:t>
       </w:r>
     </w:p>
-    <w:bookmarkStart w:id="62" w:name="thm:antimono"/>
+    <w:bookmarkStart w:id="64" w:name="thm:antimono"/>
     <w:p>
       <w:pPr>
         <w:pStyle w:val="BodyText"/>
@@ -26266,7 +26887,7 @@
         <w:t xml:space="preserve">.</w:t>
       </w:r>
     </w:p>
-    <w:bookmarkEnd w:id="62"/>
+    <w:bookmarkEnd w:id="64"/>
     <w:p>
       <w:pPr>
         <w:pStyle w:val="BodyText"/>
@@ -26299,8 +26920,8 @@
         <w:t xml:space="preserve">miss it by construction.</w:t>
       </w:r>
     </w:p>
-    <w:bookmarkEnd w:id="63"/>
-    <w:bookmarkStart w:id="64" w:name="subsec:fwer"/>
+    <w:bookmarkEnd w:id="65"/>
+    <w:bookmarkStart w:id="66" w:name="subsec:fwer"/>
     <w:p>
       <w:pPr>
         <w:pStyle w:val="Heading2"/>
@@ -26578,9 +27199,9 @@
         <w:t xml:space="preserve">requirements, which is why the consolidated record marks Opus incomparability as verified and Opus interference as reproduced but not verified; the power analysis is in Appendix A.</w:t>
       </w:r>
     </w:p>
-    <w:bookmarkEnd w:id="64"/>
-    <w:bookmarkEnd w:id="65"/>
-    <w:bookmarkStart w:id="101" w:name="sec:experiments"/>
+    <w:bookmarkEnd w:id="66"/>
+    <w:bookmarkEnd w:id="67"/>
+    <w:bookmarkStart w:id="106" w:name="sec:experiments"/>
     <w:p>
       <w:pPr>
         <w:pStyle w:val="Heading1"/>
@@ -26655,7 +27276,7 @@
         <w:t xml:space="preserve">(§7.4), so the verification is auditable rather than asserted.</w:t>
       </w:r>
     </w:p>
-    <w:bookmarkStart w:id="68" w:name="sec:design"/>
+    <w:bookmarkStart w:id="70" w:name="sec:design"/>
     <w:p>
       <w:pPr>
         <w:pStyle w:val="Heading2"/>
@@ -27538,7 +28159,7 @@
         <w:t xml:space="preserve">first) as an order control.</w:t>
       </w:r>
     </w:p>
-    <w:bookmarkStart w:id="66" w:name="why-incomparable-garbling-argument."/>
+    <w:bookmarkStart w:id="68" w:name="why-incomparable-garbling-argument."/>
     <w:p>
       <w:pPr>
         <w:pStyle w:val="Heading4"/>
@@ -27790,8 +28411,8 @@
         <w:t xml:space="preserve">(Lemma 1).</w:t>
       </w:r>
     </w:p>
-    <w:bookmarkEnd w:id="66"/>
-    <w:bookmarkStart w:id="67" w:name="confound-defense-the-double-crossover."/>
+    <w:bookmarkEnd w:id="68"/>
+    <w:bookmarkStart w:id="69" w:name="confound-defense-the-double-crossover."/>
     <w:p>
       <w:pPr>
         <w:pStyle w:val="Heading4"/>
@@ -27999,7 +28620,7 @@
         <w:t xml:space="preserve"> </w:t>
       </w:r>
       <w:r>
-        <w:t xml:space="preserve">when a model prior leaks a convention (Table 6), we report that leakage explicitly and</w:t>
+        <w:t xml:space="preserve">when a model prior leaks a convention (Table 8), we report that leakage explicitly and</w:t>
       </w:r>
       <w:r>
         <w:t xml:space="preserve"> </w:t>
@@ -28008,9 +28629,9 @@
         <w:t xml:space="preserve">do not use those cells for claims that require a near-zero baseline.</w:t>
       </w:r>
     </w:p>
-    <w:bookmarkEnd w:id="67"/>
-    <w:bookmarkEnd w:id="68"/>
-    <w:bookmarkStart w:id="71" w:name="sec:tasks"/>
+    <w:bookmarkEnd w:id="69"/>
+    <w:bookmarkEnd w:id="70"/>
+    <w:bookmarkStart w:id="73" w:name="sec:tasks"/>
     <w:p>
       <w:pPr>
         <w:pStyle w:val="Heading2"/>
@@ -28235,7 +28856,7 @@
         <w:t xml:space="preserve">, or the wrong exception type).</w:t>
       </w:r>
     </w:p>
-    <w:bookmarkStart w:id="69" w:name="verified-battery."/>
+    <w:bookmarkStart w:id="71" w:name="verified-battery."/>
     <w:p>
       <w:pPr>
         <w:pStyle w:val="Heading4"/>
@@ -28421,8 +29042,8 @@
         <w:t xml:space="preserve">deficiency surrogate accordingly (§7.4.1).</w:t>
       </w:r>
     </w:p>
-    <w:bookmarkEnd w:id="69"/>
-    <w:bookmarkStart w:id="70" w:name="the-relevance-trap."/>
+    <w:bookmarkEnd w:id="71"/>
+    <w:bookmarkStart w:id="72" w:name="the-relevance-trap."/>
     <w:p>
       <w:pPr>
         <w:pStyle w:val="Heading4"/>
@@ -28735,9 +29356,9 @@
         <w:t xml:space="preserve">claim for query-independent scalars.</w:t>
       </w:r>
     </w:p>
-    <w:bookmarkEnd w:id="70"/>
-    <w:bookmarkEnd w:id="71"/>
-    <w:bookmarkStart w:id="79" w:name="sec:methodology"/>
+    <w:bookmarkEnd w:id="72"/>
+    <w:bookmarkEnd w:id="73"/>
+    <w:bookmarkStart w:id="82" w:name="sec:methodology"/>
     <w:p>
       <w:pPr>
         <w:pStyle w:val="Heading2"/>
@@ -28746,7 +29367,7 @@
         <w:t xml:space="preserve">Methodology</w:t>
       </w:r>
     </w:p>
-    <w:bookmarkStart w:id="72" w:name="models-and-vendors."/>
+    <w:bookmarkStart w:id="74" w:name="models-and-vendors."/>
     <w:p>
       <w:pPr>
         <w:pStyle w:val="Heading4"/>
@@ -28769,8 +29390,8 @@
         <w:t xml:space="preserve">GPT-5.5; DeepSeek-V4-Pro; and Moonshot Kimi-K2.6.</w:t>
       </w:r>
     </w:p>
-    <w:bookmarkEnd w:id="72"/>
-    <w:bookmarkStart w:id="74" w:name="harness-and-arms."/>
+    <w:bookmarkEnd w:id="74"/>
+    <w:bookmarkStart w:id="76" w:name="harness-and-arms."/>
     <w:p>
       <w:pPr>
         <w:pStyle w:val="Heading4"/>
@@ -28798,7 +29419,7 @@
       <w:r>
         <w:t xml:space="preserve"> </w:t>
       </w:r>
-      <w:hyperlink r:id="rId73">
+      <w:hyperlink r:id="rId75">
         <w:r>
           <w:rPr>
             <w:rStyle w:val="Hyperlink"/>
@@ -28970,8 +29591,8 @@
         <w:t xml:space="preserve">completions per cell.</w:t>
       </w:r>
     </w:p>
-    <w:bookmarkEnd w:id="74"/>
-    <w:bookmarkStart w:id="75" w:name="one-uniform-run-mode."/>
+    <w:bookmarkEnd w:id="76"/>
+    <w:bookmarkStart w:id="77" w:name="one-uniform-run-mode."/>
     <w:p>
       <w:pPr>
         <w:pStyle w:val="Heading4"/>
@@ -29027,8 +29648,200 @@
         <w:t xml:space="preserve">agentic-exploration pathway, so the model must use what it is given in one pass.</w:t>
       </w:r>
     </w:p>
-    <w:bookmarkEnd w:id="75"/>
-    <w:bookmarkStart w:id="76" w:name="verification-parameters."/>
+    <w:bookmarkEnd w:id="77"/>
+    <w:bookmarkStart w:id="78" w:name="what-verified-means-in-plain-terms."/>
+    <w:p>
+      <w:pPr>
+        <w:pStyle w:val="Heading4"/>
+      </w:pPr>
+      <w:r>
+        <w:t xml:space="preserve">What</w:t>
+      </w:r>
+      <w:r>
+        <w:t xml:space="preserve"> </w:t>
+      </w:r>
+      <w:r>
+        <w:t xml:space="preserve">“verified”</w:t>
+      </w:r>
+      <w:r>
+        <w:t xml:space="preserve"> </w:t>
+      </w:r>
+      <w:r>
+        <w:t xml:space="preserve">means, in plain terms.</w:t>
+      </w:r>
+    </w:p>
+    <w:p>
+      <w:pPr>
+        <w:pStyle w:val="FirstParagraph"/>
+      </w:pPr>
+      <w:r>
+        <w:t xml:space="preserve">Every claim labeled</w:t>
+      </w:r>
+      <w:r>
+        <w:t xml:space="preserve"> </w:t>
+      </w:r>
+      <w:r>
+        <w:rPr>
+          <w:i/>
+          <w:iCs/>
+        </w:rPr>
+        <w:t xml:space="preserve">verified</w:t>
+      </w:r>
+      <w:r>
+        <w:t xml:space="preserve"> </w:t>
+      </w:r>
+      <w:r>
+        <w:t xml:space="preserve">is statistically significant in the standard sense and then</w:t>
+      </w:r>
+      <w:r>
+        <w:t xml:space="preserve"> </w:t>
+      </w:r>
+      <w:r>
+        <w:t xml:space="preserve">corrected for multiplicity: PASS rates are estimated from</w:t>
+      </w:r>
+      <w:r>
+        <w:t xml:space="preserve"> </w:t>
+      </w:r>
+      <m:oMath>
+        <m:r>
+          <m:t>n</m:t>
+        </m:r>
+        <m:r>
+          <m:rPr>
+            <m:sty m:val="p"/>
+          </m:rPr>
+          <m:t>=</m:t>
+        </m:r>
+        <m:r>
+          <m:t>40</m:t>
+        </m:r>
+      </m:oMath>
+      <w:r>
+        <w:t xml:space="preserve"> </w:t>
+      </w:r>
+      <w:r>
+        <w:t xml:space="preserve">independent completions per cell,</w:t>
+      </w:r>
+      <w:r>
+        <w:t xml:space="preserve"> </w:t>
+      </w:r>
+      <w:r>
+        <w:t xml:space="preserve">uncertainty is carried by exact binomial (Clopper–Pearson) confidence intervals with no</w:t>
+      </w:r>
+      <w:r>
+        <w:t xml:space="preserve"> </w:t>
+      </w:r>
+      <w:r>
+        <w:t xml:space="preserve">distributional assumptions, and the family of claims is corrected by a union bound, so all verified</w:t>
+      </w:r>
+      <w:r>
+        <w:t xml:space="preserve"> </w:t>
+      </w:r>
+      <w:r>
+        <w:t xml:space="preserve">statements hold jointly with probability at least</w:t>
+      </w:r>
+      <w:r>
+        <w:t xml:space="preserve"> </w:t>
+      </w:r>
+      <m:oMath>
+        <m:r>
+          <m:t>90</m:t>
+        </m:r>
+        <m:r>
+          <m:rPr>
+            <m:sty m:val="p"/>
+          </m:rPr>
+          <m:t>%</m:t>
+        </m:r>
+      </m:oMath>
+      <w:r>
+        <w:t xml:space="preserve">. For the effect sizes at stake, near-</w:t>
+      </w:r>
+      <m:oMath>
+        <m:r>
+          <m:t>0</m:t>
+        </m:r>
+        <m:r>
+          <m:rPr>
+            <m:sty m:val="p"/>
+          </m:rPr>
+          <m:t>%</m:t>
+        </m:r>
+      </m:oMath>
+      <w:r>
+        <w:t xml:space="preserve"> </w:t>
+      </w:r>
+      <w:r>
+        <w:t xml:space="preserve">versus near-</w:t>
+      </w:r>
+      <m:oMath>
+        <m:r>
+          <m:t>100</m:t>
+        </m:r>
+        <m:r>
+          <m:rPr>
+            <m:sty m:val="p"/>
+          </m:rPr>
+          <m:t>%</m:t>
+        </m:r>
+      </m:oMath>
+      <w:r>
+        <w:t xml:space="preserve">, the</w:t>
+      </w:r>
+      <w:r>
+        <w:t xml:space="preserve"> </w:t>
+      </w:r>
+      <m:oMath>
+        <m:r>
+          <m:t>n</m:t>
+        </m:r>
+        <m:r>
+          <m:rPr>
+            <m:sty m:val="p"/>
+          </m:rPr>
+          <m:t>=</m:t>
+        </m:r>
+        <m:r>
+          <m:t>40</m:t>
+        </m:r>
+      </m:oMath>
+      <w:r>
+        <w:t xml:space="preserve"> </w:t>
+      </w:r>
+      <w:r>
+        <w:t xml:space="preserve">intervals stay separated by a wide margin even after correction.</w:t>
+      </w:r>
+      <w:r>
+        <w:t xml:space="preserve"> </w:t>
+      </w:r>
+      <w:r>
+        <w:t xml:space="preserve">Results whose intervals did not separate are labeled</w:t>
+      </w:r>
+      <w:r>
+        <w:t xml:space="preserve"> </w:t>
+      </w:r>
+      <w:r>
+        <w:rPr>
+          <w:i/>
+          <w:iCs/>
+        </w:rPr>
+        <w:t xml:space="preserve">reproduced but not verified</w:t>
+      </w:r>
+      <w:r>
+        <w:t xml:space="preserve"> </w:t>
+      </w:r>
+      <w:r>
+        <w:t xml:space="preserve">and are</w:t>
+      </w:r>
+      <w:r>
+        <w:t xml:space="preserve"> </w:t>
+      </w:r>
+      <w:r>
+        <w:t xml:space="preserve">never used as evidence; the protocol reports its own insufficiency rather than hiding it.</w:t>
+      </w:r>
+    </w:p>
+    <w:bookmarkEnd w:id="78"/>
+    <w:bookmarkStart w:id="79" w:name="verification-parameters."/>
     <w:p>
       <w:pPr>
         <w:pStyle w:val="Heading4"/>
@@ -29524,8 +30337,8 @@
         <w:t xml:space="preserve">the interference contrast, which mixes intermediate baselines, does not.</w:t>
       </w:r>
     </w:p>
-    <w:bookmarkEnd w:id="76"/>
-    <w:bookmarkStart w:id="77" w:name="sampling-regime."/>
+    <w:bookmarkEnd w:id="79"/>
+    <w:bookmarkStart w:id="80" w:name="sampling-regime."/>
     <w:p>
       <w:pPr>
         <w:pStyle w:val="Heading4"/>
@@ -29588,8 +30401,8 @@
         <w:t xml:space="preserve">policy, and retry policy in Appendix C.</w:t>
       </w:r>
     </w:p>
-    <w:bookmarkEnd w:id="77"/>
-    <w:bookmarkStart w:id="78" w:name="spend."/>
+    <w:bookmarkEnd w:id="80"/>
+    <w:bookmarkStart w:id="81" w:name="spend."/>
     <w:p>
       <w:pPr>
         <w:pStyle w:val="Heading4"/>
@@ -29618,9 +30431,9 @@
         <w:t xml:space="preserve">returns no cost field, so this figure is not the total cost across all six models.</w:t>
       </w:r>
     </w:p>
-    <w:bookmarkEnd w:id="78"/>
-    <w:bookmarkEnd w:id="79"/>
-    <w:bookmarkStart w:id="99" w:name="sec:results"/>
+    <w:bookmarkEnd w:id="81"/>
+    <w:bookmarkEnd w:id="82"/>
+    <w:bookmarkStart w:id="102" w:name="sec:results"/>
     <w:p>
       <w:pPr>
         <w:pStyle w:val="Heading2"/>
@@ -29646,22 +30459,22 @@
         <w:t xml:space="preserve"> </w:t>
       </w:r>
       <w:r>
-        <w:t xml:space="preserve">model-relative value of private context (§7.4.4). Table 2</w:t>
-      </w:r>
-      <w:r>
-        <w:t xml:space="preserve"> </w:t>
-      </w:r>
-      <w:r>
-        <w:t xml:space="preserve">consolidates the per-model verdicts; Tables 3, 5, and</w:t>
-      </w:r>
-      <w:r>
-        <w:t xml:space="preserve"> </w:t>
-      </w:r>
-      <w:r>
-        <w:t xml:space="preserve">6 give the underlying quantities.</w:t>
+        <w:t xml:space="preserve">model-relative value of private context (§7.4.4). Table 3</w:t>
+      </w:r>
+      <w:r>
+        <w:t xml:space="preserve"> </w:t>
+      </w:r>
+      <w:r>
+        <w:t xml:space="preserve">consolidates the per-model verdicts; Tables 4, 6, and</w:t>
+      </w:r>
+      <w:r>
+        <w:t xml:space="preserve"> </w:t>
+      </w:r>
+      <w:r>
+        <w:t xml:space="preserve">8 give the underlying quantities.</w:t>
       </w:r>
     </w:p>
-    <w:bookmarkStart w:id="80" w:name="tab:consolidated"/>
+    <w:bookmarkStart w:id="83" w:name="tab:consolidated"/>
     <w:p>
       <w:pPr>
         <w:pStyle w:val="TableCaption"/>
@@ -30926,8 +31739,8 @@
         </w:tc>
       </w:tr>
     </w:tbl>
-    <w:bookmarkEnd w:id="80"/>
-    <w:bookmarkStart w:id="83" w:name="sec:results-incomp"/>
+    <w:bookmarkEnd w:id="83"/>
+    <w:bookmarkStart w:id="86" w:name="sec:results-incomp"/>
     <w:p>
       <w:pPr>
         <w:pStyle w:val="Heading3"/>
@@ -31167,7 +31980,7 @@
         <w:t xml:space="preserve"> </w:t>
       </w:r>
       <w:r>
-        <w:t xml:space="preserve">(Table 3). The crossover is stark:</w:t>
+        <w:t xml:space="preserve">(Table 4). The crossover is stark:</w:t>
       </w:r>
       <w:r>
         <w:t xml:space="preserve"> </w:t>
@@ -31528,7 +32341,7 @@
         <w:pStyle w:val="BodyText"/>
       </w:pPr>
       <w:r>
-        <w:t xml:space="preserve">Because incomparability is a two-directional claim, each row of Table 3 requires both</w:t>
+        <w:t xml:space="preserve">Because incomparability is a two-directional claim, each row of Table 4 requires both</w:t>
       </w:r>
       <w:r>
         <w:t xml:space="preserve"> </w:t>
@@ -31573,7 +32386,7 @@
         <w:t xml:space="preserve">opposition replicated across six models.</w:t>
       </w:r>
     </w:p>
-    <w:bookmarkStart w:id="81" w:name="tab:LD"/>
+    <w:bookmarkStart w:id="84" w:name="tab:LD"/>
     <w:p>
       <w:pPr>
         <w:pStyle w:val="TableCaption"/>
@@ -32577,8 +33390,8 @@
         </w:tc>
       </w:tr>
     </w:tbl>
-    <w:bookmarkEnd w:id="81"/>
-    <w:bookmarkStart w:id="82" w:name="Xb26a34529b3197c54b6ef78a1946345b612d255"/>
+    <w:bookmarkEnd w:id="84"/>
+    <w:bookmarkStart w:id="85" w:name="Xb26a34529b3197c54b6ef78a1946345b612d255"/>
     <w:p>
       <w:pPr>
         <w:pStyle w:val="Heading4"/>
@@ -32898,9 +33711,9 @@
         <w:t xml:space="preserve">added signal.</w:t>
       </w:r>
     </w:p>
-    <w:bookmarkEnd w:id="82"/>
-    <w:bookmarkEnd w:id="83"/>
-    <w:bookmarkStart w:id="86" w:name="sec:results-misrank"/>
+    <w:bookmarkEnd w:id="85"/>
+    <w:bookmarkEnd w:id="86"/>
+    <w:bookmarkStart w:id="89" w:name="sec:results-misrank"/>
     <w:p>
       <w:pPr>
         <w:pStyle w:val="Heading3"/>
@@ -33448,7 +34261,7 @@
         <w:t xml:space="preserve">unguessable and that encoding knowledge is useless on this task.</w:t>
       </w:r>
     </w:p>
-    <w:bookmarkStart w:id="85" w:name="X92ef9457b97ee405b154a7eb0fa1aa3a6f2d684"/>
+    <w:bookmarkStart w:id="88" w:name="X92ef9457b97ee405b154a7eb0fa1aa3a6f2d684"/>
     <w:p>
       <w:pPr>
         <w:pStyle w:val="Heading4"/>
@@ -33636,7 +34449,7 @@
         <w:t xml:space="preserve"> </w:t>
       </w:r>
       <w:r>
-        <w:t xml:space="preserve">per task). Table 4 reports the induced rankings.</w:t>
+        <w:t xml:space="preserve">per task). Table 5 reports the induced rankings.</w:t>
       </w:r>
       <w:r>
         <w:t xml:space="preserve"> </w:t>
@@ -33882,7 +34695,7 @@
         <w:t xml:space="preserve">deficiency verification is built from, not a free scalar.</w:t>
       </w:r>
     </w:p>
-    <w:bookmarkStart w:id="84" w:name="tab:rankers"/>
+    <w:bookmarkStart w:id="87" w:name="tab:rankers"/>
     <w:p>
       <w:pPr>
         <w:pStyle w:val="TableCaption"/>
@@ -34807,10 +35620,10 @@
         </w:tc>
       </w:tr>
     </w:tbl>
-    <w:bookmarkEnd w:id="84"/>
-    <w:bookmarkEnd w:id="85"/>
-    <w:bookmarkEnd w:id="86"/>
-    <w:bookmarkStart w:id="95" w:name="sec:results-antimono"/>
+    <w:bookmarkEnd w:id="87"/>
+    <w:bookmarkEnd w:id="88"/>
+    <w:bookmarkEnd w:id="89"/>
+    <w:bookmarkStart w:id="98" w:name="sec:results-antimono"/>
     <w:p>
       <w:pPr>
         <w:pStyle w:val="Heading3"/>
@@ -35250,7 +36063,7 @@
         <w:t xml:space="preserve"> </w:t>
       </w:r>
       <w:r>
-        <w:t xml:space="preserve">least one cell for five of the six models (Table 5). Opus reproduces the effect</w:t>
+        <w:t xml:space="preserve">least one cell for five of the six models (Table 6). Opus reproduces the effect</w:t>
       </w:r>
       <w:r>
         <w:t xml:space="preserve"> </w:t>
@@ -35371,7 +36184,7 @@
         <w:t xml:space="preserve">Figure 1 shows the collapse across the six models.</w:t>
       </w:r>
     </w:p>
-    <w:bookmarkStart w:id="87" w:name="fig:collapse"/>
+    <w:bookmarkStart w:id="90" w:name="fig:collapse"/>
     <w:tbl>
       <w:tblPr>
         <w:tblStyle w:val="FigureTable"/>
@@ -35507,7 +36320,7 @@
         <w:t xml:space="preserve"> </w:t>
       </w:r>
       <w:r>
-        <w:t xml:space="preserve">(dark), per model (Table 6). The superset</w:t>
+        <w:t xml:space="preserve">(dark), per model (Table 8). The superset</w:t>
       </w:r>
       <w:r>
         <w:t xml:space="preserve"> </w:t>
@@ -35636,11 +36449,11 @@
         </m:r>
       </m:oMath>
       <w:r>
-        <w:t xml:space="preserve">; Table 5); Opus reproduces the collapse but does not verify.</w:t>
+        <w:t xml:space="preserve">; Table 6); Opus reproduces the collapse but does not verify.</w:t>
       </w:r>
     </w:p>
-    <w:bookmarkEnd w:id="87"/>
-    <w:bookmarkStart w:id="90" w:name="Xad950c9ad2efcae5ca328fe88a654bcb87f62fc"/>
+    <w:bookmarkEnd w:id="90"/>
+    <w:bookmarkStart w:id="93" w:name="Xad950c9ad2efcae5ca328fe88a654bcb87f62fc"/>
     <w:p>
       <w:pPr>
         <w:pStyle w:val="Heading4"/>
@@ -36266,7 +37079,7 @@
         <w:t xml:space="preserve">is developed in a companion paper.</w:t>
       </w:r>
     </w:p>
-    <w:bookmarkStart w:id="88" w:name="fig:hasse"/>
+    <w:bookmarkStart w:id="91" w:name="fig:hasse"/>
     <w:tbl>
       <w:tblPr>
         <w:tblStyle w:val="FigureTable"/>
@@ -36636,7 +37449,7 @@
         </m:r>
       </m:oMath>
       <w:r>
-        <w:t xml:space="preserve">, anti-monotonicity, Table 5)</w:t>
+        <w:t xml:space="preserve">, anti-monotonicity, Table 6)</w:t>
       </w:r>
       <w:r>
         <w:t xml:space="preserve"> </w:t>
@@ -36714,8 +37527,8 @@
         <w:t xml:space="preserve">rule can represent.</w:t>
       </w:r>
     </w:p>
-    <w:bookmarkEnd w:id="88"/>
-    <w:bookmarkStart w:id="89" w:name="tab:interference"/>
+    <w:bookmarkEnd w:id="91"/>
+    <w:bookmarkStart w:id="92" w:name="tab:interference"/>
     <w:p>
       <w:pPr>
         <w:pStyle w:val="TableCaption"/>
@@ -38260,9 +39073,9 @@
         </w:tc>
       </w:tr>
     </w:tbl>
-    <w:bookmarkEnd w:id="89"/>
-    <w:bookmarkEnd w:id="90"/>
-    <w:bookmarkStart w:id="91" w:name="Xe149701baef4ebfc0c0660f6732890156a3bb29"/>
+    <w:bookmarkEnd w:id="92"/>
+    <w:bookmarkEnd w:id="93"/>
+    <w:bookmarkStart w:id="94" w:name="Xe149701baef4ebfc0c0660f6732890156a3bb29"/>
     <w:p>
       <w:pPr>
         <w:pStyle w:val="Heading4"/>
@@ -38581,7 +39394,7 @@
         <w:t xml:space="preserve"> </w:t>
       </w:r>
       <w:r>
-        <w:t xml:space="preserve">baseline floors near zero. Table 5 reports, per model, which cell</w:t>
+        <w:t xml:space="preserve">baseline floors near zero. Table 6 reports, per model, which cell</w:t>
       </w:r>
       <w:r>
         <w:t xml:space="preserve"> </w:t>
@@ -38750,8 +39563,8 @@
         <w:t xml:space="preserve">.</w:t>
       </w:r>
     </w:p>
-    <w:bookmarkEnd w:id="91"/>
-    <w:bookmarkStart w:id="92" w:name="position-is-not-the-cause."/>
+    <w:bookmarkEnd w:id="94"/>
+    <w:bookmarkStart w:id="95" w:name="position-is-not-the-cause."/>
     <w:p>
       <w:pPr>
         <w:pStyle w:val="Heading4"/>
@@ -38875,8 +39688,8 @@
         <w:t xml:space="preserve">what turns a harmless arm into a harmful one, so the cause is the added signal, not where it sits.</w:t>
       </w:r>
     </w:p>
-    <w:bookmarkEnd w:id="92"/>
-    <w:bookmarkStart w:id="93" w:name="X086de5874ce71cba9e6d9633bd38de7f701e1cb"/>
+    <w:bookmarkEnd w:id="95"/>
+    <w:bookmarkStart w:id="96" w:name="X086de5874ce71cba9e6d9633bd38de7f701e1cb"/>
     <w:p>
       <w:pPr>
         <w:pStyle w:val="Heading4"/>
@@ -38957,8 +39770,8 @@
         <w:t xml:space="preserve">could be effect rather than cause.</w:t>
       </w:r>
     </w:p>
-    <w:bookmarkEnd w:id="93"/>
-    <w:bookmarkStart w:id="94" w:name="robust-but-not-monotone-in-capability."/>
+    <w:bookmarkEnd w:id="96"/>
+    <w:bookmarkStart w:id="97" w:name="robust-but-not-monotone-in-capability."/>
     <w:p>
       <w:pPr>
         <w:pStyle w:val="Heading4"/>
@@ -39233,9 +40046,9 @@
         <w:t xml:space="preserve">across the ladder, not a capability trend.</w:t>
       </w:r>
     </w:p>
-    <w:bookmarkEnd w:id="94"/>
-    <w:bookmarkEnd w:id="95"/>
-    <w:bookmarkStart w:id="98" w:name="sec:results-moat"/>
+    <w:bookmarkEnd w:id="97"/>
+    <w:bookmarkEnd w:id="98"/>
+    <w:bookmarkStart w:id="101" w:name="sec:results-moat"/>
     <w:p>
       <w:pPr>
         <w:pStyle w:val="Heading3"/>
@@ -39388,7 +40201,7 @@
         <w:t xml:space="preserve"> </w:t>
       </w:r>
       <w:r>
-        <w:t xml:space="preserve">(Table 2; Figure 3). So the value of the private context, the</w:t>
+        <w:t xml:space="preserve">(Table 3; Figure 3). So the value of the private context, the</w:t>
       </w:r>
       <w:r>
         <w:t xml:space="preserve"> </w:t>
@@ -39631,7 +40444,7 @@
         <w:t xml:space="preserve">).</w:t>
       </w:r>
     </w:p>
-    <w:bookmarkStart w:id="96" w:name="fig:spectrum"/>
+    <w:bookmarkStart w:id="99" w:name="fig:spectrum"/>
     <w:tbl>
       <w:tblPr>
         <w:tblStyle w:val="FigureTable"/>
@@ -39762,8 +40575,8 @@
         <w:t xml:space="preserve">different vendor, and Opus (the strongest Anthropic model) guesses more than Sonnet.</w:t>
       </w:r>
     </w:p>
-    <w:bookmarkEnd w:id="96"/>
-    <w:bookmarkStart w:id="97" w:name="auditable-per-cell-record."/>
+    <w:bookmarkEnd w:id="99"/>
+    <w:bookmarkStart w:id="100" w:name="auditable-per-cell-record."/>
     <w:p>
       <w:pPr>
         <w:pStyle w:val="Heading4"/>
@@ -39777,13 +40590,13 @@
         <w:pStyle w:val="FirstParagraph"/>
       </w:pPr>
       <w:r>
-        <w:t xml:space="preserve">The full per-arm PASS record for every carrying cell is Table 6 in Appendix B, so each verification can be reconstructed from the reported counts.</w:t>
+        <w:t xml:space="preserve">The full per-arm PASS record for every carrying cell is Table 8 in Appendix B, so each verification can be reconstructed from the reported counts.</w:t>
       </w:r>
     </w:p>
-    <w:bookmarkEnd w:id="97"/>
-    <w:bookmarkEnd w:id="98"/>
-    <w:bookmarkEnd w:id="99"/>
-    <w:bookmarkStart w:id="100" w:name="sec:results-generality"/>
+    <w:bookmarkEnd w:id="100"/>
+    <w:bookmarkEnd w:id="101"/>
+    <w:bookmarkEnd w:id="102"/>
+    <w:bookmarkStart w:id="103" w:name="sec:results-generality"/>
     <w:p>
       <w:pPr>
         <w:pStyle w:val="Heading2"/>
@@ -40560,15 +41373,14 @@
         <w:t xml:space="preserve">convention-to-task routing rather than in convention segmentation.</w:t>
       </w:r>
     </w:p>
-    <w:bookmarkEnd w:id="100"/>
-    <w:bookmarkEnd w:id="101"/>
-    <w:bookmarkStart w:id="117" w:name="sec:discussion"/>
+    <w:bookmarkEnd w:id="103"/>
+    <w:bookmarkStart w:id="105" w:name="sec:results-policies"/>
     <w:p>
       <w:pPr>
-        <w:pStyle w:val="Heading1"/>
+        <w:pStyle w:val="Heading2"/>
       </w:pPr>
       <w:r>
-        <w:t xml:space="preserve">Discussion</w:t>
+        <w:t xml:space="preserve">The engineering consequence: four selection policies, one measured table</w:t>
       </w:r>
     </w:p>
     <w:p>
@@ -40576,49 +41388,47 @@
         <w:pStyle w:val="FirstParagraph"/>
       </w:pPr>
       <w:r>
-        <w:t xml:space="preserve">With the evidence in hand, we step back to what it licenses. Our results recast a piece of</w:t>
-      </w:r>
-      <w:r>
-        <w:t xml:space="preserve"> </w:t>
-      </w:r>
-      <w:r>
-        <w:t xml:space="preserve">practitioner folklore,</w:t>
-      </w:r>
-      <w:r>
-        <w:t xml:space="preserve"> </w:t>
-      </w:r>
-      <w:r>
-        <w:t xml:space="preserve">“relevance does not transfer across</w:t>
-      </w:r>
-      <w:r>
-        <w:t xml:space="preserve"> </w:t>
-      </w:r>
-      <w:r>
-        <w:t xml:space="preserve">tasks”</w:t>
-      </w:r>
-      <w:r>
-        <w:t xml:space="preserve">, as a structural fact about context sources. When two sources are Blackwell-incomparable, the</w:t>
-      </w:r>
-      <w:r>
-        <w:t xml:space="preserve"> </w:t>
-      </w:r>
-      <w:r>
-        <w:t xml:space="preserve">order over them is partial, and any scalar score, by imposing a total order, must mis-rank</w:t>
-      </w:r>
-      <w:r>
-        <w:t xml:space="preserve"> </w:t>
-      </w:r>
-      <w:r>
-        <w:t xml:space="preserve">them on some task. The empirical program does not merely illustrate this; it instantiates a single</w:t>
-      </w:r>
-      <w:r>
-        <w:t xml:space="preserve"> </w:t>
-      </w:r>
-      <w:r>
-        <w:t xml:space="preserve">hand-built incomparable pair (a private API-call contract</w:t>
-      </w:r>
-      <w:r>
-        <w:t xml:space="preserve"> </w:t>
+        <w:t xml:space="preserve">The formal results reduce to a comparison an engineer can act on. On the measured pair there are</w:t>
+      </w:r>
+      <w:r>
+        <w:t xml:space="preserve"> </w:t>
+      </w:r>
+      <w:r>
+        <w:t xml:space="preserve">four things a selection layer can do, and every one of them was measured (Table 8);</w:t>
+      </w:r>
+      <w:r>
+        <w:t xml:space="preserve"> </w:t>
+      </w:r>
+      <w:r>
+        <w:t xml:space="preserve">Table 7 scores them per model as mean PASS over the four verified cells.</w:t>
+      </w:r>
+      <w:r>
+        <w:t xml:space="preserve"> </w:t>
+      </w:r>
+      <w:r>
+        <w:rPr>
+          <w:i/>
+          <w:iCs/>
+        </w:rPr>
+        <w:t xml:space="preserve">Best fixed source</w:t>
+      </w:r>
+      <w:r>
+        <w:t xml:space="preserve"> </w:t>
+      </w:r>
+      <w:r>
+        <w:t xml:space="preserve">grants the entire query-independent-scalar class its best case: any such</w:t>
+      </w:r>
+      <w:r>
+        <w:t xml:space="preserve"> </w:t>
+      </w:r>
+      <w:r>
+        <w:t xml:space="preserve">scalar induces one total order, hence one top-1 reused for every task, and we let it pick the</w:t>
+      </w:r>
+      <w:r>
+        <w:t xml:space="preserve"> </w:t>
+      </w:r>
+      <w:r>
+        <w:t xml:space="preserve">oracle-best source (</w:t>
       </w:r>
       <m:oMath>
         <m:sSub>
@@ -40638,13 +41448,29 @@
         <w:t xml:space="preserve"> </w:t>
       </w:r>
       <w:r>
-        <w:t xml:space="preserve">versus a private wire-encoding</w:t>
-      </w:r>
-      <w:r>
-        <w:t xml:space="preserve"> </w:t>
-      </w:r>
-      <w:r>
-        <w:t xml:space="preserve">invariant</w:t>
+        <w:t xml:space="preserve">for every model).</w:t>
+      </w:r>
+      <w:r>
+        <w:t xml:space="preserve"> </w:t>
+      </w:r>
+      <w:r>
+        <w:rPr>
+          <w:i/>
+          <w:iCs/>
+        </w:rPr>
+        <w:t xml:space="preserve">Topical top-1</w:t>
+      </w:r>
+      <w:r>
+        <w:t xml:space="preserve"> </w:t>
+      </w:r>
+      <w:r>
+        <w:t xml:space="preserve">re-scores per task with topical</w:t>
+      </w:r>
+      <w:r>
+        <w:t xml:space="preserve"> </w:t>
+      </w:r>
+      <w:r>
+        <w:t xml:space="preserve">relevance, choosing</w:t>
       </w:r>
       <w:r>
         <w:t xml:space="preserve"> </w:t>
@@ -40658,6 +41484,29 @@
           </m:e>
           <m:sub>
             <m:r>
+              <m:t>1</m:t>
+            </m:r>
+          </m:sub>
+        </m:sSub>
+      </m:oMath>
+      <w:r>
+        <w:t xml:space="preserve"> </w:t>
+      </w:r>
+      <w:r>
+        <w:t xml:space="preserve">on the API cells and</w:t>
+      </w:r>
+      <w:r>
+        <w:t xml:space="preserve"> </w:t>
+      </w:r>
+      <m:oMath>
+        <m:sSub>
+          <m:e>
+            <m:r>
+              <m:t>W</m:t>
+            </m:r>
+          </m:e>
+          <m:sub>
+            <m:r>
               <m:t>2</m:t>
             </m:r>
           </m:sub>
@@ -40667,59 +41516,1247 @@
         <w:t xml:space="preserve"> </w:t>
       </w:r>
       <w:r>
-        <w:t xml:space="preserve">on the same</w:t>
-      </w:r>
-      <w:r>
-        <w:t xml:space="preserve"> </w:t>
-      </w:r>
-      <w:r>
-        <w:rPr>
-          <w:rStyle w:val="VerbatimChar"/>
-        </w:rPr>
-        <w:t xml:space="preserve">ledger</w:t>
-      </w:r>
-      <w:r>
-        <w:t xml:space="preserve"> </w:t>
-      </w:r>
-      <w:r>
-        <w:t xml:space="preserve">module) and shows that the resulting double crossover, the</w:t>
-      </w:r>
-      <w:r>
-        <w:t xml:space="preserve"> </w:t>
-      </w:r>
-      <w:r>
-        <w:t xml:space="preserve">relevance mis-rank, and an anti-monotonicity collapse all reproduce across six models and four</w:t>
-      </w:r>
-      <w:r>
-        <w:t xml:space="preserve"> </w:t>
-      </w:r>
-      <w:r>
-        <w:t xml:space="preserve">vendors. We discuss what the evidence does and does not license, and where the</w:t>
-      </w:r>
-      <w:r>
-        <w:t xml:space="preserve"> </w:t>
-      </w:r>
-      <w:r>
-        <w:t xml:space="preserve">formalization is a model rather than a proof of the realized object.</w:t>
+        <w:t xml:space="preserve">on encoding, but also</w:t>
+      </w:r>
+      <w:r>
+        <w:t xml:space="preserve"> </w:t>
+      </w:r>
+      <m:oMath>
+        <m:sSub>
+          <m:e>
+            <m:r>
+              <m:t>W</m:t>
+            </m:r>
+          </m:e>
+          <m:sub>
+            <m:r>
+              <m:t>2</m:t>
+            </m:r>
+          </m:sub>
+        </m:sSub>
+      </m:oMath>
+      <w:r>
+        <w:t xml:space="preserve"> </w:t>
+      </w:r>
+      <w:r>
+        <w:t xml:space="preserve">on the trap,</w:t>
+      </w:r>
+      <w:r>
+        <w:t xml:space="preserve"> </w:t>
+      </w:r>
+      <w:r>
+        <w:t xml:space="preserve">where every measured topical ranker puts the wrong source first</w:t>
+      </w:r>
+      <w:r>
+        <w:t xml:space="preserve"> </w:t>
+      </w:r>
+      <w:r>
+        <w:t xml:space="preserve">(§7.4.2).</w:t>
+      </w:r>
+      <w:r>
+        <w:t xml:space="preserve"> </w:t>
+      </w:r>
+      <w:r>
+        <w:rPr>
+          <w:i/>
+          <w:iCs/>
+        </w:rPr>
+        <w:t xml:space="preserve">Concatenate both</w:t>
+      </w:r>
+      <w:r>
+        <w:t xml:space="preserve"> </w:t>
+      </w:r>
+      <w:r>
+        <w:t xml:space="preserve">refuses to choose and submits</w:t>
+      </w:r>
+      <w:r>
+        <w:t xml:space="preserve"> </w:t>
+      </w:r>
+      <m:oMath>
+        <m:sSub>
+          <m:e>
+            <m:r>
+              <m:t>W</m:t>
+            </m:r>
+          </m:e>
+          <m:sub>
+            <m:r>
+              <m:t>1</m:t>
+            </m:r>
+            <m:r>
+              <m:rPr>
+                <m:sty m:val="p"/>
+              </m:rPr>
+              <m:t>+</m:t>
+            </m:r>
+          </m:sub>
+        </m:sSub>
+      </m:oMath>
+      <w:r>
+        <w:t xml:space="preserve">.</w:t>
+      </w:r>
+      <w:r>
+        <w:t xml:space="preserve"> </w:t>
+      </w:r>
+      <w:r>
+        <w:rPr>
+          <w:i/>
+          <w:iCs/>
+        </w:rPr>
+        <w:t xml:space="preserve">Front</w:t>
+      </w:r>
+      <w:r>
+        <w:rPr>
+          <w:i/>
+          <w:iCs/>
+        </w:rPr>
+        <w:t xml:space="preserve"> </w:t>
+      </w:r>
+      <m:oMath>
+        <m:r>
+          <m:rPr>
+            <m:sty m:val="p"/>
+          </m:rPr>
+          <m:t>+</m:t>
+        </m:r>
+      </m:oMath>
+      <w:r>
+        <w:rPr>
+          <w:i/>
+          <w:iCs/>
+        </w:rPr>
+        <w:t xml:space="preserve"> </w:t>
+      </w:r>
+      <w:r>
+        <w:rPr>
+          <w:i/>
+          <w:iCs/>
+        </w:rPr>
+        <w:t xml:space="preserve">routing</w:t>
+      </w:r>
+      <w:r>
+        <w:t xml:space="preserve"> </w:t>
+      </w:r>
+      <w:r>
+        <w:t xml:space="preserve">keeps the verified non-dominated set</w:t>
+      </w:r>
+      <w:r>
+        <w:t xml:space="preserve"> </w:t>
+      </w:r>
+      <m:oMath>
+        <m:r>
+          <m:rPr>
+            <m:sty m:val="p"/>
+          </m:rPr>
+          <m:t>{</m:t>
+        </m:r>
+        <m:sSub>
+          <m:e>
+            <m:r>
+              <m:t>W</m:t>
+            </m:r>
+          </m:e>
+          <m:sub>
+            <m:r>
+              <m:t>1</m:t>
+            </m:r>
+          </m:sub>
+        </m:sSub>
+        <m:r>
+          <m:rPr>
+            <m:sty m:val="p"/>
+          </m:rPr>
+          <m:t>,</m:t>
+        </m:r>
+        <m:sSub>
+          <m:e>
+            <m:r>
+              <m:t>W</m:t>
+            </m:r>
+          </m:e>
+          <m:sub>
+            <m:r>
+              <m:t>2</m:t>
+            </m:r>
+          </m:sub>
+        </m:sSub>
+        <m:r>
+          <m:rPr>
+            <m:sty m:val="p"/>
+          </m:rPr>
+          <m:t>}</m:t>
+        </m:r>
+      </m:oMath>
+      <w:r>
+        <w:t xml:space="preserve"> </w:t>
+      </w:r>
+      <w:r>
+        <w:t xml:space="preserve">and routes by task</w:t>
+      </w:r>
+      <w:r>
+        <w:t xml:space="preserve"> </w:t>
+      </w:r>
+      <w:r>
+        <w:t xml:space="preserve">family, attaining the per-cell maximum of the two sources; this is what the partial order licenses,</w:t>
+      </w:r>
+      <w:r>
+        <w:t xml:space="preserve"> </w:t>
+      </w:r>
+      <w:r>
+        <w:t xml:space="preserve">and its price is exactly one probe’s worth of knowledge, namely which source is decisive for which</w:t>
+      </w:r>
+      <w:r>
+        <w:t xml:space="preserve"> </w:t>
+      </w:r>
+      <w:r>
+        <w:t xml:space="preserve">family.</w:t>
       </w:r>
     </w:p>
-    <w:bookmarkStart w:id="104" w:name="sec:disc-bridge"/>
+    <w:bookmarkStart w:id="104" w:name="tab:policies"/>
     <w:p>
       <w:pPr>
-        <w:pStyle w:val="Heading2"/>
+        <w:pStyle w:val="TableCaption"/>
       </w:pPr>
       <w:r>
-        <w:t xml:space="preserve">Scope of the claims</w:t>
+        <w:t xml:space="preserve">Mean PASS (%) over the four verified cells under four selection policies, per model,</w:t>
+      </w:r>
+      <w:r>
+        <w:t xml:space="preserve"> </w:t>
+      </w:r>
+      <w:r>
+        <w:t xml:space="preserve">computed from the measured per-cell rates of Table 8. The front-and-routing column</w:t>
+      </w:r>
+      <w:r>
+        <w:t xml:space="preserve"> </w:t>
+      </w:r>
+      <w:r>
+        <w:t xml:space="preserve">is the per-cell maximum of</w:t>
+      </w:r>
+      <w:r>
+        <w:t xml:space="preserve"> </w:t>
+      </w:r>
+      <m:oMath>
+        <m:sSub>
+          <m:e>
+            <m:r>
+              <m:t>W</m:t>
+            </m:r>
+          </m:e>
+          <m:sub>
+            <m:r>
+              <m:t>1</m:t>
+            </m:r>
+          </m:sub>
+        </m:sSub>
+      </m:oMath>
+      <w:r>
+        <w:t xml:space="preserve"> </w:t>
+      </w:r>
+      <w:r>
+        <w:t xml:space="preserve">and</w:t>
+      </w:r>
+      <w:r>
+        <w:t xml:space="preserve"> </w:t>
+      </w:r>
+      <m:oMath>
+        <m:sSub>
+          <m:e>
+            <m:r>
+              <m:t>W</m:t>
+            </m:r>
+          </m:e>
+          <m:sub>
+            <m:r>
+              <m:t>2</m:t>
+            </m:r>
+          </m:sub>
+        </m:sSub>
+      </m:oMath>
+      <w:r>
+        <w:t xml:space="preserve"> </w:t>
+      </w:r>
+      <w:r>
+        <w:t xml:space="preserve">and is therefore the ceiling of</w:t>
+      </w:r>
+      <w:r>
+        <w:t xml:space="preserve"> </w:t>
+      </w:r>
+      <w:r>
+        <w:rPr>
+          <w:i/>
+          <w:iCs/>
+        </w:rPr>
+        <w:t xml:space="preserve">any</w:t>
+      </w:r>
+      <w:r>
+        <w:t xml:space="preserve"> </w:t>
+      </w:r>
+      <w:r>
+        <w:t xml:space="preserve">selection</w:t>
+      </w:r>
+      <w:r>
+        <w:t xml:space="preserve"> </w:t>
+      </w:r>
+      <w:r>
+        <w:t xml:space="preserve">policy on these cells; its remaining gap to</w:t>
+      </w:r>
+      <w:r>
+        <w:t xml:space="preserve"> </w:t>
+      </w:r>
+      <m:oMath>
+        <m:r>
+          <m:t>100</m:t>
+        </m:r>
+        <m:r>
+          <m:rPr>
+            <m:sty m:val="p"/>
+          </m:rPr>
+          <m:t>%</m:t>
+        </m:r>
+      </m:oMath>
+      <w:r>
+        <w:t xml:space="preserve"> </w:t>
+      </w:r>
+      <w:r>
+        <w:t xml:space="preserve">is model capability, not selection error.</w:t>
+      </w:r>
+    </w:p>
+    <w:tbl>
+      <w:tblPr>
+        <w:tblStyle w:val="Table"/>
+        <w:tblW w:type="auto" w:w="0"/>
+        <w:tblLook w:firstRow="1" w:lastRow="0" w:firstColumn="0" w:lastColumn="0" w:noHBand="0" w:noVBand="0" w:val="0020"/>
+        <w:tblCaption w:val="Mean PASS (%) over the four verified cells under four selection policies, per model, computed from the measured per-cell rates of Table 8. The front-and-routing column is the per-cell maximum of W_1 and W_2 and is therefore the ceiling of any selection policy on these cells; its remaining gap to 100\% is model capability, not selection error."/>
+      </w:tblPr>
+      <w:tblGrid>
+        <w:gridCol w:w="1584"/>
+        <w:gridCol w:w="1584"/>
+        <w:gridCol w:w="1584"/>
+        <w:gridCol w:w="1584"/>
+        <w:gridCol w:w="1584"/>
+      </w:tblGrid>
+      <w:tr>
+        <w:trPr>
+          <w:tblHeader w:val="on"/>
+        </w:trPr>
+        <w:tc>
+          <w:tcPr/>
+          <w:p>
+            <w:pPr>
+              <w:pStyle w:val="Compact"/>
+              <w:jc w:val="left"/>
+            </w:pPr>
+            <w:r>
+              <w:t xml:space="preserve">Model</w:t>
+            </w:r>
+          </w:p>
+        </w:tc>
+        <w:tc>
+          <w:tcPr/>
+          <w:p>
+            <w:pPr>
+              <w:pStyle w:val="Compact"/>
+              <w:jc w:val="center"/>
+            </w:pPr>
+            <w:r>
+              <w:t xml:space="preserve">Best fixed source</w:t>
+            </w:r>
+          </w:p>
+        </w:tc>
+        <w:tc>
+          <w:tcPr/>
+          <w:p>
+            <w:pPr>
+              <w:pStyle w:val="Compact"/>
+              <w:jc w:val="center"/>
+            </w:pPr>
+            <w:r>
+              <w:t xml:space="preserve">Topical top-1</w:t>
+            </w:r>
+          </w:p>
+        </w:tc>
+        <w:tc>
+          <w:tcPr/>
+          <w:p>
+            <w:pPr>
+              <w:pStyle w:val="Compact"/>
+              <w:jc w:val="center"/>
+            </w:pPr>
+            <w:r>
+              <w:t xml:space="preserve">Concatenate (</w:t>
+            </w:r>
+            <m:oMath>
+              <m:sSub>
+                <m:e>
+                  <m:r>
+                    <m:t>W</m:t>
+                  </m:r>
+                </m:e>
+                <m:sub>
+                  <m:r>
+                    <m:t>1</m:t>
+                  </m:r>
+                  <m:r>
+                    <m:rPr>
+                      <m:sty m:val="p"/>
+                    </m:rPr>
+                    <m:t>+</m:t>
+                  </m:r>
+                </m:sub>
+              </m:sSub>
+            </m:oMath>
+            <w:r>
+              <w:t xml:space="preserve">)</w:t>
+            </w:r>
+          </w:p>
+        </w:tc>
+        <w:tc>
+          <w:tcPr/>
+          <w:p>
+            <w:pPr>
+              <w:pStyle w:val="Compact"/>
+              <w:jc w:val="center"/>
+            </w:pPr>
+            <w:r>
+              <w:t xml:space="preserve">Front</w:t>
+            </w:r>
+            <w:r>
+              <w:t xml:space="preserve"> </w:t>
+            </w:r>
+            <m:oMath>
+              <m:r>
+                <m:rPr>
+                  <m:sty m:val="p"/>
+                </m:rPr>
+                <m:t>+</m:t>
+              </m:r>
+            </m:oMath>
+            <w:r>
+              <w:t xml:space="preserve"> </w:t>
+            </w:r>
+            <w:r>
+              <w:t xml:space="preserve">routing</w:t>
+            </w:r>
+          </w:p>
+        </w:tc>
+      </w:tr>
+      <w:tr>
+        <w:tc>
+          <w:tcPr/>
+          <w:p>
+            <w:pPr>
+              <w:pStyle w:val="Compact"/>
+              <w:jc w:val="left"/>
+            </w:pPr>
+            <w:r>
+              <w:t xml:space="preserve">Haiku-4.5</w:t>
+            </w:r>
+          </w:p>
+        </w:tc>
+        <w:tc>
+          <w:tcPr/>
+          <w:p>
+            <w:pPr>
+              <w:pStyle w:val="Compact"/>
+              <w:jc w:val="center"/>
+            </w:pPr>
+            <w:r>
+              <w:t xml:space="preserve">60.5</w:t>
+            </w:r>
+          </w:p>
+        </w:tc>
+        <w:tc>
+          <w:tcPr/>
+          <w:p>
+            <w:pPr>
+              <w:pStyle w:val="Compact"/>
+              <w:jc w:val="center"/>
+            </w:pPr>
+            <w:r>
+              <w:t xml:space="preserve">63.0</w:t>
+            </w:r>
+          </w:p>
+        </w:tc>
+        <w:tc>
+          <w:tcPr/>
+          <w:p>
+            <w:pPr>
+              <w:pStyle w:val="Compact"/>
+              <w:jc w:val="center"/>
+            </w:pPr>
+            <w:r>
+              <w:t xml:space="preserve">53.0</w:t>
+            </w:r>
+          </w:p>
+        </w:tc>
+        <w:tc>
+          <w:tcPr/>
+          <w:p>
+            <w:pPr>
+              <w:pStyle w:val="Compact"/>
+              <w:jc w:val="center"/>
+            </w:pPr>
+            <w:r>
+              <w:rPr>
+                <w:b/>
+                <w:bCs/>
+              </w:rPr>
+              <w:t xml:space="preserve">85.5</w:t>
+            </w:r>
+          </w:p>
+        </w:tc>
+      </w:tr>
+      <w:tr>
+        <w:tc>
+          <w:tcPr/>
+          <w:p>
+            <w:pPr>
+              <w:pStyle w:val="Compact"/>
+              <w:jc w:val="left"/>
+            </w:pPr>
+            <w:r>
+              <w:t xml:space="preserve">Sonnet-4.6</w:t>
+            </w:r>
+          </w:p>
+        </w:tc>
+        <w:tc>
+          <w:tcPr/>
+          <w:p>
+            <w:pPr>
+              <w:pStyle w:val="Compact"/>
+              <w:jc w:val="center"/>
+            </w:pPr>
+            <w:r>
+              <w:t xml:space="preserve">75.0</w:t>
+            </w:r>
+          </w:p>
+        </w:tc>
+        <w:tc>
+          <w:tcPr/>
+          <w:p>
+            <w:pPr>
+              <w:pStyle w:val="Compact"/>
+              <w:jc w:val="center"/>
+            </w:pPr>
+            <w:r>
+              <w:t xml:space="preserve">74.5</w:t>
+            </w:r>
+          </w:p>
+        </w:tc>
+        <w:tc>
+          <w:tcPr/>
+          <w:p>
+            <w:pPr>
+              <w:pStyle w:val="Compact"/>
+              <w:jc w:val="center"/>
+            </w:pPr>
+            <w:r>
+              <w:t xml:space="preserve">36.8</w:t>
+            </w:r>
+          </w:p>
+        </w:tc>
+        <w:tc>
+          <w:tcPr/>
+          <w:p>
+            <w:pPr>
+              <w:pStyle w:val="Compact"/>
+              <w:jc w:val="center"/>
+            </w:pPr>
+            <w:r>
+              <w:rPr>
+                <w:b/>
+                <w:bCs/>
+              </w:rPr>
+              <w:t xml:space="preserve">99.5</w:t>
+            </w:r>
+          </w:p>
+        </w:tc>
+      </w:tr>
+      <w:tr>
+        <w:tc>
+          <w:tcPr/>
+          <w:p>
+            <w:pPr>
+              <w:pStyle w:val="Compact"/>
+              <w:jc w:val="left"/>
+            </w:pPr>
+            <w:r>
+              <w:t xml:space="preserve">Opus-4.8</w:t>
+            </w:r>
+          </w:p>
+        </w:tc>
+        <w:tc>
+          <w:tcPr/>
+          <w:p>
+            <w:pPr>
+              <w:pStyle w:val="Compact"/>
+              <w:jc w:val="center"/>
+            </w:pPr>
+            <w:r>
+              <w:t xml:space="preserve">75.0</w:t>
+            </w:r>
+          </w:p>
+        </w:tc>
+        <w:tc>
+          <w:tcPr/>
+          <w:p>
+            <w:pPr>
+              <w:pStyle w:val="Compact"/>
+              <w:jc w:val="center"/>
+            </w:pPr>
+            <w:r>
+              <w:t xml:space="preserve">74.5</w:t>
+            </w:r>
+          </w:p>
+        </w:tc>
+        <w:tc>
+          <w:tcPr/>
+          <w:p>
+            <w:pPr>
+              <w:pStyle w:val="Compact"/>
+              <w:jc w:val="center"/>
+            </w:pPr>
+            <w:r>
+              <w:t xml:space="preserve">59.5</w:t>
+            </w:r>
+          </w:p>
+        </w:tc>
+        <w:tc>
+          <w:tcPr/>
+          <w:p>
+            <w:pPr>
+              <w:pStyle w:val="Compact"/>
+              <w:jc w:val="center"/>
+            </w:pPr>
+            <w:r>
+              <w:rPr>
+                <w:b/>
+                <w:bCs/>
+              </w:rPr>
+              <w:t xml:space="preserve">99.5</w:t>
+            </w:r>
+          </w:p>
+        </w:tc>
+      </w:tr>
+      <w:tr>
+        <w:tc>
+          <w:tcPr/>
+          <w:p>
+            <w:pPr>
+              <w:pStyle w:val="Compact"/>
+              <w:jc w:val="left"/>
+            </w:pPr>
+            <w:r>
+              <w:t xml:space="preserve">GPT-5.5</w:t>
+            </w:r>
+          </w:p>
+        </w:tc>
+        <w:tc>
+          <w:tcPr/>
+          <w:p>
+            <w:pPr>
+              <w:pStyle w:val="Compact"/>
+              <w:jc w:val="center"/>
+            </w:pPr>
+            <w:r>
+              <w:t xml:space="preserve">75.0</w:t>
+            </w:r>
+          </w:p>
+        </w:tc>
+        <w:tc>
+          <w:tcPr/>
+          <w:p>
+            <w:pPr>
+              <w:pStyle w:val="Compact"/>
+              <w:jc w:val="center"/>
+            </w:pPr>
+            <w:r>
+              <w:t xml:space="preserve">75.0</w:t>
+            </w:r>
+          </w:p>
+        </w:tc>
+        <w:tc>
+          <w:tcPr/>
+          <w:p>
+            <w:pPr>
+              <w:pStyle w:val="Compact"/>
+              <w:jc w:val="center"/>
+            </w:pPr>
+            <w:r>
+              <w:t xml:space="preserve">50.0</w:t>
+            </w:r>
+          </w:p>
+        </w:tc>
+        <w:tc>
+          <w:tcPr/>
+          <w:p>
+            <w:pPr>
+              <w:pStyle w:val="Compact"/>
+              <w:jc w:val="center"/>
+            </w:pPr>
+            <w:r>
+              <w:rPr>
+                <w:b/>
+                <w:bCs/>
+              </w:rPr>
+              <w:t xml:space="preserve">100.0</w:t>
+            </w:r>
+          </w:p>
+        </w:tc>
+      </w:tr>
+      <w:tr>
+        <w:tc>
+          <w:tcPr/>
+          <w:p>
+            <w:pPr>
+              <w:pStyle w:val="Compact"/>
+              <w:jc w:val="left"/>
+            </w:pPr>
+            <w:r>
+              <w:t xml:space="preserve">DeepSeek-V4-Pro</w:t>
+            </w:r>
+          </w:p>
+        </w:tc>
+        <w:tc>
+          <w:tcPr/>
+          <w:p>
+            <w:pPr>
+              <w:pStyle w:val="Compact"/>
+              <w:jc w:val="center"/>
+            </w:pPr>
+            <w:r>
+              <w:t xml:space="preserve">60.3</w:t>
+            </w:r>
+          </w:p>
+        </w:tc>
+        <w:tc>
+          <w:tcPr/>
+          <w:p>
+            <w:pPr>
+              <w:pStyle w:val="Compact"/>
+              <w:jc w:val="center"/>
+            </w:pPr>
+            <w:r>
+              <w:t xml:space="preserve">52.8</w:t>
+            </w:r>
+          </w:p>
+        </w:tc>
+        <w:tc>
+          <w:tcPr/>
+          <w:p>
+            <w:pPr>
+              <w:pStyle w:val="Compact"/>
+              <w:jc w:val="center"/>
+            </w:pPr>
+            <w:r>
+              <w:t xml:space="preserve">42.0</w:t>
+            </w:r>
+          </w:p>
+        </w:tc>
+        <w:tc>
+          <w:tcPr/>
+          <w:p>
+            <w:pPr>
+              <w:pStyle w:val="Compact"/>
+              <w:jc w:val="center"/>
+            </w:pPr>
+            <w:r>
+              <w:rPr>
+                <w:b/>
+                <w:bCs/>
+              </w:rPr>
+              <w:t xml:space="preserve">77.3</w:t>
+            </w:r>
+          </w:p>
+        </w:tc>
+      </w:tr>
+      <w:tr>
+        <w:tc>
+          <w:tcPr/>
+          <w:p>
+            <w:pPr>
+              <w:pStyle w:val="Compact"/>
+              <w:jc w:val="left"/>
+            </w:pPr>
+            <w:r>
+              <w:t xml:space="preserve">Kimi-K2.6</w:t>
+            </w:r>
+          </w:p>
+        </w:tc>
+        <w:tc>
+          <w:tcPr/>
+          <w:p>
+            <w:pPr>
+              <w:pStyle w:val="Compact"/>
+              <w:jc w:val="center"/>
+            </w:pPr>
+            <w:r>
+              <w:t xml:space="preserve">75.0</w:t>
+            </w:r>
+          </w:p>
+        </w:tc>
+        <w:tc>
+          <w:tcPr/>
+          <w:p>
+            <w:pPr>
+              <w:pStyle w:val="Compact"/>
+              <w:jc w:val="center"/>
+            </w:pPr>
+            <w:r>
+              <w:t xml:space="preserve">73.8</w:t>
+            </w:r>
+          </w:p>
+        </w:tc>
+        <w:tc>
+          <w:tcPr/>
+          <w:p>
+            <w:pPr>
+              <w:pStyle w:val="Compact"/>
+              <w:jc w:val="center"/>
+            </w:pPr>
+            <w:r>
+              <w:t xml:space="preserve">48.0</w:t>
+            </w:r>
+          </w:p>
+        </w:tc>
+        <w:tc>
+          <w:tcPr/>
+          <w:p>
+            <w:pPr>
+              <w:pStyle w:val="Compact"/>
+              <w:jc w:val="center"/>
+            </w:pPr>
+            <w:r>
+              <w:rPr>
+                <w:b/>
+                <w:bCs/>
+              </w:rPr>
+              <w:t xml:space="preserve">98.8</w:t>
+            </w:r>
+          </w:p>
+        </w:tc>
+      </w:tr>
+      <w:tr>
+        <w:tc>
+          <w:tcPr/>
+          <w:p>
+            <w:pPr>
+              <w:pStyle w:val="Compact"/>
+              <w:jc w:val="left"/>
+            </w:pPr>
+            <w:r>
+              <w:t xml:space="preserve">Mean</w:t>
+            </w:r>
+          </w:p>
+        </w:tc>
+        <w:tc>
+          <w:tcPr/>
+          <w:p>
+            <w:pPr>
+              <w:pStyle w:val="Compact"/>
+              <w:jc w:val="center"/>
+            </w:pPr>
+            <w:r>
+              <w:t xml:space="preserve">70.1</w:t>
+            </w:r>
+          </w:p>
+        </w:tc>
+        <w:tc>
+          <w:tcPr/>
+          <w:p>
+            <w:pPr>
+              <w:pStyle w:val="Compact"/>
+              <w:jc w:val="center"/>
+            </w:pPr>
+            <w:r>
+              <w:t xml:space="preserve">68.9</w:t>
+            </w:r>
+          </w:p>
+        </w:tc>
+        <w:tc>
+          <w:tcPr/>
+          <w:p>
+            <w:pPr>
+              <w:pStyle w:val="Compact"/>
+              <w:jc w:val="center"/>
+            </w:pPr>
+            <w:r>
+              <w:t xml:space="preserve">48.2</w:t>
+            </w:r>
+          </w:p>
+        </w:tc>
+        <w:tc>
+          <w:tcPr/>
+          <w:p>
+            <w:pPr>
+              <w:pStyle w:val="Compact"/>
+              <w:jc w:val="center"/>
+            </w:pPr>
+            <w:r>
+              <w:rPr>
+                <w:b/>
+                <w:bCs/>
+              </w:rPr>
+              <w:t xml:space="preserve">93.4</w:t>
+            </w:r>
+          </w:p>
+        </w:tc>
+      </w:tr>
+    </w:tbl>
+    <w:bookmarkEnd w:id="104"/>
+    <w:p>
+      <w:pPr>
+        <w:pStyle w:val="BodyText"/>
+      </w:pPr>
+      <w:r>
+        <w:t xml:space="preserve">Three structural facts, not the magnitudes, are the point. First, the two scalar policies fail on</w:t>
+      </w:r>
+      <w:r>
+        <w:t xml:space="preserve"> </w:t>
+      </w:r>
+      <w:r>
+        <w:rPr>
+          <w:i/>
+          <w:iCs/>
+        </w:rPr>
+        <w:t xml:space="preserve">different</w:t>
+      </w:r>
+      <w:r>
+        <w:t xml:space="preserve"> </w:t>
+      </w:r>
+      <w:r>
+        <w:t xml:space="preserve">cells, the fixed source can never carry encoding, topical top-1 forfeits the trap,</w:t>
+      </w:r>
+      <w:r>
+        <w:t xml:space="preserve"> </w:t>
+      </w:r>
+      <w:r>
+        <w:t xml:space="preserve">yet land within about one point of the same aggregate: the cap is the policy</w:t>
+      </w:r>
+      <w:r>
+        <w:t xml:space="preserve"> </w:t>
+      </w:r>
+      <w:r>
+        <w:rPr>
+          <w:i/>
+          <w:iCs/>
+        </w:rPr>
+        <w:t xml:space="preserve">class</w:t>
+      </w:r>
+      <w:r>
+        <w:t xml:space="preserve">, since</w:t>
+      </w:r>
+      <w:r>
+        <w:t xml:space="preserve"> </w:t>
+      </w:r>
+      <w:r>
+        <w:t xml:space="preserve">any total order must abandon at least one cell, not the choice of scorer</w:t>
+      </w:r>
+      <w:r>
+        <w:t xml:space="preserve"> </w:t>
+      </w:r>
+      <w:r>
+        <w:t xml:space="preserve">(Theorem 2, Proposition 2). Second, the policy that</w:t>
+      </w:r>
+      <w:r>
+        <w:t xml:space="preserve"> </w:t>
+      </w:r>
+      <w:r>
+        <w:t xml:space="preserve">refuses to choose is the</w:t>
+      </w:r>
+      <w:r>
+        <w:t xml:space="preserve"> </w:t>
+      </w:r>
+      <w:r>
+        <w:rPr>
+          <w:i/>
+          <w:iCs/>
+        </w:rPr>
+        <w:t xml:space="preserve">worst</w:t>
+      </w:r>
+      <w:r>
+        <w:t xml:space="preserve"> </w:t>
+      </w:r>
+      <w:r>
+        <w:t xml:space="preserve">of the four: anti-monotonicity is the dominant cost, not a</w:t>
+      </w:r>
+      <w:r>
+        <w:t xml:space="preserve"> </w:t>
+      </w:r>
+      <w:r>
+        <w:t xml:space="preserve">tie-breaking subtlety (§7.4.3). Third, the front column shows what selection</w:t>
+      </w:r>
+      <w:r>
+        <w:t xml:space="preserve"> </w:t>
+      </w:r>
+      <w:r>
+        <w:t xml:space="preserve">alone can recover: its shortfall from</w:t>
+      </w:r>
+      <w:r>
+        <w:t xml:space="preserve"> </w:t>
+      </w:r>
+      <m:oMath>
+        <m:r>
+          <m:t>100</m:t>
+        </m:r>
+        <m:r>
+          <m:rPr>
+            <m:sty m:val="p"/>
+          </m:rPr>
+          <m:t>%</m:t>
+        </m:r>
+      </m:oMath>
+      <w:r>
+        <w:t xml:space="preserve"> </w:t>
+      </w:r>
+      <w:r>
+        <w:t xml:space="preserve">(Haiku’s</w:t>
+      </w:r>
+      <w:r>
+        <w:t xml:space="preserve"> </w:t>
+      </w:r>
+      <m:oMath>
+        <m:r>
+          <m:t>52</m:t>
+        </m:r>
+        <m:r>
+          <m:rPr>
+            <m:sty m:val="p"/>
+          </m:rPr>
+          <m:t>%</m:t>
+        </m:r>
+      </m:oMath>
+      <w:r>
+        <w:t xml:space="preserve"> </w:t>
+      </w:r>
+      <w:r>
+        <w:t xml:space="preserve">ceiling on</w:t>
+      </w:r>
+      <w:r>
+        <w:t xml:space="preserve"> </w:t>
+      </w:r>
+      <w:r>
+        <w:rPr>
+          <w:rStyle w:val="VerbatimChar"/>
+        </w:rPr>
+        <w:t xml:space="preserve">api_post_ok</w:t>
+      </w:r>
+      <w:r>
+        <w:t xml:space="preserve">,</w:t>
+      </w:r>
+      <w:r>
+        <w:t xml:space="preserve"> </w:t>
+      </w:r>
+      <w:r>
+        <w:t xml:space="preserve">DeepSeek’s</w:t>
+      </w:r>
+      <w:r>
+        <w:t xml:space="preserve"> </w:t>
+      </w:r>
+      <m:oMath>
+        <m:r>
+          <m:t>68</m:t>
+        </m:r>
+      </m:oMath>
+      <w:r>
+        <w:t xml:space="preserve">–</w:t>
+      </w:r>
+      <m:oMath>
+        <m:r>
+          <m:t>75</m:t>
+        </m:r>
+        <m:r>
+          <m:rPr>
+            <m:sty m:val="p"/>
+          </m:rPr>
+          <m:t>%</m:t>
+        </m:r>
+      </m:oMath>
+      <w:r>
+        <w:t xml:space="preserve"> </w:t>
+      </w:r>
+      <w:r>
+        <w:t xml:space="preserve">band) is the model’s own capability limit. One honest caveat: the four</w:t>
+      </w:r>
+      <w:r>
+        <w:t xml:space="preserve"> </w:t>
+      </w:r>
+      <w:r>
+        <w:t xml:space="preserve">cells were constructed to exhibit the phenomenon, so the aggregate magnitudes are diagnostic of the</w:t>
+      </w:r>
+      <w:r>
+        <w:t xml:space="preserve"> </w:t>
+      </w:r>
+      <w:r>
+        <w:t xml:space="preserve">failure structure, not an estimate of production-traffic gains; what transfers is the structure,</w:t>
+      </w:r>
+      <w:r>
+        <w:t xml:space="preserve"> </w:t>
+      </w:r>
+      <w:r>
+        <w:t xml:space="preserve">each cheap policy forfeits an entire cell class, and no total-order policy can keep all four.</w:t>
+      </w:r>
+    </w:p>
+    <w:bookmarkEnd w:id="105"/>
+    <w:bookmarkEnd w:id="106"/>
+    <w:bookmarkStart w:id="122" w:name="sec:discussion"/>
+    <w:p>
+      <w:pPr>
+        <w:pStyle w:val="Heading1"/>
+      </w:pPr>
+      <w:r>
+        <w:t xml:space="preserve">Discussion</w:t>
       </w:r>
     </w:p>
     <w:p>
       <w:pPr>
         <w:pStyle w:val="FirstParagraph"/>
       </w:pPr>
-      <w:bookmarkStart w:id="102" w:name="sec:disc-deficiency"/>
-      <w:bookmarkEnd w:id="102"/>
-      <w:bookmarkStart w:id="103" w:name="sec:disc-certificate"/>
-      <w:bookmarkEnd w:id="103"/>
+      <w:r>
+        <w:t xml:space="preserve">With the evidence in hand, we step back to what it licenses. Our results recast a piece of</w:t>
+      </w:r>
+      <w:r>
+        <w:t xml:space="preserve"> </w:t>
+      </w:r>
+      <w:r>
+        <w:t xml:space="preserve">practitioner folklore,</w:t>
+      </w:r>
+      <w:r>
+        <w:t xml:space="preserve"> </w:t>
+      </w:r>
+      <w:r>
+        <w:t xml:space="preserve">“relevance does not transfer across</w:t>
+      </w:r>
+      <w:r>
+        <w:t xml:space="preserve"> </w:t>
+      </w:r>
+      <w:r>
+        <w:t xml:space="preserve">tasks”</w:t>
+      </w:r>
+      <w:r>
+        <w:t xml:space="preserve">, as a structural fact about context sources. When two sources are Blackwell-incomparable, the</w:t>
+      </w:r>
+      <w:r>
+        <w:t xml:space="preserve"> </w:t>
+      </w:r>
+      <w:r>
+        <w:t xml:space="preserve">order over them is partial, and any scalar score, by imposing a total order, must mis-rank</w:t>
+      </w:r>
+      <w:r>
+        <w:t xml:space="preserve"> </w:t>
+      </w:r>
+      <w:r>
+        <w:t xml:space="preserve">them on some task. The empirical program does not merely illustrate this; it instantiates a single</w:t>
+      </w:r>
+      <w:r>
+        <w:t xml:space="preserve"> </w:t>
+      </w:r>
+      <w:r>
+        <w:t xml:space="preserve">hand-built incomparable pair (a private API-call contract</w:t>
+      </w:r>
+      <w:r>
+        <w:t xml:space="preserve"> </w:t>
+      </w:r>
+      <m:oMath>
+        <m:sSub>
+          <m:e>
+            <m:r>
+              <m:t>W</m:t>
+            </m:r>
+          </m:e>
+          <m:sub>
+            <m:r>
+              <m:t>1</m:t>
+            </m:r>
+          </m:sub>
+        </m:sSub>
+      </m:oMath>
+      <w:r>
+        <w:t xml:space="preserve"> </w:t>
+      </w:r>
+      <w:r>
+        <w:t xml:space="preserve">versus a private wire-encoding</w:t>
+      </w:r>
+      <w:r>
+        <w:t xml:space="preserve"> </w:t>
+      </w:r>
+      <w:r>
+        <w:t xml:space="preserve">invariant</w:t>
+      </w:r>
+      <w:r>
+        <w:t xml:space="preserve"> </w:t>
+      </w:r>
+      <m:oMath>
+        <m:sSub>
+          <m:e>
+            <m:r>
+              <m:t>W</m:t>
+            </m:r>
+          </m:e>
+          <m:sub>
+            <m:r>
+              <m:t>2</m:t>
+            </m:r>
+          </m:sub>
+        </m:sSub>
+      </m:oMath>
+      <w:r>
+        <w:t xml:space="preserve"> </w:t>
+      </w:r>
+      <w:r>
+        <w:t xml:space="preserve">on the same</w:t>
+      </w:r>
+      <w:r>
+        <w:t xml:space="preserve"> </w:t>
+      </w:r>
+      <w:r>
+        <w:rPr>
+          <w:rStyle w:val="VerbatimChar"/>
+        </w:rPr>
+        <w:t xml:space="preserve">ledger</w:t>
+      </w:r>
+      <w:r>
+        <w:t xml:space="preserve"> </w:t>
+      </w:r>
+      <w:r>
+        <w:t xml:space="preserve">module) and shows that the resulting double crossover, the</w:t>
+      </w:r>
+      <w:r>
+        <w:t xml:space="preserve"> </w:t>
+      </w:r>
+      <w:r>
+        <w:t xml:space="preserve">relevance mis-rank, and an anti-monotonicity collapse all reproduce across six models and four</w:t>
+      </w:r>
+      <w:r>
+        <w:t xml:space="preserve"> </w:t>
+      </w:r>
+      <w:r>
+        <w:t xml:space="preserve">vendors. We discuss what the evidence does and does not license, and where the</w:t>
+      </w:r>
+      <w:r>
+        <w:t xml:space="preserve"> </w:t>
+      </w:r>
+      <w:r>
+        <w:t xml:space="preserve">formalization is a model rather than a proof of the realized object.</w:t>
+      </w:r>
+    </w:p>
+    <w:bookmarkStart w:id="109" w:name="sec:disc-bridge"/>
+    <w:p>
+      <w:pPr>
+        <w:pStyle w:val="Heading2"/>
+      </w:pPr>
+      <w:r>
+        <w:t xml:space="preserve">Scope of the claims</w:t>
+      </w:r>
+    </w:p>
+    <w:p>
+      <w:pPr>
+        <w:pStyle w:val="FirstParagraph"/>
+      </w:pPr>
+      <w:bookmarkStart w:id="107" w:name="sec:disc-deficiency"/>
+      <w:bookmarkEnd w:id="107"/>
+      <w:bookmarkStart w:id="108" w:name="sec:disc-certificate"/>
+      <w:bookmarkEnd w:id="108"/>
     </w:p>
     <w:p>
       <w:pPr>
@@ -40992,8 +43029,8 @@
         <w:t xml:space="preserve">a fixed adversarial battery, not a task distribution.</w:t>
       </w:r>
     </w:p>
-    <w:bookmarkEnd w:id="104"/>
-    <w:bookmarkStart w:id="106" w:name="sec:disc-antimono"/>
+    <w:bookmarkEnd w:id="109"/>
+    <w:bookmarkStart w:id="111" w:name="sec:disc-antimono"/>
     <w:p>
       <w:pPr>
         <w:pStyle w:val="Heading2"/>
@@ -41385,7 +43422,7 @@
         <w:t xml:space="preserve"> </w:t>
       </w:r>
       <w:r>
-        <w:t xml:space="preserve">(Table 5), with collapses as stark as</w:t>
+        <w:t xml:space="preserve">(Table 6), with collapses as stark as</w:t>
       </w:r>
       <w:r>
         <w:t xml:space="preserve"> </w:t>
@@ -41926,7 +43963,7 @@
         <w:t xml:space="preserve">).</w:t>
       </w:r>
     </w:p>
-    <w:bookmarkStart w:id="105" w:name="will-scale-restore-blackwell-coherence"/>
+    <w:bookmarkStart w:id="110" w:name="will-scale-restore-blackwell-coherence"/>
     <w:p>
       <w:pPr>
         <w:pStyle w:val="Heading4"/>
@@ -42201,9 +44238,9 @@
         <w:t xml:space="preserve">itself.</w:t>
       </w:r>
     </w:p>
-    <w:bookmarkEnd w:id="105"/>
-    <w:bookmarkEnd w:id="106"/>
-    <w:bookmarkStart w:id="107" w:name="sec:disc-moat"/>
+    <w:bookmarkEnd w:id="110"/>
+    <w:bookmarkEnd w:id="111"/>
+    <w:bookmarkStart w:id="112" w:name="sec:disc-moat"/>
     <w:p>
       <w:pPr>
         <w:pStyle w:val="Heading2"/>
@@ -42542,8 +44579,8 @@
         <w:t xml:space="preserve">caps which cells verify per model.</w:t>
       </w:r>
     </w:p>
-    <w:bookmarkEnd w:id="107"/>
-    <w:bookmarkStart w:id="109" w:name="sec:disc-mechanism"/>
+    <w:bookmarkEnd w:id="112"/>
+    <w:bookmarkStart w:id="114" w:name="sec:disc-mechanism"/>
     <w:p>
       <w:pPr>
         <w:pStyle w:val="Heading2"/>
@@ -42997,7 +45034,7 @@
         <w:t xml:space="preserve">mechanistic companion study, downstream of, not prerequisite to, the verified behavioral claim.</w:t>
       </w:r>
     </w:p>
-    <w:bookmarkStart w:id="108" w:name="X37a5acb05d688eb32bbe54c216dbcf303d3b4c3"/>
+    <w:bookmarkStart w:id="113" w:name="X37a5acb05d688eb32bbe54c216dbcf303d3b4c3"/>
     <w:p>
       <w:pPr>
         <w:pStyle w:val="Heading4"/>
@@ -43260,9 +45297,9 @@
         <w:t xml:space="preserve">claim in the paper is independent of which reading is true.</w:t>
       </w:r>
     </w:p>
-    <w:bookmarkEnd w:id="108"/>
-    <w:bookmarkEnd w:id="109"/>
-    <w:bookmarkStart w:id="116" w:name="sec:limitations"/>
+    <w:bookmarkEnd w:id="113"/>
+    <w:bookmarkEnd w:id="114"/>
+    <w:bookmarkStart w:id="121" w:name="sec:limitations"/>
     <w:p>
       <w:pPr>
         <w:pStyle w:val="Heading2"/>
@@ -43279,7 +45316,7 @@
         <w:t xml:space="preserve">We collect the scope restrictions here; each is stated once and sized to its weight.</w:t>
       </w:r>
     </w:p>
-    <w:bookmarkStart w:id="110" w:name="from-diagnosis-to-selection."/>
+    <w:bookmarkStart w:id="115" w:name="from-diagnosis-to-selection."/>
     <w:p>
       <w:pPr>
         <w:pStyle w:val="Heading4"/>
@@ -43423,8 +45460,8 @@
         <w:t xml:space="preserve">shortlist, is the central open problem this work opens.</w:t>
       </w:r>
     </w:p>
-    <w:bookmarkEnd w:id="110"/>
-    <w:bookmarkStart w:id="111" w:name="source-pair-generality."/>
+    <w:bookmarkEnd w:id="115"/>
+    <w:bookmarkStart w:id="116" w:name="source-pair-generality."/>
     <w:p>
       <w:pPr>
         <w:pStyle w:val="Heading4"/>
@@ -43597,8 +45634,8 @@
         <w:t xml:space="preserve">steps.</w:t>
       </w:r>
     </w:p>
-    <w:bookmarkEnd w:id="111"/>
-    <w:bookmarkStart w:id="112" w:name="Xd344a6caba248cd0f3c9915a6f9f7c4f85f22da"/>
+    <w:bookmarkEnd w:id="116"/>
+    <w:bookmarkStart w:id="117" w:name="Xd344a6caba248cd0f3c9915a6f9f7c4f85f22da"/>
     <w:p>
       <w:pPr>
         <w:pStyle w:val="Heading4"/>
@@ -43707,8 +45744,8 @@
         <w:t xml:space="preserve">comparison.</w:t>
       </w:r>
     </w:p>
-    <w:bookmarkEnd w:id="112"/>
-    <w:bookmarkStart w:id="113" w:name="the-model-is-an-idealization-twice."/>
+    <w:bookmarkEnd w:id="117"/>
+    <w:bookmarkStart w:id="118" w:name="the-model-is-an-idealization-twice."/>
     <w:p>
       <w:pPr>
         <w:pStyle w:val="Heading4"/>
@@ -43816,8 +45853,8 @@
         <w:t xml:space="preserve">document pairs is the direct next experiment.</w:t>
       </w:r>
     </w:p>
-    <w:bookmarkEnd w:id="113"/>
-    <w:bookmarkStart w:id="114" w:name="sampling-and-verification-regime."/>
+    <w:bookmarkEnd w:id="118"/>
+    <w:bookmarkStart w:id="119" w:name="sampling-and-verification-regime."/>
     <w:p>
       <w:pPr>
         <w:pStyle w:val="Heading4"/>
@@ -43887,8 +45924,8 @@
         <w:t xml:space="preserve">marginal-versus-joint control is discussed in §8.1.</w:t>
       </w:r>
     </w:p>
-    <w:bookmarkEnd w:id="114"/>
-    <w:bookmarkStart w:id="115" w:name="ranker-spectrum-and-synergy."/>
+    <w:bookmarkEnd w:id="119"/>
+    <w:bookmarkStart w:id="120" w:name="ranker-spectrum-and-synergy."/>
     <w:p>
       <w:pPr>
         <w:pStyle w:val="Heading4"/>
@@ -43986,10 +46023,10 @@
         <w:t xml:space="preserve">beyond its parts; we make no claim about it.</w:t>
       </w:r>
     </w:p>
-    <w:bookmarkEnd w:id="115"/>
-    <w:bookmarkEnd w:id="116"/>
-    <w:bookmarkEnd w:id="117"/>
-    <w:bookmarkStart w:id="118" w:name="sec:conclusion"/>
+    <w:bookmarkEnd w:id="120"/>
+    <w:bookmarkEnd w:id="121"/>
+    <w:bookmarkEnd w:id="122"/>
+    <w:bookmarkStart w:id="123" w:name="sec:conclusion"/>
     <w:p>
       <w:pPr>
         <w:pStyle w:val="Heading1"/>
@@ -44404,8 +46441,8 @@
         <w:t xml:space="preserve">domain, are the natural next steps, and the experimental record indicates each is cheap to run.</w:t>
       </w:r>
     </w:p>
-    <w:bookmarkEnd w:id="118"/>
-    <w:bookmarkStart w:id="130" w:name="app:proofs"/>
+    <w:bookmarkEnd w:id="123"/>
+    <w:bookmarkStart w:id="135" w:name="app:proofs"/>
     <w:p>
       <w:pPr>
         <w:pStyle w:val="Heading1"/>
@@ -44414,7 +46451,7 @@
         <w:t xml:space="preserve">Deferred proofs and technical material</w:t>
       </w:r>
     </w:p>
-    <w:bookmarkStart w:id="119" w:name="proof-of-lemma-1"/>
+    <w:bookmarkStart w:id="124" w:name="proof-of-lemma-1"/>
     <w:p>
       <w:pPr>
         <w:pStyle w:val="Heading2"/>
@@ -45052,8 +47089,8 @@
         <w:t xml:space="preserve">applied in both directions. ◻</w:t>
       </w:r>
     </w:p>
-    <w:bookmarkEnd w:id="119"/>
-    <w:bookmarkStart w:id="120" w:name="proof-of-lemma-2"/>
+    <w:bookmarkEnd w:id="124"/>
+    <w:bookmarkStart w:id="125" w:name="proof-of-lemma-2"/>
     <w:p>
       <w:pPr>
         <w:pStyle w:val="Heading2"/>
@@ -46156,8 +48193,8 @@
         <w:t xml:space="preserve">value obeys. ◻</w:t>
       </w:r>
     </w:p>
-    <w:bookmarkEnd w:id="120"/>
-    <w:bookmarkStart w:id="121" w:name="proof-of-proposition-1"/>
+    <w:bookmarkEnd w:id="125"/>
+    <w:bookmarkStart w:id="126" w:name="proof-of-proposition-1"/>
     <w:p>
       <w:pPr>
         <w:pStyle w:val="Heading2"/>
@@ -46509,8 +48546,8 @@
         <w:t xml:space="preserve">for all tasks. ◻</w:t>
       </w:r>
     </w:p>
-    <w:bookmarkEnd w:id="121"/>
-    <w:bookmarkStart w:id="122" w:name="proof-of-proposition-3"/>
+    <w:bookmarkEnd w:id="126"/>
+    <w:bookmarkStart w:id="127" w:name="proof-of-proposition-3"/>
     <w:p>
       <w:pPr>
         <w:pStyle w:val="Heading2"/>
@@ -47711,8 +49748,8 @@
         <w:t xml:space="preserve">without a further Bonferroni factor. ◻</w:t>
       </w:r>
     </w:p>
-    <w:bookmarkEnd w:id="122"/>
-    <w:bookmarkStart w:id="123" w:name="proof-of-proposition-4"/>
+    <w:bookmarkEnd w:id="127"/>
+    <w:bookmarkStart w:id="128" w:name="proof-of-proposition-4"/>
     <w:p>
       <w:pPr>
         <w:pStyle w:val="Heading2"/>
@@ -48129,8 +50166,8 @@
         <w:t xml:space="preserve">simultaneous coverage. ◻</w:t>
       </w:r>
     </w:p>
-    <w:bookmarkEnd w:id="123"/>
-    <w:bookmarkStart w:id="124" w:name="proof-of-theorem-3"/>
+    <w:bookmarkEnd w:id="128"/>
+    <w:bookmarkStart w:id="129" w:name="proof-of-theorem-3"/>
     <w:p>
       <w:pPr>
         <w:pStyle w:val="Heading2"/>
@@ -48590,8 +50627,8 @@
         <w:t xml:space="preserve">the realized reversal. ◻</w:t>
       </w:r>
     </w:p>
-    <w:bookmarkEnd w:id="124"/>
-    <w:bookmarkStart w:id="126" w:name="why-a-naive-dkw-bound-fails"/>
+    <w:bookmarkEnd w:id="129"/>
+    <w:bookmarkStart w:id="131" w:name="why-a-naive-dkw-bound-fails"/>
     <w:p>
       <w:pPr>
         <w:pStyle w:val="Heading2"/>
@@ -48600,7 +50637,7 @@
         <w:t xml:space="preserve">Why a naive DKW bound fails</w:t>
       </w:r>
     </w:p>
-    <w:bookmarkStart w:id="125" w:name="rem:dkw"/>
+    <w:bookmarkStart w:id="130" w:name="rem:dkw"/>
     <w:p>
       <w:pPr>
         <w:pStyle w:val="FirstParagraph"/>
@@ -48862,9 +50899,9 @@
         <w:t xml:space="preserve">absorbed into a single-sample DKW envelope.</w:t>
       </w:r>
     </w:p>
-    <w:bookmarkEnd w:id="125"/>
-    <w:bookmarkEnd w:id="126"/>
-    <w:bookmarkStart w:id="128" w:name="relation-to-llm-evaluation-statistics"/>
+    <w:bookmarkEnd w:id="130"/>
+    <w:bookmarkEnd w:id="131"/>
+    <w:bookmarkStart w:id="133" w:name="relation-to-llm-evaluation-statistics"/>
     <w:p>
       <w:pPr>
         <w:pStyle w:val="Heading2"/>
@@ -48873,7 +50910,7 @@
         <w:t xml:space="preserve">Relation to LLM-evaluation statistics</w:t>
       </w:r>
     </w:p>
-    <w:bookmarkStart w:id="127" w:name="rem:evalstats"/>
+    <w:bookmarkStart w:id="132" w:name="rem:evalstats"/>
     <w:p>
       <w:pPr>
         <w:pStyle w:val="FirstParagraph"/>
@@ -49043,9 +51080,9 @@
         <w:t xml:space="preserve">precisely what the exact Clopper–Pearson construction provides.</w:t>
       </w:r>
     </w:p>
-    <w:bookmarkEnd w:id="127"/>
-    <w:bookmarkEnd w:id="128"/>
-    <w:bookmarkStart w:id="129" w:name="subsec:power"/>
+    <w:bookmarkEnd w:id="132"/>
+    <w:bookmarkEnd w:id="133"/>
+    <w:bookmarkStart w:id="134" w:name="subsec:power"/>
     <w:p>
       <w:pPr>
         <w:pStyle w:val="Heading2"/>
@@ -49369,9 +51406,9 @@
         <w:t xml:space="preserve">that verifies incomparability need not verify interference.</w:t>
       </w:r>
     </w:p>
-    <w:bookmarkEnd w:id="129"/>
-    <w:bookmarkEnd w:id="130"/>
-    <w:bookmarkStart w:id="137" w:name="app:record"/>
+    <w:bookmarkEnd w:id="134"/>
+    <w:bookmarkEnd w:id="135"/>
+    <w:bookmarkStart w:id="142" w:name="app:record"/>
     <w:p>
       <w:pPr>
         <w:pStyle w:val="Heading1"/>
@@ -49380,7 +51417,7 @@
         <w:t xml:space="preserve">Extended experimental record</w:t>
       </w:r>
     </w:p>
-    <w:bookmarkStart w:id="131" w:name="tab:percell"/>
+    <w:bookmarkStart w:id="136" w:name="tab:percell"/>
     <w:p>
       <w:pPr>
         <w:pStyle w:val="TableCaption"/>
@@ -51572,8 +53609,8 @@
         </w:tc>
       </w:tr>
     </w:tbl>
-    <w:bookmarkEnd w:id="131"/>
-    <w:bookmarkStart w:id="136" w:name="generality-and-controls-full-protocols"/>
+    <w:bookmarkEnd w:id="136"/>
+    <w:bookmarkStart w:id="141" w:name="generality-and-controls-full-protocols"/>
     <w:p>
       <w:pPr>
         <w:pStyle w:val="Heading2"/>
@@ -51596,7 +53633,7 @@
         <w:t xml:space="preserve">confound, and whether the anti-monotonicity collapse is curable by cheap prompting.</w:t>
       </w:r>
     </w:p>
-    <w:bookmarkStart w:id="132" w:name="Xfd2ce319a26faa67e0eadf0fee657d728019446"/>
+    <w:bookmarkStart w:id="137" w:name="Xfd2ce319a26faa67e0eadf0fee657d728019446"/>
     <w:p>
       <w:pPr>
         <w:pStyle w:val="Heading4"/>
@@ -52528,8 +54565,8 @@
         <w:t xml:space="preserve">, not a second mis-rank.</w:t>
       </w:r>
     </w:p>
-    <w:bookmarkEnd w:id="132"/>
-    <w:bookmarkStart w:id="133" w:name="a-length-matched-padding-control."/>
+    <w:bookmarkEnd w:id="137"/>
+    <w:bookmarkStart w:id="138" w:name="a-length-matched-padding-control."/>
     <w:p>
       <w:pPr>
         <w:pStyle w:val="Heading4"/>
@@ -53275,8 +55312,8 @@
         <w:t xml:space="preserve">untested middle case.</w:t>
       </w:r>
     </w:p>
-    <w:bookmarkEnd w:id="133"/>
-    <w:bookmarkStart w:id="134" w:name="Xd508a319e40f775fe4906e106ed6a92e07fd05b"/>
+    <w:bookmarkEnd w:id="138"/>
+    <w:bookmarkStart w:id="139" w:name="Xd508a319e40f775fe4906e106ed6a92e07fd05b"/>
     <w:p>
       <w:pPr>
         <w:pStyle w:val="Heading4"/>
@@ -53917,8 +55954,8 @@
         <w:t xml:space="preserve">the superset, survives the ablation intact.</w:t>
       </w:r>
     </w:p>
-    <w:bookmarkEnd w:id="134"/>
-    <w:bookmarkStart w:id="135" w:name="X9488de75bf9879d7a0599574b61e9ffd4996347"/>
+    <w:bookmarkEnd w:id="139"/>
+    <w:bookmarkStart w:id="140" w:name="X9488de75bf9879d7a0599574b61e9ffd4996347"/>
     <w:p>
       <w:pPr>
         <w:pStyle w:val="Heading4"/>
@@ -54591,10 +56628,10 @@
         <w:t xml:space="preserve">dropping the dominated signal, locates the failure in convention-to-task routing.</w:t>
       </w:r>
     </w:p>
-    <w:bookmarkEnd w:id="135"/>
-    <w:bookmarkEnd w:id="136"/>
-    <w:bookmarkEnd w:id="137"/>
-    <w:bookmarkStart w:id="229" w:name="app:repro"/>
+    <w:bookmarkEnd w:id="140"/>
+    <w:bookmarkEnd w:id="141"/>
+    <w:bookmarkEnd w:id="142"/>
+    <w:bookmarkStart w:id="234" w:name="app:repro"/>
     <w:p>
       <w:pPr>
         <w:pStyle w:val="Heading1"/>
@@ -54625,7 +56662,7 @@
       <w:r>
         <w:t xml:space="preserve"> </w:t>
       </w:r>
-      <w:hyperlink r:id="rId73">
+      <w:hyperlink r:id="rId75">
         <w:r>
           <w:rPr>
             <w:rStyle w:val="Hyperlink"/>
@@ -54794,7 +56831,7 @@
         <w:t xml:space="preserve">endpoint, and all API keys are read from the environment (never written to a file).</w:t>
       </w:r>
     </w:p>
-    <w:bookmarkStart w:id="138" w:name="protocol."/>
+    <w:bookmarkStart w:id="143" w:name="protocol."/>
     <w:p>
       <w:pPr>
         <w:pStyle w:val="Heading4"/>
@@ -55170,8 +57207,8 @@
         <w:t xml:space="preserve">.</w:t>
       </w:r>
     </w:p>
-    <w:bookmarkEnd w:id="138"/>
-    <w:bookmarkStart w:id="139" w:name="decoding-seeding-and-retries."/>
+    <w:bookmarkEnd w:id="143"/>
+    <w:bookmarkStart w:id="144" w:name="decoding-seeding-and-retries."/>
     <w:p>
       <w:pPr>
         <w:pStyle w:val="Heading4"/>
@@ -55280,8 +57317,8 @@
         <w:t xml:space="preserve">arm; noted in the artifact list), so no reported cell mixes outage-scored draws with real ones.</w:t>
       </w:r>
     </w:p>
-    <w:bookmarkEnd w:id="139"/>
-    <w:bookmarkStart w:id="140" w:name="artifacts."/>
+    <w:bookmarkEnd w:id="144"/>
+    <w:bookmarkStart w:id="145" w:name="artifacts."/>
     <w:p>
       <w:pPr>
         <w:pStyle w:val="Heading4"/>
@@ -55303,7 +57340,7 @@
       <w:r>
         <w:t xml:space="preserve">(</w:t>
       </w:r>
-      <w:hyperlink r:id="rId73">
+      <w:hyperlink r:id="rId75">
         <w:r>
           <w:rPr>
             <w:rStyle w:val="Hyperlink"/>
@@ -55616,8 +57653,8 @@
         <w:t xml:space="preserve">.</w:t>
       </w:r>
     </w:p>
-    <w:bookmarkEnd w:id="140"/>
-    <w:bookmarkStart w:id="141" w:name="compute-and-cost."/>
+    <w:bookmarkEnd w:id="145"/>
+    <w:bookmarkStart w:id="146" w:name="compute-and-cost."/>
     <w:p>
       <w:pPr>
         <w:pStyle w:val="Heading4"/>
@@ -55664,8 +57701,8 @@
         <w:t xml:space="preserve">on open weights at zero API cost.</w:t>
       </w:r>
     </w:p>
-    <w:bookmarkEnd w:id="141"/>
-    <w:bookmarkStart w:id="228" w:name="reference-verification."/>
+    <w:bookmarkEnd w:id="146"/>
+    <w:bookmarkStart w:id="233" w:name="reference-verification."/>
     <w:p>
       <w:pPr>
         <w:pStyle w:val="Heading4"/>
@@ -55700,8 +57737,8 @@
         <w:t xml:space="preserve">1964/1986; Torgersen 1991; Ethayarajh et al. 2022) were checked against the primary sources.</w:t>
       </w:r>
     </w:p>
-    <w:bookmarkStart w:id="227" w:name="refs"/>
-    <w:bookmarkStart w:id="143" w:name="ref-akdemir2025"/>
+    <w:bookmarkStart w:id="232" w:name="refs"/>
+    <w:bookmarkStart w:id="148" w:name="ref-akdemir2025"/>
     <w:p>
       <w:pPr>
         <w:pStyle w:val="Bibliography"/>
@@ -55740,7 +57777,7 @@
       <w:r>
         <w:t xml:space="preserve"> </w:t>
       </w:r>
-      <w:hyperlink r:id="rId142">
+      <w:hyperlink r:id="rId147">
         <w:r>
           <w:rPr>
             <w:rStyle w:val="Hyperlink"/>
@@ -55752,8 +57789,8 @@
         <w:t xml:space="preserve">.</w:t>
       </w:r>
     </w:p>
-    <w:bookmarkEnd w:id="143"/>
-    <w:bookmarkStart w:id="145" w:name="ref-blackwell1953"/>
+    <w:bookmarkEnd w:id="148"/>
+    <w:bookmarkStart w:id="150" w:name="ref-blackwell1953"/>
     <w:p>
       <w:pPr>
         <w:pStyle w:val="Bibliography"/>
@@ -55786,7 +57823,7 @@
       <w:r>
         <w:t xml:space="preserve"> </w:t>
       </w:r>
-      <w:hyperlink r:id="rId144">
+      <w:hyperlink r:id="rId149">
         <w:r>
           <w:rPr>
             <w:rStyle w:val="Hyperlink"/>
@@ -55798,8 +57835,8 @@
         <w:t xml:space="preserve">.</w:t>
       </w:r>
     </w:p>
-    <w:bookmarkEnd w:id="145"/>
-    <w:bookmarkStart w:id="146" w:name="ref-bonferroni1936"/>
+    <w:bookmarkEnd w:id="150"/>
+    <w:bookmarkStart w:id="151" w:name="ref-bonferroni1936"/>
     <w:p>
       <w:pPr>
         <w:pStyle w:val="Bibliography"/>
@@ -55830,8 +57867,8 @@
         <w:t xml:space="preserve">8: 3–62.</w:t>
       </w:r>
     </w:p>
-    <w:bookmarkEnd w:id="146"/>
-    <w:bookmarkStart w:id="148" w:name="ref-bowyer2025clt"/>
+    <w:bookmarkEnd w:id="151"/>
+    <w:bookmarkStart w:id="153" w:name="ref-bowyer2025clt"/>
     <w:p>
       <w:pPr>
         <w:pStyle w:val="Bibliography"/>
@@ -55885,7 +57922,7 @@
       <w:r>
         <w:t xml:space="preserve"> </w:t>
       </w:r>
-      <w:hyperlink r:id="rId147">
+      <w:hyperlink r:id="rId152">
         <w:r>
           <w:rPr>
             <w:rStyle w:val="Hyperlink"/>
@@ -55897,8 +57934,8 @@
         <w:t xml:space="preserve">.</w:t>
       </w:r>
     </w:p>
-    <w:bookmarkEnd w:id="148"/>
-    <w:bookmarkStart w:id="150" w:name="ref-bradley2024garbling"/>
+    <w:bookmarkEnd w:id="153"/>
+    <w:bookmarkStart w:id="155" w:name="ref-bradley2024garbling"/>
     <w:p>
       <w:pPr>
         <w:pStyle w:val="Bibliography"/>
@@ -55940,7 +57977,7 @@
       <w:r>
         <w:t xml:space="preserve"> </w:t>
       </w:r>
-      <w:hyperlink r:id="rId149">
+      <w:hyperlink r:id="rId154">
         <w:r>
           <w:rPr>
             <w:rStyle w:val="Hyperlink"/>
@@ -55952,8 +57989,8 @@
         <w:t xml:space="preserve">.</w:t>
       </w:r>
     </w:p>
-    <w:bookmarkEnd w:id="150"/>
-    <w:bookmarkStart w:id="152" w:name="ref-carbonell1998"/>
+    <w:bookmarkEnd w:id="155"/>
+    <w:bookmarkStart w:id="157" w:name="ref-carbonell1998"/>
     <w:p>
       <w:pPr>
         <w:pStyle w:val="Bibliography"/>
@@ -55992,7 +58029,7 @@
       <w:r>
         <w:t xml:space="preserve"> </w:t>
       </w:r>
-      <w:hyperlink r:id="rId151">
+      <w:hyperlink r:id="rId156">
         <w:r>
           <w:rPr>
             <w:rStyle w:val="Hyperlink"/>
@@ -56004,8 +58041,8 @@
         <w:t xml:space="preserve">.</w:t>
       </w:r>
     </w:p>
-    <w:bookmarkEnd w:id="152"/>
-    <w:bookmarkStart w:id="154" w:name="ref-conformalip2025"/>
+    <w:bookmarkEnd w:id="157"/>
+    <w:bookmarkStart w:id="159" w:name="ref-conformalip2025"/>
     <w:p>
       <w:pPr>
         <w:pStyle w:val="Bibliography"/>
@@ -56035,7 +58072,7 @@
       <w:r>
         <w:t xml:space="preserve"> </w:t>
       </w:r>
-      <w:hyperlink r:id="rId153">
+      <w:hyperlink r:id="rId158">
         <w:r>
           <w:rPr>
             <w:rStyle w:val="Hyperlink"/>
@@ -56047,8 +58084,8 @@
         <w:t xml:space="preserve">.</w:t>
       </w:r>
     </w:p>
-    <w:bookmarkEnd w:id="154"/>
-    <w:bookmarkStart w:id="156" w:name="ref-bedllm2026"/>
+    <w:bookmarkEnd w:id="159"/>
+    <w:bookmarkStart w:id="161" w:name="ref-bedllm2026"/>
     <w:p>
       <w:pPr>
         <w:pStyle w:val="Bibliography"/>
@@ -56096,7 +58133,7 @@
       <w:r>
         <w:t xml:space="preserve"> </w:t>
       </w:r>
-      <w:hyperlink r:id="rId155">
+      <w:hyperlink r:id="rId160">
         <w:r>
           <w:rPr>
             <w:rStyle w:val="Hyperlink"/>
@@ -56108,8 +58145,8 @@
         <w:t xml:space="preserve">.</w:t>
       </w:r>
     </w:p>
-    <w:bookmarkEnd w:id="156"/>
-    <w:bookmarkStart w:id="158" w:name="ref-clopperpearson1934"/>
+    <w:bookmarkEnd w:id="161"/>
+    <w:bookmarkStart w:id="163" w:name="ref-clopperpearson1934"/>
     <w:p>
       <w:pPr>
         <w:pStyle w:val="Bibliography"/>
@@ -56142,7 +58179,7 @@
       <w:r>
         <w:t xml:space="preserve"> </w:t>
       </w:r>
-      <w:hyperlink r:id="rId157">
+      <w:hyperlink r:id="rId162">
         <w:r>
           <w:rPr>
             <w:rStyle w:val="Hyperlink"/>
@@ -56154,8 +58191,8 @@
         <w:t xml:space="preserve">.</w:t>
       </w:r>
     </w:p>
-    <w:bookmarkEnd w:id="158"/>
-    <w:bookmarkStart w:id="160" w:name="ref-cuconasu2024noise"/>
+    <w:bookmarkEnd w:id="163"/>
+    <w:bookmarkStart w:id="165" w:name="ref-cuconasu2024noise"/>
     <w:p>
       <w:pPr>
         <w:pStyle w:val="Bibliography"/>
@@ -56197,7 +58234,7 @@
       <w:r>
         <w:t xml:space="preserve"> </w:t>
       </w:r>
-      <w:hyperlink r:id="rId159">
+      <w:hyperlink r:id="rId164">
         <w:r>
           <w:rPr>
             <w:rStyle w:val="Hyperlink"/>
@@ -56209,8 +58246,8 @@
         <w:t xml:space="preserve">.</w:t>
       </w:r>
     </w:p>
-    <w:bookmarkEnd w:id="160"/>
-    <w:bookmarkStart w:id="162" w:name="ref-contexthurts2025"/>
+    <w:bookmarkEnd w:id="165"/>
+    <w:bookmarkStart w:id="167" w:name="ref-contexthurts2025"/>
     <w:p>
       <w:pPr>
         <w:pStyle w:val="Bibliography"/>
@@ -56252,7 +58289,7 @@
       <w:r>
         <w:t xml:space="preserve"> </w:t>
       </w:r>
-      <w:hyperlink r:id="rId161">
+      <w:hyperlink r:id="rId166">
         <w:r>
           <w:rPr>
             <w:rStyle w:val="Hyperlink"/>
@@ -56264,8 +58301,8 @@
         <w:t xml:space="preserve">.</w:t>
       </w:r>
     </w:p>
-    <w:bookmarkEnd w:id="162"/>
-    <w:bookmarkStart w:id="164" w:name="ref-dvoretzky1956"/>
+    <w:bookmarkEnd w:id="167"/>
+    <w:bookmarkStart w:id="169" w:name="ref-dvoretzky1956"/>
     <w:p>
       <w:pPr>
         <w:pStyle w:val="Bibliography"/>
@@ -56298,7 +58335,7 @@
       <w:r>
         <w:t xml:space="preserve"> </w:t>
       </w:r>
-      <w:hyperlink r:id="rId163">
+      <w:hyperlink r:id="rId168">
         <w:r>
           <w:rPr>
             <w:rStyle w:val="Hyperlink"/>
@@ -56310,8 +58347,8 @@
         <w:t xml:space="preserve">.</w:t>
       </w:r>
     </w:p>
-    <w:bookmarkEnd w:id="164"/>
-    <w:bookmarkStart w:id="165" w:name="ref-ethayarajh2022"/>
+    <w:bookmarkEnd w:id="169"/>
+    <w:bookmarkStart w:id="170" w:name="ref-ethayarajh2022"/>
     <w:p>
       <w:pPr>
         <w:pStyle w:val="Bibliography"/>
@@ -56354,8 +58391,8 @@
         <w:t xml:space="preserve">, PMLR, vol. 162: 5988–6008.</w:t>
       </w:r>
     </w:p>
-    <w:bookmarkEnd w:id="165"/>
-    <w:bookmarkStart w:id="167" w:name="ref-fosse2025"/>
+    <w:bookmarkEnd w:id="170"/>
+    <w:bookmarkStart w:id="172" w:name="ref-fosse2025"/>
     <w:p>
       <w:pPr>
         <w:pStyle w:val="Bibliography"/>
@@ -56385,7 +58422,7 @@
       <w:r>
         <w:t xml:space="preserve"> </w:t>
       </w:r>
-      <w:hyperlink r:id="rId166">
+      <w:hyperlink r:id="rId171">
         <w:r>
           <w:rPr>
             <w:rStyle w:val="Hyperlink"/>
@@ -56397,8 +58434,8 @@
         <w:t xml:space="preserve">.</w:t>
       </w:r>
     </w:p>
-    <w:bookmarkEnd w:id="167"/>
-    <w:bookmarkStart w:id="169" w:name="ref-fuhr2008"/>
+    <w:bookmarkEnd w:id="172"/>
+    <w:bookmarkStart w:id="174" w:name="ref-fuhr2008"/>
     <w:p>
       <w:pPr>
         <w:pStyle w:val="Bibliography"/>
@@ -56431,7 +58468,7 @@
       <w:r>
         <w:t xml:space="preserve"> </w:t>
       </w:r>
-      <w:hyperlink r:id="rId168">
+      <w:hyperlink r:id="rId173">
         <w:r>
           <w:rPr>
             <w:rStyle w:val="Hyperlink"/>
@@ -56443,8 +58480,8 @@
         <w:t xml:space="preserve">.</w:t>
       </w:r>
     </w:p>
-    <w:bookmarkEnd w:id="169"/>
-    <w:bookmarkStart w:id="171" w:name="ref-gao2024modelequality"/>
+    <w:bookmarkEnd w:id="174"/>
+    <w:bookmarkStart w:id="176" w:name="ref-gao2024modelequality"/>
     <w:p>
       <w:pPr>
         <w:pStyle w:val="Bibliography"/>
@@ -56486,7 +58523,7 @@
       <w:r>
         <w:t xml:space="preserve"> </w:t>
       </w:r>
-      <w:hyperlink r:id="rId170">
+      <w:hyperlink r:id="rId175">
         <w:r>
           <w:rPr>
             <w:rStyle w:val="Hyperlink"/>
@@ -56498,8 +58535,8 @@
         <w:t xml:space="preserve">.</w:t>
       </w:r>
     </w:p>
-    <w:bookmarkEnd w:id="171"/>
-    <w:bookmarkStart w:id="173" w:name="ref-guu2020realm"/>
+    <w:bookmarkEnd w:id="176"/>
+    <w:bookmarkStart w:id="178" w:name="ref-guu2020realm"/>
     <w:p>
       <w:pPr>
         <w:pStyle w:val="Bibliography"/>
@@ -56535,7 +58572,7 @@
       <w:r>
         <w:t xml:space="preserve"> </w:t>
       </w:r>
-      <w:hyperlink r:id="rId172">
+      <w:hyperlink r:id="rId177">
         <w:r>
           <w:rPr>
             <w:rStyle w:val="Hyperlink"/>
@@ -56547,8 +58584,8 @@
         <w:t xml:space="preserve">.</w:t>
       </w:r>
     </w:p>
-    <w:bookmarkEnd w:id="173"/>
-    <w:bookmarkStart w:id="175" w:name="ref-hong2025contextrot"/>
+    <w:bookmarkEnd w:id="178"/>
+    <w:bookmarkStart w:id="180" w:name="ref-hong2025contextrot"/>
     <w:p>
       <w:pPr>
         <w:pStyle w:val="Bibliography"/>
@@ -56600,7 +58637,7 @@
       <w:r>
         <w:t xml:space="preserve"> </w:t>
       </w:r>
-      <w:hyperlink r:id="rId174">
+      <w:hyperlink r:id="rId179">
         <w:r>
           <w:rPr>
             <w:rStyle w:val="Hyperlink"/>
@@ -56612,8 +58649,8 @@
         <w:t xml:space="preserve">.</w:t>
       </w:r>
     </w:p>
-    <w:bookmarkEnd w:id="175"/>
-    <w:bookmarkStart w:id="177" w:name="ref-huang2025gammacover"/>
+    <w:bookmarkEnd w:id="180"/>
+    <w:bookmarkStart w:id="182" w:name="ref-huang2025gammacover"/>
     <w:p>
       <w:pPr>
         <w:pStyle w:val="Bibliography"/>
@@ -56654,7 +58691,7 @@
       <w:r>
         <w:t xml:space="preserve"> </w:t>
       </w:r>
-      <w:hyperlink r:id="rId176">
+      <w:hyperlink r:id="rId181">
         <w:r>
           <w:rPr>
             <w:rStyle w:val="Hyperlink"/>
@@ -56666,8 +58703,8 @@
         <w:t xml:space="preserve">.</w:t>
       </w:r>
     </w:p>
-    <w:bookmarkEnd w:id="177"/>
-    <w:bookmarkStart w:id="179" w:name="ref-jin2024longrag"/>
+    <w:bookmarkEnd w:id="182"/>
+    <w:bookmarkStart w:id="184" w:name="ref-jin2024longrag"/>
     <w:p>
       <w:pPr>
         <w:pStyle w:val="Bibliography"/>
@@ -56727,7 +58764,7 @@
       <w:r>
         <w:t xml:space="preserve"> </w:t>
       </w:r>
-      <w:hyperlink r:id="rId178">
+      <w:hyperlink r:id="rId183">
         <w:r>
           <w:rPr>
             <w:rStyle w:val="Hyperlink"/>
@@ -56739,8 +58776,8 @@
         <w:t xml:space="preserve">.</w:t>
       </w:r>
     </w:p>
-    <w:bookmarkEnd w:id="179"/>
-    <w:bookmarkStart w:id="181" w:name="ref-sufficientcontext2024"/>
+    <w:bookmarkEnd w:id="184"/>
+    <w:bookmarkStart w:id="186" w:name="ref-sufficientcontext2024"/>
     <w:p>
       <w:pPr>
         <w:pStyle w:val="Bibliography"/>
@@ -56770,7 +58807,7 @@
       <w:r>
         <w:t xml:space="preserve"> </w:t>
       </w:r>
-      <w:hyperlink r:id="rId180">
+      <w:hyperlink r:id="rId185">
         <w:r>
           <w:rPr>
             <w:rStyle w:val="Hyperlink"/>
@@ -56782,8 +58819,8 @@
         <w:t xml:space="preserve">.</w:t>
       </w:r>
     </w:p>
-    <w:bookmarkEnd w:id="181"/>
-    <w:bookmarkStart w:id="183" w:name="ref-khattab2020colbert"/>
+    <w:bookmarkEnd w:id="186"/>
+    <w:bookmarkStart w:id="188" w:name="ref-khattab2020colbert"/>
     <w:p>
       <w:pPr>
         <w:pStyle w:val="Bibliography"/>
@@ -56828,7 +58865,7 @@
       <w:r>
         <w:t xml:space="preserve"> </w:t>
       </w:r>
-      <w:hyperlink r:id="rId182">
+      <w:hyperlink r:id="rId187">
         <w:r>
           <w:rPr>
             <w:rStyle w:val="Hyperlink"/>
@@ -56840,8 +58877,8 @@
         <w:t xml:space="preserve">.</w:t>
       </w:r>
     </w:p>
-    <w:bookmarkEnd w:id="183"/>
-    <w:bookmarkStart w:id="185" w:name="ref-lecam1964"/>
+    <w:bookmarkEnd w:id="188"/>
+    <w:bookmarkStart w:id="190" w:name="ref-lecam1964"/>
     <w:p>
       <w:pPr>
         <w:pStyle w:val="Bibliography"/>
@@ -56874,7 +58911,7 @@
       <w:r>
         <w:t xml:space="preserve"> </w:t>
       </w:r>
-      <w:hyperlink r:id="rId184">
+      <w:hyperlink r:id="rId189">
         <w:r>
           <w:rPr>
             <w:rStyle w:val="Hyperlink"/>
@@ -56886,8 +58923,8 @@
         <w:t xml:space="preserve">.</w:t>
       </w:r>
     </w:p>
-    <w:bookmarkEnd w:id="185"/>
-    <w:bookmarkStart w:id="187" w:name="ref-lecam1986"/>
+    <w:bookmarkEnd w:id="190"/>
+    <w:bookmarkStart w:id="192" w:name="ref-lecam1986"/>
     <w:p>
       <w:pPr>
         <w:pStyle w:val="Bibliography"/>
@@ -56911,7 +58948,7 @@
       <w:r>
         <w:t xml:space="preserve"> </w:t>
       </w:r>
-      <w:hyperlink r:id="rId186">
+      <w:hyperlink r:id="rId191">
         <w:r>
           <w:rPr>
             <w:rStyle w:val="Hyperlink"/>
@@ -56923,8 +58960,8 @@
         <w:t xml:space="preserve">.</w:t>
       </w:r>
     </w:p>
-    <w:bookmarkEnd w:id="187"/>
-    <w:bookmarkStart w:id="189" w:name="ref-relevanceutility2025"/>
+    <w:bookmarkEnd w:id="192"/>
+    <w:bookmarkStart w:id="194" w:name="ref-relevanceutility2025"/>
     <w:p>
       <w:pPr>
         <w:pStyle w:val="Bibliography"/>
@@ -56966,7 +59003,7 @@
       <w:r>
         <w:t xml:space="preserve"> </w:t>
       </w:r>
-      <w:hyperlink r:id="rId188">
+      <w:hyperlink r:id="rId193">
         <w:r>
           <w:rPr>
             <w:rStyle w:val="Hyperlink"/>
@@ -56978,8 +59015,8 @@
         <w:t xml:space="preserve">.</w:t>
       </w:r>
     </w:p>
-    <w:bookmarkEnd w:id="189"/>
-    <w:bookmarkStart w:id="191" w:name="ref-levy2025moredocs"/>
+    <w:bookmarkEnd w:id="194"/>
+    <w:bookmarkStart w:id="196" w:name="ref-levy2025moredocs"/>
     <w:p>
       <w:pPr>
         <w:pStyle w:val="Bibliography"/>
@@ -57018,7 +59055,7 @@
       <w:r>
         <w:t xml:space="preserve"> </w:t>
       </w:r>
-      <w:hyperlink r:id="rId190">
+      <w:hyperlink r:id="rId195">
         <w:r>
           <w:rPr>
             <w:rStyle w:val="Hyperlink"/>
@@ -57030,8 +59067,8 @@
         <w:t xml:space="preserve">.</w:t>
       </w:r>
     </w:p>
-    <w:bookmarkEnd w:id="191"/>
-    <w:bookmarkStart w:id="193" w:name="ref-longcontextdegrade2026"/>
+    <w:bookmarkEnd w:id="196"/>
+    <w:bookmarkStart w:id="198" w:name="ref-longcontextdegrade2026"/>
     <w:p>
       <w:pPr>
         <w:pStyle w:val="Bibliography"/>
@@ -57073,7 +59110,7 @@
       <w:r>
         <w:t xml:space="preserve"> </w:t>
       </w:r>
-      <w:hyperlink r:id="rId192">
+      <w:hyperlink r:id="rId197">
         <w:r>
           <w:rPr>
             <w:rStyle w:val="Hyperlink"/>
@@ -57085,8 +59122,8 @@
         <w:t xml:space="preserve">.</w:t>
       </w:r>
     </w:p>
-    <w:bookmarkEnd w:id="193"/>
-    <w:bookmarkStart w:id="195" w:name="ref-liu2024lost"/>
+    <w:bookmarkEnd w:id="198"/>
+    <w:bookmarkStart w:id="200" w:name="ref-liu2024lost"/>
     <w:p>
       <w:pPr>
         <w:pStyle w:val="Bibliography"/>
@@ -57119,7 +59156,7 @@
       <w:r>
         <w:t xml:space="preserve"> </w:t>
       </w:r>
-      <w:hyperlink r:id="rId194">
+      <w:hyperlink r:id="rId199">
         <w:r>
           <w:rPr>
             <w:rStyle w:val="Hyperlink"/>
@@ -57131,8 +59168,8 @@
         <w:t xml:space="preserve">.</w:t>
       </w:r>
     </w:p>
-    <w:bookmarkEnd w:id="195"/>
-    <w:bookmarkStart w:id="197" w:name="ref-miller2024errorbars"/>
+    <w:bookmarkEnd w:id="200"/>
+    <w:bookmarkStart w:id="202" w:name="ref-miller2024errorbars"/>
     <w:p>
       <w:pPr>
         <w:pStyle w:val="Bibliography"/>
@@ -57162,7 +59199,7 @@
       <w:r>
         <w:t xml:space="preserve"> </w:t>
       </w:r>
-      <w:hyperlink r:id="rId196">
+      <w:hyperlink r:id="rId201">
         <w:r>
           <w:rPr>
             <w:rStyle w:val="Hyperlink"/>
@@ -57174,8 +59211,8 @@
         <w:t xml:space="preserve">.</w:t>
       </w:r>
     </w:p>
-    <w:bookmarkEnd w:id="197"/>
-    <w:bookmarkStart w:id="199" w:name="ref-blackwellrep2026"/>
+    <w:bookmarkEnd w:id="202"/>
+    <w:bookmarkStart w:id="204" w:name="ref-blackwellrep2026"/>
     <w:p>
       <w:pPr>
         <w:pStyle w:val="Bibliography"/>
@@ -57205,7 +59242,7 @@
       <w:r>
         <w:t xml:space="preserve"> </w:t>
       </w:r>
-      <w:hyperlink r:id="rId198">
+      <w:hyperlink r:id="rId203">
         <w:r>
           <w:rPr>
             <w:rStyle w:val="Hyperlink"/>
@@ -57217,8 +59254,8 @@
         <w:t xml:space="preserve">.</w:t>
       </w:r>
     </w:p>
-    <w:bookmarkEnd w:id="199"/>
-    <w:bookmarkStart w:id="201" w:name="ref-sureRAG2026"/>
+    <w:bookmarkEnd w:id="204"/>
+    <w:bookmarkStart w:id="206" w:name="ref-sureRAG2026"/>
     <w:p>
       <w:pPr>
         <w:pStyle w:val="Bibliography"/>
@@ -57254,7 +59291,7 @@
       <w:r>
         <w:t xml:space="preserve"> </w:t>
       </w:r>
-      <w:hyperlink r:id="rId200">
+      <w:hyperlink r:id="rId205">
         <w:r>
           <w:rPr>
             <w:rStyle w:val="Hyperlink"/>
@@ -57266,8 +59303,8 @@
         <w:t xml:space="preserve">.</w:t>
       </w:r>
     </w:p>
-    <w:bookmarkEnd w:id="201"/>
-    <w:bookmarkStart w:id="203" w:name="ref-robertson1977"/>
+    <w:bookmarkEnd w:id="206"/>
+    <w:bookmarkStart w:id="208" w:name="ref-robertson1977"/>
     <w:p>
       <w:pPr>
         <w:pStyle w:val="Bibliography"/>
@@ -57309,7 +59346,7 @@
       <w:r>
         <w:t xml:space="preserve"> </w:t>
       </w:r>
-      <w:hyperlink r:id="rId202">
+      <w:hyperlink r:id="rId207">
         <w:r>
           <w:rPr>
             <w:rStyle w:val="Hyperlink"/>
@@ -57321,8 +59358,8 @@
         <w:t xml:space="preserve">.</w:t>
       </w:r>
     </w:p>
-    <w:bookmarkEnd w:id="203"/>
-    <w:bookmarkStart w:id="205" w:name="ref-vanrooyen2014"/>
+    <w:bookmarkEnd w:id="208"/>
+    <w:bookmarkStart w:id="210" w:name="ref-vanrooyen2014"/>
     <w:p>
       <w:pPr>
         <w:pStyle w:val="Bibliography"/>
@@ -57370,7 +59407,7 @@
       <w:r>
         <w:t xml:space="preserve"> </w:t>
       </w:r>
-      <w:hyperlink r:id="rId204">
+      <w:hyperlink r:id="rId209">
         <w:r>
           <w:rPr>
             <w:rStyle w:val="Hyperlink"/>
@@ -57382,8 +59419,8 @@
         <w:t xml:space="preserve">.</w:t>
       </w:r>
     </w:p>
-    <w:bookmarkEnd w:id="205"/>
-    <w:bookmarkStart w:id="207" w:name="ref-shi2023distracted"/>
+    <w:bookmarkEnd w:id="210"/>
+    <w:bookmarkStart w:id="212" w:name="ref-shi2023distracted"/>
     <w:p>
       <w:pPr>
         <w:pStyle w:val="Bibliography"/>
@@ -57413,7 +59450,7 @@
       <w:r>
         <w:t xml:space="preserve"> </w:t>
       </w:r>
-      <w:hyperlink r:id="rId206">
+      <w:hyperlink r:id="rId211">
         <w:r>
           <w:rPr>
             <w:rStyle w:val="Hyperlink"/>
@@ -57425,8 +59462,8 @@
         <w:t xml:space="preserve">.</w:t>
       </w:r>
     </w:p>
-    <w:bookmarkEnd w:id="207"/>
-    <w:bookmarkStart w:id="209" w:name="ref-shi2023replug"/>
+    <w:bookmarkEnd w:id="212"/>
+    <w:bookmarkStart w:id="214" w:name="ref-shi2023replug"/>
     <w:p>
       <w:pPr>
         <w:pStyle w:val="Bibliography"/>
@@ -57462,7 +59499,7 @@
       <w:r>
         <w:t xml:space="preserve"> </w:t>
       </w:r>
-      <w:hyperlink r:id="rId208">
+      <w:hyperlink r:id="rId213">
         <w:r>
           <w:rPr>
             <w:rStyle w:val="Hyperlink"/>
@@ -57474,8 +59511,8 @@
         <w:t xml:space="preserve">.</w:t>
       </w:r>
     </w:p>
-    <w:bookmarkEnd w:id="209"/>
-    <w:bookmarkStart w:id="211" w:name="ref-sun2023rankgpt"/>
+    <w:bookmarkEnd w:id="214"/>
+    <w:bookmarkStart w:id="216" w:name="ref-sun2023rankgpt"/>
     <w:p>
       <w:pPr>
         <w:pStyle w:val="Bibliography"/>
@@ -57529,7 +59566,7 @@
       <w:r>
         <w:t xml:space="preserve"> </w:t>
       </w:r>
-      <w:hyperlink r:id="rId210">
+      <w:hyperlink r:id="rId215">
         <w:r>
           <w:rPr>
             <w:rStyle w:val="Hyperlink"/>
@@ -57541,8 +59578,8 @@
         <w:t xml:space="preserve">.</w:t>
       </w:r>
     </w:p>
-    <w:bookmarkEnd w:id="211"/>
-    <w:bookmarkStart w:id="213" w:name="ref-torgersen1991"/>
+    <w:bookmarkEnd w:id="216"/>
+    <w:bookmarkStart w:id="218" w:name="ref-torgersen1991"/>
     <w:p>
       <w:pPr>
         <w:pStyle w:val="Bibliography"/>
@@ -57566,7 +59603,7 @@
       <w:r>
         <w:t xml:space="preserve"> </w:t>
       </w:r>
-      <w:hyperlink r:id="rId212">
+      <w:hyperlink r:id="rId217">
         <w:r>
           <w:rPr>
             <w:rStyle w:val="Hyperlink"/>
@@ -57578,8 +59615,8 @@
         <w:t xml:space="preserve">.</w:t>
       </w:r>
     </w:p>
-    <w:bookmarkEnd w:id="213"/>
-    <w:bookmarkStart w:id="215" w:name="ref-inficl2024"/>
+    <w:bookmarkEnd w:id="218"/>
+    <w:bookmarkStart w:id="220" w:name="ref-inficl2024"/>
     <w:p>
       <w:pPr>
         <w:pStyle w:val="Bibliography"/>
@@ -57609,7 +59646,7 @@
       <w:r>
         <w:t xml:space="preserve"> </w:t>
       </w:r>
-      <w:hyperlink r:id="rId214">
+      <w:hyperlink r:id="rId219">
         <w:r>
           <w:rPr>
             <w:rStyle w:val="Hyperlink"/>
@@ -57621,8 +59658,8 @@
         <w:t xml:space="preserve">.</w:t>
       </w:r>
     </w:p>
-    <w:bookmarkEnd w:id="215"/>
-    <w:bookmarkStart w:id="217" w:name="ref-demoshapley2024"/>
+    <w:bookmarkEnd w:id="220"/>
+    <w:bookmarkStart w:id="222" w:name="ref-demoshapley2024"/>
     <w:p>
       <w:pPr>
         <w:pStyle w:val="Bibliography"/>
@@ -57658,7 +59695,7 @@
       <w:r>
         <w:t xml:space="preserve"> </w:t>
       </w:r>
-      <w:hyperlink r:id="rId216">
+      <w:hyperlink r:id="rId221">
         <w:r>
           <w:rPr>
             <w:rStyle w:val="Hyperlink"/>
@@ -57670,8 +59707,8 @@
         <w:t xml:space="preserve">.</w:t>
       </w:r>
     </w:p>
-    <w:bookmarkEnd w:id="217"/>
-    <w:bookmarkStart w:id="219" w:name="ref-ye2023ceil"/>
+    <w:bookmarkEnd w:id="222"/>
+    <w:bookmarkStart w:id="224" w:name="ref-ye2023ceil"/>
     <w:p>
       <w:pPr>
         <w:pStyle w:val="Bibliography"/>
@@ -57701,7 +59738,7 @@
       <w:r>
         <w:t xml:space="preserve"> </w:t>
       </w:r>
-      <w:hyperlink r:id="rId218">
+      <w:hyperlink r:id="rId223">
         <w:r>
           <w:rPr>
             <w:rStyle w:val="Hyperlink"/>
@@ -57713,8 +59750,8 @@
         <w:t xml:space="preserve">.</w:t>
       </w:r>
     </w:p>
-    <w:bookmarkEnd w:id="219"/>
-    <w:bookmarkStart w:id="221" w:name="ref-rankrag2024"/>
+    <w:bookmarkEnd w:id="224"/>
+    <w:bookmarkStart w:id="226" w:name="ref-rankrag2024"/>
     <w:p>
       <w:pPr>
         <w:pStyle w:val="Bibliography"/>
@@ -57759,7 +59796,7 @@
       <w:r>
         <w:t xml:space="preserve"> </w:t>
       </w:r>
-      <w:hyperlink r:id="rId220">
+      <w:hyperlink r:id="rId225">
         <w:r>
           <w:rPr>
             <w:rStyle w:val="Hyperlink"/>
@@ -57771,8 +59808,8 @@
         <w:t xml:space="preserve">.</w:t>
       </w:r>
     </w:p>
-    <w:bookmarkEnd w:id="221"/>
-    <w:bookmarkStart w:id="223" w:name="ref-cale2025"/>
+    <w:bookmarkEnd w:id="226"/>
+    <w:bookmarkStart w:id="228" w:name="ref-cale2025"/>
     <w:p>
       <w:pPr>
         <w:pStyle w:val="Bibliography"/>
@@ -57823,7 +59860,7 @@
       <w:r>
         <w:t xml:space="preserve"> </w:t>
       </w:r>
-      <w:hyperlink r:id="rId222">
+      <w:hyperlink r:id="rId227">
         <w:r>
           <w:rPr>
             <w:rStyle w:val="Hyperlink"/>
@@ -57835,8 +59872,8 @@
         <w:t xml:space="preserve">.</w:t>
       </w:r>
     </w:p>
-    <w:bookmarkEnd w:id="223"/>
-    <w:bookmarkStart w:id="224" w:name="ref-paretoprompts2025"/>
+    <w:bookmarkEnd w:id="228"/>
+    <w:bookmarkStart w:id="229" w:name="ref-paretoprompts2025"/>
     <w:p>
       <w:pPr>
         <w:pStyle w:val="Bibliography"/>
@@ -57864,8 +59901,8 @@
         <w:t xml:space="preserve">.</w:t>
       </w:r>
     </w:p>
-    <w:bookmarkEnd w:id="224"/>
-    <w:bookmarkStart w:id="226" w:name="ref-zheng2024pmi"/>
+    <w:bookmarkEnd w:id="229"/>
+    <w:bookmarkStart w:id="231" w:name="ref-zheng2024pmi"/>
     <w:p>
       <w:pPr>
         <w:pStyle w:val="Bibliography"/>
@@ -57895,7 +59932,7 @@
       <w:r>
         <w:t xml:space="preserve"> </w:t>
       </w:r>
-      <w:hyperlink r:id="rId225">
+      <w:hyperlink r:id="rId230">
         <w:r>
           <w:rPr>
             <w:rStyle w:val="Hyperlink"/>
@@ -57907,10 +59944,10 @@
         <w:t xml:space="preserve">.</w:t>
       </w:r>
     </w:p>
-    <w:bookmarkEnd w:id="226"/>
-    <w:bookmarkEnd w:id="227"/>
-    <w:bookmarkEnd w:id="228"/>
-    <w:bookmarkEnd w:id="229"/>
+    <w:bookmarkEnd w:id="231"/>
+    <w:bookmarkEnd w:id="232"/>
+    <w:bookmarkEnd w:id="233"/>
+    <w:bookmarkEnd w:id="234"/>
     <w:sectPr>
       <w:footnotePr>
         <w:numRestart w:val="eachSect"/>

</xml_diff>

<commit_message>
Second-reviewer fixes: title 'is'->'as' a partial order (+ scope note in intro: existential claim licensed by verified pairs, framework beyond); 'Why these constants' paragraph (eta/tau a priori, tau does real work: -0.41..-1.00 clear it, -0.21 honestly fails); explicit nothing-is-trained statement; Discussion subsection 'What the approach buys, and what it costs'
</commit_message>
<xml_diff>
--- a/paper/blackwell-paper.docx
+++ b/paper/blackwell-paper.docx
@@ -7,7 +7,7 @@
         <w:pStyle w:val="Title"/>
       </w:pPr>
       <w:r>
-        <w:t xml:space="preserve">Context selection is a partial order:</w:t>
+        <w:t xml:space="preserve">Context selection as a partial order:</w:t>
       </w:r>
       <w:r>
         <w:br/>
@@ -986,6 +986,54 @@
       </w:r>
       <w:r>
         <w:t xml:space="preserve">the score orders them, it is wrong on one.</w:t>
+      </w:r>
+    </w:p>
+    <w:p>
+      <w:pPr>
+        <w:pStyle w:val="BodyText"/>
+      </w:pPr>
+      <w:r>
+        <w:t xml:space="preserve">A note on the scope of the title. A total order is refuted by a single incomparable pair, so the</w:t>
+      </w:r>
+      <w:r>
+        <w:t xml:space="preserve"> </w:t>
+      </w:r>
+      <w:r>
+        <w:t xml:space="preserve">claim in the title is licensed by exhibiting verified incomparable pairs, which we do on six</w:t>
+      </w:r>
+      <w:r>
+        <w:t xml:space="preserve"> </w:t>
+      </w:r>
+      <w:r>
+        <w:t xml:space="preserve">production models across two source domains (§7). Beyond that existential</w:t>
+      </w:r>
+      <w:r>
+        <w:t xml:space="preserve"> </w:t>
+      </w:r>
+      <w:r>
+        <w:t xml:space="preserve">core, the partial order is offered as a</w:t>
+      </w:r>
+      <w:r>
+        <w:t xml:space="preserve"> </w:t>
+      </w:r>
+      <w:r>
+        <w:rPr>
+          <w:i/>
+          <w:iCs/>
+        </w:rPr>
+        <w:t xml:space="preserve">framework</w:t>
+      </w:r>
+      <w:r>
+        <w:t xml:space="preserve"> </w:t>
+      </w:r>
+      <w:r>
+        <w:t xml:space="preserve">for the general phenomenon, and every</w:t>
+      </w:r>
+      <w:r>
+        <w:t xml:space="preserve"> </w:t>
+      </w:r>
+      <w:r>
+        <w:t xml:space="preserve">empirical claim in the paper is stated model-relative, not as a law over all context selection.</w:t>
       </w:r>
     </w:p>
     <w:bookmarkEnd w:id="9"/>
@@ -3586,7 +3634,7 @@
         <w:t xml:space="preserve"> </w:t>
       </w:r>
       <w:r>
-        <w:t xml:space="preserve">§8.5.</w:t>
+        <w:t xml:space="preserve">§8.6.</w:t>
       </w:r>
     </w:p>
     <w:bookmarkEnd w:id="14"/>
@@ -3689,7 +3737,7 @@
         <w:t xml:space="preserve"> </w:t>
       </w:r>
       <w:r>
-        <w:t xml:space="preserve">per-cell tables (C3). §8.5 states threats to validity and</w:t>
+        <w:t xml:space="preserve">per-cell tables (C3). §8.6 states threats to validity and</w:t>
       </w:r>
       <w:r>
         <w:t xml:space="preserve"> </w:t>
@@ -27201,7 +27249,7 @@
     </w:p>
     <w:bookmarkEnd w:id="66"/>
     <w:bookmarkEnd w:id="67"/>
-    <w:bookmarkStart w:id="106" w:name="sec:experiments"/>
+    <w:bookmarkStart w:id="107" w:name="sec:experiments"/>
     <w:p>
       <w:pPr>
         <w:pStyle w:val="Heading1"/>
@@ -29358,7 +29406,7 @@
     </w:p>
     <w:bookmarkEnd w:id="72"/>
     <w:bookmarkEnd w:id="73"/>
-    <w:bookmarkStart w:id="82" w:name="sec:methodology"/>
+    <w:bookmarkStart w:id="83" w:name="sec:methodology"/>
     <w:p>
       <w:pPr>
         <w:pStyle w:val="Heading2"/>
@@ -29387,7 +29435,25 @@
         <w:t xml:space="preserve"> </w:t>
       </w:r>
       <w:r>
-        <w:t xml:space="preserve">GPT-5.5; DeepSeek-V4-Pro; and Moonshot Kimi-K2.6.</w:t>
+        <w:t xml:space="preserve">GPT-5.5; DeepSeek-V4-Pro; and Moonshot Kimi-K2.6. Nothing in this paper is trained or fine-tuned:</w:t>
+      </w:r>
+      <w:r>
+        <w:t xml:space="preserve"> </w:t>
+      </w:r>
+      <w:r>
+        <w:t xml:space="preserve">all six are fixed production systems accessed through their public APIs, so there are no training</w:t>
+      </w:r>
+      <w:r>
+        <w:t xml:space="preserve"> </w:t>
+      </w:r>
+      <w:r>
+        <w:t xml:space="preserve">or validation curves to report; the released measurement record, per-cell PASS tables, exact</w:t>
+      </w:r>
+      <w:r>
+        <w:t xml:space="preserve"> </w:t>
+      </w:r>
+      <w:r>
+        <w:t xml:space="preserve">intervals, and raw run logs, is the complete empirical object.</w:t>
       </w:r>
     </w:p>
     <w:bookmarkEnd w:id="74"/>
@@ -30236,7 +30302,7 @@
         <w:t xml:space="preserve"> </w:t>
       </w:r>
       <w:r>
-        <w:t xml:space="preserve">from a single run (§6.5, §8.5). The intervals are degenerate at</w:t>
+        <w:t xml:space="preserve">from a single run (§6.5, §8.6). The intervals are degenerate at</w:t>
       </w:r>
       <w:r>
         <w:t xml:space="preserve"> </w:t>
@@ -30338,13 +30404,13 @@
       </w:r>
     </w:p>
     <w:bookmarkEnd w:id="79"/>
-    <w:bookmarkStart w:id="80" w:name="sampling-regime."/>
+    <w:bookmarkStart w:id="80" w:name="why-these-constants."/>
     <w:p>
       <w:pPr>
         <w:pStyle w:val="Heading4"/>
       </w:pPr>
       <w:r>
-        <w:t xml:space="preserve">Sampling regime.</w:t>
+        <w:t xml:space="preserve">Why these constants.</w:t>
       </w:r>
     </w:p>
     <w:p>
@@ -30352,7 +30418,142 @@
         <w:pStyle w:val="FirstParagraph"/>
       </w:pPr>
       <w:r>
-        <w:t xml:space="preserve">The verification models each cell as</w:t>
+        <w:t xml:space="preserve">Both constants were fixed before the runs and neither is load-bearing.</w:t>
+      </w:r>
+      <w:r>
+        <w:t xml:space="preserve"> </w:t>
+      </w:r>
+      <m:oMath>
+        <m:r>
+          <m:t>η</m:t>
+        </m:r>
+        <m:r>
+          <m:rPr>
+            <m:sty m:val="p"/>
+          </m:rPr>
+          <m:t>=</m:t>
+        </m:r>
+        <m:r>
+          <m:t>0.10</m:t>
+        </m:r>
+      </m:oMath>
+      <w:r>
+        <w:t xml:space="preserve"> </w:t>
+      </w:r>
+      <w:r>
+        <w:t xml:space="preserve">is a</w:t>
+      </w:r>
+      <w:r>
+        <w:t xml:space="preserve"> </w:t>
+      </w:r>
+      <w:r>
+        <w:t xml:space="preserve">conventional</w:t>
+      </w:r>
+      <w:r>
+        <w:t xml:space="preserve"> </w:t>
+      </w:r>
+      <m:oMath>
+        <m:r>
+          <m:t>90</m:t>
+        </m:r>
+        <m:r>
+          <m:rPr>
+            <m:sty m:val="p"/>
+          </m:rPr>
+          <m:t>%</m:t>
+        </m:r>
+      </m:oMath>
+      <w:r>
+        <w:t xml:space="preserve"> </w:t>
+      </w:r>
+      <w:r>
+        <w:t xml:space="preserve">family level; the headline separations are near-</w:t>
+      </w:r>
+      <m:oMath>
+        <m:r>
+          <m:t>0</m:t>
+        </m:r>
+        <m:r>
+          <m:rPr>
+            <m:sty m:val="p"/>
+          </m:rPr>
+          <m:t>%</m:t>
+        </m:r>
+      </m:oMath>
+      <w:r>
+        <w:t xml:space="preserve"> </w:t>
+      </w:r>
+      <w:r>
+        <w:t xml:space="preserve">against near-</w:t>
+      </w:r>
+      <m:oMath>
+        <m:r>
+          <m:t>100</m:t>
+        </m:r>
+        <m:r>
+          <m:rPr>
+            <m:sty m:val="p"/>
+          </m:rPr>
+          <m:t>%</m:t>
+        </m:r>
+      </m:oMath>
+      <w:r>
+        <w:t xml:space="preserve">,</w:t>
+      </w:r>
+      <w:r>
+        <w:t xml:space="preserve"> </w:t>
+      </w:r>
+      <w:r>
+        <w:t xml:space="preserve">so the verified conclusions are not sensitive to tightening it.</w:t>
+      </w:r>
+      <w:r>
+        <w:t xml:space="preserve"> </w:t>
+      </w:r>
+      <m:oMath>
+        <m:r>
+          <m:t>τ</m:t>
+        </m:r>
+        <m:r>
+          <m:rPr>
+            <m:sty m:val="p"/>
+          </m:rPr>
+          <m:t>=</m:t>
+        </m:r>
+        <m:r>
+          <m:t>0.30</m:t>
+        </m:r>
+      </m:oMath>
+      <w:r>
+        <w:t xml:space="preserve"> </w:t>
+      </w:r>
+      <w:r>
+        <w:t xml:space="preserve">is an a priori</w:t>
+      </w:r>
+      <w:r>
+        <w:t xml:space="preserve"> </w:t>
+      </w:r>
+      <w:r>
+        <w:t xml:space="preserve">materiality threshold: to count, interference must destroy at least</w:t>
+      </w:r>
+      <w:r>
+        <w:t xml:space="preserve"> </w:t>
+      </w:r>
+      <m:oMath>
+        <m:r>
+          <m:t>30</m:t>
+        </m:r>
+      </m:oMath>
+      <w:r>
+        <w:t xml:space="preserve"> </w:t>
+      </w:r>
+      <w:r>
+        <w:t xml:space="preserve">PASS points, well above</w:t>
+      </w:r>
+      <w:r>
+        <w:t xml:space="preserve"> </w:t>
+      </w:r>
+      <w:r>
+        <w:t xml:space="preserve">the interval widths at</w:t>
       </w:r>
       <w:r>
         <w:t xml:space="preserve"> </w:t>
@@ -30361,54 +30562,106 @@
         <m:r>
           <m:t>n</m:t>
         </m:r>
-      </m:oMath>
-      <w:r>
-        <w:t xml:space="preserve"> </w:t>
-      </w:r>
-      <w:r>
-        <w:t xml:space="preserve">Bernoulli PASS draws (Assumption 2); the four</w:t>
-      </w:r>
-      <w:r>
-        <w:t xml:space="preserve"> </w:t>
-      </w:r>
-      <w:r>
-        <w:t xml:space="preserve">arms within a cell are separate completions, and each of the</w:t>
-      </w:r>
-      <w:r>
-        <w:t xml:space="preserve"> </w:t>
-      </w:r>
-      <m:oMath>
-        <m:r>
-          <m:t>n</m:t>
-        </m:r>
-      </m:oMath>
-      <w:r>
-        <w:t xml:space="preserve"> </w:t>
-      </w:r>
-      <w:r>
-        <w:t xml:space="preserve">draws is an independent call with no</w:t>
-      </w:r>
-      <w:r>
-        <w:t xml:space="preserve"> </w:t>
-      </w:r>
-      <w:r>
-        <w:t xml:space="preserve">shared state, so the draws are manifestly independent. We report the decoding parameters, seeding</w:t>
-      </w:r>
-      <w:r>
-        <w:t xml:space="preserve"> </w:t>
-      </w:r>
-      <w:r>
-        <w:t xml:space="preserve">policy, and retry policy in Appendix C.</w:t>
+        <m:r>
+          <m:rPr>
+            <m:sty m:val="p"/>
+          </m:rPr>
+          <m:t>=</m:t>
+        </m:r>
+        <m:r>
+          <m:t>40</m:t>
+        </m:r>
+      </m:oMath>
+      <w:r>
+        <w:t xml:space="preserve">, so noise cannot clear it. The data show the threshold doing real</w:t>
+      </w:r>
+      <w:r>
+        <w:t xml:space="preserve"> </w:t>
+      </w:r>
+      <w:r>
+        <w:t xml:space="preserve">work in both directions: the verified collapses clear it by wide margins (upper confidence bounds</w:t>
+      </w:r>
+      <w:r>
+        <w:t xml:space="preserve"> </w:t>
+      </w:r>
+      <w:r>
+        <w:t xml:space="preserve">between</w:t>
+      </w:r>
+      <w:r>
+        <w:t xml:space="preserve"> </w:t>
+      </w:r>
+      <m:oMath>
+        <m:r>
+          <m:rPr>
+            <m:sty m:val="p"/>
+          </m:rPr>
+          <m:t>−</m:t>
+        </m:r>
+        <m:r>
+          <m:t>0.41</m:t>
+        </m:r>
+      </m:oMath>
+      <w:r>
+        <w:t xml:space="preserve"> </w:t>
+      </w:r>
+      <w:r>
+        <w:t xml:space="preserve">and</w:t>
+      </w:r>
+      <w:r>
+        <w:t xml:space="preserve"> </w:t>
+      </w:r>
+      <m:oMath>
+        <m:r>
+          <m:rPr>
+            <m:sty m:val="p"/>
+          </m:rPr>
+          <m:t>−</m:t>
+        </m:r>
+        <m:r>
+          <m:t>1.00</m:t>
+        </m:r>
+      </m:oMath>
+      <w:r>
+        <w:t xml:space="preserve">), while the second-pair contrast, with upper bound</w:t>
+      </w:r>
+      <w:r>
+        <w:t xml:space="preserve"> </w:t>
+      </w:r>
+      <m:oMath>
+        <m:r>
+          <m:rPr>
+            <m:sty m:val="p"/>
+          </m:rPr>
+          <m:t>−</m:t>
+        </m:r>
+        <m:r>
+          <m:t>0.21</m:t>
+        </m:r>
+      </m:oMath>
+      <w:r>
+        <w:t xml:space="preserve">, fails it</w:t>
+      </w:r>
+      <w:r>
+        <w:t xml:space="preserve"> </w:t>
+      </w:r>
+      <w:r>
+        <w:t xml:space="preserve">and is reported as sign-only rather than verified (§7.5). A threshold</w:t>
+      </w:r>
+      <w:r>
+        <w:t xml:space="preserve"> </w:t>
+      </w:r>
+      <w:r>
+        <w:t xml:space="preserve">that some true effects fail is evidence it was not tuned to pass the data.</w:t>
       </w:r>
     </w:p>
     <w:bookmarkEnd w:id="80"/>
-    <w:bookmarkStart w:id="81" w:name="spend."/>
+    <w:bookmarkStart w:id="81" w:name="sampling-regime."/>
     <w:p>
       <w:pPr>
         <w:pStyle w:val="Heading4"/>
       </w:pPr>
       <w:r>
-        <w:t xml:space="preserve">Spend.</w:t>
+        <w:t xml:space="preserve">Sampling regime.</w:t>
       </w:r>
     </w:p>
     <w:p>
@@ -30416,30 +30669,63 @@
         <w:pStyle w:val="FirstParagraph"/>
       </w:pPr>
       <w:r>
-        <w:t xml:space="preserve">The record reflects roughly $120 of Anthropic spend on the single-shot Haiku, Sonnet, and Opus runs</w:t>
-      </w:r>
-      <w:r>
-        <w:t xml:space="preserve"> </w:t>
-      </w:r>
-      <w:r>
-        <w:t xml:space="preserve">(itemized in Appendix C) plus Azure quota for the non-Anthropic models; the Azure API</w:t>
-      </w:r>
-      <w:r>
-        <w:t xml:space="preserve"> </w:t>
-      </w:r>
-      <w:r>
-        <w:t xml:space="preserve">returns no cost field, so this figure is not the total cost across all six models.</w:t>
+        <w:t xml:space="preserve">The verification models each cell as</w:t>
+      </w:r>
+      <w:r>
+        <w:t xml:space="preserve"> </w:t>
+      </w:r>
+      <m:oMath>
+        <m:r>
+          <m:t>n</m:t>
+        </m:r>
+      </m:oMath>
+      <w:r>
+        <w:t xml:space="preserve"> </w:t>
+      </w:r>
+      <w:r>
+        <w:t xml:space="preserve">Bernoulli PASS draws (Assumption 2); the four</w:t>
+      </w:r>
+      <w:r>
+        <w:t xml:space="preserve"> </w:t>
+      </w:r>
+      <w:r>
+        <w:t xml:space="preserve">arms within a cell are separate completions, and each of the</w:t>
+      </w:r>
+      <w:r>
+        <w:t xml:space="preserve"> </w:t>
+      </w:r>
+      <m:oMath>
+        <m:r>
+          <m:t>n</m:t>
+        </m:r>
+      </m:oMath>
+      <w:r>
+        <w:t xml:space="preserve"> </w:t>
+      </w:r>
+      <w:r>
+        <w:t xml:space="preserve">draws is an independent call with no</w:t>
+      </w:r>
+      <w:r>
+        <w:t xml:space="preserve"> </w:t>
+      </w:r>
+      <w:r>
+        <w:t xml:space="preserve">shared state, so the draws are manifestly independent. We report the decoding parameters, seeding</w:t>
+      </w:r>
+      <w:r>
+        <w:t xml:space="preserve"> </w:t>
+      </w:r>
+      <w:r>
+        <w:t xml:space="preserve">policy, and retry policy in Appendix C.</w:t>
       </w:r>
     </w:p>
     <w:bookmarkEnd w:id="81"/>
-    <w:bookmarkEnd w:id="82"/>
-    <w:bookmarkStart w:id="102" w:name="sec:results"/>
+    <w:bookmarkStart w:id="82" w:name="spend."/>
     <w:p>
       <w:pPr>
-        <w:pStyle w:val="Heading2"/>
+        <w:pStyle w:val="Heading4"/>
       </w:pPr>
       <w:r>
-        <w:t xml:space="preserve">Results</w:t>
+        <w:t xml:space="preserve">Spend.</w:t>
       </w:r>
     </w:p>
     <w:p>
@@ -30447,6 +30733,37 @@
         <w:pStyle w:val="FirstParagraph"/>
       </w:pPr>
       <w:r>
+        <w:t xml:space="preserve">The record reflects roughly $120 of Anthropic spend on the single-shot Haiku, Sonnet, and Opus runs</w:t>
+      </w:r>
+      <w:r>
+        <w:t xml:space="preserve"> </w:t>
+      </w:r>
+      <w:r>
+        <w:t xml:space="preserve">(itemized in Appendix C) plus Azure quota for the non-Anthropic models; the Azure API</w:t>
+      </w:r>
+      <w:r>
+        <w:t xml:space="preserve"> </w:t>
+      </w:r>
+      <w:r>
+        <w:t xml:space="preserve">returns no cost field, so this figure is not the total cost across all six models.</w:t>
+      </w:r>
+    </w:p>
+    <w:bookmarkEnd w:id="82"/>
+    <w:bookmarkEnd w:id="83"/>
+    <w:bookmarkStart w:id="103" w:name="sec:results"/>
+    <w:p>
+      <w:pPr>
+        <w:pStyle w:val="Heading2"/>
+      </w:pPr>
+      <w:r>
+        <w:t xml:space="preserve">Results</w:t>
+      </w:r>
+    </w:p>
+    <w:p>
+      <w:pPr>
+        <w:pStyle w:val="FirstParagraph"/>
+      </w:pPr>
+      <w:r>
         <w:t xml:space="preserve">We report four findings: incomparability (§7.4.1), the relevance mis-rank</w:t>
       </w:r>
       <w:r>
@@ -30474,7 +30791,7 @@
         <w:t xml:space="preserve">8 give the underlying quantities.</w:t>
       </w:r>
     </w:p>
-    <w:bookmarkStart w:id="83" w:name="tab:consolidated"/>
+    <w:bookmarkStart w:id="84" w:name="tab:consolidated"/>
     <w:p>
       <w:pPr>
         <w:pStyle w:val="TableCaption"/>
@@ -31739,8 +32056,8 @@
         </w:tc>
       </w:tr>
     </w:tbl>
-    <w:bookmarkEnd w:id="83"/>
-    <w:bookmarkStart w:id="86" w:name="sec:results-incomp"/>
+    <w:bookmarkEnd w:id="84"/>
+    <w:bookmarkStart w:id="87" w:name="sec:results-incomp"/>
     <w:p>
       <w:pPr>
         <w:pStyle w:val="Heading3"/>
@@ -32386,7 +32703,7 @@
         <w:t xml:space="preserve">opposition replicated across six models.</w:t>
       </w:r>
     </w:p>
-    <w:bookmarkStart w:id="84" w:name="tab:LD"/>
+    <w:bookmarkStart w:id="85" w:name="tab:LD"/>
     <w:p>
       <w:pPr>
         <w:pStyle w:val="TableCaption"/>
@@ -33390,8 +33707,8 @@
         </w:tc>
       </w:tr>
     </w:tbl>
-    <w:bookmarkEnd w:id="84"/>
-    <w:bookmarkStart w:id="85" w:name="Xb26a34529b3197c54b6ef78a1946345b612d255"/>
+    <w:bookmarkEnd w:id="85"/>
+    <w:bookmarkStart w:id="86" w:name="Xb26a34529b3197c54b6ef78a1946345b612d255"/>
     <w:p>
       <w:pPr>
         <w:pStyle w:val="Heading4"/>
@@ -33711,9 +34028,9 @@
         <w:t xml:space="preserve">added signal.</w:t>
       </w:r>
     </w:p>
-    <w:bookmarkEnd w:id="85"/>
     <w:bookmarkEnd w:id="86"/>
-    <w:bookmarkStart w:id="89" w:name="sec:results-misrank"/>
+    <w:bookmarkEnd w:id="87"/>
+    <w:bookmarkStart w:id="90" w:name="sec:results-misrank"/>
     <w:p>
       <w:pPr>
         <w:pStyle w:val="Heading3"/>
@@ -34261,7 +34578,7 @@
         <w:t xml:space="preserve">unguessable and that encoding knowledge is useless on this task.</w:t>
       </w:r>
     </w:p>
-    <w:bookmarkStart w:id="88" w:name="X92ef9457b97ee405b154a7eb0fa1aa3a6f2d684"/>
+    <w:bookmarkStart w:id="89" w:name="X92ef9457b97ee405b154a7eb0fa1aa3a6f2d684"/>
     <w:p>
       <w:pPr>
         <w:pStyle w:val="Heading4"/>
@@ -34695,7 +35012,7 @@
         <w:t xml:space="preserve">deficiency verification is built from, not a free scalar.</w:t>
       </w:r>
     </w:p>
-    <w:bookmarkStart w:id="87" w:name="tab:rankers"/>
+    <w:bookmarkStart w:id="88" w:name="tab:rankers"/>
     <w:p>
       <w:pPr>
         <w:pStyle w:val="TableCaption"/>
@@ -35620,10 +35937,10 @@
         </w:tc>
       </w:tr>
     </w:tbl>
-    <w:bookmarkEnd w:id="87"/>
     <w:bookmarkEnd w:id="88"/>
     <w:bookmarkEnd w:id="89"/>
-    <w:bookmarkStart w:id="98" w:name="sec:results-antimono"/>
+    <w:bookmarkEnd w:id="90"/>
+    <w:bookmarkStart w:id="99" w:name="sec:results-antimono"/>
     <w:p>
       <w:pPr>
         <w:pStyle w:val="Heading3"/>
@@ -36184,7 +36501,7 @@
         <w:t xml:space="preserve">Figure 1 shows the collapse across the six models.</w:t>
       </w:r>
     </w:p>
-    <w:bookmarkStart w:id="90" w:name="fig:collapse"/>
+    <w:bookmarkStart w:id="91" w:name="fig:collapse"/>
     <w:tbl>
       <w:tblPr>
         <w:tblStyle w:val="FigureTable"/>
@@ -36452,8 +36769,8 @@
         <w:t xml:space="preserve">; Table 6); Opus reproduces the collapse but does not verify.</w:t>
       </w:r>
     </w:p>
-    <w:bookmarkEnd w:id="90"/>
-    <w:bookmarkStart w:id="93" w:name="Xad950c9ad2efcae5ca328fe88a654bcb87f62fc"/>
+    <w:bookmarkEnd w:id="91"/>
+    <w:bookmarkStart w:id="94" w:name="Xad950c9ad2efcae5ca328fe88a654bcb87f62fc"/>
     <w:p>
       <w:pPr>
         <w:pStyle w:val="Heading4"/>
@@ -37079,7 +37396,7 @@
         <w:t xml:space="preserve">is developed in a companion paper.</w:t>
       </w:r>
     </w:p>
-    <w:bookmarkStart w:id="91" w:name="fig:hasse"/>
+    <w:bookmarkStart w:id="92" w:name="fig:hasse"/>
     <w:tbl>
       <w:tblPr>
         <w:tblStyle w:val="FigureTable"/>
@@ -37527,8 +37844,8 @@
         <w:t xml:space="preserve">rule can represent.</w:t>
       </w:r>
     </w:p>
-    <w:bookmarkEnd w:id="91"/>
-    <w:bookmarkStart w:id="92" w:name="tab:interference"/>
+    <w:bookmarkEnd w:id="92"/>
+    <w:bookmarkStart w:id="93" w:name="tab:interference"/>
     <w:p>
       <w:pPr>
         <w:pStyle w:val="TableCaption"/>
@@ -39073,9 +39390,9 @@
         </w:tc>
       </w:tr>
     </w:tbl>
-    <w:bookmarkEnd w:id="92"/>
     <w:bookmarkEnd w:id="93"/>
-    <w:bookmarkStart w:id="94" w:name="Xe149701baef4ebfc0c0660f6732890156a3bb29"/>
+    <w:bookmarkEnd w:id="94"/>
+    <w:bookmarkStart w:id="95" w:name="Xe149701baef4ebfc0c0660f6732890156a3bb29"/>
     <w:p>
       <w:pPr>
         <w:pStyle w:val="Heading4"/>
@@ -39563,8 +39880,8 @@
         <w:t xml:space="preserve">.</w:t>
       </w:r>
     </w:p>
-    <w:bookmarkEnd w:id="94"/>
-    <w:bookmarkStart w:id="95" w:name="position-is-not-the-cause."/>
+    <w:bookmarkEnd w:id="95"/>
+    <w:bookmarkStart w:id="96" w:name="position-is-not-the-cause."/>
     <w:p>
       <w:pPr>
         <w:pStyle w:val="Heading4"/>
@@ -39688,8 +40005,8 @@
         <w:t xml:space="preserve">what turns a harmless arm into a harmful one, so the cause is the added signal, not where it sits.</w:t>
       </w:r>
     </w:p>
-    <w:bookmarkEnd w:id="95"/>
-    <w:bookmarkStart w:id="96" w:name="X086de5874ce71cba9e6d9633bd38de7f701e1cb"/>
+    <w:bookmarkEnd w:id="96"/>
+    <w:bookmarkStart w:id="97" w:name="X086de5874ce71cba9e6d9633bd38de7f701e1cb"/>
     <w:p>
       <w:pPr>
         <w:pStyle w:val="Heading4"/>
@@ -39770,8 +40087,8 @@
         <w:t xml:space="preserve">could be effect rather than cause.</w:t>
       </w:r>
     </w:p>
-    <w:bookmarkEnd w:id="96"/>
-    <w:bookmarkStart w:id="97" w:name="robust-but-not-monotone-in-capability."/>
+    <w:bookmarkEnd w:id="97"/>
+    <w:bookmarkStart w:id="98" w:name="robust-but-not-monotone-in-capability."/>
     <w:p>
       <w:pPr>
         <w:pStyle w:val="Heading4"/>
@@ -40046,9 +40363,9 @@
         <w:t xml:space="preserve">across the ladder, not a capability trend.</w:t>
       </w:r>
     </w:p>
-    <w:bookmarkEnd w:id="97"/>
     <w:bookmarkEnd w:id="98"/>
-    <w:bookmarkStart w:id="101" w:name="sec:results-moat"/>
+    <w:bookmarkEnd w:id="99"/>
+    <w:bookmarkStart w:id="102" w:name="sec:results-moat"/>
     <w:p>
       <w:pPr>
         <w:pStyle w:val="Heading3"/>
@@ -40444,7 +40761,7 @@
         <w:t xml:space="preserve">).</w:t>
       </w:r>
     </w:p>
-    <w:bookmarkStart w:id="99" w:name="fig:spectrum"/>
+    <w:bookmarkStart w:id="100" w:name="fig:spectrum"/>
     <w:tbl>
       <w:tblPr>
         <w:tblStyle w:val="FigureTable"/>
@@ -40575,8 +40892,8 @@
         <w:t xml:space="preserve">different vendor, and Opus (the strongest Anthropic model) guesses more than Sonnet.</w:t>
       </w:r>
     </w:p>
-    <w:bookmarkEnd w:id="99"/>
-    <w:bookmarkStart w:id="100" w:name="auditable-per-cell-record."/>
+    <w:bookmarkEnd w:id="100"/>
+    <w:bookmarkStart w:id="101" w:name="auditable-per-cell-record."/>
     <w:p>
       <w:pPr>
         <w:pStyle w:val="Heading4"/>
@@ -40593,10 +40910,10 @@
         <w:t xml:space="preserve">The full per-arm PASS record for every carrying cell is Table 8 in Appendix B, so each verification can be reconstructed from the reported counts.</w:t>
       </w:r>
     </w:p>
-    <w:bookmarkEnd w:id="100"/>
     <w:bookmarkEnd w:id="101"/>
     <w:bookmarkEnd w:id="102"/>
-    <w:bookmarkStart w:id="103" w:name="sec:results-generality"/>
+    <w:bookmarkEnd w:id="103"/>
+    <w:bookmarkStart w:id="104" w:name="sec:results-generality"/>
     <w:p>
       <w:pPr>
         <w:pStyle w:val="Heading2"/>
@@ -41373,8 +41690,8 @@
         <w:t xml:space="preserve">convention-to-task routing rather than in convention segmentation.</w:t>
       </w:r>
     </w:p>
-    <w:bookmarkEnd w:id="103"/>
-    <w:bookmarkStart w:id="105" w:name="sec:results-policies"/>
+    <w:bookmarkEnd w:id="104"/>
+    <w:bookmarkStart w:id="106" w:name="sec:results-policies"/>
     <w:p>
       <w:pPr>
         <w:pStyle w:val="Heading2"/>
@@ -41712,7 +42029,7 @@
         <w:t xml:space="preserve">family.</w:t>
       </w:r>
     </w:p>
-    <w:bookmarkStart w:id="104" w:name="tab:policies"/>
+    <w:bookmarkStart w:id="105" w:name="tab:policies"/>
     <w:p>
       <w:pPr>
         <w:pStyle w:val="TableCaption"/>
@@ -42403,7 +42720,7 @@
         </w:tc>
       </w:tr>
     </w:tbl>
-    <w:bookmarkEnd w:id="104"/>
+    <w:bookmarkEnd w:id="105"/>
     <w:p>
       <w:pPr>
         <w:pStyle w:val="BodyText"/>
@@ -42597,9 +42914,9 @@
         <w:t xml:space="preserve">each cheap policy forfeits an entire cell class, and no total-order policy can keep all four.</w:t>
       </w:r>
     </w:p>
-    <w:bookmarkEnd w:id="105"/>
     <w:bookmarkEnd w:id="106"/>
-    <w:bookmarkStart w:id="122" w:name="sec:discussion"/>
+    <w:bookmarkEnd w:id="107"/>
+    <w:bookmarkStart w:id="124" w:name="sec:discussion"/>
     <w:p>
       <w:pPr>
         <w:pStyle w:val="Heading1"/>
@@ -42740,23 +43057,238 @@
         <w:t xml:space="preserve">formalization is a model rather than a proof of the realized object.</w:t>
       </w:r>
     </w:p>
-    <w:bookmarkStart w:id="109" w:name="sec:disc-bridge"/>
+    <w:bookmarkStart w:id="108" w:name="sec:disc-tradeoffs"/>
     <w:p>
       <w:pPr>
         <w:pStyle w:val="Heading2"/>
       </w:pPr>
       <w:r>
-        <w:t xml:space="preserve">Scope of the claims</w:t>
+        <w:t xml:space="preserve">What the approach buys, and what it costs</w:t>
       </w:r>
     </w:p>
     <w:p>
       <w:pPr>
         <w:pStyle w:val="FirstParagraph"/>
       </w:pPr>
-      <w:bookmarkStart w:id="107" w:name="sec:disc-deficiency"/>
-      <w:bookmarkEnd w:id="107"/>
-      <w:bookmarkStart w:id="108" w:name="sec:disc-certificate"/>
-      <w:bookmarkEnd w:id="108"/>
+      <w:r>
+        <w:t xml:space="preserve">Consolidating the comparison that runs through the paper: relative to the alternatives of</w:t>
+      </w:r>
+      <w:r>
+        <w:t xml:space="preserve"> </w:t>
+      </w:r>
+      <w:r>
+        <w:t xml:space="preserve">Table 2, the approach buys four things none of them provides. (i) A</w:t>
+      </w:r>
+      <w:r>
+        <w:t xml:space="preserve"> </w:t>
+      </w:r>
+      <w:r>
+        <w:rPr>
+          <w:i/>
+          <w:iCs/>
+        </w:rPr>
+        <w:t xml:space="preserve">diagnosis</w:t>
+      </w:r>
+      <w:r>
+        <w:t xml:space="preserve">: incomparability and interference become named, testable properties rather than</w:t>
+      </w:r>
+      <w:r>
+        <w:t xml:space="preserve"> </w:t>
+      </w:r>
+      <w:r>
+        <w:t xml:space="preserve">anecdotes about</w:t>
+      </w:r>
+      <w:r>
+        <w:t xml:space="preserve"> </w:t>
+      </w:r>
+      <w:r>
+        <w:t xml:space="preserve">“context sometimes hurting.”</w:t>
+      </w:r>
+      <w:r>
+        <w:t xml:space="preserve"> </w:t>
+      </w:r>
+      <w:r>
+        <w:t xml:space="preserve">(ii)</w:t>
+      </w:r>
+      <w:r>
+        <w:t xml:space="preserve"> </w:t>
+      </w:r>
+      <w:r>
+        <w:rPr>
+          <w:i/>
+          <w:iCs/>
+        </w:rPr>
+        <w:t xml:space="preserve">Distribution-free finite-sample</w:t>
+      </w:r>
+      <w:r>
+        <w:rPr>
+          <w:i/>
+          <w:iCs/>
+        </w:rPr>
+        <w:t xml:space="preserve"> </w:t>
+      </w:r>
+      <w:r>
+        <w:rPr>
+          <w:i/>
+          <w:iCs/>
+        </w:rPr>
+        <w:t xml:space="preserve">verification</w:t>
+      </w:r>
+      <w:r>
+        <w:t xml:space="preserve"> </w:t>
+      </w:r>
+      <w:r>
+        <w:t xml:space="preserve">on live black-box models: exact intervals and multiplicity control, with no training</w:t>
+      </w:r>
+      <w:r>
+        <w:t xml:space="preserve"> </w:t>
+      </w:r>
+      <w:r>
+        <w:t xml:space="preserve">and no white-box access. (iii)</w:t>
+      </w:r>
+      <w:r>
+        <w:t xml:space="preserve"> </w:t>
+      </w:r>
+      <w:r>
+        <w:rPr>
+          <w:i/>
+          <w:iCs/>
+        </w:rPr>
+        <w:t xml:space="preserve">Model-relative measurement</w:t>
+      </w:r>
+      <w:r>
+        <w:t xml:space="preserve">: the same protocol re-run on any</w:t>
+      </w:r>
+      <w:r>
+        <w:t xml:space="preserve"> </w:t>
+      </w:r>
+      <w:r>
+        <w:t xml:space="preserve">stack answers whether</w:t>
+      </w:r>
+      <w:r>
+        <w:t xml:space="preserve"> </w:t>
+      </w:r>
+      <w:r>
+        <w:rPr>
+          <w:i/>
+          <w:iCs/>
+        </w:rPr>
+        <w:t xml:space="preserve">your</w:t>
+      </w:r>
+      <w:r>
+        <w:t xml:space="preserve"> </w:t>
+      </w:r>
+      <w:r>
+        <w:t xml:space="preserve">model has this structure on</w:t>
+      </w:r>
+      <w:r>
+        <w:t xml:space="preserve"> </w:t>
+      </w:r>
+      <w:r>
+        <w:rPr>
+          <w:i/>
+          <w:iCs/>
+        </w:rPr>
+        <w:t xml:space="preserve">your</w:t>
+      </w:r>
+      <w:r>
+        <w:t xml:space="preserve"> </w:t>
+      </w:r>
+      <w:r>
+        <w:t xml:space="preserve">sources, including the</w:t>
+      </w:r>
+      <w:r>
+        <w:t xml:space="preserve"> </w:t>
+      </w:r>
+      <w:r>
+        <w:t xml:space="preserve">scalar-suffices answer when sources are nested. (iv) A</w:t>
+      </w:r>
+      <w:r>
+        <w:t xml:space="preserve"> </w:t>
+      </w:r>
+      <w:r>
+        <w:rPr>
+          <w:i/>
+          <w:iCs/>
+        </w:rPr>
+        <w:t xml:space="preserve">selection ceiling</w:t>
+      </w:r>
+      <w:r>
+        <w:t xml:space="preserve">: the non-dominated</w:t>
+      </w:r>
+      <w:r>
+        <w:t xml:space="preserve"> </w:t>
+      </w:r>
+      <w:r>
+        <w:t xml:space="preserve">front attains the per-cell maximum of its members (Table 7), bounding what any</w:t>
+      </w:r>
+      <w:r>
+        <w:t xml:space="preserve"> </w:t>
+      </w:r>
+      <w:r>
+        <w:t xml:space="preserve">selection policy can recover and separating selection error from model capability. The costs are</w:t>
+      </w:r>
+      <w:r>
+        <w:t xml:space="preserve"> </w:t>
+      </w:r>
+      <w:r>
+        <w:t xml:space="preserve">equally concrete. Verification is bought with probe runs, so the method lives at curation scale, a</w:t>
+      </w:r>
+      <w:r>
+        <w:t xml:space="preserve"> </w:t>
+      </w:r>
+      <w:r>
+        <w:t xml:space="preserve">reranked shortlist or an offline context library, not corpus scale (§8.6). The</w:t>
+      </w:r>
+      <w:r>
+        <w:t xml:space="preserve"> </w:t>
+      </w:r>
+      <w:r>
+        <w:t xml:space="preserve">verified cells are constructed to make the structure visible, so the magnitudes are diagnostic, not</w:t>
+      </w:r>
+      <w:r>
+        <w:t xml:space="preserve"> </w:t>
+      </w:r>
+      <w:r>
+        <w:t xml:space="preserve">production estimates. And the guarantees are existential and model-relative: they establish that</w:t>
+      </w:r>
+      <w:r>
+        <w:t xml:space="preserve"> </w:t>
+      </w:r>
+      <w:r>
+        <w:t xml:space="preserve">the partial order is real and consequential where verified, not that every source pair in the wild</w:t>
+      </w:r>
+      <w:r>
+        <w:t xml:space="preserve"> </w:t>
+      </w:r>
+      <w:r>
+        <w:t xml:space="preserve">is incomparable. In exchange, the practitioner gets what the cheap alternatives cannot give: a</w:t>
+      </w:r>
+      <w:r>
+        <w:t xml:space="preserve"> </w:t>
+      </w:r>
+      <w:r>
+        <w:t xml:space="preserve">claim about their own system that is checked rather than assumed.</w:t>
+      </w:r>
+    </w:p>
+    <w:bookmarkEnd w:id="108"/>
+    <w:bookmarkStart w:id="111" w:name="sec:disc-bridge"/>
+    <w:p>
+      <w:pPr>
+        <w:pStyle w:val="Heading2"/>
+      </w:pPr>
+      <w:r>
+        <w:t xml:space="preserve">Scope of the claims</w:t>
+      </w:r>
+    </w:p>
+    <w:p>
+      <w:pPr>
+        <w:pStyle w:val="FirstParagraph"/>
+      </w:pPr>
+      <w:bookmarkStart w:id="109" w:name="sec:disc-deficiency"/>
+      <w:bookmarkEnd w:id="109"/>
+      <w:bookmarkStart w:id="110" w:name="sec:disc-certificate"/>
+      <w:bookmarkEnd w:id="110"/>
     </w:p>
     <w:p>
       <w:pPr>
@@ -43029,8 +43561,8 @@
         <w:t xml:space="preserve">a fixed adversarial battery, not a task distribution.</w:t>
       </w:r>
     </w:p>
-    <w:bookmarkEnd w:id="109"/>
-    <w:bookmarkStart w:id="111" w:name="sec:disc-antimono"/>
+    <w:bookmarkEnd w:id="111"/>
+    <w:bookmarkStart w:id="113" w:name="sec:disc-antimono"/>
     <w:p>
       <w:pPr>
         <w:pStyle w:val="Heading2"/>
@@ -43822,7 +44354,7 @@
         <w:t xml:space="preserve"> </w:t>
       </w:r>
       <w:r>
-        <w:t xml:space="preserve">couples the verifiable-harm set to the model-relative value of private context (§8.3).</w:t>
+        <w:t xml:space="preserve">couples the verifiable-harm set to the model-relative value of private context (§8.4).</w:t>
       </w:r>
       <w:r>
         <w:t xml:space="preserve"> </w:t>
@@ -43963,7 +44495,7 @@
         <w:t xml:space="preserve">).</w:t>
       </w:r>
     </w:p>
-    <w:bookmarkStart w:id="110" w:name="will-scale-restore-blackwell-coherence"/>
+    <w:bookmarkStart w:id="112" w:name="will-scale-restore-blackwell-coherence"/>
     <w:p>
       <w:pPr>
         <w:pStyle w:val="Heading4"/>
@@ -44238,9 +44770,9 @@
         <w:t xml:space="preserve">itself.</w:t>
       </w:r>
     </w:p>
-    <w:bookmarkEnd w:id="110"/>
-    <w:bookmarkEnd w:id="111"/>
-    <w:bookmarkStart w:id="112" w:name="sec:disc-moat"/>
+    <w:bookmarkEnd w:id="112"/>
+    <w:bookmarkEnd w:id="113"/>
+    <w:bookmarkStart w:id="114" w:name="sec:disc-moat"/>
     <w:p>
       <w:pPr>
         <w:pStyle w:val="Heading2"/>
@@ -44579,8 +45111,8 @@
         <w:t xml:space="preserve">caps which cells verify per model.</w:t>
       </w:r>
     </w:p>
-    <w:bookmarkEnd w:id="112"/>
-    <w:bookmarkStart w:id="114" w:name="sec:disc-mechanism"/>
+    <w:bookmarkEnd w:id="114"/>
+    <w:bookmarkStart w:id="116" w:name="sec:disc-mechanism"/>
     <w:p>
       <w:pPr>
         <w:pStyle w:val="Heading2"/>
@@ -45034,7 +45566,7 @@
         <w:t xml:space="preserve">mechanistic companion study, downstream of, not prerequisite to, the verified behavioral claim.</w:t>
       </w:r>
     </w:p>
-    <w:bookmarkStart w:id="113" w:name="X37a5acb05d688eb32bbe54c216dbcf303d3b4c3"/>
+    <w:bookmarkStart w:id="115" w:name="X37a5acb05d688eb32bbe54c216dbcf303d3b4c3"/>
     <w:p>
       <w:pPr>
         <w:pStyle w:val="Heading4"/>
@@ -45105,7 +45637,7 @@
         <w:t xml:space="preserve"> </w:t>
       </w:r>
       <w:r>
-        <w:t xml:space="preserve">§8.2, if</w:t>
+        <w:t xml:space="preserve">§8.3, if</w:t>
       </w:r>
       <w:r>
         <w:t xml:space="preserve"> </w:t>
@@ -45297,9 +45829,9 @@
         <w:t xml:space="preserve">claim in the paper is independent of which reading is true.</w:t>
       </w:r>
     </w:p>
-    <w:bookmarkEnd w:id="113"/>
-    <w:bookmarkEnd w:id="114"/>
-    <w:bookmarkStart w:id="121" w:name="sec:limitations"/>
+    <w:bookmarkEnd w:id="115"/>
+    <w:bookmarkEnd w:id="116"/>
+    <w:bookmarkStart w:id="123" w:name="sec:limitations"/>
     <w:p>
       <w:pPr>
         <w:pStyle w:val="Heading2"/>
@@ -45316,7 +45848,7 @@
         <w:t xml:space="preserve">We collect the scope restrictions here; each is stated once and sized to its weight.</w:t>
       </w:r>
     </w:p>
-    <w:bookmarkStart w:id="115" w:name="from-diagnosis-to-selection."/>
+    <w:bookmarkStart w:id="117" w:name="from-diagnosis-to-selection."/>
     <w:p>
       <w:pPr>
         <w:pStyle w:val="Heading4"/>
@@ -45460,8 +45992,8 @@
         <w:t xml:space="preserve">shortlist, is the central open problem this work opens.</w:t>
       </w:r>
     </w:p>
-    <w:bookmarkEnd w:id="115"/>
-    <w:bookmarkStart w:id="116" w:name="source-pair-generality."/>
+    <w:bookmarkEnd w:id="117"/>
+    <w:bookmarkStart w:id="118" w:name="source-pair-generality."/>
     <w:p>
       <w:pPr>
         <w:pStyle w:val="Heading4"/>
@@ -45634,8 +46166,8 @@
         <w:t xml:space="preserve">steps.</w:t>
       </w:r>
     </w:p>
-    <w:bookmarkEnd w:id="116"/>
-    <w:bookmarkStart w:id="117" w:name="Xd344a6caba248cd0f3c9915a6f9f7c4f85f22da"/>
+    <w:bookmarkEnd w:id="118"/>
+    <w:bookmarkStart w:id="119" w:name="Xd344a6caba248cd0f3c9915a6f9f7c4f85f22da"/>
     <w:p>
       <w:pPr>
         <w:pStyle w:val="Heading4"/>
@@ -45744,8 +46276,8 @@
         <w:t xml:space="preserve">comparison.</w:t>
       </w:r>
     </w:p>
-    <w:bookmarkEnd w:id="117"/>
-    <w:bookmarkStart w:id="118" w:name="the-model-is-an-idealization-twice."/>
+    <w:bookmarkEnd w:id="119"/>
+    <w:bookmarkStart w:id="120" w:name="the-model-is-an-idealization-twice."/>
     <w:p>
       <w:pPr>
         <w:pStyle w:val="Heading4"/>
@@ -45853,8 +46385,8 @@
         <w:t xml:space="preserve">document pairs is the direct next experiment.</w:t>
       </w:r>
     </w:p>
-    <w:bookmarkEnd w:id="118"/>
-    <w:bookmarkStart w:id="119" w:name="sampling-and-verification-regime."/>
+    <w:bookmarkEnd w:id="120"/>
+    <w:bookmarkStart w:id="121" w:name="sampling-and-verification-regime."/>
     <w:p>
       <w:pPr>
         <w:pStyle w:val="Heading4"/>
@@ -45921,11 +46453,11 @@
         <w:t xml:space="preserve"> </w:t>
       </w:r>
       <w:r>
-        <w:t xml:space="preserve">marginal-versus-joint control is discussed in §8.1.</w:t>
+        <w:t xml:space="preserve">marginal-versus-joint control is discussed in §8.2.</w:t>
       </w:r>
     </w:p>
-    <w:bookmarkEnd w:id="119"/>
-    <w:bookmarkStart w:id="120" w:name="ranker-spectrum-and-synergy."/>
+    <w:bookmarkEnd w:id="121"/>
+    <w:bookmarkStart w:id="122" w:name="ranker-spectrum-and-synergy."/>
     <w:p>
       <w:pPr>
         <w:pStyle w:val="Heading4"/>
@@ -46023,10 +46555,10 @@
         <w:t xml:space="preserve">beyond its parts; we make no claim about it.</w:t>
       </w:r>
     </w:p>
-    <w:bookmarkEnd w:id="120"/>
-    <w:bookmarkEnd w:id="121"/>
     <w:bookmarkEnd w:id="122"/>
-    <w:bookmarkStart w:id="123" w:name="sec:conclusion"/>
+    <w:bookmarkEnd w:id="123"/>
+    <w:bookmarkEnd w:id="124"/>
+    <w:bookmarkStart w:id="125" w:name="sec:conclusion"/>
     <w:p>
       <w:pPr>
         <w:pStyle w:val="Heading1"/>
@@ -46441,8 +46973,8 @@
         <w:t xml:space="preserve">domain, are the natural next steps, and the experimental record indicates each is cheap to run.</w:t>
       </w:r>
     </w:p>
-    <w:bookmarkEnd w:id="123"/>
-    <w:bookmarkStart w:id="135" w:name="app:proofs"/>
+    <w:bookmarkEnd w:id="125"/>
+    <w:bookmarkStart w:id="137" w:name="app:proofs"/>
     <w:p>
       <w:pPr>
         <w:pStyle w:val="Heading1"/>
@@ -46451,7 +46983,7 @@
         <w:t xml:space="preserve">Deferred proofs and technical material</w:t>
       </w:r>
     </w:p>
-    <w:bookmarkStart w:id="124" w:name="proof-of-lemma-1"/>
+    <w:bookmarkStart w:id="126" w:name="proof-of-lemma-1"/>
     <w:p>
       <w:pPr>
         <w:pStyle w:val="Heading2"/>
@@ -47089,8 +47621,8 @@
         <w:t xml:space="preserve">applied in both directions. ◻</w:t>
       </w:r>
     </w:p>
-    <w:bookmarkEnd w:id="124"/>
-    <w:bookmarkStart w:id="125" w:name="proof-of-lemma-2"/>
+    <w:bookmarkEnd w:id="126"/>
+    <w:bookmarkStart w:id="127" w:name="proof-of-lemma-2"/>
     <w:p>
       <w:pPr>
         <w:pStyle w:val="Heading2"/>
@@ -48193,8 +48725,8 @@
         <w:t xml:space="preserve">value obeys. ◻</w:t>
       </w:r>
     </w:p>
-    <w:bookmarkEnd w:id="125"/>
-    <w:bookmarkStart w:id="126" w:name="proof-of-proposition-1"/>
+    <w:bookmarkEnd w:id="127"/>
+    <w:bookmarkStart w:id="128" w:name="proof-of-proposition-1"/>
     <w:p>
       <w:pPr>
         <w:pStyle w:val="Heading2"/>
@@ -48546,8 +49078,8 @@
         <w:t xml:space="preserve">for all tasks. ◻</w:t>
       </w:r>
     </w:p>
-    <w:bookmarkEnd w:id="126"/>
-    <w:bookmarkStart w:id="127" w:name="proof-of-proposition-3"/>
+    <w:bookmarkEnd w:id="128"/>
+    <w:bookmarkStart w:id="129" w:name="proof-of-proposition-3"/>
     <w:p>
       <w:pPr>
         <w:pStyle w:val="Heading2"/>
@@ -49748,8 +50280,8 @@
         <w:t xml:space="preserve">without a further Bonferroni factor. ◻</w:t>
       </w:r>
     </w:p>
-    <w:bookmarkEnd w:id="127"/>
-    <w:bookmarkStart w:id="128" w:name="proof-of-proposition-4"/>
+    <w:bookmarkEnd w:id="129"/>
+    <w:bookmarkStart w:id="130" w:name="proof-of-proposition-4"/>
     <w:p>
       <w:pPr>
         <w:pStyle w:val="Heading2"/>
@@ -50166,8 +50698,8 @@
         <w:t xml:space="preserve">simultaneous coverage. ◻</w:t>
       </w:r>
     </w:p>
-    <w:bookmarkEnd w:id="128"/>
-    <w:bookmarkStart w:id="129" w:name="proof-of-theorem-3"/>
+    <w:bookmarkEnd w:id="130"/>
+    <w:bookmarkStart w:id="131" w:name="proof-of-theorem-3"/>
     <w:p>
       <w:pPr>
         <w:pStyle w:val="Heading2"/>
@@ -50627,8 +51159,8 @@
         <w:t xml:space="preserve">the realized reversal. ◻</w:t>
       </w:r>
     </w:p>
-    <w:bookmarkEnd w:id="129"/>
-    <w:bookmarkStart w:id="131" w:name="why-a-naive-dkw-bound-fails"/>
+    <w:bookmarkEnd w:id="131"/>
+    <w:bookmarkStart w:id="133" w:name="why-a-naive-dkw-bound-fails"/>
     <w:p>
       <w:pPr>
         <w:pStyle w:val="Heading2"/>
@@ -50637,7 +51169,7 @@
         <w:t xml:space="preserve">Why a naive DKW bound fails</w:t>
       </w:r>
     </w:p>
-    <w:bookmarkStart w:id="130" w:name="rem:dkw"/>
+    <w:bookmarkStart w:id="132" w:name="rem:dkw"/>
     <w:p>
       <w:pPr>
         <w:pStyle w:val="FirstParagraph"/>
@@ -50899,9 +51431,9 @@
         <w:t xml:space="preserve">absorbed into a single-sample DKW envelope.</w:t>
       </w:r>
     </w:p>
-    <w:bookmarkEnd w:id="130"/>
-    <w:bookmarkEnd w:id="131"/>
-    <w:bookmarkStart w:id="133" w:name="relation-to-llm-evaluation-statistics"/>
+    <w:bookmarkEnd w:id="132"/>
+    <w:bookmarkEnd w:id="133"/>
+    <w:bookmarkStart w:id="135" w:name="relation-to-llm-evaluation-statistics"/>
     <w:p>
       <w:pPr>
         <w:pStyle w:val="Heading2"/>
@@ -50910,7 +51442,7 @@
         <w:t xml:space="preserve">Relation to LLM-evaluation statistics</w:t>
       </w:r>
     </w:p>
-    <w:bookmarkStart w:id="132" w:name="rem:evalstats"/>
+    <w:bookmarkStart w:id="134" w:name="rem:evalstats"/>
     <w:p>
       <w:pPr>
         <w:pStyle w:val="FirstParagraph"/>
@@ -51080,9 +51612,9 @@
         <w:t xml:space="preserve">precisely what the exact Clopper–Pearson construction provides.</w:t>
       </w:r>
     </w:p>
-    <w:bookmarkEnd w:id="132"/>
-    <w:bookmarkEnd w:id="133"/>
-    <w:bookmarkStart w:id="134" w:name="subsec:power"/>
+    <w:bookmarkEnd w:id="134"/>
+    <w:bookmarkEnd w:id="135"/>
+    <w:bookmarkStart w:id="136" w:name="subsec:power"/>
     <w:p>
       <w:pPr>
         <w:pStyle w:val="Heading2"/>
@@ -51406,9 +51938,9 @@
         <w:t xml:space="preserve">that verifies incomparability need not verify interference.</w:t>
       </w:r>
     </w:p>
-    <w:bookmarkEnd w:id="134"/>
-    <w:bookmarkEnd w:id="135"/>
-    <w:bookmarkStart w:id="142" w:name="app:record"/>
+    <w:bookmarkEnd w:id="136"/>
+    <w:bookmarkEnd w:id="137"/>
+    <w:bookmarkStart w:id="144" w:name="app:record"/>
     <w:p>
       <w:pPr>
         <w:pStyle w:val="Heading1"/>
@@ -51417,7 +51949,7 @@
         <w:t xml:space="preserve">Extended experimental record</w:t>
       </w:r>
     </w:p>
-    <w:bookmarkStart w:id="136" w:name="tab:percell"/>
+    <w:bookmarkStart w:id="138" w:name="tab:percell"/>
     <w:p>
       <w:pPr>
         <w:pStyle w:val="TableCaption"/>
@@ -53609,8 +54141,8 @@
         </w:tc>
       </w:tr>
     </w:tbl>
-    <w:bookmarkEnd w:id="136"/>
-    <w:bookmarkStart w:id="141" w:name="generality-and-controls-full-protocols"/>
+    <w:bookmarkEnd w:id="138"/>
+    <w:bookmarkStart w:id="143" w:name="generality-and-controls-full-protocols"/>
     <w:p>
       <w:pPr>
         <w:pStyle w:val="Heading2"/>
@@ -53633,7 +54165,7 @@
         <w:t xml:space="preserve">confound, and whether the anti-monotonicity collapse is curable by cheap prompting.</w:t>
       </w:r>
     </w:p>
-    <w:bookmarkStart w:id="137" w:name="Xfd2ce319a26faa67e0eadf0fee657d728019446"/>
+    <w:bookmarkStart w:id="139" w:name="Xfd2ce319a26faa67e0eadf0fee657d728019446"/>
     <w:p>
       <w:pPr>
         <w:pStyle w:val="Heading4"/>
@@ -54565,8 +55097,8 @@
         <w:t xml:space="preserve">, not a second mis-rank.</w:t>
       </w:r>
     </w:p>
-    <w:bookmarkEnd w:id="137"/>
-    <w:bookmarkStart w:id="138" w:name="a-length-matched-padding-control."/>
+    <w:bookmarkEnd w:id="139"/>
+    <w:bookmarkStart w:id="140" w:name="a-length-matched-padding-control."/>
     <w:p>
       <w:pPr>
         <w:pStyle w:val="Heading4"/>
@@ -55312,8 +55844,8 @@
         <w:t xml:space="preserve">untested middle case.</w:t>
       </w:r>
     </w:p>
-    <w:bookmarkEnd w:id="138"/>
-    <w:bookmarkStart w:id="139" w:name="Xd508a319e40f775fe4906e106ed6a92e07fd05b"/>
+    <w:bookmarkEnd w:id="140"/>
+    <w:bookmarkStart w:id="141" w:name="Xd508a319e40f775fe4906e106ed6a92e07fd05b"/>
     <w:p>
       <w:pPr>
         <w:pStyle w:val="Heading4"/>
@@ -55954,8 +56486,8 @@
         <w:t xml:space="preserve">the superset, survives the ablation intact.</w:t>
       </w:r>
     </w:p>
-    <w:bookmarkEnd w:id="139"/>
-    <w:bookmarkStart w:id="140" w:name="X9488de75bf9879d7a0599574b61e9ffd4996347"/>
+    <w:bookmarkEnd w:id="141"/>
+    <w:bookmarkStart w:id="142" w:name="X9488de75bf9879d7a0599574b61e9ffd4996347"/>
     <w:p>
       <w:pPr>
         <w:pStyle w:val="Heading4"/>
@@ -56628,10 +57160,10 @@
         <w:t xml:space="preserve">dropping the dominated signal, locates the failure in convention-to-task routing.</w:t>
       </w:r>
     </w:p>
-    <w:bookmarkEnd w:id="140"/>
-    <w:bookmarkEnd w:id="141"/>
     <w:bookmarkEnd w:id="142"/>
-    <w:bookmarkStart w:id="234" w:name="app:repro"/>
+    <w:bookmarkEnd w:id="143"/>
+    <w:bookmarkEnd w:id="144"/>
+    <w:bookmarkStart w:id="236" w:name="app:repro"/>
     <w:p>
       <w:pPr>
         <w:pStyle w:val="Heading1"/>
@@ -56831,7 +57363,7 @@
         <w:t xml:space="preserve">endpoint, and all API keys are read from the environment (never written to a file).</w:t>
       </w:r>
     </w:p>
-    <w:bookmarkStart w:id="143" w:name="protocol."/>
+    <w:bookmarkStart w:id="145" w:name="protocol."/>
     <w:p>
       <w:pPr>
         <w:pStyle w:val="Heading4"/>
@@ -57207,8 +57739,8 @@
         <w:t xml:space="preserve">.</w:t>
       </w:r>
     </w:p>
-    <w:bookmarkEnd w:id="143"/>
-    <w:bookmarkStart w:id="144" w:name="decoding-seeding-and-retries."/>
+    <w:bookmarkEnd w:id="145"/>
+    <w:bookmarkStart w:id="146" w:name="decoding-seeding-and-retries."/>
     <w:p>
       <w:pPr>
         <w:pStyle w:val="Heading4"/>
@@ -57317,8 +57849,8 @@
         <w:t xml:space="preserve">arm; noted in the artifact list), so no reported cell mixes outage-scored draws with real ones.</w:t>
       </w:r>
     </w:p>
-    <w:bookmarkEnd w:id="144"/>
-    <w:bookmarkStart w:id="145" w:name="artifacts."/>
+    <w:bookmarkEnd w:id="146"/>
+    <w:bookmarkStart w:id="147" w:name="artifacts."/>
     <w:p>
       <w:pPr>
         <w:pStyle w:val="Heading4"/>
@@ -57653,8 +58185,8 @@
         <w:t xml:space="preserve">.</w:t>
       </w:r>
     </w:p>
-    <w:bookmarkEnd w:id="145"/>
-    <w:bookmarkStart w:id="146" w:name="compute-and-cost."/>
+    <w:bookmarkEnd w:id="147"/>
+    <w:bookmarkStart w:id="148" w:name="compute-and-cost."/>
     <w:p>
       <w:pPr>
         <w:pStyle w:val="Heading4"/>
@@ -57701,8 +58233,8 @@
         <w:t xml:space="preserve">on open weights at zero API cost.</w:t>
       </w:r>
     </w:p>
-    <w:bookmarkEnd w:id="146"/>
-    <w:bookmarkStart w:id="233" w:name="reference-verification."/>
+    <w:bookmarkEnd w:id="148"/>
+    <w:bookmarkStart w:id="235" w:name="reference-verification."/>
     <w:p>
       <w:pPr>
         <w:pStyle w:val="Heading4"/>
@@ -57737,8 +58269,8 @@
         <w:t xml:space="preserve">1964/1986; Torgersen 1991; Ethayarajh et al. 2022) were checked against the primary sources.</w:t>
       </w:r>
     </w:p>
-    <w:bookmarkStart w:id="232" w:name="refs"/>
-    <w:bookmarkStart w:id="148" w:name="ref-akdemir2025"/>
+    <w:bookmarkStart w:id="234" w:name="refs"/>
+    <w:bookmarkStart w:id="150" w:name="ref-akdemir2025"/>
     <w:p>
       <w:pPr>
         <w:pStyle w:val="Bibliography"/>
@@ -57777,7 +58309,7 @@
       <w:r>
         <w:t xml:space="preserve"> </w:t>
       </w:r>
-      <w:hyperlink r:id="rId147">
+      <w:hyperlink r:id="rId149">
         <w:r>
           <w:rPr>
             <w:rStyle w:val="Hyperlink"/>
@@ -57789,8 +58321,8 @@
         <w:t xml:space="preserve">.</w:t>
       </w:r>
     </w:p>
-    <w:bookmarkEnd w:id="148"/>
-    <w:bookmarkStart w:id="150" w:name="ref-blackwell1953"/>
+    <w:bookmarkEnd w:id="150"/>
+    <w:bookmarkStart w:id="152" w:name="ref-blackwell1953"/>
     <w:p>
       <w:pPr>
         <w:pStyle w:val="Bibliography"/>
@@ -57823,7 +58355,7 @@
       <w:r>
         <w:t xml:space="preserve"> </w:t>
       </w:r>
-      <w:hyperlink r:id="rId149">
+      <w:hyperlink r:id="rId151">
         <w:r>
           <w:rPr>
             <w:rStyle w:val="Hyperlink"/>
@@ -57835,8 +58367,8 @@
         <w:t xml:space="preserve">.</w:t>
       </w:r>
     </w:p>
-    <w:bookmarkEnd w:id="150"/>
-    <w:bookmarkStart w:id="151" w:name="ref-bonferroni1936"/>
+    <w:bookmarkEnd w:id="152"/>
+    <w:bookmarkStart w:id="153" w:name="ref-bonferroni1936"/>
     <w:p>
       <w:pPr>
         <w:pStyle w:val="Bibliography"/>
@@ -57867,8 +58399,8 @@
         <w:t xml:space="preserve">8: 3–62.</w:t>
       </w:r>
     </w:p>
-    <w:bookmarkEnd w:id="151"/>
-    <w:bookmarkStart w:id="153" w:name="ref-bowyer2025clt"/>
+    <w:bookmarkEnd w:id="153"/>
+    <w:bookmarkStart w:id="155" w:name="ref-bowyer2025clt"/>
     <w:p>
       <w:pPr>
         <w:pStyle w:val="Bibliography"/>
@@ -57922,7 +58454,7 @@
       <w:r>
         <w:t xml:space="preserve"> </w:t>
       </w:r>
-      <w:hyperlink r:id="rId152">
+      <w:hyperlink r:id="rId154">
         <w:r>
           <w:rPr>
             <w:rStyle w:val="Hyperlink"/>
@@ -57934,8 +58466,8 @@
         <w:t xml:space="preserve">.</w:t>
       </w:r>
     </w:p>
-    <w:bookmarkEnd w:id="153"/>
-    <w:bookmarkStart w:id="155" w:name="ref-bradley2024garbling"/>
+    <w:bookmarkEnd w:id="155"/>
+    <w:bookmarkStart w:id="157" w:name="ref-bradley2024garbling"/>
     <w:p>
       <w:pPr>
         <w:pStyle w:val="Bibliography"/>
@@ -57977,7 +58509,7 @@
       <w:r>
         <w:t xml:space="preserve"> </w:t>
       </w:r>
-      <w:hyperlink r:id="rId154">
+      <w:hyperlink r:id="rId156">
         <w:r>
           <w:rPr>
             <w:rStyle w:val="Hyperlink"/>
@@ -57989,8 +58521,8 @@
         <w:t xml:space="preserve">.</w:t>
       </w:r>
     </w:p>
-    <w:bookmarkEnd w:id="155"/>
-    <w:bookmarkStart w:id="157" w:name="ref-carbonell1998"/>
+    <w:bookmarkEnd w:id="157"/>
+    <w:bookmarkStart w:id="159" w:name="ref-carbonell1998"/>
     <w:p>
       <w:pPr>
         <w:pStyle w:val="Bibliography"/>
@@ -58029,7 +58561,7 @@
       <w:r>
         <w:t xml:space="preserve"> </w:t>
       </w:r>
-      <w:hyperlink r:id="rId156">
+      <w:hyperlink r:id="rId158">
         <w:r>
           <w:rPr>
             <w:rStyle w:val="Hyperlink"/>
@@ -58041,8 +58573,8 @@
         <w:t xml:space="preserve">.</w:t>
       </w:r>
     </w:p>
-    <w:bookmarkEnd w:id="157"/>
-    <w:bookmarkStart w:id="159" w:name="ref-conformalip2025"/>
+    <w:bookmarkEnd w:id="159"/>
+    <w:bookmarkStart w:id="161" w:name="ref-conformalip2025"/>
     <w:p>
       <w:pPr>
         <w:pStyle w:val="Bibliography"/>
@@ -58072,7 +58604,7 @@
       <w:r>
         <w:t xml:space="preserve"> </w:t>
       </w:r>
-      <w:hyperlink r:id="rId158">
+      <w:hyperlink r:id="rId160">
         <w:r>
           <w:rPr>
             <w:rStyle w:val="Hyperlink"/>
@@ -58084,8 +58616,8 @@
         <w:t xml:space="preserve">.</w:t>
       </w:r>
     </w:p>
-    <w:bookmarkEnd w:id="159"/>
-    <w:bookmarkStart w:id="161" w:name="ref-bedllm2026"/>
+    <w:bookmarkEnd w:id="161"/>
+    <w:bookmarkStart w:id="163" w:name="ref-bedllm2026"/>
     <w:p>
       <w:pPr>
         <w:pStyle w:val="Bibliography"/>
@@ -58133,7 +58665,7 @@
       <w:r>
         <w:t xml:space="preserve"> </w:t>
       </w:r>
-      <w:hyperlink r:id="rId160">
+      <w:hyperlink r:id="rId162">
         <w:r>
           <w:rPr>
             <w:rStyle w:val="Hyperlink"/>
@@ -58145,8 +58677,8 @@
         <w:t xml:space="preserve">.</w:t>
       </w:r>
     </w:p>
-    <w:bookmarkEnd w:id="161"/>
-    <w:bookmarkStart w:id="163" w:name="ref-clopperpearson1934"/>
+    <w:bookmarkEnd w:id="163"/>
+    <w:bookmarkStart w:id="165" w:name="ref-clopperpearson1934"/>
     <w:p>
       <w:pPr>
         <w:pStyle w:val="Bibliography"/>
@@ -58179,7 +58711,7 @@
       <w:r>
         <w:t xml:space="preserve"> </w:t>
       </w:r>
-      <w:hyperlink r:id="rId162">
+      <w:hyperlink r:id="rId164">
         <w:r>
           <w:rPr>
             <w:rStyle w:val="Hyperlink"/>
@@ -58191,8 +58723,8 @@
         <w:t xml:space="preserve">.</w:t>
       </w:r>
     </w:p>
-    <w:bookmarkEnd w:id="163"/>
-    <w:bookmarkStart w:id="165" w:name="ref-cuconasu2024noise"/>
+    <w:bookmarkEnd w:id="165"/>
+    <w:bookmarkStart w:id="167" w:name="ref-cuconasu2024noise"/>
     <w:p>
       <w:pPr>
         <w:pStyle w:val="Bibliography"/>
@@ -58234,7 +58766,7 @@
       <w:r>
         <w:t xml:space="preserve"> </w:t>
       </w:r>
-      <w:hyperlink r:id="rId164">
+      <w:hyperlink r:id="rId166">
         <w:r>
           <w:rPr>
             <w:rStyle w:val="Hyperlink"/>
@@ -58246,8 +58778,8 @@
         <w:t xml:space="preserve">.</w:t>
       </w:r>
     </w:p>
-    <w:bookmarkEnd w:id="165"/>
-    <w:bookmarkStart w:id="167" w:name="ref-contexthurts2025"/>
+    <w:bookmarkEnd w:id="167"/>
+    <w:bookmarkStart w:id="169" w:name="ref-contexthurts2025"/>
     <w:p>
       <w:pPr>
         <w:pStyle w:val="Bibliography"/>
@@ -58289,7 +58821,7 @@
       <w:r>
         <w:t xml:space="preserve"> </w:t>
       </w:r>
-      <w:hyperlink r:id="rId166">
+      <w:hyperlink r:id="rId168">
         <w:r>
           <w:rPr>
             <w:rStyle w:val="Hyperlink"/>
@@ -58301,8 +58833,8 @@
         <w:t xml:space="preserve">.</w:t>
       </w:r>
     </w:p>
-    <w:bookmarkEnd w:id="167"/>
-    <w:bookmarkStart w:id="169" w:name="ref-dvoretzky1956"/>
+    <w:bookmarkEnd w:id="169"/>
+    <w:bookmarkStart w:id="171" w:name="ref-dvoretzky1956"/>
     <w:p>
       <w:pPr>
         <w:pStyle w:val="Bibliography"/>
@@ -58335,7 +58867,7 @@
       <w:r>
         <w:t xml:space="preserve"> </w:t>
       </w:r>
-      <w:hyperlink r:id="rId168">
+      <w:hyperlink r:id="rId170">
         <w:r>
           <w:rPr>
             <w:rStyle w:val="Hyperlink"/>
@@ -58347,8 +58879,8 @@
         <w:t xml:space="preserve">.</w:t>
       </w:r>
     </w:p>
-    <w:bookmarkEnd w:id="169"/>
-    <w:bookmarkStart w:id="170" w:name="ref-ethayarajh2022"/>
+    <w:bookmarkEnd w:id="171"/>
+    <w:bookmarkStart w:id="172" w:name="ref-ethayarajh2022"/>
     <w:p>
       <w:pPr>
         <w:pStyle w:val="Bibliography"/>
@@ -58391,8 +58923,8 @@
         <w:t xml:space="preserve">, PMLR, vol. 162: 5988–6008.</w:t>
       </w:r>
     </w:p>
-    <w:bookmarkEnd w:id="170"/>
-    <w:bookmarkStart w:id="172" w:name="ref-fosse2025"/>
+    <w:bookmarkEnd w:id="172"/>
+    <w:bookmarkStart w:id="174" w:name="ref-fosse2025"/>
     <w:p>
       <w:pPr>
         <w:pStyle w:val="Bibliography"/>
@@ -58422,7 +58954,7 @@
       <w:r>
         <w:t xml:space="preserve"> </w:t>
       </w:r>
-      <w:hyperlink r:id="rId171">
+      <w:hyperlink r:id="rId173">
         <w:r>
           <w:rPr>
             <w:rStyle w:val="Hyperlink"/>
@@ -58434,8 +58966,8 @@
         <w:t xml:space="preserve">.</w:t>
       </w:r>
     </w:p>
-    <w:bookmarkEnd w:id="172"/>
-    <w:bookmarkStart w:id="174" w:name="ref-fuhr2008"/>
+    <w:bookmarkEnd w:id="174"/>
+    <w:bookmarkStart w:id="176" w:name="ref-fuhr2008"/>
     <w:p>
       <w:pPr>
         <w:pStyle w:val="Bibliography"/>
@@ -58468,7 +59000,7 @@
       <w:r>
         <w:t xml:space="preserve"> </w:t>
       </w:r>
-      <w:hyperlink r:id="rId173">
+      <w:hyperlink r:id="rId175">
         <w:r>
           <w:rPr>
             <w:rStyle w:val="Hyperlink"/>
@@ -58480,8 +59012,8 @@
         <w:t xml:space="preserve">.</w:t>
       </w:r>
     </w:p>
-    <w:bookmarkEnd w:id="174"/>
-    <w:bookmarkStart w:id="176" w:name="ref-gao2024modelequality"/>
+    <w:bookmarkEnd w:id="176"/>
+    <w:bookmarkStart w:id="178" w:name="ref-gao2024modelequality"/>
     <w:p>
       <w:pPr>
         <w:pStyle w:val="Bibliography"/>
@@ -58523,7 +59055,7 @@
       <w:r>
         <w:t xml:space="preserve"> </w:t>
       </w:r>
-      <w:hyperlink r:id="rId175">
+      <w:hyperlink r:id="rId177">
         <w:r>
           <w:rPr>
             <w:rStyle w:val="Hyperlink"/>
@@ -58535,8 +59067,8 @@
         <w:t xml:space="preserve">.</w:t>
       </w:r>
     </w:p>
-    <w:bookmarkEnd w:id="176"/>
-    <w:bookmarkStart w:id="178" w:name="ref-guu2020realm"/>
+    <w:bookmarkEnd w:id="178"/>
+    <w:bookmarkStart w:id="180" w:name="ref-guu2020realm"/>
     <w:p>
       <w:pPr>
         <w:pStyle w:val="Bibliography"/>
@@ -58572,7 +59104,7 @@
       <w:r>
         <w:t xml:space="preserve"> </w:t>
       </w:r>
-      <w:hyperlink r:id="rId177">
+      <w:hyperlink r:id="rId179">
         <w:r>
           <w:rPr>
             <w:rStyle w:val="Hyperlink"/>
@@ -58584,8 +59116,8 @@
         <w:t xml:space="preserve">.</w:t>
       </w:r>
     </w:p>
-    <w:bookmarkEnd w:id="178"/>
-    <w:bookmarkStart w:id="180" w:name="ref-hong2025contextrot"/>
+    <w:bookmarkEnd w:id="180"/>
+    <w:bookmarkStart w:id="182" w:name="ref-hong2025contextrot"/>
     <w:p>
       <w:pPr>
         <w:pStyle w:val="Bibliography"/>
@@ -58637,7 +59169,7 @@
       <w:r>
         <w:t xml:space="preserve"> </w:t>
       </w:r>
-      <w:hyperlink r:id="rId179">
+      <w:hyperlink r:id="rId181">
         <w:r>
           <w:rPr>
             <w:rStyle w:val="Hyperlink"/>
@@ -58649,8 +59181,8 @@
         <w:t xml:space="preserve">.</w:t>
       </w:r>
     </w:p>
-    <w:bookmarkEnd w:id="180"/>
-    <w:bookmarkStart w:id="182" w:name="ref-huang2025gammacover"/>
+    <w:bookmarkEnd w:id="182"/>
+    <w:bookmarkStart w:id="184" w:name="ref-huang2025gammacover"/>
     <w:p>
       <w:pPr>
         <w:pStyle w:val="Bibliography"/>
@@ -58691,7 +59223,7 @@
       <w:r>
         <w:t xml:space="preserve"> </w:t>
       </w:r>
-      <w:hyperlink r:id="rId181">
+      <w:hyperlink r:id="rId183">
         <w:r>
           <w:rPr>
             <w:rStyle w:val="Hyperlink"/>
@@ -58703,8 +59235,8 @@
         <w:t xml:space="preserve">.</w:t>
       </w:r>
     </w:p>
-    <w:bookmarkEnd w:id="182"/>
-    <w:bookmarkStart w:id="184" w:name="ref-jin2024longrag"/>
+    <w:bookmarkEnd w:id="184"/>
+    <w:bookmarkStart w:id="186" w:name="ref-jin2024longrag"/>
     <w:p>
       <w:pPr>
         <w:pStyle w:val="Bibliography"/>
@@ -58764,7 +59296,7 @@
       <w:r>
         <w:t xml:space="preserve"> </w:t>
       </w:r>
-      <w:hyperlink r:id="rId183">
+      <w:hyperlink r:id="rId185">
         <w:r>
           <w:rPr>
             <w:rStyle w:val="Hyperlink"/>
@@ -58776,8 +59308,8 @@
         <w:t xml:space="preserve">.</w:t>
       </w:r>
     </w:p>
-    <w:bookmarkEnd w:id="184"/>
-    <w:bookmarkStart w:id="186" w:name="ref-sufficientcontext2024"/>
+    <w:bookmarkEnd w:id="186"/>
+    <w:bookmarkStart w:id="188" w:name="ref-sufficientcontext2024"/>
     <w:p>
       <w:pPr>
         <w:pStyle w:val="Bibliography"/>
@@ -58807,7 +59339,7 @@
       <w:r>
         <w:t xml:space="preserve"> </w:t>
       </w:r>
-      <w:hyperlink r:id="rId185">
+      <w:hyperlink r:id="rId187">
         <w:r>
           <w:rPr>
             <w:rStyle w:val="Hyperlink"/>
@@ -58819,8 +59351,8 @@
         <w:t xml:space="preserve">.</w:t>
       </w:r>
     </w:p>
-    <w:bookmarkEnd w:id="186"/>
-    <w:bookmarkStart w:id="188" w:name="ref-khattab2020colbert"/>
+    <w:bookmarkEnd w:id="188"/>
+    <w:bookmarkStart w:id="190" w:name="ref-khattab2020colbert"/>
     <w:p>
       <w:pPr>
         <w:pStyle w:val="Bibliography"/>
@@ -58865,7 +59397,7 @@
       <w:r>
         <w:t xml:space="preserve"> </w:t>
       </w:r>
-      <w:hyperlink r:id="rId187">
+      <w:hyperlink r:id="rId189">
         <w:r>
           <w:rPr>
             <w:rStyle w:val="Hyperlink"/>
@@ -58877,8 +59409,8 @@
         <w:t xml:space="preserve">.</w:t>
       </w:r>
     </w:p>
-    <w:bookmarkEnd w:id="188"/>
-    <w:bookmarkStart w:id="190" w:name="ref-lecam1964"/>
+    <w:bookmarkEnd w:id="190"/>
+    <w:bookmarkStart w:id="192" w:name="ref-lecam1964"/>
     <w:p>
       <w:pPr>
         <w:pStyle w:val="Bibliography"/>
@@ -58911,7 +59443,7 @@
       <w:r>
         <w:t xml:space="preserve"> </w:t>
       </w:r>
-      <w:hyperlink r:id="rId189">
+      <w:hyperlink r:id="rId191">
         <w:r>
           <w:rPr>
             <w:rStyle w:val="Hyperlink"/>
@@ -58923,8 +59455,8 @@
         <w:t xml:space="preserve">.</w:t>
       </w:r>
     </w:p>
-    <w:bookmarkEnd w:id="190"/>
-    <w:bookmarkStart w:id="192" w:name="ref-lecam1986"/>
+    <w:bookmarkEnd w:id="192"/>
+    <w:bookmarkStart w:id="194" w:name="ref-lecam1986"/>
     <w:p>
       <w:pPr>
         <w:pStyle w:val="Bibliography"/>
@@ -58948,7 +59480,7 @@
       <w:r>
         <w:t xml:space="preserve"> </w:t>
       </w:r>
-      <w:hyperlink r:id="rId191">
+      <w:hyperlink r:id="rId193">
         <w:r>
           <w:rPr>
             <w:rStyle w:val="Hyperlink"/>
@@ -58960,8 +59492,8 @@
         <w:t xml:space="preserve">.</w:t>
       </w:r>
     </w:p>
-    <w:bookmarkEnd w:id="192"/>
-    <w:bookmarkStart w:id="194" w:name="ref-relevanceutility2025"/>
+    <w:bookmarkEnd w:id="194"/>
+    <w:bookmarkStart w:id="196" w:name="ref-relevanceutility2025"/>
     <w:p>
       <w:pPr>
         <w:pStyle w:val="Bibliography"/>
@@ -59003,7 +59535,7 @@
       <w:r>
         <w:t xml:space="preserve"> </w:t>
       </w:r>
-      <w:hyperlink r:id="rId193">
+      <w:hyperlink r:id="rId195">
         <w:r>
           <w:rPr>
             <w:rStyle w:val="Hyperlink"/>
@@ -59015,8 +59547,8 @@
         <w:t xml:space="preserve">.</w:t>
       </w:r>
     </w:p>
-    <w:bookmarkEnd w:id="194"/>
-    <w:bookmarkStart w:id="196" w:name="ref-levy2025moredocs"/>
+    <w:bookmarkEnd w:id="196"/>
+    <w:bookmarkStart w:id="198" w:name="ref-levy2025moredocs"/>
     <w:p>
       <w:pPr>
         <w:pStyle w:val="Bibliography"/>
@@ -59055,7 +59587,7 @@
       <w:r>
         <w:t xml:space="preserve"> </w:t>
       </w:r>
-      <w:hyperlink r:id="rId195">
+      <w:hyperlink r:id="rId197">
         <w:r>
           <w:rPr>
             <w:rStyle w:val="Hyperlink"/>
@@ -59067,8 +59599,8 @@
         <w:t xml:space="preserve">.</w:t>
       </w:r>
     </w:p>
-    <w:bookmarkEnd w:id="196"/>
-    <w:bookmarkStart w:id="198" w:name="ref-longcontextdegrade2026"/>
+    <w:bookmarkEnd w:id="198"/>
+    <w:bookmarkStart w:id="200" w:name="ref-longcontextdegrade2026"/>
     <w:p>
       <w:pPr>
         <w:pStyle w:val="Bibliography"/>
@@ -59110,7 +59642,7 @@
       <w:r>
         <w:t xml:space="preserve"> </w:t>
       </w:r>
-      <w:hyperlink r:id="rId197">
+      <w:hyperlink r:id="rId199">
         <w:r>
           <w:rPr>
             <w:rStyle w:val="Hyperlink"/>
@@ -59122,8 +59654,8 @@
         <w:t xml:space="preserve">.</w:t>
       </w:r>
     </w:p>
-    <w:bookmarkEnd w:id="198"/>
-    <w:bookmarkStart w:id="200" w:name="ref-liu2024lost"/>
+    <w:bookmarkEnd w:id="200"/>
+    <w:bookmarkStart w:id="202" w:name="ref-liu2024lost"/>
     <w:p>
       <w:pPr>
         <w:pStyle w:val="Bibliography"/>
@@ -59156,7 +59688,7 @@
       <w:r>
         <w:t xml:space="preserve"> </w:t>
       </w:r>
-      <w:hyperlink r:id="rId199">
+      <w:hyperlink r:id="rId201">
         <w:r>
           <w:rPr>
             <w:rStyle w:val="Hyperlink"/>
@@ -59168,8 +59700,8 @@
         <w:t xml:space="preserve">.</w:t>
       </w:r>
     </w:p>
-    <w:bookmarkEnd w:id="200"/>
-    <w:bookmarkStart w:id="202" w:name="ref-miller2024errorbars"/>
+    <w:bookmarkEnd w:id="202"/>
+    <w:bookmarkStart w:id="204" w:name="ref-miller2024errorbars"/>
     <w:p>
       <w:pPr>
         <w:pStyle w:val="Bibliography"/>
@@ -59199,7 +59731,7 @@
       <w:r>
         <w:t xml:space="preserve"> </w:t>
       </w:r>
-      <w:hyperlink r:id="rId201">
+      <w:hyperlink r:id="rId203">
         <w:r>
           <w:rPr>
             <w:rStyle w:val="Hyperlink"/>
@@ -59211,8 +59743,8 @@
         <w:t xml:space="preserve">.</w:t>
       </w:r>
     </w:p>
-    <w:bookmarkEnd w:id="202"/>
-    <w:bookmarkStart w:id="204" w:name="ref-blackwellrep2026"/>
+    <w:bookmarkEnd w:id="204"/>
+    <w:bookmarkStart w:id="206" w:name="ref-blackwellrep2026"/>
     <w:p>
       <w:pPr>
         <w:pStyle w:val="Bibliography"/>
@@ -59242,7 +59774,7 @@
       <w:r>
         <w:t xml:space="preserve"> </w:t>
       </w:r>
-      <w:hyperlink r:id="rId203">
+      <w:hyperlink r:id="rId205">
         <w:r>
           <w:rPr>
             <w:rStyle w:val="Hyperlink"/>
@@ -59254,8 +59786,8 @@
         <w:t xml:space="preserve">.</w:t>
       </w:r>
     </w:p>
-    <w:bookmarkEnd w:id="204"/>
-    <w:bookmarkStart w:id="206" w:name="ref-sureRAG2026"/>
+    <w:bookmarkEnd w:id="206"/>
+    <w:bookmarkStart w:id="208" w:name="ref-sureRAG2026"/>
     <w:p>
       <w:pPr>
         <w:pStyle w:val="Bibliography"/>
@@ -59291,7 +59823,7 @@
       <w:r>
         <w:t xml:space="preserve"> </w:t>
       </w:r>
-      <w:hyperlink r:id="rId205">
+      <w:hyperlink r:id="rId207">
         <w:r>
           <w:rPr>
             <w:rStyle w:val="Hyperlink"/>
@@ -59303,8 +59835,8 @@
         <w:t xml:space="preserve">.</w:t>
       </w:r>
     </w:p>
-    <w:bookmarkEnd w:id="206"/>
-    <w:bookmarkStart w:id="208" w:name="ref-robertson1977"/>
+    <w:bookmarkEnd w:id="208"/>
+    <w:bookmarkStart w:id="210" w:name="ref-robertson1977"/>
     <w:p>
       <w:pPr>
         <w:pStyle w:val="Bibliography"/>
@@ -59346,7 +59878,7 @@
       <w:r>
         <w:t xml:space="preserve"> </w:t>
       </w:r>
-      <w:hyperlink r:id="rId207">
+      <w:hyperlink r:id="rId209">
         <w:r>
           <w:rPr>
             <w:rStyle w:val="Hyperlink"/>
@@ -59358,8 +59890,8 @@
         <w:t xml:space="preserve">.</w:t>
       </w:r>
     </w:p>
-    <w:bookmarkEnd w:id="208"/>
-    <w:bookmarkStart w:id="210" w:name="ref-vanrooyen2014"/>
+    <w:bookmarkEnd w:id="210"/>
+    <w:bookmarkStart w:id="212" w:name="ref-vanrooyen2014"/>
     <w:p>
       <w:pPr>
         <w:pStyle w:val="Bibliography"/>
@@ -59407,7 +59939,7 @@
       <w:r>
         <w:t xml:space="preserve"> </w:t>
       </w:r>
-      <w:hyperlink r:id="rId209">
+      <w:hyperlink r:id="rId211">
         <w:r>
           <w:rPr>
             <w:rStyle w:val="Hyperlink"/>
@@ -59419,8 +59951,8 @@
         <w:t xml:space="preserve">.</w:t>
       </w:r>
     </w:p>
-    <w:bookmarkEnd w:id="210"/>
-    <w:bookmarkStart w:id="212" w:name="ref-shi2023distracted"/>
+    <w:bookmarkEnd w:id="212"/>
+    <w:bookmarkStart w:id="214" w:name="ref-shi2023distracted"/>
     <w:p>
       <w:pPr>
         <w:pStyle w:val="Bibliography"/>
@@ -59450,7 +59982,7 @@
       <w:r>
         <w:t xml:space="preserve"> </w:t>
       </w:r>
-      <w:hyperlink r:id="rId211">
+      <w:hyperlink r:id="rId213">
         <w:r>
           <w:rPr>
             <w:rStyle w:val="Hyperlink"/>
@@ -59462,8 +59994,8 @@
         <w:t xml:space="preserve">.</w:t>
       </w:r>
     </w:p>
-    <w:bookmarkEnd w:id="212"/>
-    <w:bookmarkStart w:id="214" w:name="ref-shi2023replug"/>
+    <w:bookmarkEnd w:id="214"/>
+    <w:bookmarkStart w:id="216" w:name="ref-shi2023replug"/>
     <w:p>
       <w:pPr>
         <w:pStyle w:val="Bibliography"/>
@@ -59499,7 +60031,7 @@
       <w:r>
         <w:t xml:space="preserve"> </w:t>
       </w:r>
-      <w:hyperlink r:id="rId213">
+      <w:hyperlink r:id="rId215">
         <w:r>
           <w:rPr>
             <w:rStyle w:val="Hyperlink"/>
@@ -59511,8 +60043,8 @@
         <w:t xml:space="preserve">.</w:t>
       </w:r>
     </w:p>
-    <w:bookmarkEnd w:id="214"/>
-    <w:bookmarkStart w:id="216" w:name="ref-sun2023rankgpt"/>
+    <w:bookmarkEnd w:id="216"/>
+    <w:bookmarkStart w:id="218" w:name="ref-sun2023rankgpt"/>
     <w:p>
       <w:pPr>
         <w:pStyle w:val="Bibliography"/>
@@ -59566,7 +60098,7 @@
       <w:r>
         <w:t xml:space="preserve"> </w:t>
       </w:r>
-      <w:hyperlink r:id="rId215">
+      <w:hyperlink r:id="rId217">
         <w:r>
           <w:rPr>
             <w:rStyle w:val="Hyperlink"/>
@@ -59578,8 +60110,8 @@
         <w:t xml:space="preserve">.</w:t>
       </w:r>
     </w:p>
-    <w:bookmarkEnd w:id="216"/>
-    <w:bookmarkStart w:id="218" w:name="ref-torgersen1991"/>
+    <w:bookmarkEnd w:id="218"/>
+    <w:bookmarkStart w:id="220" w:name="ref-torgersen1991"/>
     <w:p>
       <w:pPr>
         <w:pStyle w:val="Bibliography"/>
@@ -59603,7 +60135,7 @@
       <w:r>
         <w:t xml:space="preserve"> </w:t>
       </w:r>
-      <w:hyperlink r:id="rId217">
+      <w:hyperlink r:id="rId219">
         <w:r>
           <w:rPr>
             <w:rStyle w:val="Hyperlink"/>
@@ -59615,8 +60147,8 @@
         <w:t xml:space="preserve">.</w:t>
       </w:r>
     </w:p>
-    <w:bookmarkEnd w:id="218"/>
-    <w:bookmarkStart w:id="220" w:name="ref-inficl2024"/>
+    <w:bookmarkEnd w:id="220"/>
+    <w:bookmarkStart w:id="222" w:name="ref-inficl2024"/>
     <w:p>
       <w:pPr>
         <w:pStyle w:val="Bibliography"/>
@@ -59646,7 +60178,7 @@
       <w:r>
         <w:t xml:space="preserve"> </w:t>
       </w:r>
-      <w:hyperlink r:id="rId219">
+      <w:hyperlink r:id="rId221">
         <w:r>
           <w:rPr>
             <w:rStyle w:val="Hyperlink"/>
@@ -59658,8 +60190,8 @@
         <w:t xml:space="preserve">.</w:t>
       </w:r>
     </w:p>
-    <w:bookmarkEnd w:id="220"/>
-    <w:bookmarkStart w:id="222" w:name="ref-demoshapley2024"/>
+    <w:bookmarkEnd w:id="222"/>
+    <w:bookmarkStart w:id="224" w:name="ref-demoshapley2024"/>
     <w:p>
       <w:pPr>
         <w:pStyle w:val="Bibliography"/>
@@ -59695,7 +60227,7 @@
       <w:r>
         <w:t xml:space="preserve"> </w:t>
       </w:r>
-      <w:hyperlink r:id="rId221">
+      <w:hyperlink r:id="rId223">
         <w:r>
           <w:rPr>
             <w:rStyle w:val="Hyperlink"/>
@@ -59707,8 +60239,8 @@
         <w:t xml:space="preserve">.</w:t>
       </w:r>
     </w:p>
-    <w:bookmarkEnd w:id="222"/>
-    <w:bookmarkStart w:id="224" w:name="ref-ye2023ceil"/>
+    <w:bookmarkEnd w:id="224"/>
+    <w:bookmarkStart w:id="226" w:name="ref-ye2023ceil"/>
     <w:p>
       <w:pPr>
         <w:pStyle w:val="Bibliography"/>
@@ -59738,7 +60270,7 @@
       <w:r>
         <w:t xml:space="preserve"> </w:t>
       </w:r>
-      <w:hyperlink r:id="rId223">
+      <w:hyperlink r:id="rId225">
         <w:r>
           <w:rPr>
             <w:rStyle w:val="Hyperlink"/>
@@ -59750,8 +60282,8 @@
         <w:t xml:space="preserve">.</w:t>
       </w:r>
     </w:p>
-    <w:bookmarkEnd w:id="224"/>
-    <w:bookmarkStart w:id="226" w:name="ref-rankrag2024"/>
+    <w:bookmarkEnd w:id="226"/>
+    <w:bookmarkStart w:id="228" w:name="ref-rankrag2024"/>
     <w:p>
       <w:pPr>
         <w:pStyle w:val="Bibliography"/>
@@ -59796,7 +60328,7 @@
       <w:r>
         <w:t xml:space="preserve"> </w:t>
       </w:r>
-      <w:hyperlink r:id="rId225">
+      <w:hyperlink r:id="rId227">
         <w:r>
           <w:rPr>
             <w:rStyle w:val="Hyperlink"/>
@@ -59808,8 +60340,8 @@
         <w:t xml:space="preserve">.</w:t>
       </w:r>
     </w:p>
-    <w:bookmarkEnd w:id="226"/>
-    <w:bookmarkStart w:id="228" w:name="ref-cale2025"/>
+    <w:bookmarkEnd w:id="228"/>
+    <w:bookmarkStart w:id="230" w:name="ref-cale2025"/>
     <w:p>
       <w:pPr>
         <w:pStyle w:val="Bibliography"/>
@@ -59860,7 +60392,7 @@
       <w:r>
         <w:t xml:space="preserve"> </w:t>
       </w:r>
-      <w:hyperlink r:id="rId227">
+      <w:hyperlink r:id="rId229">
         <w:r>
           <w:rPr>
             <w:rStyle w:val="Hyperlink"/>
@@ -59872,8 +60404,8 @@
         <w:t xml:space="preserve">.</w:t>
       </w:r>
     </w:p>
-    <w:bookmarkEnd w:id="228"/>
-    <w:bookmarkStart w:id="229" w:name="ref-paretoprompts2025"/>
+    <w:bookmarkEnd w:id="230"/>
+    <w:bookmarkStart w:id="231" w:name="ref-paretoprompts2025"/>
     <w:p>
       <w:pPr>
         <w:pStyle w:val="Bibliography"/>
@@ -59901,8 +60433,8 @@
         <w:t xml:space="preserve">.</w:t>
       </w:r>
     </w:p>
-    <w:bookmarkEnd w:id="229"/>
-    <w:bookmarkStart w:id="231" w:name="ref-zheng2024pmi"/>
+    <w:bookmarkEnd w:id="231"/>
+    <w:bookmarkStart w:id="233" w:name="ref-zheng2024pmi"/>
     <w:p>
       <w:pPr>
         <w:pStyle w:val="Bibliography"/>
@@ -59932,7 +60464,7 @@
       <w:r>
         <w:t xml:space="preserve"> </w:t>
       </w:r>
-      <w:hyperlink r:id="rId230">
+      <w:hyperlink r:id="rId232">
         <w:r>
           <w:rPr>
             <w:rStyle w:val="Hyperlink"/>
@@ -59944,10 +60476,10 @@
         <w:t xml:space="preserve">.</w:t>
       </w:r>
     </w:p>
-    <w:bookmarkEnd w:id="231"/>
-    <w:bookmarkEnd w:id="232"/>
     <w:bookmarkEnd w:id="233"/>
     <w:bookmarkEnd w:id="234"/>
+    <w:bookmarkEnd w:id="235"/>
+    <w:bookmarkEnd w:id="236"/>
     <w:sectPr>
       <w:footnotePr>
         <w:numRestart w:val="eachSect"/>

</xml_diff>

<commit_message>
Fix constants paragraph: report actual interference upper bounds (-0.36..-0.69) from tab:interference instead of conflating the point estimate -1.00 with a confidence bound; name all three effects that fail tau (Opus -0.23, Haiku +0.08, pair-2 -0.21)
</commit_message>
<xml_diff>
--- a/paper/blackwell-paper.docx
+++ b/paper/blackwell-paper.docx
@@ -30579,13 +30579,7 @@
         <w:t xml:space="preserve"> </w:t>
       </w:r>
       <w:r>
-        <w:t xml:space="preserve">work in both directions: the verified collapses clear it by wide margins (upper confidence bounds</w:t>
-      </w:r>
-      <w:r>
-        <w:t xml:space="preserve"> </w:t>
-      </w:r>
-      <w:r>
-        <w:t xml:space="preserve">between</w:t>
+        <w:t xml:space="preserve">work in both directions. The verified collapses clear it with upper confidence bounds from</w:t>
       </w:r>
       <w:r>
         <w:t xml:space="preserve"> </w:t>
@@ -30598,14 +30592,98 @@
           <m:t>−</m:t>
         </m:r>
         <m:r>
+          <m:t>0.36</m:t>
+        </m:r>
+      </m:oMath>
+      <w:r>
+        <w:t xml:space="preserve"> </w:t>
+      </w:r>
+      <w:r>
+        <w:t xml:space="preserve">to</w:t>
+      </w:r>
+      <w:r>
+        <w:t xml:space="preserve"> </w:t>
+      </w:r>
+      <m:oMath>
+        <m:r>
+          <m:rPr>
+            <m:sty m:val="p"/>
+          </m:rPr>
+          <m:t>−</m:t>
+        </m:r>
+        <m:r>
+          <m:t>0.69</m:t>
+        </m:r>
+      </m:oMath>
+      <w:r>
+        <w:t xml:space="preserve"> </w:t>
+      </w:r>
+      <w:r>
+        <w:t xml:space="preserve">(Table 6); the length-matched padding control clears it at</w:t>
+      </w:r>
+      <w:r>
+        <w:t xml:space="preserve"> </w:t>
+      </w:r>
+      <m:oMath>
+        <m:r>
+          <m:rPr>
+            <m:sty m:val="p"/>
+          </m:rPr>
+          <m:t>−</m:t>
+        </m:r>
+        <m:r>
           <m:t>0.41</m:t>
         </m:r>
       </m:oMath>
       <w:r>
-        <w:t xml:space="preserve"> </w:t>
-      </w:r>
-      <w:r>
-        <w:t xml:space="preserve">and</w:t>
+        <w:t xml:space="preserve">.</w:t>
+      </w:r>
+      <w:r>
+        <w:t xml:space="preserve"> </w:t>
+      </w:r>
+      <w:r>
+        <w:t xml:space="preserve">Three real effects fail it and are reported as unverified rather than folded in: Opus’s milder</w:t>
+      </w:r>
+      <w:r>
+        <w:t xml:space="preserve"> </w:t>
+      </w:r>
+      <w:r>
+        <w:t xml:space="preserve">collapse (</w:t>
+      </w:r>
+      <m:oMath>
+        <m:r>
+          <m:t>100</m:t>
+        </m:r>
+        <m:r>
+          <m:rPr>
+            <m:sty m:val="p"/>
+          </m:rPr>
+          <m:t>%</m:t>
+        </m:r>
+        <m:r>
+          <m:t>​</m:t>
+        </m:r>
+        <m:r>
+          <m:rPr>
+            <m:sty m:val="p"/>
+          </m:rPr>
+          <m:t>→</m:t>
+        </m:r>
+        <m:r>
+          <m:t>​</m:t>
+        </m:r>
+        <m:r>
+          <m:t>38</m:t>
+        </m:r>
+        <m:r>
+          <m:rPr>
+            <m:sty m:val="p"/>
+          </m:rPr>
+          <m:t>%</m:t>
+        </m:r>
+      </m:oMath>
+      <w:r>
+        <w:t xml:space="preserve">, upper</w:t>
       </w:r>
       <w:r>
         <w:t xml:space="preserve"> </w:t>
@@ -30618,11 +30696,34 @@
           <m:t>−</m:t>
         </m:r>
         <m:r>
-          <m:t>1.00</m:t>
-        </m:r>
-      </m:oMath>
-      <w:r>
-        <w:t xml:space="preserve">), while the second-pair contrast, with upper bound</w:t>
+          <m:t>0.23</m:t>
+        </m:r>
+      </m:oMath>
+      <w:r>
+        <w:t xml:space="preserve">), Haiku’s low-ceiling cell (upper</w:t>
+      </w:r>
+      <w:r>
+        <w:t xml:space="preserve"> </w:t>
+      </w:r>
+      <m:oMath>
+        <m:r>
+          <m:rPr>
+            <m:sty m:val="p"/>
+          </m:rPr>
+          <m:t>+</m:t>
+        </m:r>
+        <m:r>
+          <m:t>0.08</m:t>
+        </m:r>
+      </m:oMath>
+      <w:r>
+        <w:t xml:space="preserve">), and the</w:t>
+      </w:r>
+      <w:r>
+        <w:t xml:space="preserve"> </w:t>
+      </w:r>
+      <w:r>
+        <w:t xml:space="preserve">second-pair contrast (upper</w:t>
       </w:r>
       <w:r>
         <w:t xml:space="preserve"> </w:t>
@@ -30639,19 +30740,13 @@
         </m:r>
       </m:oMath>
       <w:r>
-        <w:t xml:space="preserve">, fails it</w:t>
-      </w:r>
-      <w:r>
-        <w:t xml:space="preserve"> </w:t>
-      </w:r>
-      <w:r>
-        <w:t xml:space="preserve">and is reported as sign-only rather than verified (§7.5). A threshold</w:t>
-      </w:r>
-      <w:r>
-        <w:t xml:space="preserve"> </w:t>
-      </w:r>
-      <w:r>
-        <w:t xml:space="preserve">that some true effects fail is evidence it was not tuned to pass the data.</w:t>
+        <w:t xml:space="preserve">, sign-only; §7.5). A threshold that</w:t>
+      </w:r>
+      <w:r>
+        <w:t xml:space="preserve"> </w:t>
+      </w:r>
+      <w:r>
+        <w:t xml:space="preserve">genuine effects fail is evidence it was not tuned to pass the data.</w:t>
       </w:r>
     </w:p>
     <w:bookmarkEnd w:id="80"/>

</xml_diff>

<commit_message>
Add Lean 4 formalization of both impossibility results
lean/ContextSelection.lean formalizes Theorem (no query-independent scalar
ranks incomparable sources) as no_faithful_query_independent_score and
Proposition (topicality boundary) as topical_score_misranks_trap.

- Mathlib-free: checks against a bare lean binary, no build step
- Order passed explicitly as TotalPre, recording that the obstruction is
  totality of the induced ranking alone, not any property of R
- Demo namespace instantiates both on the paper's own configuration
  (non-vacuity)
- #print axioms: both central theorems depend on NO axioms (constructive,
  no choice, no excluded middle); Demo instances use propext only
- Toolchain pinned (Lean 4.33.1) + README with the one-line check

Paper: new Remark (rem:lean) after the theorem, plus roadmap pointer.
</commit_message>
<xml_diff>
--- a/paper/blackwell-paper.docx
+++ b/paper/blackwell-paper.docx
@@ -3773,7 +3773,13 @@
         <w:t xml:space="preserve"> </w:t>
       </w:r>
       <w:r>
-        <w:t xml:space="preserve">against arXiv/DBLP/publisher records.</w:t>
+        <w:t xml:space="preserve">against arXiv/DBLP/publisher records, and the two impossibility results are machine-checked in</w:t>
+      </w:r>
+      <w:r>
+        <w:t xml:space="preserve"> </w:t>
+      </w:r>
+      <w:r>
+        <w:t xml:space="preserve">Lean 4 (Remark 3).</w:t>
       </w:r>
     </w:p>
     <w:bookmarkEnd w:id="15"/>
@@ -16087,7 +16093,7 @@
     </w:p>
     <w:bookmarkEnd w:id="46"/>
     <w:bookmarkEnd w:id="47"/>
-    <w:bookmarkStart w:id="55" w:name="sec:incomparability"/>
+    <w:bookmarkStart w:id="56" w:name="sec:incomparability"/>
     <w:p>
       <w:pPr>
         <w:pStyle w:val="Heading1"/>
@@ -16237,7 +16243,7 @@
         <w:t xml:space="preserve">score practitioners actually use); the two must not be conflated.</w:t>
       </w:r>
     </w:p>
-    <w:bookmarkStart w:id="52" w:name="query-independent-scores-the-theorem"/>
+    <w:bookmarkStart w:id="53" w:name="query-independent-scores-the-theorem"/>
     <w:p>
       <w:pPr>
         <w:pStyle w:val="Heading2"/>
@@ -17722,7 +17728,252 @@
       </w:r>
     </w:p>
     <w:bookmarkEnd w:id="49"/>
-    <w:bookmarkStart w:id="50" w:name="prop:vinfo-monotone"/>
+    <w:bookmarkStart w:id="50" w:name="rem:lean"/>
+    <w:p>
+      <w:pPr>
+        <w:pStyle w:val="BodyText"/>
+      </w:pPr>
+      <w:r>
+        <w:rPr>
+          <w:i/>
+          <w:iCs/>
+        </w:rPr>
+        <w:t xml:space="preserve">Remark 3</w:t>
+      </w:r>
+      <w:r>
+        <w:t xml:space="preserve"> </w:t>
+      </w:r>
+      <w:r>
+        <w:t xml:space="preserve">(Machine-checked).</w:t>
+      </w:r>
+      <w:r>
+        <w:t xml:space="preserve"> </w:t>
+      </w:r>
+      <w:r>
+        <w:t xml:space="preserve"> </w:t>
+      </w:r>
+      <w:r>
+        <w:t xml:space="preserve">Theorem 2 and Proposition 2 are formalized and</w:t>
+      </w:r>
+      <w:r>
+        <w:t xml:space="preserve"> </w:t>
+      </w:r>
+      <w:r>
+        <w:t xml:space="preserve">machine-checked in Lean 4 (</w:t>
+      </w:r>
+      <w:r>
+        <w:rPr>
+          <w:rStyle w:val="VerbatimChar"/>
+        </w:rPr>
+        <w:t xml:space="preserve">lean/ContextSelection.lean</w:t>
+      </w:r>
+      <w:r>
+        <w:t xml:space="preserve"> </w:t>
+      </w:r>
+      <w:r>
+        <w:t xml:space="preserve">in the artifact repository, as</w:t>
+      </w:r>
+      <w:r>
+        <w:t xml:space="preserve"> </w:t>
+      </w:r>
+      <w:r>
+        <w:rPr>
+          <w:rStyle w:val="VerbatimChar"/>
+        </w:rPr>
+        <w:t xml:space="preserve">no_faithful_query_independent_score</w:t>
+      </w:r>
+      <w:r>
+        <w:t xml:space="preserve"> </w:t>
+      </w:r>
+      <w:r>
+        <w:t xml:space="preserve">and</w:t>
+      </w:r>
+      <w:r>
+        <w:t xml:space="preserve"> </w:t>
+      </w:r>
+      <w:r>
+        <w:rPr>
+          <w:rStyle w:val="VerbatimChar"/>
+        </w:rPr>
+        <w:t xml:space="preserve">topical_score_misranks_trap</w:t>
+      </w:r>
+      <w:r>
+        <w:t xml:space="preserve">). The</w:t>
+      </w:r>
+      <w:r>
+        <w:t xml:space="preserve"> </w:t>
+      </w:r>
+      <w:r>
+        <w:t xml:space="preserve">formalization takes no dependency on Mathlib and checks against a bare</w:t>
+      </w:r>
+      <w:r>
+        <w:t xml:space="preserve"> </w:t>
+      </w:r>
+      <w:r>
+        <w:rPr>
+          <w:rStyle w:val="VerbatimChar"/>
+        </w:rPr>
+        <w:t xml:space="preserve">lean</w:t>
+      </w:r>
+      <w:r>
+        <w:t xml:space="preserve"> </w:t>
+      </w:r>
+      <w:r>
+        <w:t xml:space="preserve">binary; the</w:t>
+      </w:r>
+      <w:r>
+        <w:t xml:space="preserve"> </w:t>
+      </w:r>
+      <w:r>
+        <w:t xml:space="preserve">order on the score codomain is passed explicitly rather than drawn from a typeclass hierarchy,</w:t>
+      </w:r>
+      <w:r>
+        <w:t xml:space="preserve"> </w:t>
+      </w:r>
+      <w:r>
+        <w:t xml:space="preserve">which records the fact that the obstruction is</w:t>
+      </w:r>
+      <w:r>
+        <w:t xml:space="preserve"> </w:t>
+      </w:r>
+      <w:r>
+        <w:rPr>
+          <w:i/>
+          <w:iCs/>
+        </w:rPr>
+        <w:t xml:space="preserve">totality of the induced ranking alone</w:t>
+      </w:r>
+      <w:r>
+        <w:t xml:space="preserve">, not any</w:t>
+      </w:r>
+      <w:r>
+        <w:t xml:space="preserve"> </w:t>
+      </w:r>
+      <w:r>
+        <w:t xml:space="preserve">property of</w:t>
+      </w:r>
+      <w:r>
+        <w:t xml:space="preserve"> </w:t>
+      </w:r>
+      <m:oMath>
+        <m:r>
+          <m:rPr>
+            <m:scr m:val="double-struck"/>
+            <m:sty m:val="p"/>
+          </m:rPr>
+          <m:t>R</m:t>
+        </m:r>
+      </m:oMath>
+      <w:r>
+        <w:t xml:space="preserve">. Every scalar in the excluded class therefore falls under the one theorem.</w:t>
+      </w:r>
+      <w:r>
+        <w:t xml:space="preserve"> </w:t>
+      </w:r>
+      <w:r>
+        <w:t xml:space="preserve">A</w:t>
+      </w:r>
+      <w:r>
+        <w:t xml:space="preserve"> </w:t>
+      </w:r>
+      <w:r>
+        <w:rPr>
+          <w:rStyle w:val="VerbatimChar"/>
+        </w:rPr>
+        <w:t xml:space="preserve">Demo</w:t>
+      </w:r>
+      <w:r>
+        <w:t xml:space="preserve"> </w:t>
+      </w:r>
+      <w:r>
+        <w:t xml:space="preserve">namespace instantiates both results on the paper’s own configuration, so the</w:t>
+      </w:r>
+      <w:r>
+        <w:t xml:space="preserve"> </w:t>
+      </w:r>
+      <w:r>
+        <w:t xml:space="preserve">impossibility statements are not vacuous, and</w:t>
+      </w:r>
+      <w:r>
+        <w:t xml:space="preserve"> </w:t>
+      </w:r>
+      <w:r>
+        <w:rPr>
+          <w:rStyle w:val="VerbatimChar"/>
+        </w:rPr>
+        <w:t xml:space="preserve">#print axioms</w:t>
+      </w:r>
+      <w:r>
+        <w:t xml:space="preserve"> </w:t>
+      </w:r>
+      <w:r>
+        <w:t xml:space="preserve">reports that both central</w:t>
+      </w:r>
+      <w:r>
+        <w:t xml:space="preserve"> </w:t>
+      </w:r>
+      <w:r>
+        <w:t xml:space="preserve">theorems depend on</w:t>
+      </w:r>
+      <w:r>
+        <w:t xml:space="preserve"> </w:t>
+      </w:r>
+      <w:r>
+        <w:rPr>
+          <w:i/>
+          <w:iCs/>
+        </w:rPr>
+        <w:t xml:space="preserve">no</w:t>
+      </w:r>
+      <w:r>
+        <w:t xml:space="preserve"> </w:t>
+      </w:r>
+      <w:r>
+        <w:t xml:space="preserve">axioms: the arguments are constructive, using neither choice nor</w:t>
+      </w:r>
+      <w:r>
+        <w:t xml:space="preserve"> </w:t>
+      </w:r>
+      <w:r>
+        <w:t xml:space="preserve">excluded middle. What is</w:t>
+      </w:r>
+      <w:r>
+        <w:t xml:space="preserve"> </w:t>
+      </w:r>
+      <w:r>
+        <w:rPr>
+          <w:i/>
+          <w:iCs/>
+        </w:rPr>
+        <w:t xml:space="preserve">not</w:t>
+      </w:r>
+      <w:r>
+        <w:t xml:space="preserve"> </w:t>
+      </w:r>
+      <w:r>
+        <w:t xml:space="preserve">formalized is stated as plainly: the</w:t>
+      </w:r>
+      <w:r>
+        <w:t xml:space="preserve"> </w:t>
+      </w:r>
+      <w:r>
+        <w:t xml:space="preserve">Blackwell–Sherman–Stein theorem remains a cited classical black box</w:t>
+      </w:r>
+      <w:r>
+        <w:t xml:space="preserve"> </w:t>
+      </w:r>
+      <w:r>
+        <w:t xml:space="preserve">(Theorem 1), and the statistical procedures of §6 are claims</w:t>
+      </w:r>
+      <w:r>
+        <w:t xml:space="preserve"> </w:t>
+      </w:r>
+      <w:r>
+        <w:t xml:space="preserve">about measurements rather than theorems.</w:t>
+      </w:r>
+    </w:p>
+    <w:bookmarkEnd w:id="50"/>
+    <w:bookmarkStart w:id="51" w:name="prop:vinfo-monotone"/>
     <w:p>
       <w:pPr>
         <w:pStyle w:val="BodyText"/>
@@ -18281,8 +18532,8 @@
         <w:t xml:space="preserve">but collapses it to one real number.</w:t>
       </w:r>
     </w:p>
-    <w:bookmarkEnd w:id="50"/>
-    <w:bookmarkStart w:id="51" w:name="rem:vinfo-scope"/>
+    <w:bookmarkEnd w:id="51"/>
+    <w:bookmarkStart w:id="52" w:name="rem:vinfo-scope"/>
     <w:p>
       <w:pPr>
         <w:pStyle w:val="BodyText"/>
@@ -18292,7 +18543,7 @@
           <w:i/>
           <w:iCs/>
         </w:rPr>
-        <w:t xml:space="preserve">Remark 3</w:t>
+        <w:t xml:space="preserve">Remark 4</w:t>
       </w:r>
       <w:r>
         <w:t xml:space="preserve"> </w:t>
@@ -18355,9 +18606,9 @@
         <w:t xml:space="preserve">a data-processing-monotone functional of the same kernels.</w:t>
       </w:r>
     </w:p>
-    <w:bookmarkEnd w:id="51"/>
     <w:bookmarkEnd w:id="52"/>
-    <w:bookmarkStart w:id="54" w:name="subsec:trap"/>
+    <w:bookmarkEnd w:id="53"/>
+    <w:bookmarkStart w:id="55" w:name="subsec:trap"/>
     <w:p>
       <w:pPr>
         <w:pStyle w:val="Heading2"/>
@@ -18475,7 +18726,7 @@
         <w:t xml:space="preserve">cover it. We make two precise statements instead.</w:t>
       </w:r>
     </w:p>
-    <w:bookmarkStart w:id="53" w:name="prop:trap-constrained"/>
+    <w:bookmarkStart w:id="54" w:name="prop:trap-constrained"/>
     <w:p>
       <w:pPr>
         <w:pStyle w:val="BodyText"/>
@@ -19109,7 +19360,7 @@
         <w:t xml:space="preserve">correctly on all tasks.</w:t>
       </w:r>
     </w:p>
-    <w:bookmarkEnd w:id="53"/>
+    <w:bookmarkEnd w:id="54"/>
     <w:p>
       <w:pPr>
         <w:pStyle w:val="BodyText"/>
@@ -19751,9 +20002,9 @@
         <w:t xml:space="preserve">outside the impossibility class.</w:t>
       </w:r>
     </w:p>
-    <w:bookmarkEnd w:id="54"/>
     <w:bookmarkEnd w:id="55"/>
-    <w:bookmarkStart w:id="67" w:name="sec:estimator"/>
+    <w:bookmarkEnd w:id="56"/>
+    <w:bookmarkStart w:id="68" w:name="sec:estimator"/>
     <w:p>
       <w:pPr>
         <w:pStyle w:val="Heading1"/>
@@ -19788,7 +20039,7 @@
         <w:t xml:space="preserve">distribution-free verification that makes each comparison auditable on a live model.</w:t>
       </w:r>
     </w:p>
-    <w:bookmarkStart w:id="57" w:name="subsec:estimator-name"/>
+    <w:bookmarkStart w:id="58" w:name="subsec:estimator-name"/>
     <w:p>
       <w:pPr>
         <w:pStyle w:val="Heading2"/>
@@ -20742,7 +20993,7 @@
         <w:t xml:space="preserve">-incomparability.</w:t>
       </w:r>
     </w:p>
-    <w:bookmarkStart w:id="56" w:name="rem:notlecam"/>
+    <w:bookmarkStart w:id="57" w:name="rem:notlecam"/>
     <w:p>
       <w:pPr>
         <w:pStyle w:val="BodyText"/>
@@ -20752,7 +21003,7 @@
           <w:i/>
           <w:iCs/>
         </w:rPr>
-        <w:t xml:space="preserve">Remark 4</w:t>
+        <w:t xml:space="preserve">Remark 5</w:t>
       </w:r>
       <w:r>
         <w:t xml:space="preserve"> </w:t>
@@ -21245,9 +21496,9 @@
         <w:t xml:space="preserve">of Definition 5, the measurable shadow of Corollary 1.</w:t>
       </w:r>
     </w:p>
-    <w:bookmarkEnd w:id="56"/>
     <w:bookmarkEnd w:id="57"/>
-    <w:bookmarkStart w:id="60" w:name="subsec:certificate"/>
+    <w:bookmarkEnd w:id="58"/>
+    <w:bookmarkStart w:id="61" w:name="subsec:certificate"/>
     <w:p>
       <w:pPr>
         <w:pStyle w:val="Heading2"/>
@@ -21298,7 +21549,7 @@
         <w:t xml:space="preserve">valid.</w:t>
       </w:r>
     </w:p>
-    <w:bookmarkStart w:id="58" w:name="prop:certificate"/>
+    <w:bookmarkStart w:id="59" w:name="prop:certificate"/>
     <w:p>
       <w:pPr>
         <w:pStyle w:val="BodyText"/>
@@ -23493,7 +23744,7 @@
         <w:t xml:space="preserve">up to the equivalence margin.</w:t>
       </w:r>
     </w:p>
-    <w:bookmarkEnd w:id="58"/>
+    <w:bookmarkEnd w:id="59"/>
     <w:p>
       <w:pPr>
         <w:pStyle w:val="FirstParagraph"/>
@@ -23526,7 +23777,7 @@
         <w:t xml:space="preserve">guidance for black-box LLM evaluation (Appendix A).</w:t>
       </w:r>
     </w:p>
-    <w:bookmarkStart w:id="59" w:name="ass:iid"/>
+    <w:bookmarkStart w:id="60" w:name="ass:iid"/>
     <w:p>
       <w:pPr>
         <w:pStyle w:val="BodyText"/>
@@ -23701,9 +23952,9 @@
         <w:t xml:space="preserve">stark cells), Clopper–Pearson collapses and the verification is conservative.</w:t>
       </w:r>
     </w:p>
-    <w:bookmarkEnd w:id="59"/>
     <w:bookmarkEnd w:id="60"/>
-    <w:bookmarkStart w:id="63" w:name="subsec:interference"/>
+    <w:bookmarkEnd w:id="61"/>
+    <w:bookmarkStart w:id="64" w:name="subsec:interference"/>
     <w:p>
       <w:pPr>
         <w:pStyle w:val="Heading2"/>
@@ -24360,7 +24611,7 @@
         <w:t xml:space="preserve">strictly-more-informative context hurts.”</w:t>
       </w:r>
     </w:p>
-    <w:bookmarkStart w:id="61" w:name="prop:interference"/>
+    <w:bookmarkStart w:id="62" w:name="prop:interference"/>
     <w:p>
       <w:pPr>
         <w:pStyle w:val="BodyText"/>
@@ -25547,11 +25798,11 @@
           <w:i/>
           <w:iCs/>
         </w:rPr>
-        <w:t xml:space="preserve">(Remark 6), and omitting it would repeat the multiplicity error we criticize.</w:t>
+        <w:t xml:space="preserve">(Remark 7), and omitting it would repeat the multiplicity error we criticize.</w:t>
       </w:r>
     </w:p>
-    <w:bookmarkEnd w:id="61"/>
-    <w:bookmarkStart w:id="62" w:name="rem:leaky"/>
+    <w:bookmarkEnd w:id="62"/>
+    <w:bookmarkStart w:id="63" w:name="rem:leaky"/>
     <w:p>
       <w:pPr>
         <w:pStyle w:val="FirstParagraph"/>
@@ -25561,7 +25812,7 @@
           <w:i/>
           <w:iCs/>
         </w:rPr>
-        <w:t xml:space="preserve">Remark 5</w:t>
+        <w:t xml:space="preserve">Remark 6</w:t>
       </w:r>
       <w:r>
         <w:t xml:space="preserve"> </w:t>
@@ -25919,9 +26170,9 @@
         <w:t xml:space="preserve">(§3.3) thus governs which cells can carry the interference verification.</w:t>
       </w:r>
     </w:p>
-    <w:bookmarkEnd w:id="62"/>
     <w:bookmarkEnd w:id="63"/>
-    <w:bookmarkStart w:id="65" w:name="subsec:antimono"/>
+    <w:bookmarkEnd w:id="64"/>
+    <w:bookmarkStart w:id="66" w:name="subsec:antimono"/>
     <w:p>
       <w:pPr>
         <w:pStyle w:val="Heading2"/>
@@ -26047,7 +26298,7 @@
         <w:t xml:space="preserve">optimal-rule order (Theorem 1) and the realized rule diverge.</w:t>
       </w:r>
     </w:p>
-    <w:bookmarkStart w:id="64" w:name="thm:antimono"/>
+    <w:bookmarkStart w:id="65" w:name="thm:antimono"/>
     <w:p>
       <w:pPr>
         <w:pStyle w:val="BodyText"/>
@@ -26935,7 +27186,7 @@
         <w:t xml:space="preserve">.</w:t>
       </w:r>
     </w:p>
-    <w:bookmarkEnd w:id="64"/>
+    <w:bookmarkEnd w:id="65"/>
     <w:p>
       <w:pPr>
         <w:pStyle w:val="BodyText"/>
@@ -26968,8 +27219,8 @@
         <w:t xml:space="preserve">miss it by construction.</w:t>
       </w:r>
     </w:p>
-    <w:bookmarkEnd w:id="65"/>
-    <w:bookmarkStart w:id="66" w:name="subsec:fwer"/>
+    <w:bookmarkEnd w:id="66"/>
+    <w:bookmarkStart w:id="67" w:name="subsec:fwer"/>
     <w:p>
       <w:pPr>
         <w:pStyle w:val="Heading2"/>
@@ -27247,9 +27498,9 @@
         <w:t xml:space="preserve">requirements, which is why the consolidated record marks Opus incomparability as verified and Opus interference as reproduced but not verified; the power analysis is in Appendix A.</w:t>
       </w:r>
     </w:p>
-    <w:bookmarkEnd w:id="66"/>
     <w:bookmarkEnd w:id="67"/>
-    <w:bookmarkStart w:id="107" w:name="sec:experiments"/>
+    <w:bookmarkEnd w:id="68"/>
+    <w:bookmarkStart w:id="108" w:name="sec:experiments"/>
     <w:p>
       <w:pPr>
         <w:pStyle w:val="Heading1"/>
@@ -27324,7 +27575,7 @@
         <w:t xml:space="preserve">(§7.4), so the verification is auditable rather than asserted.</w:t>
       </w:r>
     </w:p>
-    <w:bookmarkStart w:id="70" w:name="sec:design"/>
+    <w:bookmarkStart w:id="71" w:name="sec:design"/>
     <w:p>
       <w:pPr>
         <w:pStyle w:val="Heading2"/>
@@ -28207,7 +28458,7 @@
         <w:t xml:space="preserve">first) as an order control.</w:t>
       </w:r>
     </w:p>
-    <w:bookmarkStart w:id="68" w:name="why-incomparable-garbling-argument."/>
+    <w:bookmarkStart w:id="69" w:name="why-incomparable-garbling-argument."/>
     <w:p>
       <w:pPr>
         <w:pStyle w:val="Heading4"/>
@@ -28459,8 +28710,8 @@
         <w:t xml:space="preserve">(Lemma 1).</w:t>
       </w:r>
     </w:p>
-    <w:bookmarkEnd w:id="68"/>
-    <w:bookmarkStart w:id="69" w:name="confound-defense-the-double-crossover."/>
+    <w:bookmarkEnd w:id="69"/>
+    <w:bookmarkStart w:id="70" w:name="confound-defense-the-double-crossover."/>
     <w:p>
       <w:pPr>
         <w:pStyle w:val="Heading4"/>
@@ -28677,9 +28928,9 @@
         <w:t xml:space="preserve">do not use those cells for claims that require a near-zero baseline.</w:t>
       </w:r>
     </w:p>
-    <w:bookmarkEnd w:id="69"/>
     <w:bookmarkEnd w:id="70"/>
-    <w:bookmarkStart w:id="73" w:name="sec:tasks"/>
+    <w:bookmarkEnd w:id="71"/>
+    <w:bookmarkStart w:id="74" w:name="sec:tasks"/>
     <w:p>
       <w:pPr>
         <w:pStyle w:val="Heading2"/>
@@ -28904,7 +29155,7 @@
         <w:t xml:space="preserve">, or the wrong exception type).</w:t>
       </w:r>
     </w:p>
-    <w:bookmarkStart w:id="71" w:name="verified-battery."/>
+    <w:bookmarkStart w:id="72" w:name="verified-battery."/>
     <w:p>
       <w:pPr>
         <w:pStyle w:val="Heading4"/>
@@ -29090,8 +29341,8 @@
         <w:t xml:space="preserve">deficiency surrogate accordingly (§7.4.1).</w:t>
       </w:r>
     </w:p>
-    <w:bookmarkEnd w:id="71"/>
-    <w:bookmarkStart w:id="72" w:name="the-relevance-trap."/>
+    <w:bookmarkEnd w:id="72"/>
+    <w:bookmarkStart w:id="73" w:name="the-relevance-trap."/>
     <w:p>
       <w:pPr>
         <w:pStyle w:val="Heading4"/>
@@ -29404,9 +29655,9 @@
         <w:t xml:space="preserve">claim for query-independent scalars.</w:t>
       </w:r>
     </w:p>
-    <w:bookmarkEnd w:id="72"/>
     <w:bookmarkEnd w:id="73"/>
-    <w:bookmarkStart w:id="83" w:name="sec:methodology"/>
+    <w:bookmarkEnd w:id="74"/>
+    <w:bookmarkStart w:id="84" w:name="sec:methodology"/>
     <w:p>
       <w:pPr>
         <w:pStyle w:val="Heading2"/>
@@ -29415,7 +29666,7 @@
         <w:t xml:space="preserve">Methodology</w:t>
       </w:r>
     </w:p>
-    <w:bookmarkStart w:id="74" w:name="models-and-vendors."/>
+    <w:bookmarkStart w:id="75" w:name="models-and-vendors."/>
     <w:p>
       <w:pPr>
         <w:pStyle w:val="Heading4"/>
@@ -29456,8 +29707,8 @@
         <w:t xml:space="preserve">intervals, and raw run logs, is the complete empirical object.</w:t>
       </w:r>
     </w:p>
-    <w:bookmarkEnd w:id="74"/>
-    <w:bookmarkStart w:id="76" w:name="harness-and-arms."/>
+    <w:bookmarkEnd w:id="75"/>
+    <w:bookmarkStart w:id="77" w:name="harness-and-arms."/>
     <w:p>
       <w:pPr>
         <w:pStyle w:val="Heading4"/>
@@ -29485,7 +29736,7 @@
       <w:r>
         <w:t xml:space="preserve"> </w:t>
       </w:r>
-      <w:hyperlink r:id="rId75">
+      <w:hyperlink r:id="rId76">
         <w:r>
           <w:rPr>
             <w:rStyle w:val="Hyperlink"/>
@@ -29657,8 +29908,8 @@
         <w:t xml:space="preserve">completions per cell.</w:t>
       </w:r>
     </w:p>
-    <w:bookmarkEnd w:id="76"/>
-    <w:bookmarkStart w:id="77" w:name="one-uniform-run-mode."/>
+    <w:bookmarkEnd w:id="77"/>
+    <w:bookmarkStart w:id="78" w:name="one-uniform-run-mode."/>
     <w:p>
       <w:pPr>
         <w:pStyle w:val="Heading4"/>
@@ -29714,8 +29965,8 @@
         <w:t xml:space="preserve">agentic-exploration pathway, so the model must use what it is given in one pass.</w:t>
       </w:r>
     </w:p>
-    <w:bookmarkEnd w:id="77"/>
-    <w:bookmarkStart w:id="78" w:name="what-verified-means-in-plain-terms."/>
+    <w:bookmarkEnd w:id="78"/>
+    <w:bookmarkStart w:id="79" w:name="what-verified-means-in-plain-terms."/>
     <w:p>
       <w:pPr>
         <w:pStyle w:val="Heading4"/>
@@ -29906,8 +30157,8 @@
         <w:t xml:space="preserve">never used as evidence; the protocol reports its own insufficiency rather than hiding it.</w:t>
       </w:r>
     </w:p>
-    <w:bookmarkEnd w:id="78"/>
-    <w:bookmarkStart w:id="79" w:name="verification-parameters."/>
+    <w:bookmarkEnd w:id="79"/>
+    <w:bookmarkStart w:id="80" w:name="verification-parameters."/>
     <w:p>
       <w:pPr>
         <w:pStyle w:val="Heading4"/>
@@ -30403,8 +30654,8 @@
         <w:t xml:space="preserve">the interference contrast, which mixes intermediate baselines, does not.</w:t>
       </w:r>
     </w:p>
-    <w:bookmarkEnd w:id="79"/>
-    <w:bookmarkStart w:id="80" w:name="why-these-constants."/>
+    <w:bookmarkEnd w:id="80"/>
+    <w:bookmarkStart w:id="81" w:name="why-these-constants."/>
     <w:p>
       <w:pPr>
         <w:pStyle w:val="Heading4"/>
@@ -30749,8 +31000,8 @@
         <w:t xml:space="preserve">genuine effects fail is evidence it was not tuned to pass the data.</w:t>
       </w:r>
     </w:p>
-    <w:bookmarkEnd w:id="80"/>
-    <w:bookmarkStart w:id="81" w:name="sampling-regime."/>
+    <w:bookmarkEnd w:id="81"/>
+    <w:bookmarkStart w:id="82" w:name="sampling-regime."/>
     <w:p>
       <w:pPr>
         <w:pStyle w:val="Heading4"/>
@@ -30813,8 +31064,8 @@
         <w:t xml:space="preserve">policy, and retry policy in Appendix C.</w:t>
       </w:r>
     </w:p>
-    <w:bookmarkEnd w:id="81"/>
-    <w:bookmarkStart w:id="82" w:name="spend."/>
+    <w:bookmarkEnd w:id="82"/>
+    <w:bookmarkStart w:id="83" w:name="spend."/>
     <w:p>
       <w:pPr>
         <w:pStyle w:val="Heading4"/>
@@ -30843,9 +31094,9 @@
         <w:t xml:space="preserve">returns no cost field, so this figure is not the total cost across all six models.</w:t>
       </w:r>
     </w:p>
-    <w:bookmarkEnd w:id="82"/>
     <w:bookmarkEnd w:id="83"/>
-    <w:bookmarkStart w:id="103" w:name="sec:results"/>
+    <w:bookmarkEnd w:id="84"/>
+    <w:bookmarkStart w:id="104" w:name="sec:results"/>
     <w:p>
       <w:pPr>
         <w:pStyle w:val="Heading2"/>
@@ -30886,7 +31137,7 @@
         <w:t xml:space="preserve">8 give the underlying quantities.</w:t>
       </w:r>
     </w:p>
-    <w:bookmarkStart w:id="84" w:name="tab:consolidated"/>
+    <w:bookmarkStart w:id="85" w:name="tab:consolidated"/>
     <w:p>
       <w:pPr>
         <w:pStyle w:val="TableCaption"/>
@@ -32151,8 +32402,8 @@
         </w:tc>
       </w:tr>
     </w:tbl>
-    <w:bookmarkEnd w:id="84"/>
-    <w:bookmarkStart w:id="87" w:name="sec:results-incomp"/>
+    <w:bookmarkEnd w:id="85"/>
+    <w:bookmarkStart w:id="88" w:name="sec:results-incomp"/>
     <w:p>
       <w:pPr>
         <w:pStyle w:val="Heading3"/>
@@ -32798,7 +33049,7 @@
         <w:t xml:space="preserve">opposition replicated across six models.</w:t>
       </w:r>
     </w:p>
-    <w:bookmarkStart w:id="85" w:name="tab:LD"/>
+    <w:bookmarkStart w:id="86" w:name="tab:LD"/>
     <w:p>
       <w:pPr>
         <w:pStyle w:val="TableCaption"/>
@@ -33802,8 +34053,8 @@
         </w:tc>
       </w:tr>
     </w:tbl>
-    <w:bookmarkEnd w:id="85"/>
-    <w:bookmarkStart w:id="86" w:name="Xb26a34529b3197c54b6ef78a1946345b612d255"/>
+    <w:bookmarkEnd w:id="86"/>
+    <w:bookmarkStart w:id="87" w:name="Xb26a34529b3197c54b6ef78a1946345b612d255"/>
     <w:p>
       <w:pPr>
         <w:pStyle w:val="Heading4"/>
@@ -34102,7 +34353,7 @@
         </m:r>
       </m:oMath>
       <w:r>
-        <w:t xml:space="preserve">; Remark 5), so neither</w:t>
+        <w:t xml:space="preserve">; Remark 6), so neither</w:t>
       </w:r>
       <w:r>
         <w:t xml:space="preserve"> </w:t>
@@ -34123,9 +34374,9 @@
         <w:t xml:space="preserve">added signal.</w:t>
       </w:r>
     </w:p>
-    <w:bookmarkEnd w:id="86"/>
     <w:bookmarkEnd w:id="87"/>
-    <w:bookmarkStart w:id="90" w:name="sec:results-misrank"/>
+    <w:bookmarkEnd w:id="88"/>
+    <w:bookmarkStart w:id="91" w:name="sec:results-misrank"/>
     <w:p>
       <w:pPr>
         <w:pStyle w:val="Heading3"/>
@@ -34673,7 +34924,7 @@
         <w:t xml:space="preserve">unguessable and that encoding knowledge is useless on this task.</w:t>
       </w:r>
     </w:p>
-    <w:bookmarkStart w:id="89" w:name="X92ef9457b97ee405b154a7eb0fa1aa3a6f2d684"/>
+    <w:bookmarkStart w:id="90" w:name="X92ef9457b97ee405b154a7eb0fa1aa3a6f2d684"/>
     <w:p>
       <w:pPr>
         <w:pStyle w:val="Heading4"/>
@@ -35107,7 +35358,7 @@
         <w:t xml:space="preserve">deficiency verification is built from, not a free scalar.</w:t>
       </w:r>
     </w:p>
-    <w:bookmarkStart w:id="88" w:name="tab:rankers"/>
+    <w:bookmarkStart w:id="89" w:name="tab:rankers"/>
     <w:p>
       <w:pPr>
         <w:pStyle w:val="TableCaption"/>
@@ -36032,10 +36283,10 @@
         </w:tc>
       </w:tr>
     </w:tbl>
-    <w:bookmarkEnd w:id="88"/>
     <w:bookmarkEnd w:id="89"/>
     <w:bookmarkEnd w:id="90"/>
-    <w:bookmarkStart w:id="99" w:name="sec:results-antimono"/>
+    <w:bookmarkEnd w:id="91"/>
+    <w:bookmarkStart w:id="100" w:name="sec:results-antimono"/>
     <w:p>
       <w:pPr>
         <w:pStyle w:val="Heading3"/>
@@ -36596,7 +36847,7 @@
         <w:t xml:space="preserve">Figure 1 shows the collapse across the six models.</w:t>
       </w:r>
     </w:p>
-    <w:bookmarkStart w:id="91" w:name="fig:collapse"/>
+    <w:bookmarkStart w:id="92" w:name="fig:collapse"/>
     <w:tbl>
       <w:tblPr>
         <w:tblStyle w:val="FigureTable"/>
@@ -36864,8 +37115,8 @@
         <w:t xml:space="preserve">; Table 6); Opus reproduces the collapse but does not verify.</w:t>
       </w:r>
     </w:p>
-    <w:bookmarkEnd w:id="91"/>
-    <w:bookmarkStart w:id="94" w:name="Xad950c9ad2efcae5ca328fe88a654bcb87f62fc"/>
+    <w:bookmarkEnd w:id="92"/>
+    <w:bookmarkStart w:id="95" w:name="Xad950c9ad2efcae5ca328fe88a654bcb87f62fc"/>
     <w:p>
       <w:pPr>
         <w:pStyle w:val="Heading4"/>
@@ -37491,7 +37742,7 @@
         <w:t xml:space="preserve">is developed in a companion paper.</w:t>
       </w:r>
     </w:p>
-    <w:bookmarkStart w:id="92" w:name="fig:hasse"/>
+    <w:bookmarkStart w:id="93" w:name="fig:hasse"/>
     <w:tbl>
       <w:tblPr>
         <w:tblStyle w:val="FigureTable"/>
@@ -37939,8 +38190,8 @@
         <w:t xml:space="preserve">rule can represent.</w:t>
       </w:r>
     </w:p>
-    <w:bookmarkEnd w:id="92"/>
-    <w:bookmarkStart w:id="93" w:name="tab:interference"/>
+    <w:bookmarkEnd w:id="93"/>
+    <w:bookmarkStart w:id="94" w:name="tab:interference"/>
     <w:p>
       <w:pPr>
         <w:pStyle w:val="TableCaption"/>
@@ -38358,7 +38609,7 @@
         <w:t xml:space="preserve"> </w:t>
       </w:r>
       <w:r>
-        <w:t xml:space="preserve">Remark 5).</w:t>
+        <w:t xml:space="preserve">Remark 6).</w:t>
       </w:r>
     </w:p>
     <w:tbl>
@@ -38366,7 +38617,7 @@
         <w:tblStyle w:val="Table"/>
         <w:tblW w:type="auto" w:w="0"/>
         <w:tblLook w:firstRow="1" w:lastRow="0" w:firstColumn="0" w:lastColumn="0" w:noHBand="0" w:noVBand="0" w:val="0020"/>
-        <w:tblCaption w:val="Anti-monotonicity (interference) verification on the carrying cell per model. \Psi_T =     \mathrm{PASS}(W_{1+}) - \mathrm{PASS}(W_1) - \mathrm{PASS}(W_2) + \mathrm{PASS}(\texttt{none}); “Upper” is the \eta/4 Clopper–Pearson upper bound \overline\Psi_T of (7); the cell is verified harmful when Upper \le -0.30. The W_1 \to W_{1+} column reports the PASS collapse. The verification clears only on cells whose none baseline floors near zero (the leaky-baseline limitation; Remark 5)."/>
+        <w:tblCaption w:val="Anti-monotonicity (interference) verification on the carrying cell per model. \Psi_T =     \mathrm{PASS}(W_{1+}) - \mathrm{PASS}(W_1) - \mathrm{PASS}(W_2) + \mathrm{PASS}(\texttt{none}); “Upper” is the \eta/4 Clopper–Pearson upper bound \overline\Psi_T of (7); the cell is verified harmful when Upper \le -0.30. The W_1 \to W_{1+} column reports the PASS collapse. The verification clears only on cells whose none baseline floors near zero (the leaky-baseline limitation; Remark 6)."/>
       </w:tblPr>
       <w:tblGrid>
         <w:gridCol w:w="1320"/>
@@ -39485,9 +39736,9 @@
         </w:tc>
       </w:tr>
     </w:tbl>
-    <w:bookmarkEnd w:id="93"/>
     <w:bookmarkEnd w:id="94"/>
-    <w:bookmarkStart w:id="95" w:name="Xe149701baef4ebfc0c0660f6732890156a3bb29"/>
+    <w:bookmarkEnd w:id="95"/>
+    <w:bookmarkStart w:id="96" w:name="Xe149701baef4ebfc0c0660f6732890156a3bb29"/>
     <w:p>
       <w:pPr>
         <w:pStyle w:val="Heading4"/>
@@ -39791,7 +40042,7 @@
         <w:t xml:space="preserve"> </w:t>
       </w:r>
       <w:r>
-        <w:t xml:space="preserve">this as a protocol up front (Remark 5): we verify anti-monotonicity only on cells whose</w:t>
+        <w:t xml:space="preserve">this as a protocol up front (Remark 6): we verify anti-monotonicity only on cells whose</w:t>
       </w:r>
       <w:r>
         <w:t xml:space="preserve"> </w:t>
@@ -39975,8 +40226,8 @@
         <w:t xml:space="preserve">.</w:t>
       </w:r>
     </w:p>
-    <w:bookmarkEnd w:id="95"/>
-    <w:bookmarkStart w:id="96" w:name="position-is-not-the-cause."/>
+    <w:bookmarkEnd w:id="96"/>
+    <w:bookmarkStart w:id="97" w:name="position-is-not-the-cause."/>
     <w:p>
       <w:pPr>
         <w:pStyle w:val="Heading4"/>
@@ -40100,8 +40351,8 @@
         <w:t xml:space="preserve">what turns a harmless arm into a harmful one, so the cause is the added signal, not where it sits.</w:t>
       </w:r>
     </w:p>
-    <w:bookmarkEnd w:id="96"/>
-    <w:bookmarkStart w:id="97" w:name="X086de5874ce71cba9e6d9633bd38de7f701e1cb"/>
+    <w:bookmarkEnd w:id="97"/>
+    <w:bookmarkStart w:id="98" w:name="X086de5874ce71cba9e6d9633bd38de7f701e1cb"/>
     <w:p>
       <w:pPr>
         <w:pStyle w:val="Heading4"/>
@@ -40182,8 +40433,8 @@
         <w:t xml:space="preserve">could be effect rather than cause.</w:t>
       </w:r>
     </w:p>
-    <w:bookmarkEnd w:id="97"/>
-    <w:bookmarkStart w:id="98" w:name="robust-but-not-monotone-in-capability."/>
+    <w:bookmarkEnd w:id="98"/>
+    <w:bookmarkStart w:id="99" w:name="robust-but-not-monotone-in-capability."/>
     <w:p>
       <w:pPr>
         <w:pStyle w:val="Heading4"/>
@@ -40458,9 +40709,9 @@
         <w:t xml:space="preserve">across the ladder, not a capability trend.</w:t>
       </w:r>
     </w:p>
-    <w:bookmarkEnd w:id="98"/>
     <w:bookmarkEnd w:id="99"/>
-    <w:bookmarkStart w:id="102" w:name="sec:results-moat"/>
+    <w:bookmarkEnd w:id="100"/>
+    <w:bookmarkStart w:id="103" w:name="sec:results-moat"/>
     <w:p>
       <w:pPr>
         <w:pStyle w:val="Heading3"/>
@@ -40856,7 +41107,7 @@
         <w:t xml:space="preserve">).</w:t>
       </w:r>
     </w:p>
-    <w:bookmarkStart w:id="100" w:name="fig:spectrum"/>
+    <w:bookmarkStart w:id="101" w:name="fig:spectrum"/>
     <w:tbl>
       <w:tblPr>
         <w:tblStyle w:val="FigureTable"/>
@@ -40987,8 +41238,8 @@
         <w:t xml:space="preserve">different vendor, and Opus (the strongest Anthropic model) guesses more than Sonnet.</w:t>
       </w:r>
     </w:p>
-    <w:bookmarkEnd w:id="100"/>
-    <w:bookmarkStart w:id="101" w:name="auditable-per-cell-record."/>
+    <w:bookmarkEnd w:id="101"/>
+    <w:bookmarkStart w:id="102" w:name="auditable-per-cell-record."/>
     <w:p>
       <w:pPr>
         <w:pStyle w:val="Heading4"/>
@@ -41005,10 +41256,10 @@
         <w:t xml:space="preserve">The full per-arm PASS record for every carrying cell is Table 8 in Appendix B, so each verification can be reconstructed from the reported counts.</w:t>
       </w:r>
     </w:p>
-    <w:bookmarkEnd w:id="101"/>
     <w:bookmarkEnd w:id="102"/>
     <w:bookmarkEnd w:id="103"/>
-    <w:bookmarkStart w:id="104" w:name="sec:results-generality"/>
+    <w:bookmarkEnd w:id="104"/>
+    <w:bookmarkStart w:id="105" w:name="sec:results-generality"/>
     <w:p>
       <w:pPr>
         <w:pStyle w:val="Heading2"/>
@@ -41785,8 +42036,8 @@
         <w:t xml:space="preserve">convention-to-task routing rather than in convention segmentation.</w:t>
       </w:r>
     </w:p>
-    <w:bookmarkEnd w:id="104"/>
-    <w:bookmarkStart w:id="106" w:name="sec:results-policies"/>
+    <w:bookmarkEnd w:id="105"/>
+    <w:bookmarkStart w:id="107" w:name="sec:results-policies"/>
     <w:p>
       <w:pPr>
         <w:pStyle w:val="Heading2"/>
@@ -42124,7 +42375,7 @@
         <w:t xml:space="preserve">family.</w:t>
       </w:r>
     </w:p>
-    <w:bookmarkStart w:id="105" w:name="tab:policies"/>
+    <w:bookmarkStart w:id="106" w:name="tab:policies"/>
     <w:p>
       <w:pPr>
         <w:pStyle w:val="TableCaption"/>
@@ -42815,7 +43066,7 @@
         </w:tc>
       </w:tr>
     </w:tbl>
-    <w:bookmarkEnd w:id="105"/>
+    <w:bookmarkEnd w:id="106"/>
     <w:p>
       <w:pPr>
         <w:pStyle w:val="BodyText"/>
@@ -43009,9 +43260,9 @@
         <w:t xml:space="preserve">each cheap policy forfeits an entire cell class, and no total-order policy can keep all four.</w:t>
       </w:r>
     </w:p>
-    <w:bookmarkEnd w:id="106"/>
     <w:bookmarkEnd w:id="107"/>
-    <w:bookmarkStart w:id="124" w:name="sec:discussion"/>
+    <w:bookmarkEnd w:id="108"/>
+    <w:bookmarkStart w:id="125" w:name="sec:discussion"/>
     <w:p>
       <w:pPr>
         <w:pStyle w:val="Heading1"/>
@@ -43152,7 +43403,7 @@
         <w:t xml:space="preserve">formalization is a model rather than a proof of the realized object.</w:t>
       </w:r>
     </w:p>
-    <w:bookmarkStart w:id="108" w:name="sec:disc-tradeoffs"/>
+    <w:bookmarkStart w:id="109" w:name="sec:disc-tradeoffs"/>
     <w:p>
       <w:pPr>
         <w:pStyle w:val="Heading2"/>
@@ -43366,8 +43617,8 @@
         <w:t xml:space="preserve">claim about their own system that is checked rather than assumed.</w:t>
       </w:r>
     </w:p>
-    <w:bookmarkEnd w:id="108"/>
-    <w:bookmarkStart w:id="111" w:name="sec:disc-bridge"/>
+    <w:bookmarkEnd w:id="109"/>
+    <w:bookmarkStart w:id="112" w:name="sec:disc-bridge"/>
     <w:p>
       <w:pPr>
         <w:pStyle w:val="Heading2"/>
@@ -43380,10 +43631,10 @@
       <w:pPr>
         <w:pStyle w:val="FirstParagraph"/>
       </w:pPr>
-      <w:bookmarkStart w:id="109" w:name="sec:disc-deficiency"/>
-      <w:bookmarkEnd w:id="109"/>
-      <w:bookmarkStart w:id="110" w:name="sec:disc-certificate"/>
+      <w:bookmarkStart w:id="110" w:name="sec:disc-deficiency"/>
       <w:bookmarkEnd w:id="110"/>
+      <w:bookmarkStart w:id="111" w:name="sec:disc-certificate"/>
+      <w:bookmarkEnd w:id="111"/>
     </w:p>
     <w:p>
       <w:pPr>
@@ -43567,7 +43818,7 @@
         <w:t xml:space="preserve"> </w:t>
       </w:r>
       <w:r>
-        <w:t xml:space="preserve">(Remark 4). What is rigorous is the verification, which we regard as the most</w:t>
+        <w:t xml:space="preserve">(Remark 5). What is rigorous is the verification, which we regard as the most</w:t>
       </w:r>
       <w:r>
         <w:t xml:space="preserve"> </w:t>
@@ -43656,8 +43907,8 @@
         <w:t xml:space="preserve">a fixed adversarial battery, not a task distribution.</w:t>
       </w:r>
     </w:p>
-    <w:bookmarkEnd w:id="111"/>
-    <w:bookmarkStart w:id="113" w:name="sec:disc-antimono"/>
+    <w:bookmarkEnd w:id="112"/>
+    <w:bookmarkStart w:id="114" w:name="sec:disc-antimono"/>
     <w:p>
       <w:pPr>
         <w:pStyle w:val="Heading2"/>
@@ -44455,7 +44706,7 @@
         <w:t xml:space="preserve"> </w:t>
       </w:r>
       <w:r>
-        <w:t xml:space="preserve">We treat this as a protocol (Remark 5): we verify anti-monotonicity only on</w:t>
+        <w:t xml:space="preserve">We treat this as a protocol (Remark 6): we verify anti-monotonicity only on</w:t>
       </w:r>
       <w:r>
         <w:t xml:space="preserve"> </w:t>
@@ -44590,7 +44841,7 @@
         <w:t xml:space="preserve">).</w:t>
       </w:r>
     </w:p>
-    <w:bookmarkStart w:id="112" w:name="will-scale-restore-blackwell-coherence"/>
+    <w:bookmarkStart w:id="113" w:name="will-scale-restore-blackwell-coherence"/>
     <w:p>
       <w:pPr>
         <w:pStyle w:val="Heading4"/>
@@ -44865,9 +45116,9 @@
         <w:t xml:space="preserve">itself.</w:t>
       </w:r>
     </w:p>
-    <w:bookmarkEnd w:id="112"/>
     <w:bookmarkEnd w:id="113"/>
-    <w:bookmarkStart w:id="114" w:name="sec:disc-moat"/>
+    <w:bookmarkEnd w:id="114"/>
+    <w:bookmarkStart w:id="115" w:name="sec:disc-moat"/>
     <w:p>
       <w:pPr>
         <w:pStyle w:val="Heading2"/>
@@ -45206,8 +45457,8 @@
         <w:t xml:space="preserve">caps which cells verify per model.</w:t>
       </w:r>
     </w:p>
-    <w:bookmarkEnd w:id="114"/>
-    <w:bookmarkStart w:id="116" w:name="sec:disc-mechanism"/>
+    <w:bookmarkEnd w:id="115"/>
+    <w:bookmarkStart w:id="117" w:name="sec:disc-mechanism"/>
     <w:p>
       <w:pPr>
         <w:pStyle w:val="Heading2"/>
@@ -45661,7 +45912,7 @@
         <w:t xml:space="preserve">mechanistic companion study, downstream of, not prerequisite to, the verified behavioral claim.</w:t>
       </w:r>
     </w:p>
-    <w:bookmarkStart w:id="115" w:name="X37a5acb05d688eb32bbe54c216dbcf303d3b4c3"/>
+    <w:bookmarkStart w:id="116" w:name="X37a5acb05d688eb32bbe54c216dbcf303d3b4c3"/>
     <w:p>
       <w:pPr>
         <w:pStyle w:val="Heading4"/>
@@ -45924,9 +46175,9 @@
         <w:t xml:space="preserve">claim in the paper is independent of which reading is true.</w:t>
       </w:r>
     </w:p>
-    <w:bookmarkEnd w:id="115"/>
     <w:bookmarkEnd w:id="116"/>
-    <w:bookmarkStart w:id="123" w:name="sec:limitations"/>
+    <w:bookmarkEnd w:id="117"/>
+    <w:bookmarkStart w:id="124" w:name="sec:limitations"/>
     <w:p>
       <w:pPr>
         <w:pStyle w:val="Heading2"/>
@@ -45943,7 +46194,7 @@
         <w:t xml:space="preserve">We collect the scope restrictions here; each is stated once and sized to its weight.</w:t>
       </w:r>
     </w:p>
-    <w:bookmarkStart w:id="117" w:name="from-diagnosis-to-selection."/>
+    <w:bookmarkStart w:id="118" w:name="from-diagnosis-to-selection."/>
     <w:p>
       <w:pPr>
         <w:pStyle w:val="Heading4"/>
@@ -46087,8 +46338,8 @@
         <w:t xml:space="preserve">shortlist, is the central open problem this work opens.</w:t>
       </w:r>
     </w:p>
-    <w:bookmarkEnd w:id="117"/>
-    <w:bookmarkStart w:id="118" w:name="source-pair-generality."/>
+    <w:bookmarkEnd w:id="118"/>
+    <w:bookmarkStart w:id="119" w:name="source-pair-generality."/>
     <w:p>
       <w:pPr>
         <w:pStyle w:val="Heading4"/>
@@ -46261,8 +46512,8 @@
         <w:t xml:space="preserve">steps.</w:t>
       </w:r>
     </w:p>
-    <w:bookmarkEnd w:id="118"/>
-    <w:bookmarkStart w:id="119" w:name="Xd344a6caba248cd0f3c9915a6f9f7c4f85f22da"/>
+    <w:bookmarkEnd w:id="119"/>
+    <w:bookmarkStart w:id="120" w:name="Xd344a6caba248cd0f3c9915a6f9f7c4f85f22da"/>
     <w:p>
       <w:pPr>
         <w:pStyle w:val="Heading4"/>
@@ -46371,8 +46622,8 @@
         <w:t xml:space="preserve">comparison.</w:t>
       </w:r>
     </w:p>
-    <w:bookmarkEnd w:id="119"/>
-    <w:bookmarkStart w:id="120" w:name="the-model-is-an-idealization-twice."/>
+    <w:bookmarkEnd w:id="120"/>
+    <w:bookmarkStart w:id="121" w:name="the-model-is-an-idealization-twice."/>
     <w:p>
       <w:pPr>
         <w:pStyle w:val="Heading4"/>
@@ -46480,8 +46731,8 @@
         <w:t xml:space="preserve">document pairs is the direct next experiment.</w:t>
       </w:r>
     </w:p>
-    <w:bookmarkEnd w:id="120"/>
-    <w:bookmarkStart w:id="121" w:name="sampling-and-verification-regime."/>
+    <w:bookmarkEnd w:id="121"/>
+    <w:bookmarkStart w:id="122" w:name="sampling-and-verification-regime."/>
     <w:p>
       <w:pPr>
         <w:pStyle w:val="Heading4"/>
@@ -46542,7 +46793,7 @@
         <w:t xml:space="preserve"> </w:t>
       </w:r>
       <w:r>
-        <w:t xml:space="preserve">baseline floors near zero, stated as a protocol (Remark 5);</w:t>
+        <w:t xml:space="preserve">baseline floors near zero, stated as a protocol (Remark 6);</w:t>
       </w:r>
       <w:r>
         <w:t xml:space="preserve"> </w:t>
@@ -46551,8 +46802,8 @@
         <w:t xml:space="preserve">marginal-versus-joint control is discussed in §8.2.</w:t>
       </w:r>
     </w:p>
-    <w:bookmarkEnd w:id="121"/>
-    <w:bookmarkStart w:id="122" w:name="ranker-spectrum-and-synergy."/>
+    <w:bookmarkEnd w:id="122"/>
+    <w:bookmarkStart w:id="123" w:name="ranker-spectrum-and-synergy."/>
     <w:p>
       <w:pPr>
         <w:pStyle w:val="Heading4"/>
@@ -46650,10 +46901,10 @@
         <w:t xml:space="preserve">beyond its parts; we make no claim about it.</w:t>
       </w:r>
     </w:p>
-    <w:bookmarkEnd w:id="122"/>
     <w:bookmarkEnd w:id="123"/>
     <w:bookmarkEnd w:id="124"/>
-    <w:bookmarkStart w:id="125" w:name="sec:conclusion"/>
+    <w:bookmarkEnd w:id="125"/>
+    <w:bookmarkStart w:id="126" w:name="sec:conclusion"/>
     <w:p>
       <w:pPr>
         <w:pStyle w:val="Heading1"/>
@@ -47068,8 +47319,8 @@
         <w:t xml:space="preserve">domain, are the natural next steps, and the experimental record indicates each is cheap to run.</w:t>
       </w:r>
     </w:p>
-    <w:bookmarkEnd w:id="125"/>
-    <w:bookmarkStart w:id="137" w:name="app:proofs"/>
+    <w:bookmarkEnd w:id="126"/>
+    <w:bookmarkStart w:id="138" w:name="app:proofs"/>
     <w:p>
       <w:pPr>
         <w:pStyle w:val="Heading1"/>
@@ -47078,7 +47329,7 @@
         <w:t xml:space="preserve">Deferred proofs and technical material</w:t>
       </w:r>
     </w:p>
-    <w:bookmarkStart w:id="126" w:name="proof-of-lemma-1"/>
+    <w:bookmarkStart w:id="127" w:name="proof-of-lemma-1"/>
     <w:p>
       <w:pPr>
         <w:pStyle w:val="Heading2"/>
@@ -47716,8 +47967,8 @@
         <w:t xml:space="preserve">applied in both directions. ◻</w:t>
       </w:r>
     </w:p>
-    <w:bookmarkEnd w:id="126"/>
-    <w:bookmarkStart w:id="127" w:name="proof-of-lemma-2"/>
+    <w:bookmarkEnd w:id="127"/>
+    <w:bookmarkStart w:id="128" w:name="proof-of-lemma-2"/>
     <w:p>
       <w:pPr>
         <w:pStyle w:val="Heading2"/>
@@ -48820,8 +49071,8 @@
         <w:t xml:space="preserve">value obeys. ◻</w:t>
       </w:r>
     </w:p>
-    <w:bookmarkEnd w:id="127"/>
-    <w:bookmarkStart w:id="128" w:name="proof-of-proposition-1"/>
+    <w:bookmarkEnd w:id="128"/>
+    <w:bookmarkStart w:id="129" w:name="proof-of-proposition-1"/>
     <w:p>
       <w:pPr>
         <w:pStyle w:val="Heading2"/>
@@ -49173,8 +49424,8 @@
         <w:t xml:space="preserve">for all tasks. ◻</w:t>
       </w:r>
     </w:p>
-    <w:bookmarkEnd w:id="128"/>
-    <w:bookmarkStart w:id="129" w:name="proof-of-proposition-3"/>
+    <w:bookmarkEnd w:id="129"/>
+    <w:bookmarkStart w:id="130" w:name="proof-of-proposition-3"/>
     <w:p>
       <w:pPr>
         <w:pStyle w:val="Heading2"/>
@@ -50375,8 +50626,8 @@
         <w:t xml:space="preserve">without a further Bonferroni factor. ◻</w:t>
       </w:r>
     </w:p>
-    <w:bookmarkEnd w:id="129"/>
-    <w:bookmarkStart w:id="130" w:name="proof-of-proposition-4"/>
+    <w:bookmarkEnd w:id="130"/>
+    <w:bookmarkStart w:id="131" w:name="proof-of-proposition-4"/>
     <w:p>
       <w:pPr>
         <w:pStyle w:val="Heading2"/>
@@ -50793,8 +51044,8 @@
         <w:t xml:space="preserve">simultaneous coverage. ◻</w:t>
       </w:r>
     </w:p>
-    <w:bookmarkEnd w:id="130"/>
-    <w:bookmarkStart w:id="131" w:name="proof-of-theorem-3"/>
+    <w:bookmarkEnd w:id="131"/>
+    <w:bookmarkStart w:id="132" w:name="proof-of-theorem-3"/>
     <w:p>
       <w:pPr>
         <w:pStyle w:val="Heading2"/>
@@ -51254,8 +51505,8 @@
         <w:t xml:space="preserve">the realized reversal. ◻</w:t>
       </w:r>
     </w:p>
-    <w:bookmarkEnd w:id="131"/>
-    <w:bookmarkStart w:id="133" w:name="why-a-naive-dkw-bound-fails"/>
+    <w:bookmarkEnd w:id="132"/>
+    <w:bookmarkStart w:id="134" w:name="why-a-naive-dkw-bound-fails"/>
     <w:p>
       <w:pPr>
         <w:pStyle w:val="Heading2"/>
@@ -51264,7 +51515,7 @@
         <w:t xml:space="preserve">Why a naive DKW bound fails</w:t>
       </w:r>
     </w:p>
-    <w:bookmarkStart w:id="132" w:name="rem:dkw"/>
+    <w:bookmarkStart w:id="133" w:name="rem:dkw"/>
     <w:p>
       <w:pPr>
         <w:pStyle w:val="FirstParagraph"/>
@@ -51274,7 +51525,7 @@
           <w:i/>
           <w:iCs/>
         </w:rPr>
-        <w:t xml:space="preserve">Remark 6</w:t>
+        <w:t xml:space="preserve">Remark 7</w:t>
       </w:r>
       <w:r>
         <w:t xml:space="preserve"> </w:t>
@@ -51526,9 +51777,9 @@
         <w:t xml:space="preserve">absorbed into a single-sample DKW envelope.</w:t>
       </w:r>
     </w:p>
-    <w:bookmarkEnd w:id="132"/>
     <w:bookmarkEnd w:id="133"/>
-    <w:bookmarkStart w:id="135" w:name="relation-to-llm-evaluation-statistics"/>
+    <w:bookmarkEnd w:id="134"/>
+    <w:bookmarkStart w:id="136" w:name="relation-to-llm-evaluation-statistics"/>
     <w:p>
       <w:pPr>
         <w:pStyle w:val="Heading2"/>
@@ -51537,7 +51788,7 @@
         <w:t xml:space="preserve">Relation to LLM-evaluation statistics</w:t>
       </w:r>
     </w:p>
-    <w:bookmarkStart w:id="134" w:name="rem:evalstats"/>
+    <w:bookmarkStart w:id="135" w:name="rem:evalstats"/>
     <w:p>
       <w:pPr>
         <w:pStyle w:val="FirstParagraph"/>
@@ -51547,7 +51798,7 @@
           <w:i/>
           <w:iCs/>
         </w:rPr>
-        <w:t xml:space="preserve">Remark 7</w:t>
+        <w:t xml:space="preserve">Remark 8</w:t>
       </w:r>
       <w:r>
         <w:t xml:space="preserve"> </w:t>
@@ -51707,9 +51958,9 @@
         <w:t xml:space="preserve">precisely what the exact Clopper–Pearson construction provides.</w:t>
       </w:r>
     </w:p>
-    <w:bookmarkEnd w:id="134"/>
     <w:bookmarkEnd w:id="135"/>
-    <w:bookmarkStart w:id="136" w:name="subsec:power"/>
+    <w:bookmarkEnd w:id="136"/>
+    <w:bookmarkStart w:id="137" w:name="subsec:power"/>
     <w:p>
       <w:pPr>
         <w:pStyle w:val="Heading2"/>
@@ -52033,9 +52284,9 @@
         <w:t xml:space="preserve">that verifies incomparability need not verify interference.</w:t>
       </w:r>
     </w:p>
-    <w:bookmarkEnd w:id="136"/>
     <w:bookmarkEnd w:id="137"/>
-    <w:bookmarkStart w:id="144" w:name="app:record"/>
+    <w:bookmarkEnd w:id="138"/>
+    <w:bookmarkStart w:id="145" w:name="app:record"/>
     <w:p>
       <w:pPr>
         <w:pStyle w:val="Heading1"/>
@@ -52044,7 +52295,7 @@
         <w:t xml:space="preserve">Extended experimental record</w:t>
       </w:r>
     </w:p>
-    <w:bookmarkStart w:id="138" w:name="tab:percell"/>
+    <w:bookmarkStart w:id="139" w:name="tab:percell"/>
     <w:p>
       <w:pPr>
         <w:pStyle w:val="TableCaption"/>
@@ -54236,8 +54487,8 @@
         </w:tc>
       </w:tr>
     </w:tbl>
-    <w:bookmarkEnd w:id="138"/>
-    <w:bookmarkStart w:id="143" w:name="generality-and-controls-full-protocols"/>
+    <w:bookmarkEnd w:id="139"/>
+    <w:bookmarkStart w:id="144" w:name="generality-and-controls-full-protocols"/>
     <w:p>
       <w:pPr>
         <w:pStyle w:val="Heading2"/>
@@ -54260,7 +54511,7 @@
         <w:t xml:space="preserve">confound, and whether the anti-monotonicity collapse is curable by cheap prompting.</w:t>
       </w:r>
     </w:p>
-    <w:bookmarkStart w:id="139" w:name="Xfd2ce319a26faa67e0eadf0fee657d728019446"/>
+    <w:bookmarkStart w:id="140" w:name="Xfd2ce319a26faa67e0eadf0fee657d728019446"/>
     <w:p>
       <w:pPr>
         <w:pStyle w:val="Heading4"/>
@@ -55192,8 +55443,8 @@
         <w:t xml:space="preserve">, not a second mis-rank.</w:t>
       </w:r>
     </w:p>
-    <w:bookmarkEnd w:id="139"/>
-    <w:bookmarkStart w:id="140" w:name="a-length-matched-padding-control."/>
+    <w:bookmarkEnd w:id="140"/>
+    <w:bookmarkStart w:id="141" w:name="a-length-matched-padding-control."/>
     <w:p>
       <w:pPr>
         <w:pStyle w:val="Heading4"/>
@@ -55939,8 +56190,8 @@
         <w:t xml:space="preserve">untested middle case.</w:t>
       </w:r>
     </w:p>
-    <w:bookmarkEnd w:id="140"/>
-    <w:bookmarkStart w:id="141" w:name="Xd508a319e40f775fe4906e106ed6a92e07fd05b"/>
+    <w:bookmarkEnd w:id="141"/>
+    <w:bookmarkStart w:id="142" w:name="Xd508a319e40f775fe4906e106ed6a92e07fd05b"/>
     <w:p>
       <w:pPr>
         <w:pStyle w:val="Heading4"/>
@@ -56581,8 +56832,8 @@
         <w:t xml:space="preserve">the superset, survives the ablation intact.</w:t>
       </w:r>
     </w:p>
-    <w:bookmarkEnd w:id="141"/>
-    <w:bookmarkStart w:id="142" w:name="X9488de75bf9879d7a0599574b61e9ffd4996347"/>
+    <w:bookmarkEnd w:id="142"/>
+    <w:bookmarkStart w:id="143" w:name="X9488de75bf9879d7a0599574b61e9ffd4996347"/>
     <w:p>
       <w:pPr>
         <w:pStyle w:val="Heading4"/>
@@ -57255,10 +57506,10 @@
         <w:t xml:space="preserve">dropping the dominated signal, locates the failure in convention-to-task routing.</w:t>
       </w:r>
     </w:p>
-    <w:bookmarkEnd w:id="142"/>
     <w:bookmarkEnd w:id="143"/>
     <w:bookmarkEnd w:id="144"/>
-    <w:bookmarkStart w:id="236" w:name="app:repro"/>
+    <w:bookmarkEnd w:id="145"/>
+    <w:bookmarkStart w:id="237" w:name="app:repro"/>
     <w:p>
       <w:pPr>
         <w:pStyle w:val="Heading1"/>
@@ -57289,7 +57540,7 @@
       <w:r>
         <w:t xml:space="preserve"> </w:t>
       </w:r>
-      <w:hyperlink r:id="rId75">
+      <w:hyperlink r:id="rId76">
         <w:r>
           <w:rPr>
             <w:rStyle w:val="Hyperlink"/>
@@ -57458,7 +57709,7 @@
         <w:t xml:space="preserve">endpoint, and all API keys are read from the environment (never written to a file).</w:t>
       </w:r>
     </w:p>
-    <w:bookmarkStart w:id="145" w:name="protocol."/>
+    <w:bookmarkStart w:id="146" w:name="protocol."/>
     <w:p>
       <w:pPr>
         <w:pStyle w:val="Heading4"/>
@@ -57834,8 +58085,8 @@
         <w:t xml:space="preserve">.</w:t>
       </w:r>
     </w:p>
-    <w:bookmarkEnd w:id="145"/>
-    <w:bookmarkStart w:id="146" w:name="decoding-seeding-and-retries."/>
+    <w:bookmarkEnd w:id="146"/>
+    <w:bookmarkStart w:id="147" w:name="decoding-seeding-and-retries."/>
     <w:p>
       <w:pPr>
         <w:pStyle w:val="Heading4"/>
@@ -57944,8 +58195,8 @@
         <w:t xml:space="preserve">arm; noted in the artifact list), so no reported cell mixes outage-scored draws with real ones.</w:t>
       </w:r>
     </w:p>
-    <w:bookmarkEnd w:id="146"/>
-    <w:bookmarkStart w:id="147" w:name="artifacts."/>
+    <w:bookmarkEnd w:id="147"/>
+    <w:bookmarkStart w:id="148" w:name="artifacts."/>
     <w:p>
       <w:pPr>
         <w:pStyle w:val="Heading4"/>
@@ -57967,7 +58218,7 @@
       <w:r>
         <w:t xml:space="preserve">(</w:t>
       </w:r>
-      <w:hyperlink r:id="rId75">
+      <w:hyperlink r:id="rId76">
         <w:r>
           <w:rPr>
             <w:rStyle w:val="Hyperlink"/>
@@ -58280,8 +58531,8 @@
         <w:t xml:space="preserve">.</w:t>
       </w:r>
     </w:p>
-    <w:bookmarkEnd w:id="147"/>
-    <w:bookmarkStart w:id="148" w:name="compute-and-cost."/>
+    <w:bookmarkEnd w:id="148"/>
+    <w:bookmarkStart w:id="149" w:name="compute-and-cost."/>
     <w:p>
       <w:pPr>
         <w:pStyle w:val="Heading4"/>
@@ -58328,8 +58579,8 @@
         <w:t xml:space="preserve">on open weights at zero API cost.</w:t>
       </w:r>
     </w:p>
-    <w:bookmarkEnd w:id="148"/>
-    <w:bookmarkStart w:id="235" w:name="reference-verification."/>
+    <w:bookmarkEnd w:id="149"/>
+    <w:bookmarkStart w:id="236" w:name="reference-verification."/>
     <w:p>
       <w:pPr>
         <w:pStyle w:val="Heading4"/>
@@ -58364,8 +58615,8 @@
         <w:t xml:space="preserve">1964/1986; Torgersen 1991; Ethayarajh et al. 2022) were checked against the primary sources.</w:t>
       </w:r>
     </w:p>
-    <w:bookmarkStart w:id="234" w:name="refs"/>
-    <w:bookmarkStart w:id="150" w:name="ref-akdemir2025"/>
+    <w:bookmarkStart w:id="235" w:name="refs"/>
+    <w:bookmarkStart w:id="151" w:name="ref-akdemir2025"/>
     <w:p>
       <w:pPr>
         <w:pStyle w:val="Bibliography"/>
@@ -58404,7 +58655,7 @@
       <w:r>
         <w:t xml:space="preserve"> </w:t>
       </w:r>
-      <w:hyperlink r:id="rId149">
+      <w:hyperlink r:id="rId150">
         <w:r>
           <w:rPr>
             <w:rStyle w:val="Hyperlink"/>
@@ -58416,8 +58667,8 @@
         <w:t xml:space="preserve">.</w:t>
       </w:r>
     </w:p>
-    <w:bookmarkEnd w:id="150"/>
-    <w:bookmarkStart w:id="152" w:name="ref-blackwell1953"/>
+    <w:bookmarkEnd w:id="151"/>
+    <w:bookmarkStart w:id="153" w:name="ref-blackwell1953"/>
     <w:p>
       <w:pPr>
         <w:pStyle w:val="Bibliography"/>
@@ -58450,7 +58701,7 @@
       <w:r>
         <w:t xml:space="preserve"> </w:t>
       </w:r>
-      <w:hyperlink r:id="rId151">
+      <w:hyperlink r:id="rId152">
         <w:r>
           <w:rPr>
             <w:rStyle w:val="Hyperlink"/>
@@ -58462,8 +58713,8 @@
         <w:t xml:space="preserve">.</w:t>
       </w:r>
     </w:p>
-    <w:bookmarkEnd w:id="152"/>
-    <w:bookmarkStart w:id="153" w:name="ref-bonferroni1936"/>
+    <w:bookmarkEnd w:id="153"/>
+    <w:bookmarkStart w:id="154" w:name="ref-bonferroni1936"/>
     <w:p>
       <w:pPr>
         <w:pStyle w:val="Bibliography"/>
@@ -58494,8 +58745,8 @@
         <w:t xml:space="preserve">8: 3–62.</w:t>
       </w:r>
     </w:p>
-    <w:bookmarkEnd w:id="153"/>
-    <w:bookmarkStart w:id="155" w:name="ref-bowyer2025clt"/>
+    <w:bookmarkEnd w:id="154"/>
+    <w:bookmarkStart w:id="156" w:name="ref-bowyer2025clt"/>
     <w:p>
       <w:pPr>
         <w:pStyle w:val="Bibliography"/>
@@ -58549,7 +58800,7 @@
       <w:r>
         <w:t xml:space="preserve"> </w:t>
       </w:r>
-      <w:hyperlink r:id="rId154">
+      <w:hyperlink r:id="rId155">
         <w:r>
           <w:rPr>
             <w:rStyle w:val="Hyperlink"/>
@@ -58561,8 +58812,8 @@
         <w:t xml:space="preserve">.</w:t>
       </w:r>
     </w:p>
-    <w:bookmarkEnd w:id="155"/>
-    <w:bookmarkStart w:id="157" w:name="ref-bradley2024garbling"/>
+    <w:bookmarkEnd w:id="156"/>
+    <w:bookmarkStart w:id="158" w:name="ref-bradley2024garbling"/>
     <w:p>
       <w:pPr>
         <w:pStyle w:val="Bibliography"/>
@@ -58604,7 +58855,7 @@
       <w:r>
         <w:t xml:space="preserve"> </w:t>
       </w:r>
-      <w:hyperlink r:id="rId156">
+      <w:hyperlink r:id="rId157">
         <w:r>
           <w:rPr>
             <w:rStyle w:val="Hyperlink"/>
@@ -58616,8 +58867,8 @@
         <w:t xml:space="preserve">.</w:t>
       </w:r>
     </w:p>
-    <w:bookmarkEnd w:id="157"/>
-    <w:bookmarkStart w:id="159" w:name="ref-carbonell1998"/>
+    <w:bookmarkEnd w:id="158"/>
+    <w:bookmarkStart w:id="160" w:name="ref-carbonell1998"/>
     <w:p>
       <w:pPr>
         <w:pStyle w:val="Bibliography"/>
@@ -58656,7 +58907,7 @@
       <w:r>
         <w:t xml:space="preserve"> </w:t>
       </w:r>
-      <w:hyperlink r:id="rId158">
+      <w:hyperlink r:id="rId159">
         <w:r>
           <w:rPr>
             <w:rStyle w:val="Hyperlink"/>
@@ -58668,8 +58919,8 @@
         <w:t xml:space="preserve">.</w:t>
       </w:r>
     </w:p>
-    <w:bookmarkEnd w:id="159"/>
-    <w:bookmarkStart w:id="161" w:name="ref-conformalip2025"/>
+    <w:bookmarkEnd w:id="160"/>
+    <w:bookmarkStart w:id="162" w:name="ref-conformalip2025"/>
     <w:p>
       <w:pPr>
         <w:pStyle w:val="Bibliography"/>
@@ -58699,7 +58950,7 @@
       <w:r>
         <w:t xml:space="preserve"> </w:t>
       </w:r>
-      <w:hyperlink r:id="rId160">
+      <w:hyperlink r:id="rId161">
         <w:r>
           <w:rPr>
             <w:rStyle w:val="Hyperlink"/>
@@ -58711,8 +58962,8 @@
         <w:t xml:space="preserve">.</w:t>
       </w:r>
     </w:p>
-    <w:bookmarkEnd w:id="161"/>
-    <w:bookmarkStart w:id="163" w:name="ref-bedllm2026"/>
+    <w:bookmarkEnd w:id="162"/>
+    <w:bookmarkStart w:id="164" w:name="ref-bedllm2026"/>
     <w:p>
       <w:pPr>
         <w:pStyle w:val="Bibliography"/>
@@ -58760,7 +59011,7 @@
       <w:r>
         <w:t xml:space="preserve"> </w:t>
       </w:r>
-      <w:hyperlink r:id="rId162">
+      <w:hyperlink r:id="rId163">
         <w:r>
           <w:rPr>
             <w:rStyle w:val="Hyperlink"/>
@@ -58772,8 +59023,8 @@
         <w:t xml:space="preserve">.</w:t>
       </w:r>
     </w:p>
-    <w:bookmarkEnd w:id="163"/>
-    <w:bookmarkStart w:id="165" w:name="ref-clopperpearson1934"/>
+    <w:bookmarkEnd w:id="164"/>
+    <w:bookmarkStart w:id="166" w:name="ref-clopperpearson1934"/>
     <w:p>
       <w:pPr>
         <w:pStyle w:val="Bibliography"/>
@@ -58806,7 +59057,7 @@
       <w:r>
         <w:t xml:space="preserve"> </w:t>
       </w:r>
-      <w:hyperlink r:id="rId164">
+      <w:hyperlink r:id="rId165">
         <w:r>
           <w:rPr>
             <w:rStyle w:val="Hyperlink"/>
@@ -58818,8 +59069,8 @@
         <w:t xml:space="preserve">.</w:t>
       </w:r>
     </w:p>
-    <w:bookmarkEnd w:id="165"/>
-    <w:bookmarkStart w:id="167" w:name="ref-cuconasu2024noise"/>
+    <w:bookmarkEnd w:id="166"/>
+    <w:bookmarkStart w:id="168" w:name="ref-cuconasu2024noise"/>
     <w:p>
       <w:pPr>
         <w:pStyle w:val="Bibliography"/>
@@ -58861,7 +59112,7 @@
       <w:r>
         <w:t xml:space="preserve"> </w:t>
       </w:r>
-      <w:hyperlink r:id="rId166">
+      <w:hyperlink r:id="rId167">
         <w:r>
           <w:rPr>
             <w:rStyle w:val="Hyperlink"/>
@@ -58873,8 +59124,8 @@
         <w:t xml:space="preserve">.</w:t>
       </w:r>
     </w:p>
-    <w:bookmarkEnd w:id="167"/>
-    <w:bookmarkStart w:id="169" w:name="ref-contexthurts2025"/>
+    <w:bookmarkEnd w:id="168"/>
+    <w:bookmarkStart w:id="170" w:name="ref-contexthurts2025"/>
     <w:p>
       <w:pPr>
         <w:pStyle w:val="Bibliography"/>
@@ -58916,7 +59167,7 @@
       <w:r>
         <w:t xml:space="preserve"> </w:t>
       </w:r>
-      <w:hyperlink r:id="rId168">
+      <w:hyperlink r:id="rId169">
         <w:r>
           <w:rPr>
             <w:rStyle w:val="Hyperlink"/>
@@ -58928,8 +59179,8 @@
         <w:t xml:space="preserve">.</w:t>
       </w:r>
     </w:p>
-    <w:bookmarkEnd w:id="169"/>
-    <w:bookmarkStart w:id="171" w:name="ref-dvoretzky1956"/>
+    <w:bookmarkEnd w:id="170"/>
+    <w:bookmarkStart w:id="172" w:name="ref-dvoretzky1956"/>
     <w:p>
       <w:pPr>
         <w:pStyle w:val="Bibliography"/>
@@ -58962,7 +59213,7 @@
       <w:r>
         <w:t xml:space="preserve"> </w:t>
       </w:r>
-      <w:hyperlink r:id="rId170">
+      <w:hyperlink r:id="rId171">
         <w:r>
           <w:rPr>
             <w:rStyle w:val="Hyperlink"/>
@@ -58974,8 +59225,8 @@
         <w:t xml:space="preserve">.</w:t>
       </w:r>
     </w:p>
-    <w:bookmarkEnd w:id="171"/>
-    <w:bookmarkStart w:id="172" w:name="ref-ethayarajh2022"/>
+    <w:bookmarkEnd w:id="172"/>
+    <w:bookmarkStart w:id="173" w:name="ref-ethayarajh2022"/>
     <w:p>
       <w:pPr>
         <w:pStyle w:val="Bibliography"/>
@@ -59018,8 +59269,8 @@
         <w:t xml:space="preserve">, PMLR, vol. 162: 5988–6008.</w:t>
       </w:r>
     </w:p>
-    <w:bookmarkEnd w:id="172"/>
-    <w:bookmarkStart w:id="174" w:name="ref-fosse2025"/>
+    <w:bookmarkEnd w:id="173"/>
+    <w:bookmarkStart w:id="175" w:name="ref-fosse2025"/>
     <w:p>
       <w:pPr>
         <w:pStyle w:val="Bibliography"/>
@@ -59049,7 +59300,7 @@
       <w:r>
         <w:t xml:space="preserve"> </w:t>
       </w:r>
-      <w:hyperlink r:id="rId173">
+      <w:hyperlink r:id="rId174">
         <w:r>
           <w:rPr>
             <w:rStyle w:val="Hyperlink"/>
@@ -59061,8 +59312,8 @@
         <w:t xml:space="preserve">.</w:t>
       </w:r>
     </w:p>
-    <w:bookmarkEnd w:id="174"/>
-    <w:bookmarkStart w:id="176" w:name="ref-fuhr2008"/>
+    <w:bookmarkEnd w:id="175"/>
+    <w:bookmarkStart w:id="177" w:name="ref-fuhr2008"/>
     <w:p>
       <w:pPr>
         <w:pStyle w:val="Bibliography"/>
@@ -59095,7 +59346,7 @@
       <w:r>
         <w:t xml:space="preserve"> </w:t>
       </w:r>
-      <w:hyperlink r:id="rId175">
+      <w:hyperlink r:id="rId176">
         <w:r>
           <w:rPr>
             <w:rStyle w:val="Hyperlink"/>
@@ -59107,8 +59358,8 @@
         <w:t xml:space="preserve">.</w:t>
       </w:r>
     </w:p>
-    <w:bookmarkEnd w:id="176"/>
-    <w:bookmarkStart w:id="178" w:name="ref-gao2024modelequality"/>
+    <w:bookmarkEnd w:id="177"/>
+    <w:bookmarkStart w:id="179" w:name="ref-gao2024modelequality"/>
     <w:p>
       <w:pPr>
         <w:pStyle w:val="Bibliography"/>
@@ -59150,7 +59401,7 @@
       <w:r>
         <w:t xml:space="preserve"> </w:t>
       </w:r>
-      <w:hyperlink r:id="rId177">
+      <w:hyperlink r:id="rId178">
         <w:r>
           <w:rPr>
             <w:rStyle w:val="Hyperlink"/>
@@ -59162,8 +59413,8 @@
         <w:t xml:space="preserve">.</w:t>
       </w:r>
     </w:p>
-    <w:bookmarkEnd w:id="178"/>
-    <w:bookmarkStart w:id="180" w:name="ref-guu2020realm"/>
+    <w:bookmarkEnd w:id="179"/>
+    <w:bookmarkStart w:id="181" w:name="ref-guu2020realm"/>
     <w:p>
       <w:pPr>
         <w:pStyle w:val="Bibliography"/>
@@ -59199,7 +59450,7 @@
       <w:r>
         <w:t xml:space="preserve"> </w:t>
       </w:r>
-      <w:hyperlink r:id="rId179">
+      <w:hyperlink r:id="rId180">
         <w:r>
           <w:rPr>
             <w:rStyle w:val="Hyperlink"/>
@@ -59211,8 +59462,8 @@
         <w:t xml:space="preserve">.</w:t>
       </w:r>
     </w:p>
-    <w:bookmarkEnd w:id="180"/>
-    <w:bookmarkStart w:id="182" w:name="ref-hong2025contextrot"/>
+    <w:bookmarkEnd w:id="181"/>
+    <w:bookmarkStart w:id="183" w:name="ref-hong2025contextrot"/>
     <w:p>
       <w:pPr>
         <w:pStyle w:val="Bibliography"/>
@@ -59264,7 +59515,7 @@
       <w:r>
         <w:t xml:space="preserve"> </w:t>
       </w:r>
-      <w:hyperlink r:id="rId181">
+      <w:hyperlink r:id="rId182">
         <w:r>
           <w:rPr>
             <w:rStyle w:val="Hyperlink"/>
@@ -59276,8 +59527,8 @@
         <w:t xml:space="preserve">.</w:t>
       </w:r>
     </w:p>
-    <w:bookmarkEnd w:id="182"/>
-    <w:bookmarkStart w:id="184" w:name="ref-huang2025gammacover"/>
+    <w:bookmarkEnd w:id="183"/>
+    <w:bookmarkStart w:id="185" w:name="ref-huang2025gammacover"/>
     <w:p>
       <w:pPr>
         <w:pStyle w:val="Bibliography"/>
@@ -59318,7 +59569,7 @@
       <w:r>
         <w:t xml:space="preserve"> </w:t>
       </w:r>
-      <w:hyperlink r:id="rId183">
+      <w:hyperlink r:id="rId184">
         <w:r>
           <w:rPr>
             <w:rStyle w:val="Hyperlink"/>
@@ -59330,8 +59581,8 @@
         <w:t xml:space="preserve">.</w:t>
       </w:r>
     </w:p>
-    <w:bookmarkEnd w:id="184"/>
-    <w:bookmarkStart w:id="186" w:name="ref-jin2024longrag"/>
+    <w:bookmarkEnd w:id="185"/>
+    <w:bookmarkStart w:id="187" w:name="ref-jin2024longrag"/>
     <w:p>
       <w:pPr>
         <w:pStyle w:val="Bibliography"/>
@@ -59391,7 +59642,7 @@
       <w:r>
         <w:t xml:space="preserve"> </w:t>
       </w:r>
-      <w:hyperlink r:id="rId185">
+      <w:hyperlink r:id="rId186">
         <w:r>
           <w:rPr>
             <w:rStyle w:val="Hyperlink"/>
@@ -59403,8 +59654,8 @@
         <w:t xml:space="preserve">.</w:t>
       </w:r>
     </w:p>
-    <w:bookmarkEnd w:id="186"/>
-    <w:bookmarkStart w:id="188" w:name="ref-sufficientcontext2024"/>
+    <w:bookmarkEnd w:id="187"/>
+    <w:bookmarkStart w:id="189" w:name="ref-sufficientcontext2024"/>
     <w:p>
       <w:pPr>
         <w:pStyle w:val="Bibliography"/>
@@ -59434,7 +59685,7 @@
       <w:r>
         <w:t xml:space="preserve"> </w:t>
       </w:r>
-      <w:hyperlink r:id="rId187">
+      <w:hyperlink r:id="rId188">
         <w:r>
           <w:rPr>
             <w:rStyle w:val="Hyperlink"/>
@@ -59446,8 +59697,8 @@
         <w:t xml:space="preserve">.</w:t>
       </w:r>
     </w:p>
-    <w:bookmarkEnd w:id="188"/>
-    <w:bookmarkStart w:id="190" w:name="ref-khattab2020colbert"/>
+    <w:bookmarkEnd w:id="189"/>
+    <w:bookmarkStart w:id="191" w:name="ref-khattab2020colbert"/>
     <w:p>
       <w:pPr>
         <w:pStyle w:val="Bibliography"/>
@@ -59492,7 +59743,7 @@
       <w:r>
         <w:t xml:space="preserve"> </w:t>
       </w:r>
-      <w:hyperlink r:id="rId189">
+      <w:hyperlink r:id="rId190">
         <w:r>
           <w:rPr>
             <w:rStyle w:val="Hyperlink"/>
@@ -59504,8 +59755,8 @@
         <w:t xml:space="preserve">.</w:t>
       </w:r>
     </w:p>
-    <w:bookmarkEnd w:id="190"/>
-    <w:bookmarkStart w:id="192" w:name="ref-lecam1964"/>
+    <w:bookmarkEnd w:id="191"/>
+    <w:bookmarkStart w:id="193" w:name="ref-lecam1964"/>
     <w:p>
       <w:pPr>
         <w:pStyle w:val="Bibliography"/>
@@ -59538,7 +59789,7 @@
       <w:r>
         <w:t xml:space="preserve"> </w:t>
       </w:r>
-      <w:hyperlink r:id="rId191">
+      <w:hyperlink r:id="rId192">
         <w:r>
           <w:rPr>
             <w:rStyle w:val="Hyperlink"/>
@@ -59550,8 +59801,8 @@
         <w:t xml:space="preserve">.</w:t>
       </w:r>
     </w:p>
-    <w:bookmarkEnd w:id="192"/>
-    <w:bookmarkStart w:id="194" w:name="ref-lecam1986"/>
+    <w:bookmarkEnd w:id="193"/>
+    <w:bookmarkStart w:id="195" w:name="ref-lecam1986"/>
     <w:p>
       <w:pPr>
         <w:pStyle w:val="Bibliography"/>
@@ -59575,7 +59826,7 @@
       <w:r>
         <w:t xml:space="preserve"> </w:t>
       </w:r>
-      <w:hyperlink r:id="rId193">
+      <w:hyperlink r:id="rId194">
         <w:r>
           <w:rPr>
             <w:rStyle w:val="Hyperlink"/>
@@ -59587,8 +59838,8 @@
         <w:t xml:space="preserve">.</w:t>
       </w:r>
     </w:p>
-    <w:bookmarkEnd w:id="194"/>
-    <w:bookmarkStart w:id="196" w:name="ref-relevanceutility2025"/>
+    <w:bookmarkEnd w:id="195"/>
+    <w:bookmarkStart w:id="197" w:name="ref-relevanceutility2025"/>
     <w:p>
       <w:pPr>
         <w:pStyle w:val="Bibliography"/>
@@ -59630,7 +59881,7 @@
       <w:r>
         <w:t xml:space="preserve"> </w:t>
       </w:r>
-      <w:hyperlink r:id="rId195">
+      <w:hyperlink r:id="rId196">
         <w:r>
           <w:rPr>
             <w:rStyle w:val="Hyperlink"/>
@@ -59642,8 +59893,8 @@
         <w:t xml:space="preserve">.</w:t>
       </w:r>
     </w:p>
-    <w:bookmarkEnd w:id="196"/>
-    <w:bookmarkStart w:id="198" w:name="ref-levy2025moredocs"/>
+    <w:bookmarkEnd w:id="197"/>
+    <w:bookmarkStart w:id="199" w:name="ref-levy2025moredocs"/>
     <w:p>
       <w:pPr>
         <w:pStyle w:val="Bibliography"/>
@@ -59682,7 +59933,7 @@
       <w:r>
         <w:t xml:space="preserve"> </w:t>
       </w:r>
-      <w:hyperlink r:id="rId197">
+      <w:hyperlink r:id="rId198">
         <w:r>
           <w:rPr>
             <w:rStyle w:val="Hyperlink"/>
@@ -59694,8 +59945,8 @@
         <w:t xml:space="preserve">.</w:t>
       </w:r>
     </w:p>
-    <w:bookmarkEnd w:id="198"/>
-    <w:bookmarkStart w:id="200" w:name="ref-longcontextdegrade2026"/>
+    <w:bookmarkEnd w:id="199"/>
+    <w:bookmarkStart w:id="201" w:name="ref-longcontextdegrade2026"/>
     <w:p>
       <w:pPr>
         <w:pStyle w:val="Bibliography"/>
@@ -59737,7 +59988,7 @@
       <w:r>
         <w:t xml:space="preserve"> </w:t>
       </w:r>
-      <w:hyperlink r:id="rId199">
+      <w:hyperlink r:id="rId200">
         <w:r>
           <w:rPr>
             <w:rStyle w:val="Hyperlink"/>
@@ -59749,8 +60000,8 @@
         <w:t xml:space="preserve">.</w:t>
       </w:r>
     </w:p>
-    <w:bookmarkEnd w:id="200"/>
-    <w:bookmarkStart w:id="202" w:name="ref-liu2024lost"/>
+    <w:bookmarkEnd w:id="201"/>
+    <w:bookmarkStart w:id="203" w:name="ref-liu2024lost"/>
     <w:p>
       <w:pPr>
         <w:pStyle w:val="Bibliography"/>
@@ -59783,7 +60034,7 @@
       <w:r>
         <w:t xml:space="preserve"> </w:t>
       </w:r>
-      <w:hyperlink r:id="rId201">
+      <w:hyperlink r:id="rId202">
         <w:r>
           <w:rPr>
             <w:rStyle w:val="Hyperlink"/>
@@ -59795,8 +60046,8 @@
         <w:t xml:space="preserve">.</w:t>
       </w:r>
     </w:p>
-    <w:bookmarkEnd w:id="202"/>
-    <w:bookmarkStart w:id="204" w:name="ref-miller2024errorbars"/>
+    <w:bookmarkEnd w:id="203"/>
+    <w:bookmarkStart w:id="205" w:name="ref-miller2024errorbars"/>
     <w:p>
       <w:pPr>
         <w:pStyle w:val="Bibliography"/>
@@ -59826,7 +60077,7 @@
       <w:r>
         <w:t xml:space="preserve"> </w:t>
       </w:r>
-      <w:hyperlink r:id="rId203">
+      <w:hyperlink r:id="rId204">
         <w:r>
           <w:rPr>
             <w:rStyle w:val="Hyperlink"/>
@@ -59838,8 +60089,8 @@
         <w:t xml:space="preserve">.</w:t>
       </w:r>
     </w:p>
-    <w:bookmarkEnd w:id="204"/>
-    <w:bookmarkStart w:id="206" w:name="ref-blackwellrep2026"/>
+    <w:bookmarkEnd w:id="205"/>
+    <w:bookmarkStart w:id="207" w:name="ref-blackwellrep2026"/>
     <w:p>
       <w:pPr>
         <w:pStyle w:val="Bibliography"/>
@@ -59869,7 +60120,7 @@
       <w:r>
         <w:t xml:space="preserve"> </w:t>
       </w:r>
-      <w:hyperlink r:id="rId205">
+      <w:hyperlink r:id="rId206">
         <w:r>
           <w:rPr>
             <w:rStyle w:val="Hyperlink"/>
@@ -59881,8 +60132,8 @@
         <w:t xml:space="preserve">.</w:t>
       </w:r>
     </w:p>
-    <w:bookmarkEnd w:id="206"/>
-    <w:bookmarkStart w:id="208" w:name="ref-sureRAG2026"/>
+    <w:bookmarkEnd w:id="207"/>
+    <w:bookmarkStart w:id="209" w:name="ref-sureRAG2026"/>
     <w:p>
       <w:pPr>
         <w:pStyle w:val="Bibliography"/>
@@ -59918,7 +60169,7 @@
       <w:r>
         <w:t xml:space="preserve"> </w:t>
       </w:r>
-      <w:hyperlink r:id="rId207">
+      <w:hyperlink r:id="rId208">
         <w:r>
           <w:rPr>
             <w:rStyle w:val="Hyperlink"/>
@@ -59930,8 +60181,8 @@
         <w:t xml:space="preserve">.</w:t>
       </w:r>
     </w:p>
-    <w:bookmarkEnd w:id="208"/>
-    <w:bookmarkStart w:id="210" w:name="ref-robertson1977"/>
+    <w:bookmarkEnd w:id="209"/>
+    <w:bookmarkStart w:id="211" w:name="ref-robertson1977"/>
     <w:p>
       <w:pPr>
         <w:pStyle w:val="Bibliography"/>
@@ -59973,7 +60224,7 @@
       <w:r>
         <w:t xml:space="preserve"> </w:t>
       </w:r>
-      <w:hyperlink r:id="rId209">
+      <w:hyperlink r:id="rId210">
         <w:r>
           <w:rPr>
             <w:rStyle w:val="Hyperlink"/>
@@ -59985,8 +60236,8 @@
         <w:t xml:space="preserve">.</w:t>
       </w:r>
     </w:p>
-    <w:bookmarkEnd w:id="210"/>
-    <w:bookmarkStart w:id="212" w:name="ref-vanrooyen2014"/>
+    <w:bookmarkEnd w:id="211"/>
+    <w:bookmarkStart w:id="213" w:name="ref-vanrooyen2014"/>
     <w:p>
       <w:pPr>
         <w:pStyle w:val="Bibliography"/>
@@ -60034,7 +60285,7 @@
       <w:r>
         <w:t xml:space="preserve"> </w:t>
       </w:r>
-      <w:hyperlink r:id="rId211">
+      <w:hyperlink r:id="rId212">
         <w:r>
           <w:rPr>
             <w:rStyle w:val="Hyperlink"/>
@@ -60046,8 +60297,8 @@
         <w:t xml:space="preserve">.</w:t>
       </w:r>
     </w:p>
-    <w:bookmarkEnd w:id="212"/>
-    <w:bookmarkStart w:id="214" w:name="ref-shi2023distracted"/>
+    <w:bookmarkEnd w:id="213"/>
+    <w:bookmarkStart w:id="215" w:name="ref-shi2023distracted"/>
     <w:p>
       <w:pPr>
         <w:pStyle w:val="Bibliography"/>
@@ -60077,7 +60328,7 @@
       <w:r>
         <w:t xml:space="preserve"> </w:t>
       </w:r>
-      <w:hyperlink r:id="rId213">
+      <w:hyperlink r:id="rId214">
         <w:r>
           <w:rPr>
             <w:rStyle w:val="Hyperlink"/>
@@ -60089,8 +60340,8 @@
         <w:t xml:space="preserve">.</w:t>
       </w:r>
     </w:p>
-    <w:bookmarkEnd w:id="214"/>
-    <w:bookmarkStart w:id="216" w:name="ref-shi2023replug"/>
+    <w:bookmarkEnd w:id="215"/>
+    <w:bookmarkStart w:id="217" w:name="ref-shi2023replug"/>
     <w:p>
       <w:pPr>
         <w:pStyle w:val="Bibliography"/>
@@ -60126,7 +60377,7 @@
       <w:r>
         <w:t xml:space="preserve"> </w:t>
       </w:r>
-      <w:hyperlink r:id="rId215">
+      <w:hyperlink r:id="rId216">
         <w:r>
           <w:rPr>
             <w:rStyle w:val="Hyperlink"/>
@@ -60138,8 +60389,8 @@
         <w:t xml:space="preserve">.</w:t>
       </w:r>
     </w:p>
-    <w:bookmarkEnd w:id="216"/>
-    <w:bookmarkStart w:id="218" w:name="ref-sun2023rankgpt"/>
+    <w:bookmarkEnd w:id="217"/>
+    <w:bookmarkStart w:id="219" w:name="ref-sun2023rankgpt"/>
     <w:p>
       <w:pPr>
         <w:pStyle w:val="Bibliography"/>
@@ -60193,7 +60444,7 @@
       <w:r>
         <w:t xml:space="preserve"> </w:t>
       </w:r>
-      <w:hyperlink r:id="rId217">
+      <w:hyperlink r:id="rId218">
         <w:r>
           <w:rPr>
             <w:rStyle w:val="Hyperlink"/>
@@ -60205,8 +60456,8 @@
         <w:t xml:space="preserve">.</w:t>
       </w:r>
     </w:p>
-    <w:bookmarkEnd w:id="218"/>
-    <w:bookmarkStart w:id="220" w:name="ref-torgersen1991"/>
+    <w:bookmarkEnd w:id="219"/>
+    <w:bookmarkStart w:id="221" w:name="ref-torgersen1991"/>
     <w:p>
       <w:pPr>
         <w:pStyle w:val="Bibliography"/>
@@ -60230,7 +60481,7 @@
       <w:r>
         <w:t xml:space="preserve"> </w:t>
       </w:r>
-      <w:hyperlink r:id="rId219">
+      <w:hyperlink r:id="rId220">
         <w:r>
           <w:rPr>
             <w:rStyle w:val="Hyperlink"/>
@@ -60242,8 +60493,8 @@
         <w:t xml:space="preserve">.</w:t>
       </w:r>
     </w:p>
-    <w:bookmarkEnd w:id="220"/>
-    <w:bookmarkStart w:id="222" w:name="ref-inficl2024"/>
+    <w:bookmarkEnd w:id="221"/>
+    <w:bookmarkStart w:id="223" w:name="ref-inficl2024"/>
     <w:p>
       <w:pPr>
         <w:pStyle w:val="Bibliography"/>
@@ -60273,7 +60524,7 @@
       <w:r>
         <w:t xml:space="preserve"> </w:t>
       </w:r>
-      <w:hyperlink r:id="rId221">
+      <w:hyperlink r:id="rId222">
         <w:r>
           <w:rPr>
             <w:rStyle w:val="Hyperlink"/>
@@ -60285,8 +60536,8 @@
         <w:t xml:space="preserve">.</w:t>
       </w:r>
     </w:p>
-    <w:bookmarkEnd w:id="222"/>
-    <w:bookmarkStart w:id="224" w:name="ref-demoshapley2024"/>
+    <w:bookmarkEnd w:id="223"/>
+    <w:bookmarkStart w:id="225" w:name="ref-demoshapley2024"/>
     <w:p>
       <w:pPr>
         <w:pStyle w:val="Bibliography"/>
@@ -60322,7 +60573,7 @@
       <w:r>
         <w:t xml:space="preserve"> </w:t>
       </w:r>
-      <w:hyperlink r:id="rId223">
+      <w:hyperlink r:id="rId224">
         <w:r>
           <w:rPr>
             <w:rStyle w:val="Hyperlink"/>
@@ -60334,8 +60585,8 @@
         <w:t xml:space="preserve">.</w:t>
       </w:r>
     </w:p>
-    <w:bookmarkEnd w:id="224"/>
-    <w:bookmarkStart w:id="226" w:name="ref-ye2023ceil"/>
+    <w:bookmarkEnd w:id="225"/>
+    <w:bookmarkStart w:id="227" w:name="ref-ye2023ceil"/>
     <w:p>
       <w:pPr>
         <w:pStyle w:val="Bibliography"/>
@@ -60365,7 +60616,7 @@
       <w:r>
         <w:t xml:space="preserve"> </w:t>
       </w:r>
-      <w:hyperlink r:id="rId225">
+      <w:hyperlink r:id="rId226">
         <w:r>
           <w:rPr>
             <w:rStyle w:val="Hyperlink"/>
@@ -60377,8 +60628,8 @@
         <w:t xml:space="preserve">.</w:t>
       </w:r>
     </w:p>
-    <w:bookmarkEnd w:id="226"/>
-    <w:bookmarkStart w:id="228" w:name="ref-rankrag2024"/>
+    <w:bookmarkEnd w:id="227"/>
+    <w:bookmarkStart w:id="229" w:name="ref-rankrag2024"/>
     <w:p>
       <w:pPr>
         <w:pStyle w:val="Bibliography"/>
@@ -60423,7 +60674,7 @@
       <w:r>
         <w:t xml:space="preserve"> </w:t>
       </w:r>
-      <w:hyperlink r:id="rId227">
+      <w:hyperlink r:id="rId228">
         <w:r>
           <w:rPr>
             <w:rStyle w:val="Hyperlink"/>
@@ -60435,8 +60686,8 @@
         <w:t xml:space="preserve">.</w:t>
       </w:r>
     </w:p>
-    <w:bookmarkEnd w:id="228"/>
-    <w:bookmarkStart w:id="230" w:name="ref-cale2025"/>
+    <w:bookmarkEnd w:id="229"/>
+    <w:bookmarkStart w:id="231" w:name="ref-cale2025"/>
     <w:p>
       <w:pPr>
         <w:pStyle w:val="Bibliography"/>
@@ -60487,7 +60738,7 @@
       <w:r>
         <w:t xml:space="preserve"> </w:t>
       </w:r>
-      <w:hyperlink r:id="rId229">
+      <w:hyperlink r:id="rId230">
         <w:r>
           <w:rPr>
             <w:rStyle w:val="Hyperlink"/>
@@ -60499,8 +60750,8 @@
         <w:t xml:space="preserve">.</w:t>
       </w:r>
     </w:p>
-    <w:bookmarkEnd w:id="230"/>
-    <w:bookmarkStart w:id="231" w:name="ref-paretoprompts2025"/>
+    <w:bookmarkEnd w:id="231"/>
+    <w:bookmarkStart w:id="232" w:name="ref-paretoprompts2025"/>
     <w:p>
       <w:pPr>
         <w:pStyle w:val="Bibliography"/>
@@ -60528,8 +60779,8 @@
         <w:t xml:space="preserve">.</w:t>
       </w:r>
     </w:p>
-    <w:bookmarkEnd w:id="231"/>
-    <w:bookmarkStart w:id="233" w:name="ref-zheng2024pmi"/>
+    <w:bookmarkEnd w:id="232"/>
+    <w:bookmarkStart w:id="234" w:name="ref-zheng2024pmi"/>
     <w:p>
       <w:pPr>
         <w:pStyle w:val="Bibliography"/>
@@ -60559,7 +60810,7 @@
       <w:r>
         <w:t xml:space="preserve"> </w:t>
       </w:r>
-      <w:hyperlink r:id="rId232">
+      <w:hyperlink r:id="rId233">
         <w:r>
           <w:rPr>
             <w:rStyle w:val="Hyperlink"/>
@@ -60571,10 +60822,10 @@
         <w:t xml:space="preserve">.</w:t>
       </w:r>
     </w:p>
-    <w:bookmarkEnd w:id="233"/>
     <w:bookmarkEnd w:id="234"/>
     <w:bookmarkEnd w:id="235"/>
     <w:bookmarkEnd w:id="236"/>
+    <w:bookmarkEnd w:id="237"/>
     <w:sectPr>
       <w:footnotePr>
         <w:numRestart w:val="eachSect"/>

</xml_diff>

<commit_message>
Add CI that machine-checks the Lean proofs on a clean machine
.github/workflows/lean.yml: rejects any sorry/admit, installs the pinned
toolchain, runs lean ContextSelection.lean, and asserts both central theorems
still report an empty axiom footprint. Paper: artifact paragraph in the
reproducibility appendix.
</commit_message>
<xml_diff>
--- a/paper/blackwell-paper.docx
+++ b/paper/blackwell-paper.docx
@@ -57509,7 +57509,7 @@
     <w:bookmarkEnd w:id="143"/>
     <w:bookmarkEnd w:id="144"/>
     <w:bookmarkEnd w:id="145"/>
-    <w:bookmarkStart w:id="237" w:name="app:repro"/>
+    <w:bookmarkStart w:id="238" w:name="app:repro"/>
     <w:p>
       <w:pPr>
         <w:pStyle w:val="Heading1"/>
@@ -57709,13 +57709,13 @@
         <w:t xml:space="preserve">endpoint, and all API keys are read from the environment (never written to a file).</w:t>
       </w:r>
     </w:p>
-    <w:bookmarkStart w:id="146" w:name="protocol."/>
+    <w:bookmarkStart w:id="146" w:name="machine-checked-proofs."/>
     <w:p>
       <w:pPr>
         <w:pStyle w:val="Heading4"/>
       </w:pPr>
       <w:r>
-        <w:t xml:space="preserve">Protocol.</w:t>
+        <w:t xml:space="preserve">Machine-checked proofs.</w:t>
       </w:r>
     </w:p>
     <w:p>
@@ -57723,7 +57723,7 @@
         <w:pStyle w:val="FirstParagraph"/>
       </w:pPr>
       <w:r>
-        <w:t xml:space="preserve">The verifier stubs a fake</w:t>
+        <w:t xml:space="preserve">The bundle also contains</w:t>
       </w:r>
       <w:r>
         <w:t xml:space="preserve"> </w:t>
@@ -57732,35 +57732,22 @@
         <w:rPr>
           <w:rStyle w:val="VerbatimChar"/>
         </w:rPr>
-        <w:t xml:space="preserve">ledger</w:t>
-      </w:r>
-      <w:r>
-        <w:t xml:space="preserve"> </w:t>
-      </w:r>
-      <w:r>
-        <w:t xml:space="preserve">module that accepts</w:t>
-      </w:r>
-      <w:r>
-        <w:t xml:space="preserve"> </w:t>
-      </w:r>
-      <w:r>
-        <w:rPr>
-          <w:i/>
-          <w:iCs/>
-        </w:rPr>
-        <w:t xml:space="preserve">only</w:t>
-      </w:r>
-      <w:r>
-        <w:t xml:space="preserve"> </w:t>
-      </w:r>
-      <w:r>
-        <w:t xml:space="preserve">the exact</w:t>
-      </w:r>
-      <w:r>
-        <w:t xml:space="preserve"> </w:t>
-      </w:r>
-      <w:r>
-        <w:t xml:space="preserve">private contract (it rejects wrong positional arg order, a missing</w:t>
+        <w:t xml:space="preserve">lean/ContextSelection.lean</w:t>
+      </w:r>
+      <w:r>
+        <w:t xml:space="preserve">, a</w:t>
+      </w:r>
+      <w:r>
+        <w:t xml:space="preserve"> </w:t>
+      </w:r>
+      <w:r>
+        <w:t xml:space="preserve">Lean 4 formalization of the two impossibility results (Remark 3). It takes no</w:t>
+      </w:r>
+      <w:r>
+        <w:t xml:space="preserve"> </w:t>
+      </w:r>
+      <w:r>
+        <w:t xml:space="preserve">dependency on Mathlib, so it is checked by</w:t>
       </w:r>
       <w:r>
         <w:t xml:space="preserve"> </w:t>
@@ -57769,33 +57756,19 @@
         <w:rPr>
           <w:rStyle w:val="VerbatimChar"/>
         </w:rPr>
-        <w:t xml:space="preserve">memo=</w:t>
-      </w:r>
-      <w:r>
-        <w:t xml:space="preserve"> </w:t>
-      </w:r>
-      <w:r>
-        <w:t xml:space="preserve">keyword, and the wrong</w:t>
-      </w:r>
-      <w:r>
-        <w:t xml:space="preserve"> </w:t>
-      </w:r>
-      <w:r>
-        <w:t xml:space="preserve">exception type); return code</w:t>
-      </w:r>
-      <w:r>
-        <w:t xml:space="preserve"> </w:t>
-      </w:r>
-      <m:oMath>
-        <m:r>
-          <m:t>0</m:t>
-        </m:r>
-      </m:oMath>
-      <w:r>
-        <w:t xml:space="preserve"> </w:t>
-      </w:r>
-      <w:r>
-        <w:t xml:space="preserve">is PASS. The four verified cells are</w:t>
+        <w:t xml:space="preserve">lean ContextSelection.lean</w:t>
+      </w:r>
+      <w:r>
+        <w:t xml:space="preserve"> </w:t>
+      </w:r>
+      <w:r>
+        <w:t xml:space="preserve">against a bare</w:t>
+      </w:r>
+      <w:r>
+        <w:t xml:space="preserve"> </w:t>
+      </w:r>
+      <w:r>
+        <w:t xml:space="preserve">toolchain with no build step or network access; the version is pinned in</w:t>
       </w:r>
       <w:r>
         <w:t xml:space="preserve"> </w:t>
@@ -57804,10 +57777,19 @@
         <w:rPr>
           <w:rStyle w:val="VerbatimChar"/>
         </w:rPr>
-        <w:t xml:space="preserve">api_post_ok</w:t>
-      </w:r>
-      <w:r>
-        <w:t xml:space="preserve">,</w:t>
+        <w:t xml:space="preserve">lean/lean-toolchain</w:t>
+      </w:r>
+      <w:r>
+        <w:t xml:space="preserve"> </w:t>
+      </w:r>
+      <w:r>
+        <w:t xml:space="preserve">and a continuous-integration job re-checks it on a clean machine at every change, failing the build</w:t>
+      </w:r>
+      <w:r>
+        <w:t xml:space="preserve"> </w:t>
+      </w:r>
+      <w:r>
+        <w:t xml:space="preserve">if any</w:t>
       </w:r>
       <w:r>
         <w:t xml:space="preserve"> </w:t>
@@ -57816,283 +57798,23 @@
         <w:rPr>
           <w:rStyle w:val="VerbatimChar"/>
         </w:rPr>
-        <w:t xml:space="preserve">api_argorder</w:t>
-      </w:r>
-      <w:r>
-        <w:t xml:space="preserve"> </w:t>
-      </w:r>
-      <w:r>
-        <w:t xml:space="preserve">(</w:t>
-      </w:r>
-      <w:r>
-        <w:rPr>
-          <w:rStyle w:val="VerbatimChar"/>
-        </w:rPr>
-        <w:t xml:space="preserve">memo</w:t>
-      </w:r>
-      <w:r>
-        <w:t xml:space="preserve"> </w:t>
-      </w:r>
-      <w:r>
-        <w:t xml:space="preserve">arrives via a parameter, forcing the keyword-only fact),</w:t>
-      </w:r>
-      <w:r>
-        <w:t xml:space="preserve"> </w:t>
-      </w:r>
-      <w:r>
-        <w:rPr>
-          <w:rStyle w:val="VerbatimChar"/>
-        </w:rPr>
-        <w:t xml:space="preserve">enc_amount</w:t>
-      </w:r>
-      <w:r>
-        <w:t xml:space="preserve">, and</w:t>
-      </w:r>
-      <w:r>
-        <w:t xml:space="preserve"> </w:t>
-      </w:r>
-      <w:r>
-        <w:rPr>
-          <w:rStyle w:val="VerbatimChar"/>
-        </w:rPr>
-        <w:t xml:space="preserve">trap_store_wire</w:t>
-      </w:r>
-      <w:r>
-        <w:t xml:space="preserve">; the arms are</w:t>
-      </w:r>
-      <w:r>
-        <w:t xml:space="preserve"> </w:t>
-      </w:r>
-      <m:oMath>
-        <m:r>
-          <m:rPr>
-            <m:sty m:val="p"/>
-          </m:rPr>
-          <m:t>{</m:t>
-        </m:r>
-        <m:r>
-          <m:rPr>
-            <m:nor/>
-            <m:sty m:val="p"/>
-          </m:rPr>
-          <m:t>none</m:t>
-        </m:r>
-        <m:r>
-          <m:rPr>
-            <m:sty m:val="p"/>
-          </m:rPr>
-          <m:t>,</m:t>
-        </m:r>
-        <m:sSub>
-          <m:e>
-            <m:r>
-              <m:t>W</m:t>
-            </m:r>
-          </m:e>
-          <m:sub>
-            <m:r>
-              <m:t>1</m:t>
-            </m:r>
-          </m:sub>
-        </m:sSub>
-        <m:r>
-          <m:rPr>
-            <m:sty m:val="p"/>
-          </m:rPr>
-          <m:t>,</m:t>
-        </m:r>
-        <m:sSub>
-          <m:e>
-            <m:r>
-              <m:t>W</m:t>
-            </m:r>
-          </m:e>
-          <m:sub>
-            <m:r>
-              <m:t>2</m:t>
-            </m:r>
-          </m:sub>
-        </m:sSub>
-        <m:r>
-          <m:rPr>
-            <m:sty m:val="p"/>
-          </m:rPr>
-          <m:t>,</m:t>
-        </m:r>
-        <m:sSub>
-          <m:e>
-            <m:r>
-              <m:t>W</m:t>
-            </m:r>
-          </m:e>
-          <m:sub>
-            <m:r>
-              <m:t>1</m:t>
-            </m:r>
-            <m:r>
-              <m:rPr>
-                <m:sty m:val="p"/>
-              </m:rPr>
-              <m:t>+</m:t>
-            </m:r>
-          </m:sub>
-        </m:sSub>
-        <m:r>
-          <m:rPr>
-            <m:sty m:val="p"/>
-          </m:rPr>
-          <m:t>}</m:t>
-        </m:r>
-      </m:oMath>
-      <w:r>
-        <w:t xml:space="preserve">,</w:t>
-      </w:r>
-      <w:r>
-        <w:t xml:space="preserve"> </w:t>
-      </w:r>
-      <w:r>
-        <w:t xml:space="preserve">with</w:t>
-      </w:r>
-      <w:r>
-        <w:t xml:space="preserve"> </w:t>
-      </w:r>
-      <m:oMath>
-        <m:sSub>
-          <m:e>
-            <m:r>
-              <m:t>W</m:t>
-            </m:r>
-          </m:e>
-          <m:sub>
-            <m:r>
-              <m:rPr>
-                <m:sty m:val="p"/>
-              </m:rPr>
-              <m:t>p</m:t>
-            </m:r>
-            <m:r>
-              <m:rPr>
-                <m:sty m:val="p"/>
-              </m:rPr>
-              <m:t>a</m:t>
-            </m:r>
-            <m:r>
-              <m:rPr>
-                <m:sty m:val="p"/>
-              </m:rPr>
-              <m:t>d</m:t>
-            </m:r>
-          </m:sub>
-        </m:sSub>
-      </m:oMath>
-      <w:r>
-        <w:t xml:space="preserve"> </w:t>
-      </w:r>
-      <w:r>
-        <w:t xml:space="preserve">(length-matched neutral filler</w:t>
-      </w:r>
-      <w:r>
-        <w:t xml:space="preserve"> </w:t>
-      </w:r>
-      <m:oMath>
-        <m:r>
-          <m:t> </m:t>
-        </m:r>
-        <m:r>
-          <m:rPr>
-            <m:sty m:val="p"/>
-          </m:rPr>
-          <m:t>+</m:t>
-        </m:r>
-        <m:r>
-          <m:rPr>
-            <m:sty m:val="p"/>
-          </m:rPr>
-          <m:t>+</m:t>
-        </m:r>
-        <m:r>
-          <m:t> </m:t>
-        </m:r>
-        <m:sSub>
-          <m:e>
-            <m:r>
-              <m:t>W</m:t>
-            </m:r>
-          </m:e>
-          <m:sub>
-            <m:r>
-              <m:t>1</m:t>
-            </m:r>
-          </m:sub>
-        </m:sSub>
-      </m:oMath>
-      <w:r>
-        <w:t xml:space="preserve">) added for the padding control.</w:t>
-      </w:r>
-      <w:r>
-        <w:t xml:space="preserve"> </w:t>
-      </w:r>
-      <w:r>
-        <w:t xml:space="preserve">All six models are queried in a single-shot completion (one call, no tools, code extracted from the</w:t>
-      </w:r>
-      <w:r>
-        <w:t xml:space="preserve"> </w:t>
-      </w:r>
-      <w:r>
-        <w:t xml:space="preserve">returned text), and PASS is measured over</w:t>
-      </w:r>
-      <w:r>
-        <w:t xml:space="preserve"> </w:t>
-      </w:r>
-      <m:oMath>
-        <m:r>
-          <m:t>n</m:t>
-        </m:r>
-        <m:r>
-          <m:rPr>
-            <m:sty m:val="p"/>
-          </m:rPr>
-          <m:t>=</m:t>
-        </m:r>
-        <m:r>
-          <m:t>40</m:t>
-        </m:r>
-      </m:oMath>
-      <w:r>
-        <w:t xml:space="preserve"> </w:t>
-      </w:r>
-      <w:r>
-        <w:t xml:space="preserve">i.i.d. completions per cell at</w:t>
-      </w:r>
-      <w:r>
-        <w:t xml:space="preserve"> </w:t>
-      </w:r>
-      <m:oMath>
-        <m:r>
-          <m:t>η</m:t>
-        </m:r>
-        <m:r>
-          <m:rPr>
-            <m:sty m:val="p"/>
-          </m:rPr>
-          <m:t>=</m:t>
-        </m:r>
-        <m:r>
-          <m:t>0.10</m:t>
-        </m:r>
-      </m:oMath>
-      <w:r>
-        <w:t xml:space="preserve">.</w:t>
+        <w:t xml:space="preserve">sorry</w:t>
+      </w:r>
+      <w:r>
+        <w:t xml:space="preserve"> </w:t>
+      </w:r>
+      <w:r>
+        <w:t xml:space="preserve">appears or if either theorem stops reporting an empty axiom footprint.</w:t>
       </w:r>
     </w:p>
     <w:bookmarkEnd w:id="146"/>
-    <w:bookmarkStart w:id="147" w:name="decoding-seeding-and-retries."/>
+    <w:bookmarkStart w:id="147" w:name="protocol."/>
     <w:p>
       <w:pPr>
         <w:pStyle w:val="Heading4"/>
       </w:pPr>
       <w:r>
-        <w:t xml:space="preserve">Decoding, seeding, and retries.</w:t>
+        <w:t xml:space="preserve">Protocol.</w:t>
       </w:r>
     </w:p>
     <w:p>
@@ -58100,75 +57822,202 @@
         <w:pStyle w:val="FirstParagraph"/>
       </w:pPr>
       <w:r>
-        <w:t xml:space="preserve">All runs use the provider’s default decoding</w:t>
-      </w:r>
-      <w:r>
-        <w:t xml:space="preserve"> </w:t>
-      </w:r>
-      <w:r>
-        <w:t xml:space="preserve">configuration: the harness sets no explicit temperature, top-</w:t>
-      </w:r>
-      <m:oMath>
-        <m:r>
-          <m:t>p</m:t>
-        </m:r>
-      </m:oMath>
-      <w:r>
-        <w:t xml:space="preserve">, or seed (the Claude CLI and the</w:t>
-      </w:r>
-      <w:r>
-        <w:t xml:space="preserve"> </w:t>
-      </w:r>
-      <w:r>
-        <w:t xml:space="preserve">Azure/OpenAI-compatible launchers are invoked without sampling overrides), so the</w:t>
-      </w:r>
-      <w:r>
-        <w:t xml:space="preserve"> </w:t>
-      </w:r>
-      <m:oMath>
-        <m:r>
-          <m:t>n</m:t>
-        </m:r>
-      </m:oMath>
-      <w:r>
-        <w:t xml:space="preserve"> </w:t>
-      </w:r>
-      <w:r>
-        <w:t xml:space="preserve">draws per cell</w:t>
-      </w:r>
-      <w:r>
-        <w:t xml:space="preserve"> </w:t>
-      </w:r>
-      <w:r>
-        <w:t xml:space="preserve">are independent samples from each provider’s default decoder, each a fresh single-turn call with a</w:t>
-      </w:r>
-      <w:r>
-        <w:t xml:space="preserve"> </w:t>
-      </w:r>
-      <m:oMath>
-        <m:r>
-          <m:t>200</m:t>
-        </m:r>
-      </m:oMath>
-      <w:r>
-        <w:t xml:space="preserve">-second timeout. Transport-level failures (empty or zero-token results) are retried up to three</w:t>
-      </w:r>
-      <w:r>
-        <w:t xml:space="preserve"> </w:t>
-      </w:r>
-      <w:r>
-        <w:t xml:space="preserve">times with quadratic backoff; a draw that still fails is scored as a failure, never as a pass. Where</w:t>
-      </w:r>
-      <w:r>
-        <w:t xml:space="preserve"> </w:t>
-      </w:r>
-      <w:r>
-        <w:t xml:space="preserve">a whole arm was hit by a transport-outage window, we re-ran that arm in isolation (the Opus</w:t>
-      </w:r>
-      <w:r>
-        <w:t xml:space="preserve"> </w:t>
-      </w:r>
-      <m:oMath>
+        <w:t xml:space="preserve">The verifier stubs a fake</w:t>
+      </w:r>
+      <w:r>
+        <w:t xml:space="preserve"> </w:t>
+      </w:r>
+      <w:r>
+        <w:rPr>
+          <w:rStyle w:val="VerbatimChar"/>
+        </w:rPr>
+        <w:t xml:space="preserve">ledger</w:t>
+      </w:r>
+      <w:r>
+        <w:t xml:space="preserve"> </w:t>
+      </w:r>
+      <w:r>
+        <w:t xml:space="preserve">module that accepts</w:t>
+      </w:r>
+      <w:r>
+        <w:t xml:space="preserve"> </w:t>
+      </w:r>
+      <w:r>
+        <w:rPr>
+          <w:i/>
+          <w:iCs/>
+        </w:rPr>
+        <w:t xml:space="preserve">only</w:t>
+      </w:r>
+      <w:r>
+        <w:t xml:space="preserve"> </w:t>
+      </w:r>
+      <w:r>
+        <w:t xml:space="preserve">the exact</w:t>
+      </w:r>
+      <w:r>
+        <w:t xml:space="preserve"> </w:t>
+      </w:r>
+      <w:r>
+        <w:t xml:space="preserve">private contract (it rejects wrong positional arg order, a missing</w:t>
+      </w:r>
+      <w:r>
+        <w:t xml:space="preserve"> </w:t>
+      </w:r>
+      <w:r>
+        <w:rPr>
+          <w:rStyle w:val="VerbatimChar"/>
+        </w:rPr>
+        <w:t xml:space="preserve">memo=</w:t>
+      </w:r>
+      <w:r>
+        <w:t xml:space="preserve"> </w:t>
+      </w:r>
+      <w:r>
+        <w:t xml:space="preserve">keyword, and the wrong</w:t>
+      </w:r>
+      <w:r>
+        <w:t xml:space="preserve"> </w:t>
+      </w:r>
+      <w:r>
+        <w:t xml:space="preserve">exception type); return code</w:t>
+      </w:r>
+      <w:r>
+        <w:t xml:space="preserve"> </w:t>
+      </w:r>
+      <m:oMath>
+        <m:r>
+          <m:t>0</m:t>
+        </m:r>
+      </m:oMath>
+      <w:r>
+        <w:t xml:space="preserve"> </w:t>
+      </w:r>
+      <w:r>
+        <w:t xml:space="preserve">is PASS. The four verified cells are</w:t>
+      </w:r>
+      <w:r>
+        <w:t xml:space="preserve"> </w:t>
+      </w:r>
+      <w:r>
+        <w:rPr>
+          <w:rStyle w:val="VerbatimChar"/>
+        </w:rPr>
+        <w:t xml:space="preserve">api_post_ok</w:t>
+      </w:r>
+      <w:r>
+        <w:t xml:space="preserve">,</w:t>
+      </w:r>
+      <w:r>
+        <w:t xml:space="preserve"> </w:t>
+      </w:r>
+      <w:r>
+        <w:rPr>
+          <w:rStyle w:val="VerbatimChar"/>
+        </w:rPr>
+        <w:t xml:space="preserve">api_argorder</w:t>
+      </w:r>
+      <w:r>
+        <w:t xml:space="preserve"> </w:t>
+      </w:r>
+      <w:r>
+        <w:t xml:space="preserve">(</w:t>
+      </w:r>
+      <w:r>
+        <w:rPr>
+          <w:rStyle w:val="VerbatimChar"/>
+        </w:rPr>
+        <w:t xml:space="preserve">memo</w:t>
+      </w:r>
+      <w:r>
+        <w:t xml:space="preserve"> </w:t>
+      </w:r>
+      <w:r>
+        <w:t xml:space="preserve">arrives via a parameter, forcing the keyword-only fact),</w:t>
+      </w:r>
+      <w:r>
+        <w:t xml:space="preserve"> </w:t>
+      </w:r>
+      <w:r>
+        <w:rPr>
+          <w:rStyle w:val="VerbatimChar"/>
+        </w:rPr>
+        <w:t xml:space="preserve">enc_amount</w:t>
+      </w:r>
+      <w:r>
+        <w:t xml:space="preserve">, and</w:t>
+      </w:r>
+      <w:r>
+        <w:t xml:space="preserve"> </w:t>
+      </w:r>
+      <w:r>
+        <w:rPr>
+          <w:rStyle w:val="VerbatimChar"/>
+        </w:rPr>
+        <w:t xml:space="preserve">trap_store_wire</w:t>
+      </w:r>
+      <w:r>
+        <w:t xml:space="preserve">; the arms are</w:t>
+      </w:r>
+      <w:r>
+        <w:t xml:space="preserve"> </w:t>
+      </w:r>
+      <m:oMath>
+        <m:r>
+          <m:rPr>
+            <m:sty m:val="p"/>
+          </m:rPr>
+          <m:t>{</m:t>
+        </m:r>
+        <m:r>
+          <m:rPr>
+            <m:nor/>
+            <m:sty m:val="p"/>
+          </m:rPr>
+          <m:t>none</m:t>
+        </m:r>
+        <m:r>
+          <m:rPr>
+            <m:sty m:val="p"/>
+          </m:rPr>
+          <m:t>,</m:t>
+        </m:r>
+        <m:sSub>
+          <m:e>
+            <m:r>
+              <m:t>W</m:t>
+            </m:r>
+          </m:e>
+          <m:sub>
+            <m:r>
+              <m:t>1</m:t>
+            </m:r>
+          </m:sub>
+        </m:sSub>
+        <m:r>
+          <m:rPr>
+            <m:sty m:val="p"/>
+          </m:rPr>
+          <m:t>,</m:t>
+        </m:r>
+        <m:sSub>
+          <m:e>
+            <m:r>
+              <m:t>W</m:t>
+            </m:r>
+          </m:e>
+          <m:sub>
+            <m:r>
+              <m:t>2</m:t>
+            </m:r>
+          </m:sub>
+        </m:sSub>
+        <m:r>
+          <m:rPr>
+            <m:sty m:val="p"/>
+          </m:rPr>
+          <m:t>,</m:t>
+        </m:r>
         <m:sSub>
           <m:e>
             <m:r>
@@ -58187,16 +58036,266 @@
             </m:r>
           </m:sub>
         </m:sSub>
-      </m:oMath>
-      <w:r>
-        <w:t xml:space="preserve"> </w:t>
-      </w:r>
-      <w:r>
-        <w:t xml:space="preserve">arm; noted in the artifact list), so no reported cell mixes outage-scored draws with real ones.</w:t>
+        <m:r>
+          <m:rPr>
+            <m:sty m:val="p"/>
+          </m:rPr>
+          <m:t>}</m:t>
+        </m:r>
+      </m:oMath>
+      <w:r>
+        <w:t xml:space="preserve">,</w:t>
+      </w:r>
+      <w:r>
+        <w:t xml:space="preserve"> </w:t>
+      </w:r>
+      <w:r>
+        <w:t xml:space="preserve">with</w:t>
+      </w:r>
+      <w:r>
+        <w:t xml:space="preserve"> </w:t>
+      </w:r>
+      <m:oMath>
+        <m:sSub>
+          <m:e>
+            <m:r>
+              <m:t>W</m:t>
+            </m:r>
+          </m:e>
+          <m:sub>
+            <m:r>
+              <m:rPr>
+                <m:sty m:val="p"/>
+              </m:rPr>
+              <m:t>p</m:t>
+            </m:r>
+            <m:r>
+              <m:rPr>
+                <m:sty m:val="p"/>
+              </m:rPr>
+              <m:t>a</m:t>
+            </m:r>
+            <m:r>
+              <m:rPr>
+                <m:sty m:val="p"/>
+              </m:rPr>
+              <m:t>d</m:t>
+            </m:r>
+          </m:sub>
+        </m:sSub>
+      </m:oMath>
+      <w:r>
+        <w:t xml:space="preserve"> </w:t>
+      </w:r>
+      <w:r>
+        <w:t xml:space="preserve">(length-matched neutral filler</w:t>
+      </w:r>
+      <w:r>
+        <w:t xml:space="preserve"> </w:t>
+      </w:r>
+      <m:oMath>
+        <m:r>
+          <m:t> </m:t>
+        </m:r>
+        <m:r>
+          <m:rPr>
+            <m:sty m:val="p"/>
+          </m:rPr>
+          <m:t>+</m:t>
+        </m:r>
+        <m:r>
+          <m:rPr>
+            <m:sty m:val="p"/>
+          </m:rPr>
+          <m:t>+</m:t>
+        </m:r>
+        <m:r>
+          <m:t> </m:t>
+        </m:r>
+        <m:sSub>
+          <m:e>
+            <m:r>
+              <m:t>W</m:t>
+            </m:r>
+          </m:e>
+          <m:sub>
+            <m:r>
+              <m:t>1</m:t>
+            </m:r>
+          </m:sub>
+        </m:sSub>
+      </m:oMath>
+      <w:r>
+        <w:t xml:space="preserve">) added for the padding control.</w:t>
+      </w:r>
+      <w:r>
+        <w:t xml:space="preserve"> </w:t>
+      </w:r>
+      <w:r>
+        <w:t xml:space="preserve">All six models are queried in a single-shot completion (one call, no tools, code extracted from the</w:t>
+      </w:r>
+      <w:r>
+        <w:t xml:space="preserve"> </w:t>
+      </w:r>
+      <w:r>
+        <w:t xml:space="preserve">returned text), and PASS is measured over</w:t>
+      </w:r>
+      <w:r>
+        <w:t xml:space="preserve"> </w:t>
+      </w:r>
+      <m:oMath>
+        <m:r>
+          <m:t>n</m:t>
+        </m:r>
+        <m:r>
+          <m:rPr>
+            <m:sty m:val="p"/>
+          </m:rPr>
+          <m:t>=</m:t>
+        </m:r>
+        <m:r>
+          <m:t>40</m:t>
+        </m:r>
+      </m:oMath>
+      <w:r>
+        <w:t xml:space="preserve"> </w:t>
+      </w:r>
+      <w:r>
+        <w:t xml:space="preserve">i.i.d. completions per cell at</w:t>
+      </w:r>
+      <w:r>
+        <w:t xml:space="preserve"> </w:t>
+      </w:r>
+      <m:oMath>
+        <m:r>
+          <m:t>η</m:t>
+        </m:r>
+        <m:r>
+          <m:rPr>
+            <m:sty m:val="p"/>
+          </m:rPr>
+          <m:t>=</m:t>
+        </m:r>
+        <m:r>
+          <m:t>0.10</m:t>
+        </m:r>
+      </m:oMath>
+      <w:r>
+        <w:t xml:space="preserve">.</w:t>
       </w:r>
     </w:p>
     <w:bookmarkEnd w:id="147"/>
-    <w:bookmarkStart w:id="148" w:name="artifacts."/>
+    <w:bookmarkStart w:id="148" w:name="decoding-seeding-and-retries."/>
+    <w:p>
+      <w:pPr>
+        <w:pStyle w:val="Heading4"/>
+      </w:pPr>
+      <w:r>
+        <w:t xml:space="preserve">Decoding, seeding, and retries.</w:t>
+      </w:r>
+    </w:p>
+    <w:p>
+      <w:pPr>
+        <w:pStyle w:val="FirstParagraph"/>
+      </w:pPr>
+      <w:r>
+        <w:t xml:space="preserve">All runs use the provider’s default decoding</w:t>
+      </w:r>
+      <w:r>
+        <w:t xml:space="preserve"> </w:t>
+      </w:r>
+      <w:r>
+        <w:t xml:space="preserve">configuration: the harness sets no explicit temperature, top-</w:t>
+      </w:r>
+      <m:oMath>
+        <m:r>
+          <m:t>p</m:t>
+        </m:r>
+      </m:oMath>
+      <w:r>
+        <w:t xml:space="preserve">, or seed (the Claude CLI and the</w:t>
+      </w:r>
+      <w:r>
+        <w:t xml:space="preserve"> </w:t>
+      </w:r>
+      <w:r>
+        <w:t xml:space="preserve">Azure/OpenAI-compatible launchers are invoked without sampling overrides), so the</w:t>
+      </w:r>
+      <w:r>
+        <w:t xml:space="preserve"> </w:t>
+      </w:r>
+      <m:oMath>
+        <m:r>
+          <m:t>n</m:t>
+        </m:r>
+      </m:oMath>
+      <w:r>
+        <w:t xml:space="preserve"> </w:t>
+      </w:r>
+      <w:r>
+        <w:t xml:space="preserve">draws per cell</w:t>
+      </w:r>
+      <w:r>
+        <w:t xml:space="preserve"> </w:t>
+      </w:r>
+      <w:r>
+        <w:t xml:space="preserve">are independent samples from each provider’s default decoder, each a fresh single-turn call with a</w:t>
+      </w:r>
+      <w:r>
+        <w:t xml:space="preserve"> </w:t>
+      </w:r>
+      <m:oMath>
+        <m:r>
+          <m:t>200</m:t>
+        </m:r>
+      </m:oMath>
+      <w:r>
+        <w:t xml:space="preserve">-second timeout. Transport-level failures (empty or zero-token results) are retried up to three</w:t>
+      </w:r>
+      <w:r>
+        <w:t xml:space="preserve"> </w:t>
+      </w:r>
+      <w:r>
+        <w:t xml:space="preserve">times with quadratic backoff; a draw that still fails is scored as a failure, never as a pass. Where</w:t>
+      </w:r>
+      <w:r>
+        <w:t xml:space="preserve"> </w:t>
+      </w:r>
+      <w:r>
+        <w:t xml:space="preserve">a whole arm was hit by a transport-outage window, we re-ran that arm in isolation (the Opus</w:t>
+      </w:r>
+      <w:r>
+        <w:t xml:space="preserve"> </w:t>
+      </w:r>
+      <m:oMath>
+        <m:sSub>
+          <m:e>
+            <m:r>
+              <m:t>W</m:t>
+            </m:r>
+          </m:e>
+          <m:sub>
+            <m:r>
+              <m:t>1</m:t>
+            </m:r>
+            <m:r>
+              <m:rPr>
+                <m:sty m:val="p"/>
+              </m:rPr>
+              <m:t>+</m:t>
+            </m:r>
+          </m:sub>
+        </m:sSub>
+      </m:oMath>
+      <w:r>
+        <w:t xml:space="preserve"> </w:t>
+      </w:r>
+      <w:r>
+        <w:t xml:space="preserve">arm; noted in the artifact list), so no reported cell mixes outage-scored draws with real ones.</w:t>
+      </w:r>
+    </w:p>
+    <w:bookmarkEnd w:id="148"/>
+    <w:bookmarkStart w:id="149" w:name="artifacts."/>
     <w:p>
       <w:pPr>
         <w:pStyle w:val="Heading4"/>
@@ -58531,8 +58630,8 @@
         <w:t xml:space="preserve">.</w:t>
       </w:r>
     </w:p>
-    <w:bookmarkEnd w:id="148"/>
-    <w:bookmarkStart w:id="149" w:name="compute-and-cost."/>
+    <w:bookmarkEnd w:id="149"/>
+    <w:bookmarkStart w:id="150" w:name="compute-and-cost."/>
     <w:p>
       <w:pPr>
         <w:pStyle w:val="Heading4"/>
@@ -58579,8 +58678,8 @@
         <w:t xml:space="preserve">on open weights at zero API cost.</w:t>
       </w:r>
     </w:p>
-    <w:bookmarkEnd w:id="149"/>
-    <w:bookmarkStart w:id="236" w:name="reference-verification."/>
+    <w:bookmarkEnd w:id="150"/>
+    <w:bookmarkStart w:id="237" w:name="reference-verification."/>
     <w:p>
       <w:pPr>
         <w:pStyle w:val="Heading4"/>
@@ -58615,8 +58714,8 @@
         <w:t xml:space="preserve">1964/1986; Torgersen 1991; Ethayarajh et al. 2022) were checked against the primary sources.</w:t>
       </w:r>
     </w:p>
-    <w:bookmarkStart w:id="235" w:name="refs"/>
-    <w:bookmarkStart w:id="151" w:name="ref-akdemir2025"/>
+    <w:bookmarkStart w:id="236" w:name="refs"/>
+    <w:bookmarkStart w:id="152" w:name="ref-akdemir2025"/>
     <w:p>
       <w:pPr>
         <w:pStyle w:val="Bibliography"/>
@@ -58655,7 +58754,7 @@
       <w:r>
         <w:t xml:space="preserve"> </w:t>
       </w:r>
-      <w:hyperlink r:id="rId150">
+      <w:hyperlink r:id="rId151">
         <w:r>
           <w:rPr>
             <w:rStyle w:val="Hyperlink"/>
@@ -58667,8 +58766,8 @@
         <w:t xml:space="preserve">.</w:t>
       </w:r>
     </w:p>
-    <w:bookmarkEnd w:id="151"/>
-    <w:bookmarkStart w:id="153" w:name="ref-blackwell1953"/>
+    <w:bookmarkEnd w:id="152"/>
+    <w:bookmarkStart w:id="154" w:name="ref-blackwell1953"/>
     <w:p>
       <w:pPr>
         <w:pStyle w:val="Bibliography"/>
@@ -58701,7 +58800,7 @@
       <w:r>
         <w:t xml:space="preserve"> </w:t>
       </w:r>
-      <w:hyperlink r:id="rId152">
+      <w:hyperlink r:id="rId153">
         <w:r>
           <w:rPr>
             <w:rStyle w:val="Hyperlink"/>
@@ -58713,8 +58812,8 @@
         <w:t xml:space="preserve">.</w:t>
       </w:r>
     </w:p>
-    <w:bookmarkEnd w:id="153"/>
-    <w:bookmarkStart w:id="154" w:name="ref-bonferroni1936"/>
+    <w:bookmarkEnd w:id="154"/>
+    <w:bookmarkStart w:id="155" w:name="ref-bonferroni1936"/>
     <w:p>
       <w:pPr>
         <w:pStyle w:val="Bibliography"/>
@@ -58745,8 +58844,8 @@
         <w:t xml:space="preserve">8: 3–62.</w:t>
       </w:r>
     </w:p>
-    <w:bookmarkEnd w:id="154"/>
-    <w:bookmarkStart w:id="156" w:name="ref-bowyer2025clt"/>
+    <w:bookmarkEnd w:id="155"/>
+    <w:bookmarkStart w:id="157" w:name="ref-bowyer2025clt"/>
     <w:p>
       <w:pPr>
         <w:pStyle w:val="Bibliography"/>
@@ -58800,7 +58899,7 @@
       <w:r>
         <w:t xml:space="preserve"> </w:t>
       </w:r>
-      <w:hyperlink r:id="rId155">
+      <w:hyperlink r:id="rId156">
         <w:r>
           <w:rPr>
             <w:rStyle w:val="Hyperlink"/>
@@ -58812,8 +58911,8 @@
         <w:t xml:space="preserve">.</w:t>
       </w:r>
     </w:p>
-    <w:bookmarkEnd w:id="156"/>
-    <w:bookmarkStart w:id="158" w:name="ref-bradley2024garbling"/>
+    <w:bookmarkEnd w:id="157"/>
+    <w:bookmarkStart w:id="159" w:name="ref-bradley2024garbling"/>
     <w:p>
       <w:pPr>
         <w:pStyle w:val="Bibliography"/>
@@ -58855,7 +58954,7 @@
       <w:r>
         <w:t xml:space="preserve"> </w:t>
       </w:r>
-      <w:hyperlink r:id="rId157">
+      <w:hyperlink r:id="rId158">
         <w:r>
           <w:rPr>
             <w:rStyle w:val="Hyperlink"/>
@@ -58867,8 +58966,8 @@
         <w:t xml:space="preserve">.</w:t>
       </w:r>
     </w:p>
-    <w:bookmarkEnd w:id="158"/>
-    <w:bookmarkStart w:id="160" w:name="ref-carbonell1998"/>
+    <w:bookmarkEnd w:id="159"/>
+    <w:bookmarkStart w:id="161" w:name="ref-carbonell1998"/>
     <w:p>
       <w:pPr>
         <w:pStyle w:val="Bibliography"/>
@@ -58907,7 +59006,7 @@
       <w:r>
         <w:t xml:space="preserve"> </w:t>
       </w:r>
-      <w:hyperlink r:id="rId159">
+      <w:hyperlink r:id="rId160">
         <w:r>
           <w:rPr>
             <w:rStyle w:val="Hyperlink"/>
@@ -58919,8 +59018,8 @@
         <w:t xml:space="preserve">.</w:t>
       </w:r>
     </w:p>
-    <w:bookmarkEnd w:id="160"/>
-    <w:bookmarkStart w:id="162" w:name="ref-conformalip2025"/>
+    <w:bookmarkEnd w:id="161"/>
+    <w:bookmarkStart w:id="163" w:name="ref-conformalip2025"/>
     <w:p>
       <w:pPr>
         <w:pStyle w:val="Bibliography"/>
@@ -58950,7 +59049,7 @@
       <w:r>
         <w:t xml:space="preserve"> </w:t>
       </w:r>
-      <w:hyperlink r:id="rId161">
+      <w:hyperlink r:id="rId162">
         <w:r>
           <w:rPr>
             <w:rStyle w:val="Hyperlink"/>
@@ -58962,8 +59061,8 @@
         <w:t xml:space="preserve">.</w:t>
       </w:r>
     </w:p>
-    <w:bookmarkEnd w:id="162"/>
-    <w:bookmarkStart w:id="164" w:name="ref-bedllm2026"/>
+    <w:bookmarkEnd w:id="163"/>
+    <w:bookmarkStart w:id="165" w:name="ref-bedllm2026"/>
     <w:p>
       <w:pPr>
         <w:pStyle w:val="Bibliography"/>
@@ -59011,7 +59110,7 @@
       <w:r>
         <w:t xml:space="preserve"> </w:t>
       </w:r>
-      <w:hyperlink r:id="rId163">
+      <w:hyperlink r:id="rId164">
         <w:r>
           <w:rPr>
             <w:rStyle w:val="Hyperlink"/>
@@ -59023,8 +59122,8 @@
         <w:t xml:space="preserve">.</w:t>
       </w:r>
     </w:p>
-    <w:bookmarkEnd w:id="164"/>
-    <w:bookmarkStart w:id="166" w:name="ref-clopperpearson1934"/>
+    <w:bookmarkEnd w:id="165"/>
+    <w:bookmarkStart w:id="167" w:name="ref-clopperpearson1934"/>
     <w:p>
       <w:pPr>
         <w:pStyle w:val="Bibliography"/>
@@ -59057,7 +59156,7 @@
       <w:r>
         <w:t xml:space="preserve"> </w:t>
       </w:r>
-      <w:hyperlink r:id="rId165">
+      <w:hyperlink r:id="rId166">
         <w:r>
           <w:rPr>
             <w:rStyle w:val="Hyperlink"/>
@@ -59069,8 +59168,8 @@
         <w:t xml:space="preserve">.</w:t>
       </w:r>
     </w:p>
-    <w:bookmarkEnd w:id="166"/>
-    <w:bookmarkStart w:id="168" w:name="ref-cuconasu2024noise"/>
+    <w:bookmarkEnd w:id="167"/>
+    <w:bookmarkStart w:id="169" w:name="ref-cuconasu2024noise"/>
     <w:p>
       <w:pPr>
         <w:pStyle w:val="Bibliography"/>
@@ -59112,7 +59211,7 @@
       <w:r>
         <w:t xml:space="preserve"> </w:t>
       </w:r>
-      <w:hyperlink r:id="rId167">
+      <w:hyperlink r:id="rId168">
         <w:r>
           <w:rPr>
             <w:rStyle w:val="Hyperlink"/>
@@ -59124,8 +59223,8 @@
         <w:t xml:space="preserve">.</w:t>
       </w:r>
     </w:p>
-    <w:bookmarkEnd w:id="168"/>
-    <w:bookmarkStart w:id="170" w:name="ref-contexthurts2025"/>
+    <w:bookmarkEnd w:id="169"/>
+    <w:bookmarkStart w:id="171" w:name="ref-contexthurts2025"/>
     <w:p>
       <w:pPr>
         <w:pStyle w:val="Bibliography"/>
@@ -59167,7 +59266,7 @@
       <w:r>
         <w:t xml:space="preserve"> </w:t>
       </w:r>
-      <w:hyperlink r:id="rId169">
+      <w:hyperlink r:id="rId170">
         <w:r>
           <w:rPr>
             <w:rStyle w:val="Hyperlink"/>
@@ -59179,8 +59278,8 @@
         <w:t xml:space="preserve">.</w:t>
       </w:r>
     </w:p>
-    <w:bookmarkEnd w:id="170"/>
-    <w:bookmarkStart w:id="172" w:name="ref-dvoretzky1956"/>
+    <w:bookmarkEnd w:id="171"/>
+    <w:bookmarkStart w:id="173" w:name="ref-dvoretzky1956"/>
     <w:p>
       <w:pPr>
         <w:pStyle w:val="Bibliography"/>
@@ -59213,7 +59312,7 @@
       <w:r>
         <w:t xml:space="preserve"> </w:t>
       </w:r>
-      <w:hyperlink r:id="rId171">
+      <w:hyperlink r:id="rId172">
         <w:r>
           <w:rPr>
             <w:rStyle w:val="Hyperlink"/>
@@ -59225,8 +59324,8 @@
         <w:t xml:space="preserve">.</w:t>
       </w:r>
     </w:p>
-    <w:bookmarkEnd w:id="172"/>
-    <w:bookmarkStart w:id="173" w:name="ref-ethayarajh2022"/>
+    <w:bookmarkEnd w:id="173"/>
+    <w:bookmarkStart w:id="174" w:name="ref-ethayarajh2022"/>
     <w:p>
       <w:pPr>
         <w:pStyle w:val="Bibliography"/>
@@ -59269,8 +59368,8 @@
         <w:t xml:space="preserve">, PMLR, vol. 162: 5988–6008.</w:t>
       </w:r>
     </w:p>
-    <w:bookmarkEnd w:id="173"/>
-    <w:bookmarkStart w:id="175" w:name="ref-fosse2025"/>
+    <w:bookmarkEnd w:id="174"/>
+    <w:bookmarkStart w:id="176" w:name="ref-fosse2025"/>
     <w:p>
       <w:pPr>
         <w:pStyle w:val="Bibliography"/>
@@ -59300,7 +59399,7 @@
       <w:r>
         <w:t xml:space="preserve"> </w:t>
       </w:r>
-      <w:hyperlink r:id="rId174">
+      <w:hyperlink r:id="rId175">
         <w:r>
           <w:rPr>
             <w:rStyle w:val="Hyperlink"/>
@@ -59312,8 +59411,8 @@
         <w:t xml:space="preserve">.</w:t>
       </w:r>
     </w:p>
-    <w:bookmarkEnd w:id="175"/>
-    <w:bookmarkStart w:id="177" w:name="ref-fuhr2008"/>
+    <w:bookmarkEnd w:id="176"/>
+    <w:bookmarkStart w:id="178" w:name="ref-fuhr2008"/>
     <w:p>
       <w:pPr>
         <w:pStyle w:val="Bibliography"/>
@@ -59346,7 +59445,7 @@
       <w:r>
         <w:t xml:space="preserve"> </w:t>
       </w:r>
-      <w:hyperlink r:id="rId176">
+      <w:hyperlink r:id="rId177">
         <w:r>
           <w:rPr>
             <w:rStyle w:val="Hyperlink"/>
@@ -59358,8 +59457,8 @@
         <w:t xml:space="preserve">.</w:t>
       </w:r>
     </w:p>
-    <w:bookmarkEnd w:id="177"/>
-    <w:bookmarkStart w:id="179" w:name="ref-gao2024modelequality"/>
+    <w:bookmarkEnd w:id="178"/>
+    <w:bookmarkStart w:id="180" w:name="ref-gao2024modelequality"/>
     <w:p>
       <w:pPr>
         <w:pStyle w:val="Bibliography"/>
@@ -59401,7 +59500,7 @@
       <w:r>
         <w:t xml:space="preserve"> </w:t>
       </w:r>
-      <w:hyperlink r:id="rId178">
+      <w:hyperlink r:id="rId179">
         <w:r>
           <w:rPr>
             <w:rStyle w:val="Hyperlink"/>
@@ -59413,8 +59512,8 @@
         <w:t xml:space="preserve">.</w:t>
       </w:r>
     </w:p>
-    <w:bookmarkEnd w:id="179"/>
-    <w:bookmarkStart w:id="181" w:name="ref-guu2020realm"/>
+    <w:bookmarkEnd w:id="180"/>
+    <w:bookmarkStart w:id="182" w:name="ref-guu2020realm"/>
     <w:p>
       <w:pPr>
         <w:pStyle w:val="Bibliography"/>
@@ -59450,7 +59549,7 @@
       <w:r>
         <w:t xml:space="preserve"> </w:t>
       </w:r>
-      <w:hyperlink r:id="rId180">
+      <w:hyperlink r:id="rId181">
         <w:r>
           <w:rPr>
             <w:rStyle w:val="Hyperlink"/>
@@ -59462,8 +59561,8 @@
         <w:t xml:space="preserve">.</w:t>
       </w:r>
     </w:p>
-    <w:bookmarkEnd w:id="181"/>
-    <w:bookmarkStart w:id="183" w:name="ref-hong2025contextrot"/>
+    <w:bookmarkEnd w:id="182"/>
+    <w:bookmarkStart w:id="184" w:name="ref-hong2025contextrot"/>
     <w:p>
       <w:pPr>
         <w:pStyle w:val="Bibliography"/>
@@ -59515,7 +59614,7 @@
       <w:r>
         <w:t xml:space="preserve"> </w:t>
       </w:r>
-      <w:hyperlink r:id="rId182">
+      <w:hyperlink r:id="rId183">
         <w:r>
           <w:rPr>
             <w:rStyle w:val="Hyperlink"/>
@@ -59527,8 +59626,8 @@
         <w:t xml:space="preserve">.</w:t>
       </w:r>
     </w:p>
-    <w:bookmarkEnd w:id="183"/>
-    <w:bookmarkStart w:id="185" w:name="ref-huang2025gammacover"/>
+    <w:bookmarkEnd w:id="184"/>
+    <w:bookmarkStart w:id="186" w:name="ref-huang2025gammacover"/>
     <w:p>
       <w:pPr>
         <w:pStyle w:val="Bibliography"/>
@@ -59569,7 +59668,7 @@
       <w:r>
         <w:t xml:space="preserve"> </w:t>
       </w:r>
-      <w:hyperlink r:id="rId184">
+      <w:hyperlink r:id="rId185">
         <w:r>
           <w:rPr>
             <w:rStyle w:val="Hyperlink"/>
@@ -59581,8 +59680,8 @@
         <w:t xml:space="preserve">.</w:t>
       </w:r>
     </w:p>
-    <w:bookmarkEnd w:id="185"/>
-    <w:bookmarkStart w:id="187" w:name="ref-jin2024longrag"/>
+    <w:bookmarkEnd w:id="186"/>
+    <w:bookmarkStart w:id="188" w:name="ref-jin2024longrag"/>
     <w:p>
       <w:pPr>
         <w:pStyle w:val="Bibliography"/>
@@ -59642,7 +59741,7 @@
       <w:r>
         <w:t xml:space="preserve"> </w:t>
       </w:r>
-      <w:hyperlink r:id="rId186">
+      <w:hyperlink r:id="rId187">
         <w:r>
           <w:rPr>
             <w:rStyle w:val="Hyperlink"/>
@@ -59654,8 +59753,8 @@
         <w:t xml:space="preserve">.</w:t>
       </w:r>
     </w:p>
-    <w:bookmarkEnd w:id="187"/>
-    <w:bookmarkStart w:id="189" w:name="ref-sufficientcontext2024"/>
+    <w:bookmarkEnd w:id="188"/>
+    <w:bookmarkStart w:id="190" w:name="ref-sufficientcontext2024"/>
     <w:p>
       <w:pPr>
         <w:pStyle w:val="Bibliography"/>
@@ -59685,7 +59784,7 @@
       <w:r>
         <w:t xml:space="preserve"> </w:t>
       </w:r>
-      <w:hyperlink r:id="rId188">
+      <w:hyperlink r:id="rId189">
         <w:r>
           <w:rPr>
             <w:rStyle w:val="Hyperlink"/>
@@ -59697,8 +59796,8 @@
         <w:t xml:space="preserve">.</w:t>
       </w:r>
     </w:p>
-    <w:bookmarkEnd w:id="189"/>
-    <w:bookmarkStart w:id="191" w:name="ref-khattab2020colbert"/>
+    <w:bookmarkEnd w:id="190"/>
+    <w:bookmarkStart w:id="192" w:name="ref-khattab2020colbert"/>
     <w:p>
       <w:pPr>
         <w:pStyle w:val="Bibliography"/>
@@ -59743,7 +59842,7 @@
       <w:r>
         <w:t xml:space="preserve"> </w:t>
       </w:r>
-      <w:hyperlink r:id="rId190">
+      <w:hyperlink r:id="rId191">
         <w:r>
           <w:rPr>
             <w:rStyle w:val="Hyperlink"/>
@@ -59755,8 +59854,8 @@
         <w:t xml:space="preserve">.</w:t>
       </w:r>
     </w:p>
-    <w:bookmarkEnd w:id="191"/>
-    <w:bookmarkStart w:id="193" w:name="ref-lecam1964"/>
+    <w:bookmarkEnd w:id="192"/>
+    <w:bookmarkStart w:id="194" w:name="ref-lecam1964"/>
     <w:p>
       <w:pPr>
         <w:pStyle w:val="Bibliography"/>
@@ -59789,7 +59888,7 @@
       <w:r>
         <w:t xml:space="preserve"> </w:t>
       </w:r>
-      <w:hyperlink r:id="rId192">
+      <w:hyperlink r:id="rId193">
         <w:r>
           <w:rPr>
             <w:rStyle w:val="Hyperlink"/>
@@ -59801,8 +59900,8 @@
         <w:t xml:space="preserve">.</w:t>
       </w:r>
     </w:p>
-    <w:bookmarkEnd w:id="193"/>
-    <w:bookmarkStart w:id="195" w:name="ref-lecam1986"/>
+    <w:bookmarkEnd w:id="194"/>
+    <w:bookmarkStart w:id="196" w:name="ref-lecam1986"/>
     <w:p>
       <w:pPr>
         <w:pStyle w:val="Bibliography"/>
@@ -59826,7 +59925,7 @@
       <w:r>
         <w:t xml:space="preserve"> </w:t>
       </w:r>
-      <w:hyperlink r:id="rId194">
+      <w:hyperlink r:id="rId195">
         <w:r>
           <w:rPr>
             <w:rStyle w:val="Hyperlink"/>
@@ -59838,8 +59937,8 @@
         <w:t xml:space="preserve">.</w:t>
       </w:r>
     </w:p>
-    <w:bookmarkEnd w:id="195"/>
-    <w:bookmarkStart w:id="197" w:name="ref-relevanceutility2025"/>
+    <w:bookmarkEnd w:id="196"/>
+    <w:bookmarkStart w:id="198" w:name="ref-relevanceutility2025"/>
     <w:p>
       <w:pPr>
         <w:pStyle w:val="Bibliography"/>
@@ -59881,7 +59980,7 @@
       <w:r>
         <w:t xml:space="preserve"> </w:t>
       </w:r>
-      <w:hyperlink r:id="rId196">
+      <w:hyperlink r:id="rId197">
         <w:r>
           <w:rPr>
             <w:rStyle w:val="Hyperlink"/>
@@ -59893,8 +59992,8 @@
         <w:t xml:space="preserve">.</w:t>
       </w:r>
     </w:p>
-    <w:bookmarkEnd w:id="197"/>
-    <w:bookmarkStart w:id="199" w:name="ref-levy2025moredocs"/>
+    <w:bookmarkEnd w:id="198"/>
+    <w:bookmarkStart w:id="200" w:name="ref-levy2025moredocs"/>
     <w:p>
       <w:pPr>
         <w:pStyle w:val="Bibliography"/>
@@ -59933,7 +60032,7 @@
       <w:r>
         <w:t xml:space="preserve"> </w:t>
       </w:r>
-      <w:hyperlink r:id="rId198">
+      <w:hyperlink r:id="rId199">
         <w:r>
           <w:rPr>
             <w:rStyle w:val="Hyperlink"/>
@@ -59945,8 +60044,8 @@
         <w:t xml:space="preserve">.</w:t>
       </w:r>
     </w:p>
-    <w:bookmarkEnd w:id="199"/>
-    <w:bookmarkStart w:id="201" w:name="ref-longcontextdegrade2026"/>
+    <w:bookmarkEnd w:id="200"/>
+    <w:bookmarkStart w:id="202" w:name="ref-longcontextdegrade2026"/>
     <w:p>
       <w:pPr>
         <w:pStyle w:val="Bibliography"/>
@@ -59988,7 +60087,7 @@
       <w:r>
         <w:t xml:space="preserve"> </w:t>
       </w:r>
-      <w:hyperlink r:id="rId200">
+      <w:hyperlink r:id="rId201">
         <w:r>
           <w:rPr>
             <w:rStyle w:val="Hyperlink"/>
@@ -60000,8 +60099,8 @@
         <w:t xml:space="preserve">.</w:t>
       </w:r>
     </w:p>
-    <w:bookmarkEnd w:id="201"/>
-    <w:bookmarkStart w:id="203" w:name="ref-liu2024lost"/>
+    <w:bookmarkEnd w:id="202"/>
+    <w:bookmarkStart w:id="204" w:name="ref-liu2024lost"/>
     <w:p>
       <w:pPr>
         <w:pStyle w:val="Bibliography"/>
@@ -60034,7 +60133,7 @@
       <w:r>
         <w:t xml:space="preserve"> </w:t>
       </w:r>
-      <w:hyperlink r:id="rId202">
+      <w:hyperlink r:id="rId203">
         <w:r>
           <w:rPr>
             <w:rStyle w:val="Hyperlink"/>
@@ -60046,8 +60145,8 @@
         <w:t xml:space="preserve">.</w:t>
       </w:r>
     </w:p>
-    <w:bookmarkEnd w:id="203"/>
-    <w:bookmarkStart w:id="205" w:name="ref-miller2024errorbars"/>
+    <w:bookmarkEnd w:id="204"/>
+    <w:bookmarkStart w:id="206" w:name="ref-miller2024errorbars"/>
     <w:p>
       <w:pPr>
         <w:pStyle w:val="Bibliography"/>
@@ -60077,7 +60176,7 @@
       <w:r>
         <w:t xml:space="preserve"> </w:t>
       </w:r>
-      <w:hyperlink r:id="rId204">
+      <w:hyperlink r:id="rId205">
         <w:r>
           <w:rPr>
             <w:rStyle w:val="Hyperlink"/>
@@ -60089,8 +60188,8 @@
         <w:t xml:space="preserve">.</w:t>
       </w:r>
     </w:p>
-    <w:bookmarkEnd w:id="205"/>
-    <w:bookmarkStart w:id="207" w:name="ref-blackwellrep2026"/>
+    <w:bookmarkEnd w:id="206"/>
+    <w:bookmarkStart w:id="208" w:name="ref-blackwellrep2026"/>
     <w:p>
       <w:pPr>
         <w:pStyle w:val="Bibliography"/>
@@ -60120,7 +60219,7 @@
       <w:r>
         <w:t xml:space="preserve"> </w:t>
       </w:r>
-      <w:hyperlink r:id="rId206">
+      <w:hyperlink r:id="rId207">
         <w:r>
           <w:rPr>
             <w:rStyle w:val="Hyperlink"/>
@@ -60132,8 +60231,8 @@
         <w:t xml:space="preserve">.</w:t>
       </w:r>
     </w:p>
-    <w:bookmarkEnd w:id="207"/>
-    <w:bookmarkStart w:id="209" w:name="ref-sureRAG2026"/>
+    <w:bookmarkEnd w:id="208"/>
+    <w:bookmarkStart w:id="210" w:name="ref-sureRAG2026"/>
     <w:p>
       <w:pPr>
         <w:pStyle w:val="Bibliography"/>
@@ -60169,7 +60268,7 @@
       <w:r>
         <w:t xml:space="preserve"> </w:t>
       </w:r>
-      <w:hyperlink r:id="rId208">
+      <w:hyperlink r:id="rId209">
         <w:r>
           <w:rPr>
             <w:rStyle w:val="Hyperlink"/>
@@ -60181,8 +60280,8 @@
         <w:t xml:space="preserve">.</w:t>
       </w:r>
     </w:p>
-    <w:bookmarkEnd w:id="209"/>
-    <w:bookmarkStart w:id="211" w:name="ref-robertson1977"/>
+    <w:bookmarkEnd w:id="210"/>
+    <w:bookmarkStart w:id="212" w:name="ref-robertson1977"/>
     <w:p>
       <w:pPr>
         <w:pStyle w:val="Bibliography"/>
@@ -60224,7 +60323,7 @@
       <w:r>
         <w:t xml:space="preserve"> </w:t>
       </w:r>
-      <w:hyperlink r:id="rId210">
+      <w:hyperlink r:id="rId211">
         <w:r>
           <w:rPr>
             <w:rStyle w:val="Hyperlink"/>
@@ -60236,8 +60335,8 @@
         <w:t xml:space="preserve">.</w:t>
       </w:r>
     </w:p>
-    <w:bookmarkEnd w:id="211"/>
-    <w:bookmarkStart w:id="213" w:name="ref-vanrooyen2014"/>
+    <w:bookmarkEnd w:id="212"/>
+    <w:bookmarkStart w:id="214" w:name="ref-vanrooyen2014"/>
     <w:p>
       <w:pPr>
         <w:pStyle w:val="Bibliography"/>
@@ -60285,7 +60384,7 @@
       <w:r>
         <w:t xml:space="preserve"> </w:t>
       </w:r>
-      <w:hyperlink r:id="rId212">
+      <w:hyperlink r:id="rId213">
         <w:r>
           <w:rPr>
             <w:rStyle w:val="Hyperlink"/>
@@ -60297,8 +60396,8 @@
         <w:t xml:space="preserve">.</w:t>
       </w:r>
     </w:p>
-    <w:bookmarkEnd w:id="213"/>
-    <w:bookmarkStart w:id="215" w:name="ref-shi2023distracted"/>
+    <w:bookmarkEnd w:id="214"/>
+    <w:bookmarkStart w:id="216" w:name="ref-shi2023distracted"/>
     <w:p>
       <w:pPr>
         <w:pStyle w:val="Bibliography"/>
@@ -60328,7 +60427,7 @@
       <w:r>
         <w:t xml:space="preserve"> </w:t>
       </w:r>
-      <w:hyperlink r:id="rId214">
+      <w:hyperlink r:id="rId215">
         <w:r>
           <w:rPr>
             <w:rStyle w:val="Hyperlink"/>
@@ -60340,8 +60439,8 @@
         <w:t xml:space="preserve">.</w:t>
       </w:r>
     </w:p>
-    <w:bookmarkEnd w:id="215"/>
-    <w:bookmarkStart w:id="217" w:name="ref-shi2023replug"/>
+    <w:bookmarkEnd w:id="216"/>
+    <w:bookmarkStart w:id="218" w:name="ref-shi2023replug"/>
     <w:p>
       <w:pPr>
         <w:pStyle w:val="Bibliography"/>
@@ -60377,7 +60476,7 @@
       <w:r>
         <w:t xml:space="preserve"> </w:t>
       </w:r>
-      <w:hyperlink r:id="rId216">
+      <w:hyperlink r:id="rId217">
         <w:r>
           <w:rPr>
             <w:rStyle w:val="Hyperlink"/>
@@ -60389,8 +60488,8 @@
         <w:t xml:space="preserve">.</w:t>
       </w:r>
     </w:p>
-    <w:bookmarkEnd w:id="217"/>
-    <w:bookmarkStart w:id="219" w:name="ref-sun2023rankgpt"/>
+    <w:bookmarkEnd w:id="218"/>
+    <w:bookmarkStart w:id="220" w:name="ref-sun2023rankgpt"/>
     <w:p>
       <w:pPr>
         <w:pStyle w:val="Bibliography"/>
@@ -60444,7 +60543,7 @@
       <w:r>
         <w:t xml:space="preserve"> </w:t>
       </w:r>
-      <w:hyperlink r:id="rId218">
+      <w:hyperlink r:id="rId219">
         <w:r>
           <w:rPr>
             <w:rStyle w:val="Hyperlink"/>
@@ -60456,8 +60555,8 @@
         <w:t xml:space="preserve">.</w:t>
       </w:r>
     </w:p>
-    <w:bookmarkEnd w:id="219"/>
-    <w:bookmarkStart w:id="221" w:name="ref-torgersen1991"/>
+    <w:bookmarkEnd w:id="220"/>
+    <w:bookmarkStart w:id="222" w:name="ref-torgersen1991"/>
     <w:p>
       <w:pPr>
         <w:pStyle w:val="Bibliography"/>
@@ -60481,7 +60580,7 @@
       <w:r>
         <w:t xml:space="preserve"> </w:t>
       </w:r>
-      <w:hyperlink r:id="rId220">
+      <w:hyperlink r:id="rId221">
         <w:r>
           <w:rPr>
             <w:rStyle w:val="Hyperlink"/>
@@ -60493,8 +60592,8 @@
         <w:t xml:space="preserve">.</w:t>
       </w:r>
     </w:p>
-    <w:bookmarkEnd w:id="221"/>
-    <w:bookmarkStart w:id="223" w:name="ref-inficl2024"/>
+    <w:bookmarkEnd w:id="222"/>
+    <w:bookmarkStart w:id="224" w:name="ref-inficl2024"/>
     <w:p>
       <w:pPr>
         <w:pStyle w:val="Bibliography"/>
@@ -60524,7 +60623,7 @@
       <w:r>
         <w:t xml:space="preserve"> </w:t>
       </w:r>
-      <w:hyperlink r:id="rId222">
+      <w:hyperlink r:id="rId223">
         <w:r>
           <w:rPr>
             <w:rStyle w:val="Hyperlink"/>
@@ -60536,8 +60635,8 @@
         <w:t xml:space="preserve">.</w:t>
       </w:r>
     </w:p>
-    <w:bookmarkEnd w:id="223"/>
-    <w:bookmarkStart w:id="225" w:name="ref-demoshapley2024"/>
+    <w:bookmarkEnd w:id="224"/>
+    <w:bookmarkStart w:id="226" w:name="ref-demoshapley2024"/>
     <w:p>
       <w:pPr>
         <w:pStyle w:val="Bibliography"/>
@@ -60573,7 +60672,7 @@
       <w:r>
         <w:t xml:space="preserve"> </w:t>
       </w:r>
-      <w:hyperlink r:id="rId224">
+      <w:hyperlink r:id="rId225">
         <w:r>
           <w:rPr>
             <w:rStyle w:val="Hyperlink"/>
@@ -60585,8 +60684,8 @@
         <w:t xml:space="preserve">.</w:t>
       </w:r>
     </w:p>
-    <w:bookmarkEnd w:id="225"/>
-    <w:bookmarkStart w:id="227" w:name="ref-ye2023ceil"/>
+    <w:bookmarkEnd w:id="226"/>
+    <w:bookmarkStart w:id="228" w:name="ref-ye2023ceil"/>
     <w:p>
       <w:pPr>
         <w:pStyle w:val="Bibliography"/>
@@ -60616,7 +60715,7 @@
       <w:r>
         <w:t xml:space="preserve"> </w:t>
       </w:r>
-      <w:hyperlink r:id="rId226">
+      <w:hyperlink r:id="rId227">
         <w:r>
           <w:rPr>
             <w:rStyle w:val="Hyperlink"/>
@@ -60628,8 +60727,8 @@
         <w:t xml:space="preserve">.</w:t>
       </w:r>
     </w:p>
-    <w:bookmarkEnd w:id="227"/>
-    <w:bookmarkStart w:id="229" w:name="ref-rankrag2024"/>
+    <w:bookmarkEnd w:id="228"/>
+    <w:bookmarkStart w:id="230" w:name="ref-rankrag2024"/>
     <w:p>
       <w:pPr>
         <w:pStyle w:val="Bibliography"/>
@@ -60674,7 +60773,7 @@
       <w:r>
         <w:t xml:space="preserve"> </w:t>
       </w:r>
-      <w:hyperlink r:id="rId228">
+      <w:hyperlink r:id="rId229">
         <w:r>
           <w:rPr>
             <w:rStyle w:val="Hyperlink"/>
@@ -60686,8 +60785,8 @@
         <w:t xml:space="preserve">.</w:t>
       </w:r>
     </w:p>
-    <w:bookmarkEnd w:id="229"/>
-    <w:bookmarkStart w:id="231" w:name="ref-cale2025"/>
+    <w:bookmarkEnd w:id="230"/>
+    <w:bookmarkStart w:id="232" w:name="ref-cale2025"/>
     <w:p>
       <w:pPr>
         <w:pStyle w:val="Bibliography"/>
@@ -60738,7 +60837,7 @@
       <w:r>
         <w:t xml:space="preserve"> </w:t>
       </w:r>
-      <w:hyperlink r:id="rId230">
+      <w:hyperlink r:id="rId231">
         <w:r>
           <w:rPr>
             <w:rStyle w:val="Hyperlink"/>
@@ -60750,8 +60849,8 @@
         <w:t xml:space="preserve">.</w:t>
       </w:r>
     </w:p>
-    <w:bookmarkEnd w:id="231"/>
-    <w:bookmarkStart w:id="232" w:name="ref-paretoprompts2025"/>
+    <w:bookmarkEnd w:id="232"/>
+    <w:bookmarkStart w:id="233" w:name="ref-paretoprompts2025"/>
     <w:p>
       <w:pPr>
         <w:pStyle w:val="Bibliography"/>
@@ -60779,8 +60878,8 @@
         <w:t xml:space="preserve">.</w:t>
       </w:r>
     </w:p>
-    <w:bookmarkEnd w:id="232"/>
-    <w:bookmarkStart w:id="234" w:name="ref-zheng2024pmi"/>
+    <w:bookmarkEnd w:id="233"/>
+    <w:bookmarkStart w:id="235" w:name="ref-zheng2024pmi"/>
     <w:p>
       <w:pPr>
         <w:pStyle w:val="Bibliography"/>
@@ -60810,7 +60909,7 @@
       <w:r>
         <w:t xml:space="preserve"> </w:t>
       </w:r>
-      <w:hyperlink r:id="rId233">
+      <w:hyperlink r:id="rId234">
         <w:r>
           <w:rPr>
             <w:rStyle w:val="Hyperlink"/>
@@ -60822,10 +60921,10 @@
         <w:t xml:space="preserve">.</w:t>
       </w:r>
     </w:p>
-    <w:bookmarkEnd w:id="234"/>
     <w:bookmarkEnd w:id="235"/>
     <w:bookmarkEnd w:id="236"/>
     <w:bookmarkEnd w:id="237"/>
+    <w:bookmarkEnd w:id="238"/>
     <w:sectPr>
       <w:footnotePr>
         <w:numRestart w:val="eachSect"/>

</xml_diff>

<commit_message>
Audit: round neutralized interference consistently (-0.475 -> -0.48, matching the table's convention)
</commit_message>
<xml_diff>
--- a/paper/blackwell-paper.docx
+++ b/paper/blackwell-paper.docx
@@ -39249,7 +39249,7 @@
                 <m:t>−</m:t>
               </m:r>
               <m:r>
-                <m:t>0.47</m:t>
+                <m:t>0.48</m:t>
               </m:r>
             </m:oMath>
             <w:r>
@@ -43093,7 +43093,7 @@
           <m:t>−</m:t>
         </m:r>
         <m:r>
-          <m:t>0.47</m:t>
+          <m:t>0.48</m:t>
         </m:r>
       </m:oMath>
       <w:r>

</xml_diff>

<commit_message>
Trim + fixes after positioning refactor
- Remove every 'companion paper' mention (abstract, 2.1, 7, 8) and the
  self-titled @misc{companion} bib entry; the selection rule is now stated
  in-paper as future work with its cost.
- Cut the 'not new core mathematics' disclaimer from the roadmap and the
  theorem Remark (kept once in the intro and once in section 4).
- Compress the design-space prose, the mechanism three-readings paragraph,
  and the buys-and-costs subsection.
- Correct the predicted-utility sentence in 2.1: task-fixed scorers fall
  under Theorem 1, topical query-conditioned ones under Proposition 2, a
  scorer that reads the decisive coordinate is on the listwise boundary.
</commit_message>
<xml_diff>
--- a/paper/blackwell-paper.docx
+++ b/paper/blackwell-paper.docx
@@ -288,19 +288,13 @@
         <w:t xml:space="preserve"> </w:t>
       </w:r>
       <w:r>
-        <w:t xml:space="preserve">compare sources by a verified pass-rate test rather than a relevance number. A</w:t>
-      </w:r>
-      <w:r>
-        <w:t xml:space="preserve"> </w:t>
-      </w:r>
-      <w:r>
-        <w:t xml:space="preserve">companion paper gives the selection rule this implies; scaling it to large</w:t>
-      </w:r>
-      <w:r>
-        <w:t xml:space="preserve"> </w:t>
-      </w:r>
-      <w:r>
-        <w:t xml:space="preserve">corpora is the main open problem.</w:t>
+        <w:t xml:space="preserve">compare sources by a verified pass-rate test rather than a relevance number.</w:t>
+      </w:r>
+      <w:r>
+        <w:t xml:space="preserve"> </w:t>
+      </w:r>
+      <w:r>
+        <w:t xml:space="preserve">Scaling the selection rule this implies to large corpora is the main open problem.</w:t>
       </w:r>
     </w:p>
     <w:bookmarkStart w:id="18" w:name="sec:intro"/>
@@ -3852,19 +3846,13 @@
         <w:t xml:space="preserve"> </w:t>
       </w:r>
       <w:r>
-        <w:t xml:space="preserve">and the recent transport of comparison-of-experiments into machine learning, and</w:t>
-      </w:r>
-      <w:r>
-        <w:t xml:space="preserve"> </w:t>
-      </w:r>
-      <w:r>
-        <w:t xml:space="preserve">frames our delta as application-plus-framing-plus-estimator rather than new core</w:t>
-      </w:r>
-      <w:r>
-        <w:t xml:space="preserve"> </w:t>
-      </w:r>
-      <w:r>
-        <w:t xml:space="preserve">mathematics. §3 gives the latent-coordinate experiment</w:t>
+        <w:t xml:space="preserve">and the recent transport of comparison-of-experiments into machine learning.</w:t>
+      </w:r>
+      <w:r>
+        <w:t xml:space="preserve"> </w:t>
+      </w:r>
+      <w:r>
+        <w:t xml:space="preserve">§3 gives the latent-coordinate experiment</w:t>
       </w:r>
       <w:r>
         <w:t xml:space="preserve"> </w:t>
@@ -5299,13 +5287,25 @@
         <w:t xml:space="preserve"> </w:t>
       </w:r>
       <w:r>
-        <w:t xml:space="preserve">by a learned scorer, LLM-agnostic or</w:t>
-      </w:r>
-      <w:r>
-        <w:t xml:space="preserve"> </w:t>
-      </w:r>
-      <w:r>
-        <w:t xml:space="preserve">LLM-specific, is one number per source again and falls back into the excluded class. Three families</w:t>
+        <w:t xml:space="preserve">by a learned scorer is a number again: fixed across tasks it is</w:t>
+      </w:r>
+      <w:r>
+        <w:t xml:space="preserve"> </w:t>
+      </w:r>
+      <w:r>
+        <w:t xml:space="preserve">covered by Theorem 2; query-conditioned but topical, by</w:t>
+      </w:r>
+      <w:r>
+        <w:t xml:space="preserve"> </w:t>
+      </w:r>
+      <w:r>
+        <w:t xml:space="preserve">Proposition 2; only a scorer that reads the decisive coordinate escapes,</w:t>
+      </w:r>
+      <w:r>
+        <w:t xml:space="preserve"> </w:t>
+      </w:r>
+      <w:r>
+        <w:t xml:space="preserve">which is the listwise boundary. Three families</w:t>
       </w:r>
       <w:r>
         <w:t xml:space="preserve"> </w:t>
@@ -5522,13 +5522,7 @@
         <w:t xml:space="preserve"> </w:t>
       </w:r>
       <w:r>
-        <w:t xml:space="preserve">objectives over embedding geometry, whose partial-order-grounded analogue (verified coverage of</w:t>
-      </w:r>
-      <w:r>
-        <w:t xml:space="preserve"> </w:t>
-      </w:r>
-      <w:r>
-        <w:t xml:space="preserve">latent coordinates) we develop in a companion paper.</w:t>
+        <w:t xml:space="preserve">objectives over embedding geometry rather than over verified task value.</w:t>
       </w:r>
     </w:p>
     <w:p>
@@ -6737,149 +6731,37 @@
         <w:t xml:space="preserve">incomparability</w:t>
       </w:r>
       <w:r>
-        <w:t xml:space="preserve">. The pattern is uniform, and it is why we frame the problem as we</w:t>
-      </w:r>
-      <w:r>
-        <w:t xml:space="preserve"> </w:t>
-      </w:r>
-      <w:r>
-        <w:t xml:space="preserve">do. Every method cheap enough to run at retrieval scale emits a final scalar and therefore lives in</w:t>
-      </w:r>
-      <w:r>
-        <w:t xml:space="preserve"> </w:t>
-      </w:r>
-      <w:r>
-        <w:t xml:space="preserve">a total order, including multi-vector late interaction </w:t>
-      </w:r>
-      <w:r>
-        <w:t xml:space="preserve">(</w:t>
-      </w:r>
-      <w:hyperlink w:anchor="ref-khattab2020colbert">
-        <w:r>
-          <w:rPr>
-            <w:rStyle w:val="Hyperlink"/>
-          </w:rPr>
-          <w:t xml:space="preserve">Khattab and Zaharia 2020</w:t>
-        </w:r>
-      </w:hyperlink>
-      <w:r>
-        <w:t xml:space="preserve">)</w:t>
-      </w:r>
-      <w:r>
-        <w:t xml:space="preserve">, whose per-token</w:t>
-      </w:r>
-      <w:r>
-        <w:t xml:space="preserve"> </w:t>
-      </w:r>
-      <w:r>
-        <w:t xml:space="preserve">match is query-dependent but still collapses to one document score, and retrievers trained on the</w:t>
-      </w:r>
-      <w:r>
-        <w:t xml:space="preserve"> </w:t>
-      </w:r>
-      <w:r>
-        <w:t xml:space="preserve">language model’s own likelihood </w:t>
-      </w:r>
-      <w:r>
-        <w:t xml:space="preserve">(</w:t>
-      </w:r>
-      <w:hyperlink w:anchor="ref-shi2023replug">
-        <w:r>
-          <w:rPr>
-            <w:rStyle w:val="Hyperlink"/>
-          </w:rPr>
-          <w:t xml:space="preserve">W. Shi et al. 2023</w:t>
-        </w:r>
-      </w:hyperlink>
-      <w:r>
-        <w:t xml:space="preserve">;</w:t>
-      </w:r>
-      <w:r>
-        <w:t xml:space="preserve"> </w:t>
-      </w:r>
-      <w:hyperlink w:anchor="ref-guu2020realm">
-        <w:r>
-          <w:rPr>
-            <w:rStyle w:val="Hyperlink"/>
-          </w:rPr>
-          <w:t xml:space="preserve">Guu et al. 2020</w:t>
-        </w:r>
-      </w:hyperlink>
-      <w:r>
-        <w:t xml:space="preserve">)</w:t>
-      </w:r>
-      <w:r>
-        <w:t xml:space="preserve">, which amortize</w:t>
-      </w:r>
-      <w:r>
-        <w:t xml:space="preserve"> </w:t>
-      </w:r>
-      <w:r>
-        <w:t xml:space="preserve">“value to the</w:t>
-      </w:r>
-      <w:r>
-        <w:t xml:space="preserve"> </w:t>
-      </w:r>
-      <w:r>
-        <w:t xml:space="preserve">model”</w:t>
-      </w:r>
-      <w:r>
-        <w:t xml:space="preserve"> </w:t>
-      </w:r>
-      <w:r>
-        <w:t xml:space="preserve">into a</w:t>
-      </w:r>
-      <w:r>
-        <w:t xml:space="preserve"> </w:t>
-      </w:r>
-      <w:r>
-        <w:rPr>
-          <w:i/>
-          <w:iCs/>
-        </w:rPr>
-        <w:t xml:space="preserve">number</w:t>
-      </w:r>
-      <w:r>
-        <w:t xml:space="preserve"> </w:t>
-      </w:r>
-      <w:r>
-        <w:t xml:space="preserve">rather than the non-domination relation and so inherit the limitation</w:t>
-      </w:r>
-      <w:r>
-        <w:t xml:space="preserve"> </w:t>
-      </w:r>
-      <w:r>
-        <w:t xml:space="preserve">of Theorem 2. Every method that genuinely models interaction is in turn either</w:t>
-      </w:r>
-      <w:r>
-        <w:t xml:space="preserve"> </w:t>
-      </w:r>
-      <w:r>
-        <w:t xml:space="preserve">symmetric redundancy over embedding geometry (MMR, DPPs, submodular coverage), carries no dominance</w:t>
-      </w:r>
-      <w:r>
-        <w:t xml:space="preserve"> </w:t>
-      </w:r>
-      <w:r>
-        <w:t xml:space="preserve">guarantee (listwise rerankers), or is as costly as direct probing (Shapley valuation, expected</w:t>
-      </w:r>
-      <w:r>
-        <w:t xml:space="preserve"> </w:t>
-      </w:r>
-      <w:r>
-        <w:t xml:space="preserve">information gain). No prior row is both cheap and partial-order-faithful; that empty cell is the open</w:t>
-      </w:r>
-      <w:r>
-        <w:t xml:space="preserve"> </w:t>
-      </w:r>
-      <w:r>
-        <w:t xml:space="preserve">problem this paper isolates. We occupy the last row, paying probe cost for the guarantee, and leave</w:t>
-      </w:r>
-      <w:r>
-        <w:t xml:space="preserve"> </w:t>
-      </w:r>
-      <w:r>
-        <w:t xml:space="preserve">its amortization as the central open question.</w:t>
+        <w:t xml:space="preserve">. The pattern is uniform. Every method cheap enough to run at</w:t>
+      </w:r>
+      <w:r>
+        <w:t xml:space="preserve"> </w:t>
+      </w:r>
+      <w:r>
+        <w:t xml:space="preserve">retrieval scale emits a final per-item number, however that number is produced, and therefore lives</w:t>
+      </w:r>
+      <w:r>
+        <w:t xml:space="preserve"> </w:t>
+      </w:r>
+      <w:r>
+        <w:t xml:space="preserve">in a total order; every method that genuinely models interaction is either symmetric redundancy</w:t>
+      </w:r>
+      <w:r>
+        <w:t xml:space="preserve"> </w:t>
+      </w:r>
+      <w:r>
+        <w:t xml:space="preserve">over embedding geometry, carries no dominance guarantee, or is as costly as direct probing. No prior</w:t>
+      </w:r>
+      <w:r>
+        <w:t xml:space="preserve"> </w:t>
+      </w:r>
+      <w:r>
+        <w:t xml:space="preserve">row is both cheap and partial-order-faithful; that empty cell is the open problem this paper</w:t>
+      </w:r>
+      <w:r>
+        <w:t xml:space="preserve"> </w:t>
+      </w:r>
+      <w:r>
+        <w:t xml:space="preserve">isolates, and we occupy the last row, paying probe cost for the guarantee.</w:t>
       </w:r>
     </w:p>
     <w:bookmarkStart w:id="26" w:name="tab:designspace"/>
@@ -19109,63 +18991,7 @@
         <w:t xml:space="preserve"> </w:t>
       </w:r>
       <w:r>
-        <w:t xml:space="preserve">victims of the theorem, not competitors (Proposition 1). The theorem is</w:t>
-      </w:r>
-      <w:r>
-        <w:t xml:space="preserve"> </w:t>
-      </w:r>
-      <w:r>
-        <w:t xml:space="preserve">mathematically a one-line consequence of Blackwell’s theorem; the contribution is the</w:t>
-      </w:r>
-      <w:r>
-        <w:t xml:space="preserve"> </w:t>
-      </w:r>
-      <w:r>
-        <w:rPr>
-          <w:i/>
-          <w:iCs/>
-        </w:rPr>
-        <w:t xml:space="preserve">application and framing</w:t>
-      </w:r>
-      <w:r>
-        <w:t xml:space="preserve">, reading cross-task non-transfer of relevance as the signature of a</w:t>
-      </w:r>
-      <w:r>
-        <w:t xml:space="preserve"> </w:t>
-      </w:r>
-      <w:r>
-        <w:t xml:space="preserve">partial order, not new core mathematics </w:t>
-      </w:r>
-      <w:r>
-        <w:t xml:space="preserve">(</w:t>
-      </w:r>
-      <w:hyperlink w:anchor="ref-blackwell1953">
-        <w:r>
-          <w:rPr>
-            <w:rStyle w:val="Hyperlink"/>
-          </w:rPr>
-          <w:t xml:space="preserve">Blackwell 1953</w:t>
-        </w:r>
-      </w:hyperlink>
-      <w:r>
-        <w:t xml:space="preserve">;</w:t>
-      </w:r>
-      <w:r>
-        <w:t xml:space="preserve"> </w:t>
-      </w:r>
-      <w:hyperlink w:anchor="ref-torgersen1991">
-        <w:r>
-          <w:rPr>
-            <w:rStyle w:val="Hyperlink"/>
-          </w:rPr>
-          <w:t xml:space="preserve">Torgersen 1991</w:t>
-        </w:r>
-      </w:hyperlink>
-      <w:r>
-        <w:t xml:space="preserve">)</w:t>
-      </w:r>
-      <w:r>
-        <w:t xml:space="preserve">.</w:t>
+        <w:t xml:space="preserve">victims of the theorem, not competitors (Proposition 1).</w:t>
       </w:r>
     </w:p>
     <w:bookmarkEnd w:id="49"/>
@@ -39329,7 +39155,7 @@
         <w:t xml:space="preserve"> </w:t>
       </w:r>
       <w:r>
-        <w:t xml:space="preserve">is developed in a companion paper.</w:t>
+        <w:t xml:space="preserve">follows directly.</w:t>
       </w:r>
     </w:p>
     <w:bookmarkStart w:id="93" w:name="fig:hasse"/>
@@ -46121,13 +45947,13 @@
         <w:pStyle w:val="FirstParagraph"/>
       </w:pPr>
       <w:r>
-        <w:t xml:space="preserve">Consolidating the comparison that runs through the paper: relative to the alternatives of</w:t>
-      </w:r>
-      <w:r>
-        <w:t xml:space="preserve"> </w:t>
-      </w:r>
-      <w:r>
-        <w:t xml:space="preserve">Table 2, the approach buys four things none of them provides. (i) A</w:t>
+        <w:t xml:space="preserve">Consolidating the comparison that runs through the paper (Tables 2</w:t>
+      </w:r>
+      <w:r>
+        <w:t xml:space="preserve"> </w:t>
+      </w:r>
+      <w:r>
+        <w:t xml:space="preserve">and 7): the approach buys a</w:t>
       </w:r>
       <w:r>
         <w:t xml:space="preserve"> </w:t>
@@ -46140,118 +45966,54 @@
         <w:t xml:space="preserve">diagnosis</w:t>
       </w:r>
       <w:r>
-        <w:t xml:space="preserve">: incomparability and interference become named, testable properties rather than</w:t>
-      </w:r>
-      <w:r>
-        <w:t xml:space="preserve"> </w:t>
-      </w:r>
-      <w:r>
-        <w:t xml:space="preserve">anecdotes about</w:t>
-      </w:r>
-      <w:r>
-        <w:t xml:space="preserve"> </w:t>
-      </w:r>
-      <w:r>
-        <w:t xml:space="preserve">“context sometimes hurting.”</w:t>
-      </w:r>
-      <w:r>
-        <w:t xml:space="preserve"> </w:t>
-      </w:r>
-      <w:r>
-        <w:t xml:space="preserve">(ii)</w:t>
-      </w:r>
-      <w:r>
-        <w:t xml:space="preserve"> </w:t>
-      </w:r>
-      <w:r>
-        <w:rPr>
-          <w:i/>
-          <w:iCs/>
-        </w:rPr>
-        <w:t xml:space="preserve">Distribution-free finite-sample</w:t>
-      </w:r>
-      <w:r>
-        <w:rPr>
-          <w:i/>
-          <w:iCs/>
-        </w:rPr>
-        <w:t xml:space="preserve"> </w:t>
-      </w:r>
-      <w:r>
-        <w:rPr>
-          <w:i/>
-          <w:iCs/>
-        </w:rPr>
-        <w:t xml:space="preserve">verification</w:t>
-      </w:r>
-      <w:r>
-        <w:t xml:space="preserve"> </w:t>
-      </w:r>
-      <w:r>
-        <w:t xml:space="preserve">on live black-box models: exact intervals and multiplicity control, with no training</w:t>
-      </w:r>
-      <w:r>
-        <w:t xml:space="preserve"> </w:t>
-      </w:r>
-      <w:r>
-        <w:t xml:space="preserve">and no white-box access. (iii)</w:t>
-      </w:r>
-      <w:r>
-        <w:t xml:space="preserve"> </w:t>
-      </w:r>
-      <w:r>
-        <w:rPr>
-          <w:i/>
-          <w:iCs/>
-        </w:rPr>
-        <w:t xml:space="preserve">Model-relative measurement</w:t>
-      </w:r>
-      <w:r>
-        <w:t xml:space="preserve">: the same protocol re-run on any</w:t>
-      </w:r>
-      <w:r>
-        <w:t xml:space="preserve"> </w:t>
-      </w:r>
-      <w:r>
-        <w:t xml:space="preserve">stack answers whether</w:t>
-      </w:r>
-      <w:r>
-        <w:t xml:space="preserve"> </w:t>
-      </w:r>
-      <w:r>
-        <w:rPr>
-          <w:i/>
-          <w:iCs/>
-        </w:rPr>
-        <w:t xml:space="preserve">your</w:t>
-      </w:r>
-      <w:r>
-        <w:t xml:space="preserve"> </w:t>
-      </w:r>
-      <w:r>
-        <w:t xml:space="preserve">model has this structure on</w:t>
-      </w:r>
-      <w:r>
-        <w:t xml:space="preserve"> </w:t>
-      </w:r>
-      <w:r>
-        <w:rPr>
-          <w:i/>
-          <w:iCs/>
-        </w:rPr>
-        <w:t xml:space="preserve">your</w:t>
-      </w:r>
-      <w:r>
-        <w:t xml:space="preserve"> </w:t>
-      </w:r>
-      <w:r>
-        <w:t xml:space="preserve">sources, including the</w:t>
-      </w:r>
-      <w:r>
-        <w:t xml:space="preserve"> </w:t>
-      </w:r>
-      <w:r>
-        <w:t xml:space="preserve">scalar-suffices answer when sources are nested. (iv) A</w:t>
+        <w:t xml:space="preserve">, incomparability and interference as</w:t>
+      </w:r>
+      <w:r>
+        <w:t xml:space="preserve"> </w:t>
+      </w:r>
+      <w:r>
+        <w:t xml:space="preserve">named, testable properties;</w:t>
+      </w:r>
+      <w:r>
+        <w:t xml:space="preserve"> </w:t>
+      </w:r>
+      <w:r>
+        <w:rPr>
+          <w:i/>
+          <w:iCs/>
+        </w:rPr>
+        <w:t xml:space="preserve">distribution-free finite-sample verification</w:t>
+      </w:r>
+      <w:r>
+        <w:t xml:space="preserve"> </w:t>
+      </w:r>
+      <w:r>
+        <w:t xml:space="preserve">on live black-box</w:t>
+      </w:r>
+      <w:r>
+        <w:t xml:space="preserve"> </w:t>
+      </w:r>
+      <w:r>
+        <w:t xml:space="preserve">models, with no training and no white-box access;</w:t>
+      </w:r>
+      <w:r>
+        <w:t xml:space="preserve"> </w:t>
+      </w:r>
+      <w:r>
+        <w:rPr>
+          <w:i/>
+          <w:iCs/>
+        </w:rPr>
+        <w:t xml:space="preserve">model-relative measurement</w:t>
+      </w:r>
+      <w:r>
+        <w:t xml:space="preserve">, the same</w:t>
+      </w:r>
+      <w:r>
+        <w:t xml:space="preserve"> </w:t>
+      </w:r>
+      <w:r>
+        <w:t xml:space="preserve">protocol re-run on any stack, including the scalar-suffices answer when sources are nested; and a</w:t>
       </w:r>
       <w:r>
         <w:t xml:space="preserve"> </w:t>
@@ -46264,61 +46026,31 @@
         <w:t xml:space="preserve">selection ceiling</w:t>
       </w:r>
       <w:r>
-        <w:t xml:space="preserve">: the non-dominated</w:t>
-      </w:r>
-      <w:r>
-        <w:t xml:space="preserve"> </w:t>
-      </w:r>
-      <w:r>
-        <w:t xml:space="preserve">front attains the per-cell maximum of its members (Table 7), bounding what any</w:t>
-      </w:r>
-      <w:r>
-        <w:t xml:space="preserve"> </w:t>
-      </w:r>
-      <w:r>
-        <w:t xml:space="preserve">selection policy can recover and separating selection error from model capability. The costs are</w:t>
-      </w:r>
-      <w:r>
-        <w:t xml:space="preserve"> </w:t>
-      </w:r>
-      <w:r>
-        <w:t xml:space="preserve">equally concrete. Verification is bought with probe runs, so the method lives at curation scale, a</w:t>
-      </w:r>
-      <w:r>
-        <w:t xml:space="preserve"> </w:t>
-      </w:r>
-      <w:r>
-        <w:t xml:space="preserve">reranked shortlist or an offline context library, not corpus scale (§8.6). The</w:t>
-      </w:r>
-      <w:r>
-        <w:t xml:space="preserve"> </w:t>
-      </w:r>
-      <w:r>
-        <w:t xml:space="preserve">verified cells are constructed to make the structure visible, so the magnitudes are diagnostic, not</w:t>
-      </w:r>
-      <w:r>
-        <w:t xml:space="preserve"> </w:t>
-      </w:r>
-      <w:r>
-        <w:t xml:space="preserve">production estimates. And the guarantees are existential and model-relative: they establish that</w:t>
-      </w:r>
-      <w:r>
-        <w:t xml:space="preserve"> </w:t>
-      </w:r>
-      <w:r>
-        <w:t xml:space="preserve">the partial order is real and consequential where verified, not that every source pair in the wild</w:t>
-      </w:r>
-      <w:r>
-        <w:t xml:space="preserve"> </w:t>
-      </w:r>
-      <w:r>
-        <w:t xml:space="preserve">is incomparable. In exchange, the practitioner gets what the cheap alternatives cannot give: a</w:t>
-      </w:r>
-      <w:r>
-        <w:t xml:space="preserve"> </w:t>
-      </w:r>
-      <w:r>
-        <w:t xml:space="preserve">claim about their own system that is checked rather than assumed.</w:t>
+        <w:t xml:space="preserve">, the front’s per-cell maximum separating selection error from model</w:t>
+      </w:r>
+      <w:r>
+        <w:t xml:space="preserve"> </w:t>
+      </w:r>
+      <w:r>
+        <w:t xml:space="preserve">capability. It costs probe runs, so it lives at curation scale, not corpus scale</w:t>
+      </w:r>
+      <w:r>
+        <w:t xml:space="preserve"> </w:t>
+      </w:r>
+      <w:r>
+        <w:t xml:space="preserve">(§8.6); its cells are constructed, so magnitudes are diagnostic rather than</w:t>
+      </w:r>
+      <w:r>
+        <w:t xml:space="preserve"> </w:t>
+      </w:r>
+      <w:r>
+        <w:t xml:space="preserve">production estimates; and its guarantees are existential and model-relative. In exchange the</w:t>
+      </w:r>
+      <w:r>
+        <w:t xml:space="preserve"> </w:t>
+      </w:r>
+      <w:r>
+        <w:t xml:space="preserve">practitioner gets a claim about their own system that is checked rather than assumed.</w:t>
       </w:r>
     </w:p>
     <w:bookmarkEnd w:id="110"/>
@@ -48648,16 +48380,16 @@
         <w:t xml:space="preserve"> </w:t>
       </w:r>
       <w:r>
-        <w:t xml:space="preserve">mechanistic companion study, downstream of, not prerequisite to, the verified behavioral claim.</w:t>
+        <w:t xml:space="preserve">mechanistic follow-up study, downstream of, not prerequisite to, the verified behavioral claim.</w:t>
       </w:r>
     </w:p>
-    <w:bookmarkStart w:id="117" w:name="X37a5acb05d688eb32bbe54c216dbcf303d3b4c3"/>
+    <w:bookmarkStart w:id="117" w:name="levels-of-description."/>
     <w:p>
       <w:pPr>
         <w:pStyle w:val="Heading4"/>
       </w:pPr>
       <w:r>
-        <w:t xml:space="preserve">Levels of description, and three readings of the phenomenon.</w:t>
+        <w:t xml:space="preserve">Levels of description.</w:t>
       </w:r>
     </w:p>
     <w:p>
@@ -48671,58 +48403,25 @@
         <w:t xml:space="preserve"> </w:t>
       </w:r>
       <w:r>
-        <w:t xml:space="preserve">computational account of how conditioning on added text changes the model’s processing. The two</w:t>
-      </w:r>
-      <w:r>
-        <w:t xml:space="preserve"> </w:t>
-      </w:r>
-      <w:r>
-        <w:t xml:space="preserve">are levels of description of the same event, and the verified behavioral facts are the</w:t>
-      </w:r>
-      <w:r>
-        <w:t xml:space="preserve"> </w:t>
-      </w:r>
-      <w:r>
-        <w:t xml:space="preserve">constraints any computational account must satisfy. Three interpretive readings are compatible</w:t>
-      </w:r>
-      <w:r>
-        <w:t xml:space="preserve"> </w:t>
-      </w:r>
-      <w:r>
-        <w:t xml:space="preserve">with the present data, and each is discriminable by a named experiment.</w:t>
-      </w:r>
-      <w:r>
-        <w:t xml:space="preserve"> </w:t>
-      </w:r>
-      <w:r>
-        <w:rPr>
-          <w:b/>
-          <w:bCs/>
-        </w:rPr>
-        <w:t xml:space="preserve">(i) A transient</w:t>
-      </w:r>
-      <w:r>
-        <w:rPr>
-          <w:b/>
-          <w:bCs/>
-        </w:rPr>
-        <w:t xml:space="preserve"> </w:t>
-      </w:r>
-      <w:r>
-        <w:rPr>
-          <w:b/>
-          <w:bCs/>
-        </w:rPr>
-        <w:t xml:space="preserve">failure of current models</w:t>
-      </w:r>
-      <w:r>
-        <w:t xml:space="preserve">: discriminated by the coherence-versus-scale trajectory of</w:t>
-      </w:r>
-      <w:r>
-        <w:t xml:space="preserve"> </w:t>
-      </w:r>
-      <w:r>
-        <w:t xml:space="preserve">§8.3, if</w:t>
+        <w:t xml:space="preserve">computational account of how conditioning on added text changes the model’s processing, and the</w:t>
+      </w:r>
+      <w:r>
+        <w:t xml:space="preserve"> </w:t>
+      </w:r>
+      <w:r>
+        <w:t xml:space="preserve">verified behavioral facts are the constraints any such account must satisfy. Of the readings</w:t>
+      </w:r>
+      <w:r>
+        <w:t xml:space="preserve"> </w:t>
+      </w:r>
+      <w:r>
+        <w:t xml:space="preserve">compatible with the data, two are discriminable by named experiments but not by ours: a transient</w:t>
+      </w:r>
+      <w:r>
+        <w:t xml:space="preserve"> </w:t>
+      </w:r>
+      <w:r>
+        <w:t xml:space="preserve">failure of current models (if</w:t>
       </w:r>
       <w:r>
         <w:t xml:space="preserve"> </w:t>
@@ -48748,87 +48447,56 @@
         <w:t xml:space="preserve"> </w:t>
       </w:r>
       <w:r>
-        <w:t xml:space="preserve">shrinks toward zero across model generations, the</w:t>
-      </w:r>
-      <w:r>
-        <w:t xml:space="preserve"> </w:t>
-      </w:r>
-      <w:r>
-        <w:t xml:space="preserve">anti-monotonicity half of the phenomenon was a passing artifact (the incomparability half, being</w:t>
-      </w:r>
-      <w:r>
-        <w:t xml:space="preserve"> </w:t>
-      </w:r>
-      <w:r>
-        <w:t xml:space="preserve">a property of the sources, remains).</w:t>
-      </w:r>
-      <w:r>
-        <w:t xml:space="preserve"> </w:t>
-      </w:r>
-      <w:r>
-        <w:rPr>
-          <w:b/>
-          <w:bCs/>
-        </w:rPr>
-        <w:t xml:space="preserve">(ii) A property of fixed-compute inference</w:t>
-      </w:r>
-      <w:r>
-        <w:t xml:space="preserve">: a rule</w:t>
-      </w:r>
-      <w:r>
-        <w:t xml:space="preserve"> </w:t>
-      </w:r>
-      <w:r>
-        <w:t xml:space="preserve">that spends the same forward computation regardless of context configuration cannot be optimal</w:t>
-      </w:r>
-      <w:r>
-        <w:t xml:space="preserve"> </w:t>
-      </w:r>
-      <w:r>
-        <w:t xml:space="preserve">for every configuration, on this reading some coherence violation persists at every scale and</w:t>
-      </w:r>
-      <w:r>
-        <w:t xml:space="preserve"> </w:t>
-      </w:r>
-      <w:r>
-        <w:t xml:space="preserve">only relocates.</w:t>
-      </w:r>
-      <w:r>
-        <w:t xml:space="preserve"> </w:t>
-      </w:r>
-      <w:r>
-        <w:rPr>
-          <w:b/>
-          <w:bCs/>
-        </w:rPr>
-        <w:t xml:space="preserve">(iii) Prompts as programs</w:t>
-      </w:r>
-      <w:r>
-        <w:t xml:space="preserve">: the added convention does not merely add</w:t>
-      </w:r>
-      <w:r>
-        <w:t xml:space="preserve"> </w:t>
-      </w:r>
-      <w:r>
-        <w:t xml:space="preserve">information, it selects a different computation; this reading is supported by the routing</w:t>
-      </w:r>
-      <w:r>
-        <w:t xml:space="preserve"> </w:t>
-      </w:r>
-      <w:r>
-        <w:t xml:space="preserve">result, a one-line control statement that adds no task-relevant information recovers most of the</w:t>
-      </w:r>
-      <w:r>
-        <w:t xml:space="preserve"> </w:t>
-      </w:r>
-      <w:r>
-        <w:t xml:space="preserve">collapse, and by the structured-context ablation, labeled XML segmentation of the same content</w:t>
-      </w:r>
-      <w:r>
-        <w:t xml:space="preserve"> </w:t>
-      </w:r>
-      <w:r>
-        <w:t xml:space="preserve">recovers only a minority of the collapse (</w:t>
+        <w:t xml:space="preserve">shrinks toward zero across generations,</w:t>
+      </w:r>
+      <w:r>
+        <w:t xml:space="preserve"> </w:t>
+      </w:r>
+      <w:r>
+        <w:t xml:space="preserve">§8.3), and a property of fixed-compute inference (a rule that spends the same</w:t>
+      </w:r>
+      <w:r>
+        <w:t xml:space="preserve"> </w:t>
+      </w:r>
+      <w:r>
+        <w:t xml:space="preserve">computation for every context configuration cannot be optimal for all of them). The reading the</w:t>
+      </w:r>
+      <w:r>
+        <w:t xml:space="preserve"> </w:t>
+      </w:r>
+      <w:r>
+        <w:t xml:space="preserve">data favour is</w:t>
+      </w:r>
+      <w:r>
+        <w:t xml:space="preserve"> </w:t>
+      </w:r>
+      <w:r>
+        <w:rPr>
+          <w:i/>
+          <w:iCs/>
+        </w:rPr>
+        <w:t xml:space="preserve">prompts as programs</w:t>
+      </w:r>
+      <w:r>
+        <w:t xml:space="preserve">: the added convention does not merely add information,</w:t>
+      </w:r>
+      <w:r>
+        <w:t xml:space="preserve"> </w:t>
+      </w:r>
+      <w:r>
+        <w:t xml:space="preserve">it selects a different computation. A one-line routing statement that adds no task-relevant</w:t>
+      </w:r>
+      <w:r>
+        <w:t xml:space="preserve"> </w:t>
+      </w:r>
+      <w:r>
+        <w:t xml:space="preserve">information recovers most of the collapse, while labeled XML segmentation of the same content</w:t>
+      </w:r>
+      <w:r>
+        <w:t xml:space="preserve"> </w:t>
+      </w:r>
+      <w:r>
+        <w:t xml:space="preserve">recovers only a minority (</w:t>
       </w:r>
       <m:oMath>
         <m:r>
@@ -48857,13 +48525,13 @@
         </m:r>
       </m:oMath>
       <w:r>
-        <w:t xml:space="preserve">) while the routing statement recovers most</w:t>
-      </w:r>
-      <w:r>
-        <w:t xml:space="preserve"> </w:t>
-      </w:r>
-      <w:r>
-        <w:t xml:space="preserve">of it (</w:t>
+        <w:t xml:space="preserve"> </w:t>
+      </w:r>
+      <w:r>
+        <w:t xml:space="preserve">against</w:t>
+      </w:r>
+      <w:r>
+        <w:t xml:space="preserve"> </w:t>
       </w:r>
       <m:oMath>
         <m:r>
@@ -48883,7 +48551,13 @@
         </m:r>
       </m:oMath>
       <w:r>
-        <w:t xml:space="preserve">), locating the operative variable in convention-to-task</w:t>
+        <w:t xml:space="preserve">), locating the operative variable in</w:t>
+      </w:r>
+      <w:r>
+        <w:t xml:space="preserve"> </w:t>
+      </w:r>
+      <w:r>
+        <w:t xml:space="preserve">convention-to-task</w:t>
       </w:r>
       <w:r>
         <w:t xml:space="preserve"> </w:t>
@@ -48899,19 +48573,13 @@
         <w:t xml:space="preserve"> </w:t>
       </w:r>
       <w:r>
-        <w:t xml:space="preserve">rather</w:t>
-      </w:r>
-      <w:r>
-        <w:t xml:space="preserve"> </w:t>
-      </w:r>
-      <w:r>
-        <w:t xml:space="preserve">than formatting or segmentation. We state these as interpretations, not findings; every verified</w:t>
-      </w:r>
-      <w:r>
-        <w:t xml:space="preserve"> </w:t>
-      </w:r>
-      <w:r>
-        <w:t xml:space="preserve">claim in the paper is independent of which reading is true.</w:t>
+        <w:t xml:space="preserve">rather than formatting. These are interpretations, not findings;</w:t>
+      </w:r>
+      <w:r>
+        <w:t xml:space="preserve"> </w:t>
+      </w:r>
+      <w:r>
+        <w:t xml:space="preserve">every verified claim in the paper is independent of which is true.</w:t>
       </w:r>
     </w:p>
     <w:p>
@@ -49074,13 +48742,13 @@
         <w:t xml:space="preserve"> </w:t>
       </w:r>
       <w:r>
-        <w:t xml:space="preserve">implies, with its guarantees and evaluation against strong reranker baselines, is factored into a</w:t>
-      </w:r>
-      <w:r>
-        <w:t xml:space="preserve"> </w:t>
-      </w:r>
-      <w:r>
-        <w:t xml:space="preserve">companion paper. Building the verified order on</w:t>
+        <w:t xml:space="preserve">implies, keep the verified non-dominated set and cover what it leaves uncovered, is left for</w:t>
+      </w:r>
+      <w:r>
+        <w:t xml:space="preserve"> </w:t>
+      </w:r>
+      <w:r>
+        <w:t xml:space="preserve">future work; here we note only its cost. Building the verified order on</w:t>
       </w:r>
       <w:r>
         <w:t xml:space="preserve"> </w:t>

</xml_diff>